<commit_message>
Photograph the window, not the desk it stands on
The screenshots with an open menu were taken from the screen, because a menu is a separate
window and PrintWindow of the form does not contain it. Taking the whole region from the
screen also took whatever was behind the window - in the Russian set, the editor and the
folders of the machine that built it. The window is printed now and only the rectangle of
the menu is lifted from the screen, so no stray pixel can reach the manual even if the
backdrop is covered. The language menu had to say where it is, too: it used to arrive in
the frame by accident, and with the fix it stopped arriving at all.
</commit_message>
<xml_diff>
--- a/docs/User manual.docx
+++ b/docs/User manual.docx
@@ -120,7 +120,7 @@
       <w:r>
         <w:fldChar w:fldCharType="separate"/>
       </w:r>
-      <w:hyperlink w:anchor="_Toc236316652" w:history="1">
+      <w:hyperlink w:anchor="_Toc236319885" w:history="1">
         <w:r>
           <w:rPr>
             <w:rStyle w:val="aff8"/>
@@ -148,7 +148,7 @@
             <w:noProof/>
             <w:webHidden/>
           </w:rPr>
-          <w:instrText xml:space="preserve"> PAGEREF _Toc236316652 \h </w:instrText>
+          <w:instrText xml:space="preserve"> PAGEREF _Toc236319885 \h </w:instrText>
         </w:r>
         <w:r>
           <w:rPr>
@@ -195,7 +195,7 @@
           <w14:ligatures w14:val="standardContextual"/>
         </w:rPr>
       </w:pPr>
-      <w:hyperlink w:anchor="_Toc236316653" w:history="1">
+      <w:hyperlink w:anchor="_Toc236319886" w:history="1">
         <w:r>
           <w:rPr>
             <w:rStyle w:val="aff8"/>
@@ -223,7 +223,7 @@
             <w:noProof/>
             <w:webHidden/>
           </w:rPr>
-          <w:instrText xml:space="preserve"> PAGEREF _Toc236316653 \h </w:instrText>
+          <w:instrText xml:space="preserve"> PAGEREF _Toc236319886 \h </w:instrText>
         </w:r>
         <w:r>
           <w:rPr>
@@ -270,7 +270,7 @@
           <w14:ligatures w14:val="standardContextual"/>
         </w:rPr>
       </w:pPr>
-      <w:hyperlink w:anchor="_Toc236316654" w:history="1">
+      <w:hyperlink w:anchor="_Toc236319887" w:history="1">
         <w:r>
           <w:rPr>
             <w:rStyle w:val="aff8"/>
@@ -298,7 +298,7 @@
             <w:noProof/>
             <w:webHidden/>
           </w:rPr>
-          <w:instrText xml:space="preserve"> PAGEREF _Toc236316654 \h </w:instrText>
+          <w:instrText xml:space="preserve"> PAGEREF _Toc236319887 \h </w:instrText>
         </w:r>
         <w:r>
           <w:rPr>
@@ -345,7 +345,7 @@
           <w14:ligatures w14:val="standardContextual"/>
         </w:rPr>
       </w:pPr>
-      <w:hyperlink w:anchor="_Toc236316655" w:history="1">
+      <w:hyperlink w:anchor="_Toc236319888" w:history="1">
         <w:r>
           <w:rPr>
             <w:rStyle w:val="aff8"/>
@@ -373,7 +373,7 @@
             <w:noProof/>
             <w:webHidden/>
           </w:rPr>
-          <w:instrText xml:space="preserve"> PAGEREF _Toc236316655 \h </w:instrText>
+          <w:instrText xml:space="preserve"> PAGEREF _Toc236319888 \h </w:instrText>
         </w:r>
         <w:r>
           <w:rPr>
@@ -420,7 +420,7 @@
           <w14:ligatures w14:val="standardContextual"/>
         </w:rPr>
       </w:pPr>
-      <w:hyperlink w:anchor="_Toc236316656" w:history="1">
+      <w:hyperlink w:anchor="_Toc236319889" w:history="1">
         <w:r>
           <w:rPr>
             <w:rStyle w:val="aff8"/>
@@ -448,7 +448,7 @@
             <w:noProof/>
             <w:webHidden/>
           </w:rPr>
-          <w:instrText xml:space="preserve"> PAGEREF _Toc236316656 \h </w:instrText>
+          <w:instrText xml:space="preserve"> PAGEREF _Toc236319889 \h </w:instrText>
         </w:r>
         <w:r>
           <w:rPr>
@@ -495,7 +495,7 @@
           <w14:ligatures w14:val="standardContextual"/>
         </w:rPr>
       </w:pPr>
-      <w:hyperlink w:anchor="_Toc236316657" w:history="1">
+      <w:hyperlink w:anchor="_Toc236319890" w:history="1">
         <w:r>
           <w:rPr>
             <w:rStyle w:val="aff8"/>
@@ -523,7 +523,7 @@
             <w:noProof/>
             <w:webHidden/>
           </w:rPr>
-          <w:instrText xml:space="preserve"> PAGEREF _Toc236316657 \h </w:instrText>
+          <w:instrText xml:space="preserve"> PAGEREF _Toc236319890 \h </w:instrText>
         </w:r>
         <w:r>
           <w:rPr>
@@ -570,7 +570,7 @@
           <w14:ligatures w14:val="standardContextual"/>
         </w:rPr>
       </w:pPr>
-      <w:hyperlink w:anchor="_Toc236316658" w:history="1">
+      <w:hyperlink w:anchor="_Toc236319891" w:history="1">
         <w:r>
           <w:rPr>
             <w:rStyle w:val="aff8"/>
@@ -598,7 +598,7 @@
             <w:noProof/>
             <w:webHidden/>
           </w:rPr>
-          <w:instrText xml:space="preserve"> PAGEREF _Toc236316658 \h </w:instrText>
+          <w:instrText xml:space="preserve"> PAGEREF _Toc236319891 \h </w:instrText>
         </w:r>
         <w:r>
           <w:rPr>
@@ -645,7 +645,7 @@
           <w14:ligatures w14:val="standardContextual"/>
         </w:rPr>
       </w:pPr>
-      <w:hyperlink w:anchor="_Toc236316659" w:history="1">
+      <w:hyperlink w:anchor="_Toc236319892" w:history="1">
         <w:r>
           <w:rPr>
             <w:rStyle w:val="aff8"/>
@@ -673,7 +673,7 @@
             <w:noProof/>
             <w:webHidden/>
           </w:rPr>
-          <w:instrText xml:space="preserve"> PAGEREF _Toc236316659 \h </w:instrText>
+          <w:instrText xml:space="preserve"> PAGEREF _Toc236319892 \h </w:instrText>
         </w:r>
         <w:r>
           <w:rPr>
@@ -720,7 +720,7 @@
           <w14:ligatures w14:val="standardContextual"/>
         </w:rPr>
       </w:pPr>
-      <w:hyperlink w:anchor="_Toc236316660" w:history="1">
+      <w:hyperlink w:anchor="_Toc236319893" w:history="1">
         <w:r>
           <w:rPr>
             <w:rStyle w:val="aff8"/>
@@ -748,7 +748,7 @@
             <w:noProof/>
             <w:webHidden/>
           </w:rPr>
-          <w:instrText xml:space="preserve"> PAGEREF _Toc236316660 \h </w:instrText>
+          <w:instrText xml:space="preserve"> PAGEREF _Toc236319893 \h </w:instrText>
         </w:r>
         <w:r>
           <w:rPr>
@@ -795,7 +795,7 @@
           <w14:ligatures w14:val="standardContextual"/>
         </w:rPr>
       </w:pPr>
-      <w:hyperlink w:anchor="_Toc236316661" w:history="1">
+      <w:hyperlink w:anchor="_Toc236319894" w:history="1">
         <w:r>
           <w:rPr>
             <w:rStyle w:val="aff8"/>
@@ -823,7 +823,7 @@
             <w:noProof/>
             <w:webHidden/>
           </w:rPr>
-          <w:instrText xml:space="preserve"> PAGEREF _Toc236316661 \h </w:instrText>
+          <w:instrText xml:space="preserve"> PAGEREF _Toc236319894 \h </w:instrText>
         </w:r>
         <w:r>
           <w:rPr>
@@ -870,7 +870,7 @@
           <w14:ligatures w14:val="standardContextual"/>
         </w:rPr>
       </w:pPr>
-      <w:hyperlink w:anchor="_Toc236316662" w:history="1">
+      <w:hyperlink w:anchor="_Toc236319895" w:history="1">
         <w:r>
           <w:rPr>
             <w:rStyle w:val="aff8"/>
@@ -898,7 +898,7 @@
             <w:noProof/>
             <w:webHidden/>
           </w:rPr>
-          <w:instrText xml:space="preserve"> PAGEREF _Toc236316662 \h </w:instrText>
+          <w:instrText xml:space="preserve"> PAGEREF _Toc236319895 \h </w:instrText>
         </w:r>
         <w:r>
           <w:rPr>
@@ -945,7 +945,7 @@
           <w14:ligatures w14:val="standardContextual"/>
         </w:rPr>
       </w:pPr>
-      <w:hyperlink w:anchor="_Toc236316663" w:history="1">
+      <w:hyperlink w:anchor="_Toc236319896" w:history="1">
         <w:r>
           <w:rPr>
             <w:rStyle w:val="aff8"/>
@@ -973,7 +973,7 @@
             <w:noProof/>
             <w:webHidden/>
           </w:rPr>
-          <w:instrText xml:space="preserve"> PAGEREF _Toc236316663 \h </w:instrText>
+          <w:instrText xml:space="preserve"> PAGEREF _Toc236319896 \h </w:instrText>
         </w:r>
         <w:r>
           <w:rPr>
@@ -1020,7 +1020,7 @@
           <w14:ligatures w14:val="standardContextual"/>
         </w:rPr>
       </w:pPr>
-      <w:hyperlink w:anchor="_Toc236316664" w:history="1">
+      <w:hyperlink w:anchor="_Toc236319897" w:history="1">
         <w:r>
           <w:rPr>
             <w:rStyle w:val="aff8"/>
@@ -1048,7 +1048,7 @@
             <w:noProof/>
             <w:webHidden/>
           </w:rPr>
-          <w:instrText xml:space="preserve"> PAGEREF _Toc236316664 \h </w:instrText>
+          <w:instrText xml:space="preserve"> PAGEREF _Toc236319897 \h </w:instrText>
         </w:r>
         <w:r>
           <w:rPr>
@@ -1095,7 +1095,7 @@
           <w14:ligatures w14:val="standardContextual"/>
         </w:rPr>
       </w:pPr>
-      <w:hyperlink w:anchor="_Toc236316665" w:history="1">
+      <w:hyperlink w:anchor="_Toc236319898" w:history="1">
         <w:r>
           <w:rPr>
             <w:rStyle w:val="aff8"/>
@@ -1123,7 +1123,7 @@
             <w:noProof/>
             <w:webHidden/>
           </w:rPr>
-          <w:instrText xml:space="preserve"> PAGEREF _Toc236316665 \h </w:instrText>
+          <w:instrText xml:space="preserve"> PAGEREF _Toc236319898 \h </w:instrText>
         </w:r>
         <w:r>
           <w:rPr>
@@ -1170,7 +1170,7 @@
           <w14:ligatures w14:val="standardContextual"/>
         </w:rPr>
       </w:pPr>
-      <w:hyperlink w:anchor="_Toc236316666" w:history="1">
+      <w:hyperlink w:anchor="_Toc236319899" w:history="1">
         <w:r>
           <w:rPr>
             <w:rStyle w:val="aff8"/>
@@ -1198,7 +1198,7 @@
             <w:noProof/>
             <w:webHidden/>
           </w:rPr>
-          <w:instrText xml:space="preserve"> PAGEREF _Toc236316666 \h </w:instrText>
+          <w:instrText xml:space="preserve"> PAGEREF _Toc236319899 \h </w:instrText>
         </w:r>
         <w:r>
           <w:rPr>
@@ -1245,7 +1245,7 @@
           <w14:ligatures w14:val="standardContextual"/>
         </w:rPr>
       </w:pPr>
-      <w:hyperlink w:anchor="_Toc236316667" w:history="1">
+      <w:hyperlink w:anchor="_Toc236319900" w:history="1">
         <w:r>
           <w:rPr>
             <w:rStyle w:val="aff8"/>
@@ -1273,7 +1273,7 @@
             <w:noProof/>
             <w:webHidden/>
           </w:rPr>
-          <w:instrText xml:space="preserve"> PAGEREF _Toc236316667 \h </w:instrText>
+          <w:instrText xml:space="preserve"> PAGEREF _Toc236319900 \h </w:instrText>
         </w:r>
         <w:r>
           <w:rPr>
@@ -1320,7 +1320,7 @@
           <w14:ligatures w14:val="standardContextual"/>
         </w:rPr>
       </w:pPr>
-      <w:hyperlink w:anchor="_Toc236316668" w:history="1">
+      <w:hyperlink w:anchor="_Toc236319901" w:history="1">
         <w:r>
           <w:rPr>
             <w:rStyle w:val="aff8"/>
@@ -1348,7 +1348,7 @@
             <w:noProof/>
             <w:webHidden/>
           </w:rPr>
-          <w:instrText xml:space="preserve"> PAGEREF _Toc236316668 \h </w:instrText>
+          <w:instrText xml:space="preserve"> PAGEREF _Toc236319901 \h </w:instrText>
         </w:r>
         <w:r>
           <w:rPr>
@@ -1395,7 +1395,7 @@
           <w14:ligatures w14:val="standardContextual"/>
         </w:rPr>
       </w:pPr>
-      <w:hyperlink w:anchor="_Toc236316669" w:history="1">
+      <w:hyperlink w:anchor="_Toc236319902" w:history="1">
         <w:r>
           <w:rPr>
             <w:rStyle w:val="aff8"/>
@@ -1423,7 +1423,7 @@
             <w:noProof/>
             <w:webHidden/>
           </w:rPr>
-          <w:instrText xml:space="preserve"> PAGEREF _Toc236316669 \h </w:instrText>
+          <w:instrText xml:space="preserve"> PAGEREF _Toc236319902 \h </w:instrText>
         </w:r>
         <w:r>
           <w:rPr>
@@ -1470,7 +1470,7 @@
           <w14:ligatures w14:val="standardContextual"/>
         </w:rPr>
       </w:pPr>
-      <w:hyperlink w:anchor="_Toc236316670" w:history="1">
+      <w:hyperlink w:anchor="_Toc236319903" w:history="1">
         <w:r>
           <w:rPr>
             <w:rStyle w:val="aff8"/>
@@ -1498,7 +1498,7 @@
             <w:noProof/>
             <w:webHidden/>
           </w:rPr>
-          <w:instrText xml:space="preserve"> PAGEREF _Toc236316670 \h </w:instrText>
+          <w:instrText xml:space="preserve"> PAGEREF _Toc236319903 \h </w:instrText>
         </w:r>
         <w:r>
           <w:rPr>
@@ -1545,7 +1545,7 @@
           <w14:ligatures w14:val="standardContextual"/>
         </w:rPr>
       </w:pPr>
-      <w:hyperlink w:anchor="_Toc236316671" w:history="1">
+      <w:hyperlink w:anchor="_Toc236319904" w:history="1">
         <w:r>
           <w:rPr>
             <w:rStyle w:val="aff8"/>
@@ -1573,7 +1573,7 @@
             <w:noProof/>
             <w:webHidden/>
           </w:rPr>
-          <w:instrText xml:space="preserve"> PAGEREF _Toc236316671 \h </w:instrText>
+          <w:instrText xml:space="preserve"> PAGEREF _Toc236319904 \h </w:instrText>
         </w:r>
         <w:r>
           <w:rPr>
@@ -1620,7 +1620,7 @@
           <w14:ligatures w14:val="standardContextual"/>
         </w:rPr>
       </w:pPr>
-      <w:hyperlink w:anchor="_Toc236316672" w:history="1">
+      <w:hyperlink w:anchor="_Toc236319905" w:history="1">
         <w:r>
           <w:rPr>
             <w:rStyle w:val="aff8"/>
@@ -1648,7 +1648,7 @@
             <w:noProof/>
             <w:webHidden/>
           </w:rPr>
-          <w:instrText xml:space="preserve"> PAGEREF _Toc236316672 \h </w:instrText>
+          <w:instrText xml:space="preserve"> PAGEREF _Toc236319905 \h </w:instrText>
         </w:r>
         <w:r>
           <w:rPr>
@@ -1695,7 +1695,7 @@
           <w14:ligatures w14:val="standardContextual"/>
         </w:rPr>
       </w:pPr>
-      <w:hyperlink w:anchor="_Toc236316673" w:history="1">
+      <w:hyperlink w:anchor="_Toc236319906" w:history="1">
         <w:r>
           <w:rPr>
             <w:rStyle w:val="aff8"/>
@@ -1723,7 +1723,7 @@
             <w:noProof/>
             <w:webHidden/>
           </w:rPr>
-          <w:instrText xml:space="preserve"> PAGEREF _Toc236316673 \h </w:instrText>
+          <w:instrText xml:space="preserve"> PAGEREF _Toc236319906 \h </w:instrText>
         </w:r>
         <w:r>
           <w:rPr>
@@ -1770,7 +1770,7 @@
           <w14:ligatures w14:val="standardContextual"/>
         </w:rPr>
       </w:pPr>
-      <w:hyperlink w:anchor="_Toc236316674" w:history="1">
+      <w:hyperlink w:anchor="_Toc236319907" w:history="1">
         <w:r>
           <w:rPr>
             <w:rStyle w:val="aff8"/>
@@ -1798,7 +1798,7 @@
             <w:noProof/>
             <w:webHidden/>
           </w:rPr>
-          <w:instrText xml:space="preserve"> PAGEREF _Toc236316674 \h </w:instrText>
+          <w:instrText xml:space="preserve"> PAGEREF _Toc236319907 \h </w:instrText>
         </w:r>
         <w:r>
           <w:rPr>
@@ -1845,7 +1845,7 @@
           <w14:ligatures w14:val="standardContextual"/>
         </w:rPr>
       </w:pPr>
-      <w:hyperlink w:anchor="_Toc236316675" w:history="1">
+      <w:hyperlink w:anchor="_Toc236319908" w:history="1">
         <w:r>
           <w:rPr>
             <w:rStyle w:val="aff8"/>
@@ -1873,7 +1873,7 @@
             <w:noProof/>
             <w:webHidden/>
           </w:rPr>
-          <w:instrText xml:space="preserve"> PAGEREF _Toc236316675 \h </w:instrText>
+          <w:instrText xml:space="preserve"> PAGEREF _Toc236319908 \h </w:instrText>
         </w:r>
         <w:r>
           <w:rPr>
@@ -1920,7 +1920,7 @@
           <w14:ligatures w14:val="standardContextual"/>
         </w:rPr>
       </w:pPr>
-      <w:hyperlink w:anchor="_Toc236316676" w:history="1">
+      <w:hyperlink w:anchor="_Toc236319909" w:history="1">
         <w:r>
           <w:rPr>
             <w:rStyle w:val="aff8"/>
@@ -1948,7 +1948,7 @@
             <w:noProof/>
             <w:webHidden/>
           </w:rPr>
-          <w:instrText xml:space="preserve"> PAGEREF _Toc236316676 \h </w:instrText>
+          <w:instrText xml:space="preserve"> PAGEREF _Toc236319909 \h </w:instrText>
         </w:r>
         <w:r>
           <w:rPr>
@@ -1995,7 +1995,7 @@
           <w14:ligatures w14:val="standardContextual"/>
         </w:rPr>
       </w:pPr>
-      <w:hyperlink w:anchor="_Toc236316677" w:history="1">
+      <w:hyperlink w:anchor="_Toc236319910" w:history="1">
         <w:r>
           <w:rPr>
             <w:rStyle w:val="aff8"/>
@@ -2023,7 +2023,7 @@
             <w:noProof/>
             <w:webHidden/>
           </w:rPr>
-          <w:instrText xml:space="preserve"> PAGEREF _Toc236316677 \h </w:instrText>
+          <w:instrText xml:space="preserve"> PAGEREF _Toc236319910 \h </w:instrText>
         </w:r>
         <w:r>
           <w:rPr>
@@ -2070,7 +2070,7 @@
           <w14:ligatures w14:val="standardContextual"/>
         </w:rPr>
       </w:pPr>
-      <w:hyperlink w:anchor="_Toc236316678" w:history="1">
+      <w:hyperlink w:anchor="_Toc236319911" w:history="1">
         <w:r>
           <w:rPr>
             <w:rStyle w:val="aff8"/>
@@ -2098,7 +2098,7 @@
             <w:noProof/>
             <w:webHidden/>
           </w:rPr>
-          <w:instrText xml:space="preserve"> PAGEREF _Toc236316678 \h </w:instrText>
+          <w:instrText xml:space="preserve"> PAGEREF _Toc236319911 \h </w:instrText>
         </w:r>
         <w:r>
           <w:rPr>
@@ -2145,7 +2145,7 @@
           <w14:ligatures w14:val="standardContextual"/>
         </w:rPr>
       </w:pPr>
-      <w:hyperlink w:anchor="_Toc236316679" w:history="1">
+      <w:hyperlink w:anchor="_Toc236319912" w:history="1">
         <w:r>
           <w:rPr>
             <w:rStyle w:val="aff8"/>
@@ -2173,7 +2173,7 @@
             <w:noProof/>
             <w:webHidden/>
           </w:rPr>
-          <w:instrText xml:space="preserve"> PAGEREF _Toc236316679 \h </w:instrText>
+          <w:instrText xml:space="preserve"> PAGEREF _Toc236319912 \h </w:instrText>
         </w:r>
         <w:r>
           <w:rPr>
@@ -2220,7 +2220,7 @@
           <w14:ligatures w14:val="standardContextual"/>
         </w:rPr>
       </w:pPr>
-      <w:hyperlink w:anchor="_Toc236316680" w:history="1">
+      <w:hyperlink w:anchor="_Toc236319913" w:history="1">
         <w:r>
           <w:rPr>
             <w:rStyle w:val="aff8"/>
@@ -2248,7 +2248,7 @@
             <w:noProof/>
             <w:webHidden/>
           </w:rPr>
-          <w:instrText xml:space="preserve"> PAGEREF _Toc236316680 \h </w:instrText>
+          <w:instrText xml:space="preserve"> PAGEREF _Toc236319913 \h </w:instrText>
         </w:r>
         <w:r>
           <w:rPr>
@@ -2295,7 +2295,7 @@
           <w14:ligatures w14:val="standardContextual"/>
         </w:rPr>
       </w:pPr>
-      <w:hyperlink w:anchor="_Toc236316681" w:history="1">
+      <w:hyperlink w:anchor="_Toc236319914" w:history="1">
         <w:r>
           <w:rPr>
             <w:rStyle w:val="aff8"/>
@@ -2323,7 +2323,7 @@
             <w:noProof/>
             <w:webHidden/>
           </w:rPr>
-          <w:instrText xml:space="preserve"> PAGEREF _Toc236316681 \h </w:instrText>
+          <w:instrText xml:space="preserve"> PAGEREF _Toc236319914 \h </w:instrText>
         </w:r>
         <w:r>
           <w:rPr>
@@ -2370,7 +2370,7 @@
           <w14:ligatures w14:val="standardContextual"/>
         </w:rPr>
       </w:pPr>
-      <w:hyperlink w:anchor="_Toc236316682" w:history="1">
+      <w:hyperlink w:anchor="_Toc236319915" w:history="1">
         <w:r>
           <w:rPr>
             <w:rStyle w:val="aff8"/>
@@ -2398,7 +2398,7 @@
             <w:noProof/>
             <w:webHidden/>
           </w:rPr>
-          <w:instrText xml:space="preserve"> PAGEREF _Toc236316682 \h </w:instrText>
+          <w:instrText xml:space="preserve"> PAGEREF _Toc236319915 \h </w:instrText>
         </w:r>
         <w:r>
           <w:rPr>
@@ -2445,7 +2445,7 @@
           <w14:ligatures w14:val="standardContextual"/>
         </w:rPr>
       </w:pPr>
-      <w:hyperlink w:anchor="_Toc236316683" w:history="1">
+      <w:hyperlink w:anchor="_Toc236319916" w:history="1">
         <w:r>
           <w:rPr>
             <w:rStyle w:val="aff8"/>
@@ -2473,7 +2473,7 @@
             <w:noProof/>
             <w:webHidden/>
           </w:rPr>
-          <w:instrText xml:space="preserve"> PAGEREF _Toc236316683 \h </w:instrText>
+          <w:instrText xml:space="preserve"> PAGEREF _Toc236319916 \h </w:instrText>
         </w:r>
         <w:r>
           <w:rPr>
@@ -2520,7 +2520,7 @@
           <w14:ligatures w14:val="standardContextual"/>
         </w:rPr>
       </w:pPr>
-      <w:hyperlink w:anchor="_Toc236316684" w:history="1">
+      <w:hyperlink w:anchor="_Toc236319917" w:history="1">
         <w:r>
           <w:rPr>
             <w:rStyle w:val="aff8"/>
@@ -2548,7 +2548,7 @@
             <w:noProof/>
             <w:webHidden/>
           </w:rPr>
-          <w:instrText xml:space="preserve"> PAGEREF _Toc236316684 \h </w:instrText>
+          <w:instrText xml:space="preserve"> PAGEREF _Toc236319917 \h </w:instrText>
         </w:r>
         <w:r>
           <w:rPr>
@@ -2595,7 +2595,7 @@
           <w14:ligatures w14:val="standardContextual"/>
         </w:rPr>
       </w:pPr>
-      <w:hyperlink w:anchor="_Toc236316685" w:history="1">
+      <w:hyperlink w:anchor="_Toc236319918" w:history="1">
         <w:r>
           <w:rPr>
             <w:rStyle w:val="aff8"/>
@@ -2623,7 +2623,7 @@
             <w:noProof/>
             <w:webHidden/>
           </w:rPr>
-          <w:instrText xml:space="preserve"> PAGEREF _Toc236316685 \h </w:instrText>
+          <w:instrText xml:space="preserve"> PAGEREF _Toc236319918 \h </w:instrText>
         </w:r>
         <w:r>
           <w:rPr>
@@ -2670,7 +2670,7 @@
           <w14:ligatures w14:val="standardContextual"/>
         </w:rPr>
       </w:pPr>
-      <w:hyperlink w:anchor="_Toc236316686" w:history="1">
+      <w:hyperlink w:anchor="_Toc236319919" w:history="1">
         <w:r>
           <w:rPr>
             <w:rStyle w:val="aff8"/>
@@ -2698,7 +2698,7 @@
             <w:noProof/>
             <w:webHidden/>
           </w:rPr>
-          <w:instrText xml:space="preserve"> PAGEREF _Toc236316686 \h </w:instrText>
+          <w:instrText xml:space="preserve"> PAGEREF _Toc236319919 \h </w:instrText>
         </w:r>
         <w:r>
           <w:rPr>
@@ -2745,7 +2745,7 @@
           <w14:ligatures w14:val="standardContextual"/>
         </w:rPr>
       </w:pPr>
-      <w:hyperlink w:anchor="_Toc236316687" w:history="1">
+      <w:hyperlink w:anchor="_Toc236319920" w:history="1">
         <w:r>
           <w:rPr>
             <w:rStyle w:val="aff8"/>
@@ -2773,7 +2773,7 @@
             <w:noProof/>
             <w:webHidden/>
           </w:rPr>
-          <w:instrText xml:space="preserve"> PAGEREF _Toc236316687 \h </w:instrText>
+          <w:instrText xml:space="preserve"> PAGEREF _Toc236319920 \h </w:instrText>
         </w:r>
         <w:r>
           <w:rPr>
@@ -2820,7 +2820,7 @@
           <w14:ligatures w14:val="standardContextual"/>
         </w:rPr>
       </w:pPr>
-      <w:hyperlink w:anchor="_Toc236316688" w:history="1">
+      <w:hyperlink w:anchor="_Toc236319921" w:history="1">
         <w:r>
           <w:rPr>
             <w:rStyle w:val="aff8"/>
@@ -2848,7 +2848,7 @@
             <w:noProof/>
             <w:webHidden/>
           </w:rPr>
-          <w:instrText xml:space="preserve"> PAGEREF _Toc236316688 \h </w:instrText>
+          <w:instrText xml:space="preserve"> PAGEREF _Toc236319921 \h </w:instrText>
         </w:r>
         <w:r>
           <w:rPr>
@@ -2895,7 +2895,7 @@
           <w14:ligatures w14:val="standardContextual"/>
         </w:rPr>
       </w:pPr>
-      <w:hyperlink w:anchor="_Toc236316689" w:history="1">
+      <w:hyperlink w:anchor="_Toc236319922" w:history="1">
         <w:r>
           <w:rPr>
             <w:rStyle w:val="aff8"/>
@@ -2923,7 +2923,7 @@
             <w:noProof/>
             <w:webHidden/>
           </w:rPr>
-          <w:instrText xml:space="preserve"> PAGEREF _Toc236316689 \h </w:instrText>
+          <w:instrText xml:space="preserve"> PAGEREF _Toc236319922 \h </w:instrText>
         </w:r>
         <w:r>
           <w:rPr>
@@ -2970,7 +2970,7 @@
           <w14:ligatures w14:val="standardContextual"/>
         </w:rPr>
       </w:pPr>
-      <w:hyperlink w:anchor="_Toc236316690" w:history="1">
+      <w:hyperlink w:anchor="_Toc236319923" w:history="1">
         <w:r>
           <w:rPr>
             <w:rStyle w:val="aff8"/>
@@ -2998,7 +2998,7 @@
             <w:noProof/>
             <w:webHidden/>
           </w:rPr>
-          <w:instrText xml:space="preserve"> PAGEREF _Toc236316690 \h </w:instrText>
+          <w:instrText xml:space="preserve"> PAGEREF _Toc236319923 \h </w:instrText>
         </w:r>
         <w:r>
           <w:rPr>
@@ -3045,7 +3045,7 @@
           <w14:ligatures w14:val="standardContextual"/>
         </w:rPr>
       </w:pPr>
-      <w:hyperlink w:anchor="_Toc236316691" w:history="1">
+      <w:hyperlink w:anchor="_Toc236319924" w:history="1">
         <w:r>
           <w:rPr>
             <w:rStyle w:val="aff8"/>
@@ -3073,7 +3073,7 @@
             <w:noProof/>
             <w:webHidden/>
           </w:rPr>
-          <w:instrText xml:space="preserve"> PAGEREF _Toc236316691 \h </w:instrText>
+          <w:instrText xml:space="preserve"> PAGEREF _Toc236319924 \h </w:instrText>
         </w:r>
         <w:r>
           <w:rPr>
@@ -3120,7 +3120,7 @@
           <w14:ligatures w14:val="standardContextual"/>
         </w:rPr>
       </w:pPr>
-      <w:hyperlink w:anchor="_Toc236316692" w:history="1">
+      <w:hyperlink w:anchor="_Toc236319925" w:history="1">
         <w:r>
           <w:rPr>
             <w:rStyle w:val="aff8"/>
@@ -3148,7 +3148,7 @@
             <w:noProof/>
             <w:webHidden/>
           </w:rPr>
-          <w:instrText xml:space="preserve"> PAGEREF _Toc236316692 \h </w:instrText>
+          <w:instrText xml:space="preserve"> PAGEREF _Toc236319925 \h </w:instrText>
         </w:r>
         <w:r>
           <w:rPr>
@@ -3195,7 +3195,7 @@
           <w14:ligatures w14:val="standardContextual"/>
         </w:rPr>
       </w:pPr>
-      <w:hyperlink w:anchor="_Toc236316693" w:history="1">
+      <w:hyperlink w:anchor="_Toc236319926" w:history="1">
         <w:r>
           <w:rPr>
             <w:rStyle w:val="aff8"/>
@@ -3223,7 +3223,7 @@
             <w:noProof/>
             <w:webHidden/>
           </w:rPr>
-          <w:instrText xml:space="preserve"> PAGEREF _Toc236316693 \h </w:instrText>
+          <w:instrText xml:space="preserve"> PAGEREF _Toc236319926 \h </w:instrText>
         </w:r>
         <w:r>
           <w:rPr>
@@ -3270,7 +3270,7 @@
           <w14:ligatures w14:val="standardContextual"/>
         </w:rPr>
       </w:pPr>
-      <w:hyperlink w:anchor="_Toc236316694" w:history="1">
+      <w:hyperlink w:anchor="_Toc236319927" w:history="1">
         <w:r>
           <w:rPr>
             <w:rStyle w:val="aff8"/>
@@ -3298,7 +3298,7 @@
             <w:noProof/>
             <w:webHidden/>
           </w:rPr>
-          <w:instrText xml:space="preserve"> PAGEREF _Toc236316694 \h </w:instrText>
+          <w:instrText xml:space="preserve"> PAGEREF _Toc236319927 \h </w:instrText>
         </w:r>
         <w:r>
           <w:rPr>
@@ -3345,7 +3345,7 @@
           <w14:ligatures w14:val="standardContextual"/>
         </w:rPr>
       </w:pPr>
-      <w:hyperlink w:anchor="_Toc236316695" w:history="1">
+      <w:hyperlink w:anchor="_Toc236319928" w:history="1">
         <w:r>
           <w:rPr>
             <w:rStyle w:val="aff8"/>
@@ -3373,7 +3373,7 @@
             <w:noProof/>
             <w:webHidden/>
           </w:rPr>
-          <w:instrText xml:space="preserve"> PAGEREF _Toc236316695 \h </w:instrText>
+          <w:instrText xml:space="preserve"> PAGEREF _Toc236319928 \h </w:instrText>
         </w:r>
         <w:r>
           <w:rPr>
@@ -3420,7 +3420,7 @@
           <w14:ligatures w14:val="standardContextual"/>
         </w:rPr>
       </w:pPr>
-      <w:hyperlink w:anchor="_Toc236316696" w:history="1">
+      <w:hyperlink w:anchor="_Toc236319929" w:history="1">
         <w:r>
           <w:rPr>
             <w:rStyle w:val="aff8"/>
@@ -3448,7 +3448,7 @@
             <w:noProof/>
             <w:webHidden/>
           </w:rPr>
-          <w:instrText xml:space="preserve"> PAGEREF _Toc236316696 \h </w:instrText>
+          <w:instrText xml:space="preserve"> PAGEREF _Toc236319929 \h </w:instrText>
         </w:r>
         <w:r>
           <w:rPr>
@@ -3495,7 +3495,7 @@
           <w14:ligatures w14:val="standardContextual"/>
         </w:rPr>
       </w:pPr>
-      <w:hyperlink w:anchor="_Toc236316697" w:history="1">
+      <w:hyperlink w:anchor="_Toc236319930" w:history="1">
         <w:r>
           <w:rPr>
             <w:rStyle w:val="aff8"/>
@@ -3523,7 +3523,7 @@
             <w:noProof/>
             <w:webHidden/>
           </w:rPr>
-          <w:instrText xml:space="preserve"> PAGEREF _Toc236316697 \h </w:instrText>
+          <w:instrText xml:space="preserve"> PAGEREF _Toc236319930 \h </w:instrText>
         </w:r>
         <w:r>
           <w:rPr>
@@ -3570,7 +3570,7 @@
           <w14:ligatures w14:val="standardContextual"/>
         </w:rPr>
       </w:pPr>
-      <w:hyperlink w:anchor="_Toc236316698" w:history="1">
+      <w:hyperlink w:anchor="_Toc236319931" w:history="1">
         <w:r>
           <w:rPr>
             <w:rStyle w:val="aff8"/>
@@ -3598,7 +3598,7 @@
             <w:noProof/>
             <w:webHidden/>
           </w:rPr>
-          <w:instrText xml:space="preserve"> PAGEREF _Toc236316698 \h </w:instrText>
+          <w:instrText xml:space="preserve"> PAGEREF _Toc236319931 \h </w:instrText>
         </w:r>
         <w:r>
           <w:rPr>
@@ -3645,7 +3645,7 @@
           <w14:ligatures w14:val="standardContextual"/>
         </w:rPr>
       </w:pPr>
-      <w:hyperlink w:anchor="_Toc236316699" w:history="1">
+      <w:hyperlink w:anchor="_Toc236319932" w:history="1">
         <w:r>
           <w:rPr>
             <w:rStyle w:val="aff8"/>
@@ -3673,7 +3673,7 @@
             <w:noProof/>
             <w:webHidden/>
           </w:rPr>
-          <w:instrText xml:space="preserve"> PAGEREF _Toc236316699 \h </w:instrText>
+          <w:instrText xml:space="preserve"> PAGEREF _Toc236319932 \h </w:instrText>
         </w:r>
         <w:r>
           <w:rPr>
@@ -3720,7 +3720,7 @@
           <w14:ligatures w14:val="standardContextual"/>
         </w:rPr>
       </w:pPr>
-      <w:hyperlink w:anchor="_Toc236316700" w:history="1">
+      <w:hyperlink w:anchor="_Toc236319933" w:history="1">
         <w:r>
           <w:rPr>
             <w:rStyle w:val="aff8"/>
@@ -3748,7 +3748,7 @@
             <w:noProof/>
             <w:webHidden/>
           </w:rPr>
-          <w:instrText xml:space="preserve"> PAGEREF _Toc236316700 \h </w:instrText>
+          <w:instrText xml:space="preserve"> PAGEREF _Toc236319933 \h </w:instrText>
         </w:r>
         <w:r>
           <w:rPr>
@@ -3795,7 +3795,7 @@
           <w14:ligatures w14:val="standardContextual"/>
         </w:rPr>
       </w:pPr>
-      <w:hyperlink w:anchor="_Toc236316701" w:history="1">
+      <w:hyperlink w:anchor="_Toc236319934" w:history="1">
         <w:r>
           <w:rPr>
             <w:rStyle w:val="aff8"/>
@@ -3823,7 +3823,7 @@
             <w:noProof/>
             <w:webHidden/>
           </w:rPr>
-          <w:instrText xml:space="preserve"> PAGEREF _Toc236316701 \h </w:instrText>
+          <w:instrText xml:space="preserve"> PAGEREF _Toc236319934 \h </w:instrText>
         </w:r>
         <w:r>
           <w:rPr>
@@ -3870,7 +3870,7 @@
           <w14:ligatures w14:val="standardContextual"/>
         </w:rPr>
       </w:pPr>
-      <w:hyperlink w:anchor="_Toc236316702" w:history="1">
+      <w:hyperlink w:anchor="_Toc236319935" w:history="1">
         <w:r>
           <w:rPr>
             <w:rStyle w:val="aff8"/>
@@ -3898,7 +3898,7 @@
             <w:noProof/>
             <w:webHidden/>
           </w:rPr>
-          <w:instrText xml:space="preserve"> PAGEREF _Toc236316702 \h </w:instrText>
+          <w:instrText xml:space="preserve"> PAGEREF _Toc236319935 \h </w:instrText>
         </w:r>
         <w:r>
           <w:rPr>
@@ -3945,7 +3945,7 @@
           <w14:ligatures w14:val="standardContextual"/>
         </w:rPr>
       </w:pPr>
-      <w:hyperlink w:anchor="_Toc236316703" w:history="1">
+      <w:hyperlink w:anchor="_Toc236319936" w:history="1">
         <w:r>
           <w:rPr>
             <w:rStyle w:val="aff8"/>
@@ -3973,7 +3973,7 @@
             <w:noProof/>
             <w:webHidden/>
           </w:rPr>
-          <w:instrText xml:space="preserve"> PAGEREF _Toc236316703 \h </w:instrText>
+          <w:instrText xml:space="preserve"> PAGEREF _Toc236319936 \h </w:instrText>
         </w:r>
         <w:r>
           <w:rPr>
@@ -4020,7 +4020,7 @@
           <w14:ligatures w14:val="standardContextual"/>
         </w:rPr>
       </w:pPr>
-      <w:hyperlink w:anchor="_Toc236316704" w:history="1">
+      <w:hyperlink w:anchor="_Toc236319937" w:history="1">
         <w:r>
           <w:rPr>
             <w:rStyle w:val="aff8"/>
@@ -4048,7 +4048,7 @@
             <w:noProof/>
             <w:webHidden/>
           </w:rPr>
-          <w:instrText xml:space="preserve"> PAGEREF _Toc236316704 \h </w:instrText>
+          <w:instrText xml:space="preserve"> PAGEREF _Toc236319937 \h </w:instrText>
         </w:r>
         <w:r>
           <w:rPr>
@@ -4095,7 +4095,7 @@
           <w14:ligatures w14:val="standardContextual"/>
         </w:rPr>
       </w:pPr>
-      <w:hyperlink w:anchor="_Toc236316705" w:history="1">
+      <w:hyperlink w:anchor="_Toc236319938" w:history="1">
         <w:r>
           <w:rPr>
             <w:rStyle w:val="aff8"/>
@@ -4123,7 +4123,7 @@
             <w:noProof/>
             <w:webHidden/>
           </w:rPr>
-          <w:instrText xml:space="preserve"> PAGEREF _Toc236316705 \h </w:instrText>
+          <w:instrText xml:space="preserve"> PAGEREF _Toc236319938 \h </w:instrText>
         </w:r>
         <w:r>
           <w:rPr>
@@ -4170,7 +4170,7 @@
           <w14:ligatures w14:val="standardContextual"/>
         </w:rPr>
       </w:pPr>
-      <w:hyperlink w:anchor="_Toc236316706" w:history="1">
+      <w:hyperlink w:anchor="_Toc236319939" w:history="1">
         <w:r>
           <w:rPr>
             <w:rStyle w:val="aff8"/>
@@ -4198,7 +4198,7 @@
             <w:noProof/>
             <w:webHidden/>
           </w:rPr>
-          <w:instrText xml:space="preserve"> PAGEREF _Toc236316706 \h </w:instrText>
+          <w:instrText xml:space="preserve"> PAGEREF _Toc236319939 \h </w:instrText>
         </w:r>
         <w:r>
           <w:rPr>
@@ -4245,7 +4245,7 @@
           <w14:ligatures w14:val="standardContextual"/>
         </w:rPr>
       </w:pPr>
-      <w:hyperlink w:anchor="_Toc236316707" w:history="1">
+      <w:hyperlink w:anchor="_Toc236319940" w:history="1">
         <w:r>
           <w:rPr>
             <w:rStyle w:val="aff8"/>
@@ -4273,7 +4273,7 @@
             <w:noProof/>
             <w:webHidden/>
           </w:rPr>
-          <w:instrText xml:space="preserve"> PAGEREF _Toc236316707 \h </w:instrText>
+          <w:instrText xml:space="preserve"> PAGEREF _Toc236319940 \h </w:instrText>
         </w:r>
         <w:r>
           <w:rPr>
@@ -4321,7 +4321,7 @@
       <w:pPr>
         <w:pStyle w:val="1"/>
       </w:pPr>
-      <w:bookmarkStart w:id="0" w:name="_Toc236316652"/>
+      <w:bookmarkStart w:id="0" w:name="_Toc236319885"/>
       <w:r>
         <w:lastRenderedPageBreak/>
         <w:t>1. About the program</w:t>
@@ -4332,7 +4332,7 @@
       <w:pPr>
         <w:pStyle w:val="21"/>
       </w:pPr>
-      <w:bookmarkStart w:id="1" w:name="_Toc236316653"/>
+      <w:bookmarkStart w:id="1" w:name="_Toc236319886"/>
       <w:r>
         <w:t>1.1. What it is for</w:t>
       </w:r>
@@ -4755,7 +4755,7 @@
       <w:pPr>
         <w:pStyle w:val="21"/>
       </w:pPr>
-      <w:bookmarkStart w:id="2" w:name="_Toc236316654"/>
+      <w:bookmarkStart w:id="2" w:name="_Toc236319887"/>
       <w:r>
         <w:t>1.2. What the program gives you</w:t>
       </w:r>
@@ -4840,7 +4840,7 @@
       <w:pPr>
         <w:pStyle w:val="21"/>
       </w:pPr>
-      <w:bookmarkStart w:id="3" w:name="_Toc236316655"/>
+      <w:bookmarkStart w:id="3" w:name="_Toc236319888"/>
       <w:r>
         <w:t>1.3. What the workplace needs</w:t>
       </w:r>
@@ -4870,7 +4870,7 @@
       <w:pPr>
         <w:pStyle w:val="21"/>
       </w:pPr>
-      <w:bookmarkStart w:id="4" w:name="_Toc236316656"/>
+      <w:bookmarkStart w:id="4" w:name="_Toc236319889"/>
       <w:r>
         <w:t>1.4. Installing, starting and updating</w:t>
       </w:r>
@@ -4946,7 +4946,7 @@
       <w:pPr>
         <w:pStyle w:val="1"/>
       </w:pPr>
-      <w:bookmarkStart w:id="5" w:name="_Toc236316657"/>
+      <w:bookmarkStart w:id="5" w:name="_Toc236319890"/>
       <w:r>
         <w:lastRenderedPageBreak/>
         <w:t>2. How working with the program is arranged</w:t>
@@ -4957,7 +4957,7 @@
       <w:pPr>
         <w:pStyle w:val="21"/>
       </w:pPr>
-      <w:bookmarkStart w:id="6" w:name="_Toc236316658"/>
+      <w:bookmarkStart w:id="6" w:name="_Toc236319891"/>
       <w:r>
         <w:t>2.1. The start screen</w:t>
       </w:r>
@@ -4983,7 +4983,7 @@
           <w:noProof/>
         </w:rPr>
         <w:drawing>
-          <wp:inline distT="0" distB="0" distL="0" distR="0" wp14:anchorId="206BE6C9" wp14:editId="6681607E">
+          <wp:inline distT="0" distB="0" distL="0" distR="0" wp14:anchorId="73CE47D4" wp14:editId="4BA690F8">
             <wp:extent cx="5760000" cy="5127111"/>
             <wp:effectExtent l="0" t="0" r="0" b="0"/>
             <wp:docPr id="1" name="Picture 1"/>
@@ -5047,7 +5047,7 @@
         </w:rPr>
         <w:lastRenderedPageBreak/>
         <w:drawing>
-          <wp:inline distT="0" distB="0" distL="0" distR="0" wp14:anchorId="0C5FB9D0" wp14:editId="4F681397">
+          <wp:inline distT="0" distB="0" distL="0" distR="0" wp14:anchorId="501444CC" wp14:editId="34A0239F">
             <wp:extent cx="5760000" cy="5127111"/>
             <wp:effectExtent l="0" t="0" r="0" b="0"/>
             <wp:docPr id="2" name="Picture 2"/>
@@ -5134,7 +5134,7 @@
       <w:pPr>
         <w:pStyle w:val="21"/>
       </w:pPr>
-      <w:bookmarkStart w:id="7" w:name="_Toc236316659"/>
+      <w:bookmarkStart w:id="7" w:name="_Toc236319892"/>
       <w:r>
         <w:t>2.2. The language of the interface</w:t>
       </w:r>
@@ -5157,8 +5157,8 @@
           <w:noProof/>
         </w:rPr>
         <w:drawing>
-          <wp:inline distT="0" distB="0" distL="0" distR="0" wp14:anchorId="66C45614" wp14:editId="15272F62">
-            <wp:extent cx="5760000" cy="5139371"/>
+          <wp:inline distT="0" distB="0" distL="0" distR="0" wp14:anchorId="7E83589C" wp14:editId="0FEB4E50">
+            <wp:extent cx="5760000" cy="5127111"/>
             <wp:effectExtent l="0" t="0" r="0" b="0"/>
             <wp:docPr id="3" name="Picture 3"/>
             <wp:cNvGraphicFramePr>
@@ -5180,7 +5180,7 @@
                   <pic:spPr>
                     <a:xfrm>
                       <a:off x="0" y="0"/>
-                      <a:ext cx="5760000" cy="5139371"/>
+                      <a:ext cx="5760000" cy="5127111"/>
                     </a:xfrm>
                     <a:prstGeom prst="rect">
                       <a:avLst/>
@@ -5230,7 +5230,7 @@
       <w:pPr>
         <w:pStyle w:val="21"/>
       </w:pPr>
-      <w:bookmarkStart w:id="8" w:name="_Toc236316660"/>
+      <w:bookmarkStart w:id="8" w:name="_Toc236319893"/>
       <w:r>
         <w:t>2.3. The built-in help</w:t>
       </w:r>
@@ -5253,7 +5253,7 @@
           <w:noProof/>
         </w:rPr>
         <w:drawing>
-          <wp:inline distT="0" distB="0" distL="0" distR="0" wp14:anchorId="1B518E95" wp14:editId="22D7A4A6">
+          <wp:inline distT="0" distB="0" distL="0" distR="0" wp14:anchorId="51280D6E" wp14:editId="089821E9">
             <wp:extent cx="3133777" cy="6119999"/>
             <wp:effectExtent l="0" t="0" r="0" b="0"/>
             <wp:docPr id="4" name="Picture 4"/>
@@ -5317,7 +5317,7 @@
           <w:noProof/>
         </w:rPr>
         <w:drawing>
-          <wp:inline distT="0" distB="0" distL="0" distR="0" wp14:anchorId="45D448D3" wp14:editId="7BFA9C4B">
+          <wp:inline distT="0" distB="0" distL="0" distR="0" wp14:anchorId="4F599F2A" wp14:editId="3C3BFEF3">
             <wp:extent cx="3707476" cy="2718262"/>
             <wp:effectExtent l="0" t="0" r="0" b="0"/>
             <wp:docPr id="5" name="Picture 5"/>
@@ -5822,7 +5822,7 @@
       <w:pPr>
         <w:pStyle w:val="21"/>
       </w:pPr>
-      <w:bookmarkStart w:id="9" w:name="_Toc236316661"/>
+      <w:bookmarkStart w:id="9" w:name="_Toc236319894"/>
       <w:r>
         <w:t>2.4. The page grid</w:t>
       </w:r>
@@ -5862,8 +5862,8 @@
           <w:noProof/>
         </w:rPr>
         <w:drawing>
-          <wp:inline distT="0" distB="0" distL="0" distR="0" wp14:anchorId="584ADAB0" wp14:editId="4AB46C13">
-            <wp:extent cx="5760000" cy="4626142"/>
+          <wp:inline distT="0" distB="0" distL="0" distR="0" wp14:anchorId="64B0914F" wp14:editId="64C36627">
+            <wp:extent cx="5760000" cy="4608000"/>
             <wp:effectExtent l="0" t="0" r="0" b="0"/>
             <wp:docPr id="6" name="Picture 6"/>
             <wp:cNvGraphicFramePr>
@@ -5885,7 +5885,7 @@
                   <pic:spPr>
                     <a:xfrm>
                       <a:off x="0" y="0"/>
-                      <a:ext cx="5760000" cy="4626142"/>
+                      <a:ext cx="5760000" cy="4608000"/>
                     </a:xfrm>
                     <a:prstGeom prst="rect">
                       <a:avLst/>
@@ -5926,7 +5926,7 @@
         </w:rPr>
         <w:lastRenderedPageBreak/>
         <w:drawing>
-          <wp:inline distT="0" distB="0" distL="0" distR="0" wp14:anchorId="06A30274" wp14:editId="36A1BEAF">
+          <wp:inline distT="0" distB="0" distL="0" distR="0" wp14:anchorId="3732D9EF" wp14:editId="34DF71A7">
             <wp:extent cx="2543694" cy="1255222"/>
             <wp:effectExtent l="0" t="0" r="0" b="0"/>
             <wp:docPr id="7" name="Picture 7"/>
@@ -5998,7 +5998,7 @@
       <w:pPr>
         <w:pStyle w:val="21"/>
       </w:pPr>
-      <w:bookmarkStart w:id="10" w:name="_Toc236316662"/>
+      <w:bookmarkStart w:id="10" w:name="_Toc236319895"/>
       <w:r>
         <w:t>2.5. Viewing a page full size</w:t>
       </w:r>
@@ -6022,7 +6022,7 @@
         </w:rPr>
         <w:lastRenderedPageBreak/>
         <w:drawing>
-          <wp:inline distT="0" distB="0" distL="0" distR="0" wp14:anchorId="761D0F4C" wp14:editId="53E0BAA3">
+          <wp:inline distT="0" distB="0" distL="0" distR="0" wp14:anchorId="7B17E69C" wp14:editId="5EF6F1CB">
             <wp:extent cx="5338723" cy="6120000"/>
             <wp:effectExtent l="0" t="0" r="0" b="0"/>
             <wp:docPr id="8" name="Picture 8"/>
@@ -6086,7 +6086,7 @@
       <w:pPr>
         <w:pStyle w:val="21"/>
       </w:pPr>
-      <w:bookmarkStart w:id="11" w:name="_Toc236316663"/>
+      <w:bookmarkStart w:id="11" w:name="_Toc236319896"/>
       <w:r>
         <w:t>2.6. Printing</w:t>
       </w:r>
@@ -6106,7 +6106,7 @@
       <w:pPr>
         <w:pStyle w:val="21"/>
       </w:pPr>
-      <w:bookmarkStart w:id="12" w:name="_Toc236316664"/>
+      <w:bookmarkStart w:id="12" w:name="_Toc236319897"/>
       <w:r>
         <w:t>2.7. Making the file smaller (compression)</w:t>
       </w:r>
@@ -6130,8 +6130,8 @@
         </w:rPr>
         <w:lastRenderedPageBreak/>
         <w:drawing>
-          <wp:inline distT="0" distB="0" distL="0" distR="0" wp14:anchorId="6F64EBEF" wp14:editId="0DBC1F2C">
-            <wp:extent cx="5760000" cy="4626142"/>
+          <wp:inline distT="0" distB="0" distL="0" distR="0" wp14:anchorId="42A6F427" wp14:editId="19F15C3B">
+            <wp:extent cx="5760000" cy="4608000"/>
             <wp:effectExtent l="0" t="0" r="0" b="0"/>
             <wp:docPr id="9" name="Picture 9"/>
             <wp:cNvGraphicFramePr>
@@ -6153,7 +6153,7 @@
                   <pic:spPr>
                     <a:xfrm>
                       <a:off x="0" y="0"/>
-                      <a:ext cx="5760000" cy="4626142"/>
+                      <a:ext cx="5760000" cy="4608000"/>
                     </a:xfrm>
                     <a:prstGeom prst="rect">
                       <a:avLst/>
@@ -6443,7 +6443,7 @@
           <w:noProof/>
         </w:rPr>
         <w:drawing>
-          <wp:inline distT="0" distB="0" distL="0" distR="0" wp14:anchorId="05048B78" wp14:editId="1A671BB7">
+          <wp:inline distT="0" distB="0" distL="0" distR="0" wp14:anchorId="5B6BF1AA" wp14:editId="5722E35E">
             <wp:extent cx="5760000" cy="2724324"/>
             <wp:effectExtent l="0" t="0" r="0" b="0"/>
             <wp:docPr id="10" name="Picture 10"/>
@@ -6504,7 +6504,7 @@
       <w:pPr>
         <w:pStyle w:val="21"/>
       </w:pPr>
-      <w:bookmarkStart w:id="13" w:name="_Toc236316665"/>
+      <w:bookmarkStart w:id="13" w:name="_Toc236319898"/>
       <w:r>
         <w:t>2.8. Settings</w:t>
       </w:r>
@@ -6528,7 +6528,7 @@
         </w:rPr>
         <w:lastRenderedPageBreak/>
         <w:drawing>
-          <wp:inline distT="0" distB="0" distL="0" distR="0" wp14:anchorId="009EF9E6" wp14:editId="6DE5ABCB">
+          <wp:inline distT="0" distB="0" distL="0" distR="0" wp14:anchorId="70797A77" wp14:editId="7F5C27F4">
             <wp:extent cx="3873730" cy="4588624"/>
             <wp:effectExtent l="0" t="0" r="0" b="0"/>
             <wp:docPr id="11" name="Picture 11"/>
@@ -6611,7 +6611,7 @@
       <w:pPr>
         <w:pStyle w:val="21"/>
       </w:pPr>
-      <w:bookmarkStart w:id="14" w:name="_Toc236316666"/>
+      <w:bookmarkStart w:id="14" w:name="_Toc236319899"/>
       <w:r>
         <w:t>2.9. Statistics</w:t>
       </w:r>
@@ -6634,7 +6634,7 @@
           <w:noProof/>
         </w:rPr>
         <w:drawing>
-          <wp:inline distT="0" distB="0" distL="0" distR="0" wp14:anchorId="1EFC7047" wp14:editId="556C179A">
+          <wp:inline distT="0" distB="0" distL="0" distR="0" wp14:anchorId="0D75BE3E" wp14:editId="79101B13">
             <wp:extent cx="3707476" cy="4148051"/>
             <wp:effectExtent l="0" t="0" r="0" b="0"/>
             <wp:docPr id="12" name="Picture 12"/>
@@ -6692,7 +6692,7 @@
       <w:pPr>
         <w:pStyle w:val="21"/>
       </w:pPr>
-      <w:bookmarkStart w:id="15" w:name="_Toc236316667"/>
+      <w:bookmarkStart w:id="15" w:name="_Toc236319900"/>
       <w:r>
         <w:t>2.10. What happens to your files</w:t>
       </w:r>
@@ -6716,7 +6716,7 @@
       <w:pPr>
         <w:pStyle w:val="1"/>
       </w:pPr>
-      <w:bookmarkStart w:id="16" w:name="_Toc236316668"/>
+      <w:bookmarkStart w:id="16" w:name="_Toc236319901"/>
       <w:r>
         <w:t>3. Merge PDF</w:t>
       </w:r>
@@ -6726,7 +6726,7 @@
       <w:pPr>
         <w:pStyle w:val="21"/>
       </w:pPr>
-      <w:bookmarkStart w:id="17" w:name="_Toc236316669"/>
+      <w:bookmarkStart w:id="17" w:name="_Toc236319902"/>
       <w:r>
         <w:t>3.1. What it is for</w:t>
       </w:r>
@@ -6746,7 +6746,7 @@
       <w:pPr>
         <w:pStyle w:val="21"/>
       </w:pPr>
-      <w:bookmarkStart w:id="18" w:name="_Toc236316670"/>
+      <w:bookmarkStart w:id="18" w:name="_Toc236319903"/>
       <w:r>
         <w:t>3.2. The window</w:t>
       </w:r>
@@ -6770,7 +6770,7 @@
         </w:rPr>
         <w:lastRenderedPageBreak/>
         <w:drawing>
-          <wp:inline distT="0" distB="0" distL="0" distR="0" wp14:anchorId="2ED2578C" wp14:editId="56755F37">
+          <wp:inline distT="0" distB="0" distL="0" distR="0" wp14:anchorId="79EB9DD6" wp14:editId="5F131759">
             <wp:extent cx="5760000" cy="4608000"/>
             <wp:effectExtent l="0" t="0" r="0" b="0"/>
             <wp:docPr id="13" name="Picture 13"/>
@@ -6820,7 +6820,7 @@
       <w:pPr>
         <w:pStyle w:val="21"/>
       </w:pPr>
-      <w:bookmarkStart w:id="19" w:name="_Toc236316671"/>
+      <w:bookmarkStart w:id="19" w:name="_Toc236319904"/>
       <w:r>
         <w:t>3.3. The order of work</w:t>
       </w:r>
@@ -6877,7 +6877,7 @@
       <w:pPr>
         <w:pStyle w:val="21"/>
       </w:pPr>
-      <w:bookmarkStart w:id="20" w:name="_Toc236316672"/>
+      <w:bookmarkStart w:id="20" w:name="_Toc236319905"/>
       <w:r>
         <w:lastRenderedPageBreak/>
         <w:t>3.4. Double-sided printing: “Add a blank page”</w:t>
@@ -6910,7 +6910,7 @@
       <w:pPr>
         <w:pStyle w:val="21"/>
       </w:pPr>
-      <w:bookmarkStart w:id="21" w:name="_Toc236316673"/>
+      <w:bookmarkStart w:id="21" w:name="_Toc236319906"/>
       <w:r>
         <w:t>3.5. Assembling a double-sided scan</w:t>
       </w:r>
@@ -6934,8 +6934,8 @@
         </w:rPr>
         <w:lastRenderedPageBreak/>
         <w:drawing>
-          <wp:inline distT="0" distB="0" distL="0" distR="0" wp14:anchorId="6FD29426" wp14:editId="7C8A6778">
-            <wp:extent cx="5760000" cy="4626142"/>
+          <wp:inline distT="0" distB="0" distL="0" distR="0" wp14:anchorId="7A738DDD" wp14:editId="3E166400">
+            <wp:extent cx="5760000" cy="4608000"/>
             <wp:effectExtent l="0" t="0" r="0" b="0"/>
             <wp:docPr id="14" name="Picture 14"/>
             <wp:cNvGraphicFramePr>
@@ -6957,7 +6957,7 @@
                   <pic:spPr>
                     <a:xfrm>
                       <a:off x="0" y="0"/>
-                      <a:ext cx="5760000" cy="4626142"/>
+                      <a:ext cx="5760000" cy="4608000"/>
                     </a:xfrm>
                     <a:prstGeom prst="rect">
                       <a:avLst/>
@@ -6992,7 +6992,7 @@
       <w:pPr>
         <w:pStyle w:val="1"/>
       </w:pPr>
-      <w:bookmarkStart w:id="22" w:name="_Toc236316674"/>
+      <w:bookmarkStart w:id="22" w:name="_Toc236319907"/>
       <w:r>
         <w:t>4. Split PDF</w:t>
       </w:r>
@@ -7002,7 +7002,7 @@
       <w:pPr>
         <w:pStyle w:val="21"/>
       </w:pPr>
-      <w:bookmarkStart w:id="23" w:name="_Toc236316675"/>
+      <w:bookmarkStart w:id="23" w:name="_Toc236319908"/>
       <w:r>
         <w:t>4.1. What it is for</w:t>
       </w:r>
@@ -7023,7 +7023,7 @@
       <w:pPr>
         <w:pStyle w:val="21"/>
       </w:pPr>
-      <w:bookmarkStart w:id="24" w:name="_Toc236316676"/>
+      <w:bookmarkStart w:id="24" w:name="_Toc236319909"/>
       <w:r>
         <w:t>4.2. The window</w:t>
       </w:r>
@@ -7046,7 +7046,7 @@
           <w:noProof/>
         </w:rPr>
         <w:drawing>
-          <wp:inline distT="0" distB="0" distL="0" distR="0" wp14:anchorId="64B05590" wp14:editId="5BCF4F9A">
+          <wp:inline distT="0" distB="0" distL="0" distR="0" wp14:anchorId="7C0732A2" wp14:editId="3B2E5A80">
             <wp:extent cx="5760000" cy="4608000"/>
             <wp:effectExtent l="0" t="0" r="0" b="0"/>
             <wp:docPr id="15" name="Picture 15"/>
@@ -7096,7 +7096,7 @@
       <w:pPr>
         <w:pStyle w:val="21"/>
       </w:pPr>
-      <w:bookmarkStart w:id="25" w:name="_Toc236316677"/>
+      <w:bookmarkStart w:id="25" w:name="_Toc236319910"/>
       <w:r>
         <w:t>4.3. The modes of splitting</w:t>
       </w:r>
@@ -7123,8 +7123,8 @@
           <w:noProof/>
         </w:rPr>
         <w:drawing>
-          <wp:inline distT="0" distB="0" distL="0" distR="0" wp14:anchorId="3B2D9C11" wp14:editId="5FC8F8D6">
-            <wp:extent cx="5760000" cy="4626142"/>
+          <wp:inline distT="0" distB="0" distL="0" distR="0" wp14:anchorId="7C52BED5" wp14:editId="0D6FE585">
+            <wp:extent cx="5760000" cy="4608000"/>
             <wp:effectExtent l="0" t="0" r="0" b="0"/>
             <wp:docPr id="16" name="Picture 16"/>
             <wp:cNvGraphicFramePr>
@@ -7146,7 +7146,7 @@
                   <pic:spPr>
                     <a:xfrm>
                       <a:off x="0" y="0"/>
-                      <a:ext cx="5760000" cy="4626142"/>
+                      <a:ext cx="5760000" cy="4608000"/>
                     </a:xfrm>
                     <a:prstGeom prst="rect">
                       <a:avLst/>
@@ -7485,7 +7485,7 @@
           <w:noProof/>
         </w:rPr>
         <w:drawing>
-          <wp:inline distT="0" distB="0" distL="0" distR="0" wp14:anchorId="3BFF2094" wp14:editId="4591AAC0">
+          <wp:inline distT="0" distB="0" distL="0" distR="0" wp14:anchorId="18C4E7C6" wp14:editId="54FC6335">
             <wp:extent cx="5760000" cy="4608000"/>
             <wp:effectExtent l="0" t="0" r="0" b="0"/>
             <wp:docPr id="17" name="Picture 17"/>
@@ -7549,7 +7549,7 @@
         </w:rPr>
         <w:lastRenderedPageBreak/>
         <w:drawing>
-          <wp:inline distT="0" distB="0" distL="0" distR="0" wp14:anchorId="0050718E" wp14:editId="2920F3FC">
+          <wp:inline distT="0" distB="0" distL="0" distR="0" wp14:anchorId="7176BEA5" wp14:editId="737CAA56">
             <wp:extent cx="5760000" cy="4608000"/>
             <wp:effectExtent l="0" t="0" r="0" b="0"/>
             <wp:docPr id="18" name="Picture 18"/>
@@ -7613,7 +7613,7 @@
         </w:rPr>
         <w:lastRenderedPageBreak/>
         <w:drawing>
-          <wp:inline distT="0" distB="0" distL="0" distR="0" wp14:anchorId="703CC224" wp14:editId="65F0E51F">
+          <wp:inline distT="0" distB="0" distL="0" distR="0" wp14:anchorId="109FA2C0" wp14:editId="57335CD1">
             <wp:extent cx="5760000" cy="4608000"/>
             <wp:effectExtent l="0" t="0" r="0" b="0"/>
             <wp:docPr id="19" name="Picture 19"/>
@@ -7663,7 +7663,7 @@
       <w:pPr>
         <w:pStyle w:val="21"/>
       </w:pPr>
-      <w:bookmarkStart w:id="26" w:name="_Toc236316678"/>
+      <w:bookmarkStart w:id="26" w:name="_Toc236319911"/>
       <w:r>
         <w:t>4.4. Naming the parts</w:t>
       </w:r>
@@ -7692,8 +7692,8 @@
         </w:rPr>
         <w:lastRenderedPageBreak/>
         <w:drawing>
-          <wp:inline distT="0" distB="0" distL="0" distR="0" wp14:anchorId="6592D4D0" wp14:editId="4CFB27BF">
-            <wp:extent cx="5760000" cy="4626142"/>
+          <wp:inline distT="0" distB="0" distL="0" distR="0" wp14:anchorId="687C9930" wp14:editId="0F0DA96C">
+            <wp:extent cx="5760000" cy="4608000"/>
             <wp:effectExtent l="0" t="0" r="0" b="0"/>
             <wp:docPr id="20" name="Picture 20"/>
             <wp:cNvGraphicFramePr>
@@ -7715,7 +7715,7 @@
                   <pic:spPr>
                     <a:xfrm>
                       <a:off x="0" y="0"/>
-                      <a:ext cx="5760000" cy="4626142"/>
+                      <a:ext cx="5760000" cy="4608000"/>
                     </a:xfrm>
                     <a:prstGeom prst="rect">
                       <a:avLst/>
@@ -8260,7 +8260,7 @@
       <w:pPr>
         <w:pStyle w:val="21"/>
       </w:pPr>
-      <w:bookmarkStart w:id="27" w:name="_Toc236316679"/>
+      <w:bookmarkStart w:id="27" w:name="_Toc236319912"/>
       <w:r>
         <w:t>4.5. Other operations on the open document</w:t>
       </w:r>
@@ -8275,7 +8275,7 @@
       <w:pPr>
         <w:pStyle w:val="1"/>
       </w:pPr>
-      <w:bookmarkStart w:id="28" w:name="_Toc236316680"/>
+      <w:bookmarkStart w:id="28" w:name="_Toc236319913"/>
       <w:r>
         <w:t>5. More operations</w:t>
       </w:r>
@@ -8285,7 +8285,7 @@
       <w:pPr>
         <w:pStyle w:val="21"/>
       </w:pPr>
-      <w:bookmarkStart w:id="29" w:name="_Toc236316681"/>
+      <w:bookmarkStart w:id="29" w:name="_Toc236319914"/>
       <w:r>
         <w:t>5.1. What it is for</w:t>
       </w:r>
@@ -8314,7 +8314,7 @@
       <w:pPr>
         <w:pStyle w:val="21"/>
       </w:pPr>
-      <w:bookmarkStart w:id="30" w:name="_Toc236316682"/>
+      <w:bookmarkStart w:id="30" w:name="_Toc236319915"/>
       <w:r>
         <w:lastRenderedPageBreak/>
         <w:t>5.2. The window</w:t>
@@ -8338,7 +8338,7 @@
           <w:noProof/>
         </w:rPr>
         <w:drawing>
-          <wp:inline distT="0" distB="0" distL="0" distR="0" wp14:anchorId="5A30B1B6" wp14:editId="191E7F77">
+          <wp:inline distT="0" distB="0" distL="0" distR="0" wp14:anchorId="1A2945B1" wp14:editId="3C634648">
             <wp:extent cx="5760000" cy="4905646"/>
             <wp:effectExtent l="0" t="0" r="0" b="0"/>
             <wp:docPr id="21" name="Picture 21"/>
@@ -8411,7 +8411,7 @@
       <w:pPr>
         <w:pStyle w:val="21"/>
       </w:pPr>
-      <w:bookmarkStart w:id="31" w:name="_Toc236316683"/>
+      <w:bookmarkStart w:id="31" w:name="_Toc236319916"/>
       <w:r>
         <w:t>5.3. Assembling the document</w:t>
       </w:r>
@@ -8454,7 +8454,7 @@
         </w:rPr>
         <w:lastRenderedPageBreak/>
         <w:drawing>
-          <wp:inline distT="0" distB="0" distL="0" distR="0" wp14:anchorId="420CC4BC" wp14:editId="7EE4253A">
+          <wp:inline distT="0" distB="0" distL="0" distR="0" wp14:anchorId="478C0DB9" wp14:editId="62F75CAE">
             <wp:extent cx="5760000" cy="4905646"/>
             <wp:effectExtent l="0" t="0" r="0" b="0"/>
             <wp:docPr id="22" name="Picture 22"/>
@@ -8521,7 +8521,7 @@
       <w:pPr>
         <w:pStyle w:val="21"/>
       </w:pPr>
-      <w:bookmarkStart w:id="32" w:name="_Toc236316684"/>
+      <w:bookmarkStart w:id="32" w:name="_Toc236319917"/>
       <w:r>
         <w:t>5.4. The actions</w:t>
       </w:r>
@@ -8613,8 +8613,8 @@
           <w:noProof/>
         </w:rPr>
         <w:drawing>
-          <wp:inline distT="0" distB="0" distL="0" distR="0" wp14:anchorId="11752679" wp14:editId="5651A1EF">
-            <wp:extent cx="5760000" cy="4921690"/>
+          <wp:inline distT="0" distB="0" distL="0" distR="0" wp14:anchorId="46AB5D52" wp14:editId="3727F206">
+            <wp:extent cx="5760000" cy="4905646"/>
             <wp:effectExtent l="0" t="0" r="0" b="0"/>
             <wp:docPr id="23" name="Picture 23"/>
             <wp:cNvGraphicFramePr>
@@ -8636,7 +8636,7 @@
                   <pic:spPr>
                     <a:xfrm>
                       <a:off x="0" y="0"/>
-                      <a:ext cx="5760000" cy="4921690"/>
+                      <a:ext cx="5760000" cy="4905646"/>
                     </a:xfrm>
                     <a:prstGeom prst="rect">
                       <a:avLst/>
@@ -8717,7 +8717,7 @@
           <w:noProof/>
         </w:rPr>
         <w:drawing>
-          <wp:inline distT="0" distB="0" distL="0" distR="0" wp14:anchorId="14BE2D96" wp14:editId="5EE78C36">
+          <wp:inline distT="0" distB="0" distL="0" distR="0" wp14:anchorId="127CA4DA" wp14:editId="52CCFC69">
             <wp:extent cx="3873730" cy="3474719"/>
             <wp:effectExtent l="0" t="0" r="0" b="0"/>
             <wp:docPr id="24" name="Picture 24"/>
@@ -8784,7 +8784,7 @@
       <w:pPr>
         <w:pStyle w:val="1"/>
       </w:pPr>
-      <w:bookmarkStart w:id="33" w:name="_Toc236316685"/>
+      <w:bookmarkStart w:id="33" w:name="_Toc236319918"/>
       <w:r>
         <w:lastRenderedPageBreak/>
         <w:t>6. PDF → Word</w:t>
@@ -8795,7 +8795,7 @@
       <w:pPr>
         <w:pStyle w:val="21"/>
       </w:pPr>
-      <w:bookmarkStart w:id="34" w:name="_Toc236316686"/>
+      <w:bookmarkStart w:id="34" w:name="_Toc236319919"/>
       <w:r>
         <w:t>6.1. What it is for</w:t>
       </w:r>
@@ -8815,7 +8815,7 @@
       <w:pPr>
         <w:pStyle w:val="21"/>
       </w:pPr>
-      <w:bookmarkStart w:id="35" w:name="_Toc236316687"/>
+      <w:bookmarkStart w:id="35" w:name="_Toc236319920"/>
       <w:r>
         <w:t>6.2. The window</w:t>
       </w:r>
@@ -8839,7 +8839,7 @@
         </w:rPr>
         <w:lastRenderedPageBreak/>
         <w:drawing>
-          <wp:inline distT="0" distB="0" distL="0" distR="0" wp14:anchorId="73FAE0B6" wp14:editId="7A8B91F0">
+          <wp:inline distT="0" distB="0" distL="0" distR="0" wp14:anchorId="1CFC3159" wp14:editId="11FDD7B6">
             <wp:extent cx="5760000" cy="4608000"/>
             <wp:effectExtent l="0" t="0" r="0" b="0"/>
             <wp:docPr id="25" name="Picture 25"/>
@@ -8889,7 +8889,7 @@
       <w:pPr>
         <w:pStyle w:val="21"/>
       </w:pPr>
-      <w:bookmarkStart w:id="36" w:name="_Toc236316688"/>
+      <w:bookmarkStart w:id="36" w:name="_Toc236319921"/>
       <w:r>
         <w:t>6.3. The order of work</w:t>
       </w:r>
@@ -8944,7 +8944,7 @@
       <w:pPr>
         <w:pStyle w:val="21"/>
       </w:pPr>
-      <w:bookmarkStart w:id="37" w:name="_Toc236316689"/>
+      <w:bookmarkStart w:id="37" w:name="_Toc236319922"/>
       <w:r>
         <w:t>6.4. What comes across and what does not</w:t>
       </w:r>
@@ -9020,7 +9020,7 @@
       <w:pPr>
         <w:pStyle w:val="1"/>
       </w:pPr>
-      <w:bookmarkStart w:id="38" w:name="_Toc236316690"/>
+      <w:bookmarkStart w:id="38" w:name="_Toc236319923"/>
       <w:r>
         <w:t>7. PDF → PowerPoint</w:t>
       </w:r>
@@ -9030,7 +9030,7 @@
       <w:pPr>
         <w:pStyle w:val="21"/>
       </w:pPr>
-      <w:bookmarkStart w:id="39" w:name="_Toc236316691"/>
+      <w:bookmarkStart w:id="39" w:name="_Toc236319924"/>
       <w:r>
         <w:t>7.1. What it is for</w:t>
       </w:r>
@@ -9065,7 +9065,7 @@
       <w:pPr>
         <w:pStyle w:val="21"/>
       </w:pPr>
-      <w:bookmarkStart w:id="40" w:name="_Toc236316692"/>
+      <w:bookmarkStart w:id="40" w:name="_Toc236319925"/>
       <w:r>
         <w:t>7.2. How a slide is built</w:t>
       </w:r>
@@ -9102,7 +9102,7 @@
       <w:pPr>
         <w:pStyle w:val="21"/>
       </w:pPr>
-      <w:bookmarkStart w:id="41" w:name="_Toc236316693"/>
+      <w:bookmarkStart w:id="41" w:name="_Toc236319926"/>
       <w:r>
         <w:t>7.3. The window</w:t>
       </w:r>
@@ -9126,7 +9126,7 @@
         </w:rPr>
         <w:lastRenderedPageBreak/>
         <w:drawing>
-          <wp:inline distT="0" distB="0" distL="0" distR="0" wp14:anchorId="576A8CB6" wp14:editId="2DA50AF1">
+          <wp:inline distT="0" distB="0" distL="0" distR="0" wp14:anchorId="52491351" wp14:editId="5876FF17">
             <wp:extent cx="5760000" cy="4608000"/>
             <wp:effectExtent l="0" t="0" r="0" b="0"/>
             <wp:docPr id="26" name="Picture 26"/>
@@ -9176,7 +9176,7 @@
       <w:pPr>
         <w:pStyle w:val="21"/>
       </w:pPr>
-      <w:bookmarkStart w:id="42" w:name="_Toc236316694"/>
+      <w:bookmarkStart w:id="42" w:name="_Toc236319927"/>
       <w:r>
         <w:t>7.4. The order of work</w:t>
       </w:r>
@@ -9230,7 +9230,7 @@
       <w:pPr>
         <w:pStyle w:val="21"/>
       </w:pPr>
-      <w:bookmarkStart w:id="43" w:name="_Toc236316695"/>
+      <w:bookmarkStart w:id="43" w:name="_Toc236319928"/>
       <w:r>
         <w:lastRenderedPageBreak/>
         <w:t>7.5. What comes across</w:t>
@@ -9251,7 +9251,7 @@
       <w:pPr>
         <w:pStyle w:val="21"/>
       </w:pPr>
-      <w:bookmarkStart w:id="44" w:name="_Toc236316696"/>
+      <w:bookmarkStart w:id="44" w:name="_Toc236319929"/>
       <w:r>
         <w:t>7.6. What not to expect</w:t>
       </w:r>
@@ -9306,7 +9306,7 @@
       <w:pPr>
         <w:pStyle w:val="1"/>
       </w:pPr>
-      <w:bookmarkStart w:id="45" w:name="_Toc236316697"/>
+      <w:bookmarkStart w:id="45" w:name="_Toc236319930"/>
       <w:r>
         <w:t>8. Merge Excel</w:t>
       </w:r>
@@ -9316,7 +9316,7 @@
       <w:pPr>
         <w:pStyle w:val="21"/>
       </w:pPr>
-      <w:bookmarkStart w:id="46" w:name="_Toc236316698"/>
+      <w:bookmarkStart w:id="46" w:name="_Toc236319931"/>
       <w:r>
         <w:t>8.1. What it is for</w:t>
       </w:r>
@@ -9340,7 +9340,7 @@
       <w:pPr>
         <w:pStyle w:val="21"/>
       </w:pPr>
-      <w:bookmarkStart w:id="47" w:name="_Toc236316699"/>
+      <w:bookmarkStart w:id="47" w:name="_Toc236319932"/>
       <w:r>
         <w:t>8.2. The window</w:t>
       </w:r>
@@ -9363,7 +9363,7 @@
           <w:noProof/>
         </w:rPr>
         <w:drawing>
-          <wp:inline distT="0" distB="0" distL="0" distR="0" wp14:anchorId="2FA19DD0" wp14:editId="662FFB5E">
+          <wp:inline distT="0" distB="0" distL="0" distR="0" wp14:anchorId="6824E813" wp14:editId="6AE80F1F">
             <wp:extent cx="5760000" cy="4250667"/>
             <wp:effectExtent l="0" t="0" r="0" b="0"/>
             <wp:docPr id="27" name="Picture 27"/>
@@ -9413,7 +9413,7 @@
       <w:pPr>
         <w:pStyle w:val="21"/>
       </w:pPr>
-      <w:bookmarkStart w:id="48" w:name="_Toc236316700"/>
+      <w:bookmarkStart w:id="48" w:name="_Toc236319933"/>
       <w:r>
         <w:t xml:space="preserve">8.3. The </w:t>
       </w:r>
@@ -9471,7 +9471,7 @@
       <w:pPr>
         <w:pStyle w:val="21"/>
       </w:pPr>
-      <w:bookmarkStart w:id="49" w:name="_Toc236316701"/>
+      <w:bookmarkStart w:id="49" w:name="_Toc236319934"/>
       <w:r>
         <w:t>8.4. The options</w:t>
       </w:r>
@@ -9523,7 +9523,7 @@
       <w:pPr>
         <w:pStyle w:val="21"/>
       </w:pPr>
-      <w:bookmarkStart w:id="50" w:name="_Toc236316702"/>
+      <w:bookmarkStart w:id="50" w:name="_Toc236319935"/>
       <w:r>
         <w:t>8.5. The result, the report and the cover note</w:t>
       </w:r>
@@ -9555,7 +9555,7 @@
       <w:pPr>
         <w:pStyle w:val="21"/>
       </w:pPr>
-      <w:bookmarkStart w:id="51" w:name="_Toc236316703"/>
+      <w:bookmarkStart w:id="51" w:name="_Toc236319936"/>
       <w:r>
         <w:t>8.6. The Menu of the tool</w:t>
       </w:r>
@@ -9581,8 +9581,8 @@
           <w:noProof/>
         </w:rPr>
         <w:drawing>
-          <wp:inline distT="0" distB="0" distL="0" distR="0" wp14:anchorId="59CB37F0" wp14:editId="642DD684">
-            <wp:extent cx="5760000" cy="4272701"/>
+          <wp:inline distT="0" distB="0" distL="0" distR="0" wp14:anchorId="6398F984" wp14:editId="7EA93476">
+            <wp:extent cx="5760000" cy="4250667"/>
             <wp:effectExtent l="0" t="0" r="0" b="0"/>
             <wp:docPr id="28" name="Picture 28"/>
             <wp:cNvGraphicFramePr>
@@ -9604,7 +9604,7 @@
                   <pic:spPr>
                     <a:xfrm>
                       <a:off x="0" y="0"/>
-                      <a:ext cx="5760000" cy="4272701"/>
+                      <a:ext cx="5760000" cy="4250667"/>
                     </a:xfrm>
                     <a:prstGeom prst="rect">
                       <a:avLst/>
@@ -9648,7 +9648,7 @@
       <w:pPr>
         <w:pStyle w:val="1"/>
       </w:pPr>
-      <w:bookmarkStart w:id="52" w:name="_Toc236316704"/>
+      <w:bookmarkStart w:id="52" w:name="_Toc236319937"/>
       <w:r>
         <w:lastRenderedPageBreak/>
         <w:t>9. Reference</w:t>
@@ -9659,7 +9659,7 @@
       <w:pPr>
         <w:pStyle w:val="21"/>
       </w:pPr>
-      <w:bookmarkStart w:id="53" w:name="_Toc236316705"/>
+      <w:bookmarkStart w:id="53" w:name="_Toc236319938"/>
       <w:r>
         <w:t>9.1. About the program</w:t>
       </w:r>
@@ -9682,7 +9682,7 @@
           <w:noProof/>
         </w:rPr>
         <w:drawing>
-          <wp:inline distT="0" distB="0" distL="0" distR="0" wp14:anchorId="4D8B681C" wp14:editId="7825D20F">
+          <wp:inline distT="0" distB="0" distL="0" distR="0" wp14:anchorId="3C4E8835" wp14:editId="2BCC1E1D">
             <wp:extent cx="3873730" cy="3940232"/>
             <wp:effectExtent l="0" t="0" r="0" b="0"/>
             <wp:docPr id="29" name="Picture 29"/>
@@ -9748,7 +9748,7 @@
       <w:pPr>
         <w:pStyle w:val="21"/>
       </w:pPr>
-      <w:bookmarkStart w:id="54" w:name="_Toc236316706"/>
+      <w:bookmarkStart w:id="54" w:name="_Toc236319939"/>
       <w:r>
         <w:lastRenderedPageBreak/>
         <w:t>9.2. If something went wrong</w:t>
@@ -10158,7 +10158,7 @@
       <w:pPr>
         <w:pStyle w:val="21"/>
       </w:pPr>
-      <w:bookmarkStart w:id="55" w:name="_Toc236316707"/>
+      <w:bookmarkStart w:id="55" w:name="_Toc236319940"/>
       <w:r>
         <w:t>9.3. A short reminder</w:t>
       </w:r>
@@ -10665,31 +10665,31 @@
       </w:rPr>
     </w:lvl>
   </w:abstractNum>
-  <w:num w:numId="1" w16cid:durableId="511264011">
+  <w:num w:numId="1" w16cid:durableId="341007002">
     <w:abstractNumId w:val="8"/>
   </w:num>
-  <w:num w:numId="2" w16cid:durableId="1200319447">
+  <w:num w:numId="2" w16cid:durableId="482162370">
     <w:abstractNumId w:val="6"/>
   </w:num>
-  <w:num w:numId="3" w16cid:durableId="1686127631">
+  <w:num w:numId="3" w16cid:durableId="308825021">
     <w:abstractNumId w:val="5"/>
   </w:num>
-  <w:num w:numId="4" w16cid:durableId="1717124309">
+  <w:num w:numId="4" w16cid:durableId="1493251704">
     <w:abstractNumId w:val="4"/>
   </w:num>
-  <w:num w:numId="5" w16cid:durableId="483395726">
+  <w:num w:numId="5" w16cid:durableId="1056702768">
     <w:abstractNumId w:val="7"/>
   </w:num>
-  <w:num w:numId="6" w16cid:durableId="522328076">
+  <w:num w:numId="6" w16cid:durableId="634139847">
     <w:abstractNumId w:val="3"/>
   </w:num>
-  <w:num w:numId="7" w16cid:durableId="1284313101">
+  <w:num w:numId="7" w16cid:durableId="966622168">
     <w:abstractNumId w:val="2"/>
   </w:num>
-  <w:num w:numId="8" w16cid:durableId="401608306">
+  <w:num w:numId="8" w16cid:durableId="108742836">
     <w:abstractNumId w:val="1"/>
   </w:num>
-  <w:num w:numId="9" w16cid:durableId="1835412441">
+  <w:num w:numId="9" w16cid:durableId="1078745398">
     <w:abstractNumId w:val="0"/>
   </w:num>
 </w:numbering>
@@ -22128,7 +22128,7 @@
     <w:autoRedefine/>
     <w:uiPriority w:val="39"/>
     <w:unhideWhenUsed/>
-    <w:rsid w:val="00A03AB5"/>
+    <w:rsid w:val="009D0C60"/>
     <w:pPr>
       <w:spacing w:after="100"/>
     </w:pPr>
@@ -22140,7 +22140,7 @@
     <w:autoRedefine/>
     <w:uiPriority w:val="39"/>
     <w:unhideWhenUsed/>
-    <w:rsid w:val="00A03AB5"/>
+    <w:rsid w:val="009D0C60"/>
     <w:pPr>
       <w:spacing w:after="100"/>
       <w:ind w:left="280"/>
@@ -22151,7 +22151,7 @@
     <w:basedOn w:val="a2"/>
     <w:uiPriority w:val="99"/>
     <w:unhideWhenUsed/>
-    <w:rsid w:val="00A03AB5"/>
+    <w:rsid w:val="009D0C60"/>
     <w:rPr>
       <w:color w:val="0000FF" w:themeColor="hyperlink"/>
       <w:u w:val="single"/>

</xml_diff>

<commit_message>
Add bilingual release notes to update notification and update manuals
- Update notification now shows localized 'what's new' summary extracted from GitHub release body
- Changed checkbox text to 'Don't ask again' while keeping per-version skip behavior
- Added bilingual [RU]/[EN] markers to CHANGELOG.md for version 1.18.4
- Updated manual screenshots: compression chart (4 levels), metadata dialog, About window
- Both manuals rebuilt with corrected figures and current version info

Co-Authored-By: Claude Opus 5 <noreply@anthropic.com>
</commit_message>
<xml_diff>
--- a/docs/User manual.docx
+++ b/docs/User manual.docx
@@ -120,7 +120,7 @@
       <w:r>
         <w:fldChar w:fldCharType="separate"/>
       </w:r>
-      <w:hyperlink w:anchor="_Toc237174821" w:history="1">
+      <w:hyperlink w:anchor="_Toc237262373" w:history="1">
         <w:r>
           <w:rPr>
             <w:rStyle w:val="aff8"/>
@@ -148,7 +148,7 @@
             <w:noProof/>
             <w:webHidden/>
           </w:rPr>
-          <w:instrText xml:space="preserve"> PAGEREF _Toc237174821 \h </w:instrText>
+          <w:instrText xml:space="preserve"> PAGEREF _Toc237262373 \h </w:instrText>
         </w:r>
         <w:r>
           <w:rPr>
@@ -195,7 +195,7 @@
           <w14:ligatures w14:val="standardContextual"/>
         </w:rPr>
       </w:pPr>
-      <w:hyperlink w:anchor="_Toc237174822" w:history="1">
+      <w:hyperlink w:anchor="_Toc237262374" w:history="1">
         <w:r>
           <w:rPr>
             <w:rStyle w:val="aff8"/>
@@ -223,7 +223,7 @@
             <w:noProof/>
             <w:webHidden/>
           </w:rPr>
-          <w:instrText xml:space="preserve"> PAGEREF _Toc237174822 \h </w:instrText>
+          <w:instrText xml:space="preserve"> PAGEREF _Toc237262374 \h </w:instrText>
         </w:r>
         <w:r>
           <w:rPr>
@@ -270,7 +270,7 @@
           <w14:ligatures w14:val="standardContextual"/>
         </w:rPr>
       </w:pPr>
-      <w:hyperlink w:anchor="_Toc237174823" w:history="1">
+      <w:hyperlink w:anchor="_Toc237262375" w:history="1">
         <w:r>
           <w:rPr>
             <w:rStyle w:val="aff8"/>
@@ -298,7 +298,7 @@
             <w:noProof/>
             <w:webHidden/>
           </w:rPr>
-          <w:instrText xml:space="preserve"> PAGEREF _Toc237174823 \h </w:instrText>
+          <w:instrText xml:space="preserve"> PAGEREF _Toc237262375 \h </w:instrText>
         </w:r>
         <w:r>
           <w:rPr>
@@ -345,7 +345,7 @@
           <w14:ligatures w14:val="standardContextual"/>
         </w:rPr>
       </w:pPr>
-      <w:hyperlink w:anchor="_Toc237174824" w:history="1">
+      <w:hyperlink w:anchor="_Toc237262376" w:history="1">
         <w:r>
           <w:rPr>
             <w:rStyle w:val="aff8"/>
@@ -373,7 +373,7 @@
             <w:noProof/>
             <w:webHidden/>
           </w:rPr>
-          <w:instrText xml:space="preserve"> PAGEREF _Toc237174824 \h </w:instrText>
+          <w:instrText xml:space="preserve"> PAGEREF _Toc237262376 \h </w:instrText>
         </w:r>
         <w:r>
           <w:rPr>
@@ -420,7 +420,7 @@
           <w14:ligatures w14:val="standardContextual"/>
         </w:rPr>
       </w:pPr>
-      <w:hyperlink w:anchor="_Toc237174825" w:history="1">
+      <w:hyperlink w:anchor="_Toc237262377" w:history="1">
         <w:r>
           <w:rPr>
             <w:rStyle w:val="aff8"/>
@@ -448,7 +448,7 @@
             <w:noProof/>
             <w:webHidden/>
           </w:rPr>
-          <w:instrText xml:space="preserve"> PAGEREF _Toc237174825 \h </w:instrText>
+          <w:instrText xml:space="preserve"> PAGEREF _Toc237262377 \h </w:instrText>
         </w:r>
         <w:r>
           <w:rPr>
@@ -495,7 +495,7 @@
           <w14:ligatures w14:val="standardContextual"/>
         </w:rPr>
       </w:pPr>
-      <w:hyperlink w:anchor="_Toc237174826" w:history="1">
+      <w:hyperlink w:anchor="_Toc237262378" w:history="1">
         <w:r>
           <w:rPr>
             <w:rStyle w:val="aff8"/>
@@ -523,7 +523,7 @@
             <w:noProof/>
             <w:webHidden/>
           </w:rPr>
-          <w:instrText xml:space="preserve"> PAGEREF _Toc237174826 \h </w:instrText>
+          <w:instrText xml:space="preserve"> PAGEREF _Toc237262378 \h </w:instrText>
         </w:r>
         <w:r>
           <w:rPr>
@@ -570,7 +570,7 @@
           <w14:ligatures w14:val="standardContextual"/>
         </w:rPr>
       </w:pPr>
-      <w:hyperlink w:anchor="_Toc237174827" w:history="1">
+      <w:hyperlink w:anchor="_Toc237262379" w:history="1">
         <w:r>
           <w:rPr>
             <w:rStyle w:val="aff8"/>
@@ -598,7 +598,7 @@
             <w:noProof/>
             <w:webHidden/>
           </w:rPr>
-          <w:instrText xml:space="preserve"> PAGEREF _Toc237174827 \h </w:instrText>
+          <w:instrText xml:space="preserve"> PAGEREF _Toc237262379 \h </w:instrText>
         </w:r>
         <w:r>
           <w:rPr>
@@ -645,7 +645,7 @@
           <w14:ligatures w14:val="standardContextual"/>
         </w:rPr>
       </w:pPr>
-      <w:hyperlink w:anchor="_Toc237174828" w:history="1">
+      <w:hyperlink w:anchor="_Toc237262380" w:history="1">
         <w:r>
           <w:rPr>
             <w:rStyle w:val="aff8"/>
@@ -673,7 +673,7 @@
             <w:noProof/>
             <w:webHidden/>
           </w:rPr>
-          <w:instrText xml:space="preserve"> PAGEREF _Toc237174828 \h </w:instrText>
+          <w:instrText xml:space="preserve"> PAGEREF _Toc237262380 \h </w:instrText>
         </w:r>
         <w:r>
           <w:rPr>
@@ -720,7 +720,7 @@
           <w14:ligatures w14:val="standardContextual"/>
         </w:rPr>
       </w:pPr>
-      <w:hyperlink w:anchor="_Toc237174829" w:history="1">
+      <w:hyperlink w:anchor="_Toc237262381" w:history="1">
         <w:r>
           <w:rPr>
             <w:rStyle w:val="aff8"/>
@@ -748,7 +748,7 @@
             <w:noProof/>
             <w:webHidden/>
           </w:rPr>
-          <w:instrText xml:space="preserve"> PAGEREF _Toc237174829 \h </w:instrText>
+          <w:instrText xml:space="preserve"> PAGEREF _Toc237262381 \h </w:instrText>
         </w:r>
         <w:r>
           <w:rPr>
@@ -795,7 +795,7 @@
           <w14:ligatures w14:val="standardContextual"/>
         </w:rPr>
       </w:pPr>
-      <w:hyperlink w:anchor="_Toc237174830" w:history="1">
+      <w:hyperlink w:anchor="_Toc237262382" w:history="1">
         <w:r>
           <w:rPr>
             <w:rStyle w:val="aff8"/>
@@ -823,7 +823,7 @@
             <w:noProof/>
             <w:webHidden/>
           </w:rPr>
-          <w:instrText xml:space="preserve"> PAGEREF _Toc237174830 \h </w:instrText>
+          <w:instrText xml:space="preserve"> PAGEREF _Toc237262382 \h </w:instrText>
         </w:r>
         <w:r>
           <w:rPr>
@@ -843,7 +843,7 @@
             <w:noProof/>
             <w:webHidden/>
           </w:rPr>
-          <w:t>12</w:t>
+          <w:t>13</w:t>
         </w:r>
         <w:r>
           <w:rPr>
@@ -870,7 +870,7 @@
           <w14:ligatures w14:val="standardContextual"/>
         </w:rPr>
       </w:pPr>
-      <w:hyperlink w:anchor="_Toc237174831" w:history="1">
+      <w:hyperlink w:anchor="_Toc237262383" w:history="1">
         <w:r>
           <w:rPr>
             <w:rStyle w:val="aff8"/>
@@ -898,7 +898,7 @@
             <w:noProof/>
             <w:webHidden/>
           </w:rPr>
-          <w:instrText xml:space="preserve"> PAGEREF _Toc237174831 \h </w:instrText>
+          <w:instrText xml:space="preserve"> PAGEREF _Toc237262383 \h </w:instrText>
         </w:r>
         <w:r>
           <w:rPr>
@@ -918,7 +918,7 @@
             <w:noProof/>
             <w:webHidden/>
           </w:rPr>
-          <w:t>14</w:t>
+          <w:t>15</w:t>
         </w:r>
         <w:r>
           <w:rPr>
@@ -945,7 +945,7 @@
           <w14:ligatures w14:val="standardContextual"/>
         </w:rPr>
       </w:pPr>
-      <w:hyperlink w:anchor="_Toc237174832" w:history="1">
+      <w:hyperlink w:anchor="_Toc237262384" w:history="1">
         <w:r>
           <w:rPr>
             <w:rStyle w:val="aff8"/>
@@ -973,7 +973,7 @@
             <w:noProof/>
             <w:webHidden/>
           </w:rPr>
-          <w:instrText xml:space="preserve"> PAGEREF _Toc237174832 \h </w:instrText>
+          <w:instrText xml:space="preserve"> PAGEREF _Toc237262384 \h </w:instrText>
         </w:r>
         <w:r>
           <w:rPr>
@@ -1020,7 +1020,7 @@
           <w14:ligatures w14:val="standardContextual"/>
         </w:rPr>
       </w:pPr>
-      <w:hyperlink w:anchor="_Toc237174833" w:history="1">
+      <w:hyperlink w:anchor="_Toc237262385" w:history="1">
         <w:r>
           <w:rPr>
             <w:rStyle w:val="aff8"/>
@@ -1048,7 +1048,7 @@
             <w:noProof/>
             <w:webHidden/>
           </w:rPr>
-          <w:instrText xml:space="preserve"> PAGEREF _Toc237174833 \h </w:instrText>
+          <w:instrText xml:space="preserve"> PAGEREF _Toc237262385 \h </w:instrText>
         </w:r>
         <w:r>
           <w:rPr>
@@ -1095,7 +1095,7 @@
           <w14:ligatures w14:val="standardContextual"/>
         </w:rPr>
       </w:pPr>
-      <w:hyperlink w:anchor="_Toc237174834" w:history="1">
+      <w:hyperlink w:anchor="_Toc237262386" w:history="1">
         <w:r>
           <w:rPr>
             <w:rStyle w:val="aff8"/>
@@ -1123,7 +1123,7 @@
             <w:noProof/>
             <w:webHidden/>
           </w:rPr>
-          <w:instrText xml:space="preserve"> PAGEREF _Toc237174834 \h </w:instrText>
+          <w:instrText xml:space="preserve"> PAGEREF _Toc237262386 \h </w:instrText>
         </w:r>
         <w:r>
           <w:rPr>
@@ -1170,7 +1170,7 @@
           <w14:ligatures w14:val="standardContextual"/>
         </w:rPr>
       </w:pPr>
-      <w:hyperlink w:anchor="_Toc237174835" w:history="1">
+      <w:hyperlink w:anchor="_Toc237262387" w:history="1">
         <w:r>
           <w:rPr>
             <w:rStyle w:val="aff8"/>
@@ -1198,7 +1198,7 @@
             <w:noProof/>
             <w:webHidden/>
           </w:rPr>
-          <w:instrText xml:space="preserve"> PAGEREF _Toc237174835 \h </w:instrText>
+          <w:instrText xml:space="preserve"> PAGEREF _Toc237262387 \h </w:instrText>
         </w:r>
         <w:r>
           <w:rPr>
@@ -1245,7 +1245,7 @@
           <w14:ligatures w14:val="standardContextual"/>
         </w:rPr>
       </w:pPr>
-      <w:hyperlink w:anchor="_Toc237174836" w:history="1">
+      <w:hyperlink w:anchor="_Toc237262388" w:history="1">
         <w:r>
           <w:rPr>
             <w:rStyle w:val="aff8"/>
@@ -1273,7 +1273,7 @@
             <w:noProof/>
             <w:webHidden/>
           </w:rPr>
-          <w:instrText xml:space="preserve"> PAGEREF _Toc237174836 \h </w:instrText>
+          <w:instrText xml:space="preserve"> PAGEREF _Toc237262388 \h </w:instrText>
         </w:r>
         <w:r>
           <w:rPr>
@@ -1320,7 +1320,7 @@
           <w14:ligatures w14:val="standardContextual"/>
         </w:rPr>
       </w:pPr>
-      <w:hyperlink w:anchor="_Toc237174837" w:history="1">
+      <w:hyperlink w:anchor="_Toc237262389" w:history="1">
         <w:r>
           <w:rPr>
             <w:rStyle w:val="aff8"/>
@@ -1348,7 +1348,7 @@
             <w:noProof/>
             <w:webHidden/>
           </w:rPr>
-          <w:instrText xml:space="preserve"> PAGEREF _Toc237174837 \h </w:instrText>
+          <w:instrText xml:space="preserve"> PAGEREF _Toc237262389 \h </w:instrText>
         </w:r>
         <w:r>
           <w:rPr>
@@ -1395,7 +1395,7 @@
           <w14:ligatures w14:val="standardContextual"/>
         </w:rPr>
       </w:pPr>
-      <w:hyperlink w:anchor="_Toc237174838" w:history="1">
+      <w:hyperlink w:anchor="_Toc237262390" w:history="1">
         <w:r>
           <w:rPr>
             <w:rStyle w:val="aff8"/>
@@ -1423,7 +1423,7 @@
             <w:noProof/>
             <w:webHidden/>
           </w:rPr>
-          <w:instrText xml:space="preserve"> PAGEREF _Toc237174838 \h </w:instrText>
+          <w:instrText xml:space="preserve"> PAGEREF _Toc237262390 \h </w:instrText>
         </w:r>
         <w:r>
           <w:rPr>
@@ -1470,7 +1470,7 @@
           <w14:ligatures w14:val="standardContextual"/>
         </w:rPr>
       </w:pPr>
-      <w:hyperlink w:anchor="_Toc237174839" w:history="1">
+      <w:hyperlink w:anchor="_Toc237262391" w:history="1">
         <w:r>
           <w:rPr>
             <w:rStyle w:val="aff8"/>
@@ -1498,7 +1498,7 @@
             <w:noProof/>
             <w:webHidden/>
           </w:rPr>
-          <w:instrText xml:space="preserve"> PAGEREF _Toc237174839 \h </w:instrText>
+          <w:instrText xml:space="preserve"> PAGEREF _Toc237262391 \h </w:instrText>
         </w:r>
         <w:r>
           <w:rPr>
@@ -1545,7 +1545,7 @@
           <w14:ligatures w14:val="standardContextual"/>
         </w:rPr>
       </w:pPr>
-      <w:hyperlink w:anchor="_Toc237174840" w:history="1">
+      <w:hyperlink w:anchor="_Toc237262392" w:history="1">
         <w:r>
           <w:rPr>
             <w:rStyle w:val="aff8"/>
@@ -1573,7 +1573,7 @@
             <w:noProof/>
             <w:webHidden/>
           </w:rPr>
-          <w:instrText xml:space="preserve"> PAGEREF _Toc237174840 \h </w:instrText>
+          <w:instrText xml:space="preserve"> PAGEREF _Toc237262392 \h </w:instrText>
         </w:r>
         <w:r>
           <w:rPr>
@@ -1620,7 +1620,7 @@
           <w14:ligatures w14:val="standardContextual"/>
         </w:rPr>
       </w:pPr>
-      <w:hyperlink w:anchor="_Toc237174841" w:history="1">
+      <w:hyperlink w:anchor="_Toc237262393" w:history="1">
         <w:r>
           <w:rPr>
             <w:rStyle w:val="aff8"/>
@@ -1648,7 +1648,7 @@
             <w:noProof/>
             <w:webHidden/>
           </w:rPr>
-          <w:instrText xml:space="preserve"> PAGEREF _Toc237174841 \h </w:instrText>
+          <w:instrText xml:space="preserve"> PAGEREF _Toc237262393 \h </w:instrText>
         </w:r>
         <w:r>
           <w:rPr>
@@ -1695,7 +1695,7 @@
           <w14:ligatures w14:val="standardContextual"/>
         </w:rPr>
       </w:pPr>
-      <w:hyperlink w:anchor="_Toc237174842" w:history="1">
+      <w:hyperlink w:anchor="_Toc237262394" w:history="1">
         <w:r>
           <w:rPr>
             <w:rStyle w:val="aff8"/>
@@ -1723,7 +1723,7 @@
             <w:noProof/>
             <w:webHidden/>
           </w:rPr>
-          <w:instrText xml:space="preserve"> PAGEREF _Toc237174842 \h </w:instrText>
+          <w:instrText xml:space="preserve"> PAGEREF _Toc237262394 \h </w:instrText>
         </w:r>
         <w:r>
           <w:rPr>
@@ -1770,7 +1770,7 @@
           <w14:ligatures w14:val="standardContextual"/>
         </w:rPr>
       </w:pPr>
-      <w:hyperlink w:anchor="_Toc237174843" w:history="1">
+      <w:hyperlink w:anchor="_Toc237262395" w:history="1">
         <w:r>
           <w:rPr>
             <w:rStyle w:val="aff8"/>
@@ -1798,7 +1798,7 @@
             <w:noProof/>
             <w:webHidden/>
           </w:rPr>
-          <w:instrText xml:space="preserve"> PAGEREF _Toc237174843 \h </w:instrText>
+          <w:instrText xml:space="preserve"> PAGEREF _Toc237262395 \h </w:instrText>
         </w:r>
         <w:r>
           <w:rPr>
@@ -1845,7 +1845,7 @@
           <w14:ligatures w14:val="standardContextual"/>
         </w:rPr>
       </w:pPr>
-      <w:hyperlink w:anchor="_Toc237174844" w:history="1">
+      <w:hyperlink w:anchor="_Toc237262396" w:history="1">
         <w:r>
           <w:rPr>
             <w:rStyle w:val="aff8"/>
@@ -1873,7 +1873,7 @@
             <w:noProof/>
             <w:webHidden/>
           </w:rPr>
-          <w:instrText xml:space="preserve"> PAGEREF _Toc237174844 \h </w:instrText>
+          <w:instrText xml:space="preserve"> PAGEREF _Toc237262396 \h </w:instrText>
         </w:r>
         <w:r>
           <w:rPr>
@@ -1920,7 +1920,7 @@
           <w14:ligatures w14:val="standardContextual"/>
         </w:rPr>
       </w:pPr>
-      <w:hyperlink w:anchor="_Toc237174845" w:history="1">
+      <w:hyperlink w:anchor="_Toc237262397" w:history="1">
         <w:r>
           <w:rPr>
             <w:rStyle w:val="aff8"/>
@@ -1948,7 +1948,7 @@
             <w:noProof/>
             <w:webHidden/>
           </w:rPr>
-          <w:instrText xml:space="preserve"> PAGEREF _Toc237174845 \h </w:instrText>
+          <w:instrText xml:space="preserve"> PAGEREF _Toc237262397 \h </w:instrText>
         </w:r>
         <w:r>
           <w:rPr>
@@ -1995,7 +1995,7 @@
           <w14:ligatures w14:val="standardContextual"/>
         </w:rPr>
       </w:pPr>
-      <w:hyperlink w:anchor="_Toc237174846" w:history="1">
+      <w:hyperlink w:anchor="_Toc237262398" w:history="1">
         <w:r>
           <w:rPr>
             <w:rStyle w:val="aff8"/>
@@ -2023,7 +2023,7 @@
             <w:noProof/>
             <w:webHidden/>
           </w:rPr>
-          <w:instrText xml:space="preserve"> PAGEREF _Toc237174846 \h </w:instrText>
+          <w:instrText xml:space="preserve"> PAGEREF _Toc237262398 \h </w:instrText>
         </w:r>
         <w:r>
           <w:rPr>
@@ -2070,7 +2070,7 @@
           <w14:ligatures w14:val="standardContextual"/>
         </w:rPr>
       </w:pPr>
-      <w:hyperlink w:anchor="_Toc237174847" w:history="1">
+      <w:hyperlink w:anchor="_Toc237262399" w:history="1">
         <w:r>
           <w:rPr>
             <w:rStyle w:val="aff8"/>
@@ -2098,7 +2098,7 @@
             <w:noProof/>
             <w:webHidden/>
           </w:rPr>
-          <w:instrText xml:space="preserve"> PAGEREF _Toc237174847 \h </w:instrText>
+          <w:instrText xml:space="preserve"> PAGEREF _Toc237262399 \h </w:instrText>
         </w:r>
         <w:r>
           <w:rPr>
@@ -2145,7 +2145,7 @@
           <w14:ligatures w14:val="standardContextual"/>
         </w:rPr>
       </w:pPr>
-      <w:hyperlink w:anchor="_Toc237174848" w:history="1">
+      <w:hyperlink w:anchor="_Toc237262400" w:history="1">
         <w:r>
           <w:rPr>
             <w:rStyle w:val="aff8"/>
@@ -2173,7 +2173,7 @@
             <w:noProof/>
             <w:webHidden/>
           </w:rPr>
-          <w:instrText xml:space="preserve"> PAGEREF _Toc237174848 \h </w:instrText>
+          <w:instrText xml:space="preserve"> PAGEREF _Toc237262400 \h </w:instrText>
         </w:r>
         <w:r>
           <w:rPr>
@@ -2220,7 +2220,7 @@
           <w14:ligatures w14:val="standardContextual"/>
         </w:rPr>
       </w:pPr>
-      <w:hyperlink w:anchor="_Toc237174849" w:history="1">
+      <w:hyperlink w:anchor="_Toc237262401" w:history="1">
         <w:r>
           <w:rPr>
             <w:rStyle w:val="aff8"/>
@@ -2248,7 +2248,7 @@
             <w:noProof/>
             <w:webHidden/>
           </w:rPr>
-          <w:instrText xml:space="preserve"> PAGEREF _Toc237174849 \h </w:instrText>
+          <w:instrText xml:space="preserve"> PAGEREF _Toc237262401 \h </w:instrText>
         </w:r>
         <w:r>
           <w:rPr>
@@ -2295,7 +2295,7 @@
           <w14:ligatures w14:val="standardContextual"/>
         </w:rPr>
       </w:pPr>
-      <w:hyperlink w:anchor="_Toc237174850" w:history="1">
+      <w:hyperlink w:anchor="_Toc237262402" w:history="1">
         <w:r>
           <w:rPr>
             <w:rStyle w:val="aff8"/>
@@ -2323,7 +2323,7 @@
             <w:noProof/>
             <w:webHidden/>
           </w:rPr>
-          <w:instrText xml:space="preserve"> PAGEREF _Toc237174850 \h </w:instrText>
+          <w:instrText xml:space="preserve"> PAGEREF _Toc237262402 \h </w:instrText>
         </w:r>
         <w:r>
           <w:rPr>
@@ -2370,7 +2370,7 @@
           <w14:ligatures w14:val="standardContextual"/>
         </w:rPr>
       </w:pPr>
-      <w:hyperlink w:anchor="_Toc237174851" w:history="1">
+      <w:hyperlink w:anchor="_Toc237262403" w:history="1">
         <w:r>
           <w:rPr>
             <w:rStyle w:val="aff8"/>
@@ -2398,7 +2398,7 @@
             <w:noProof/>
             <w:webHidden/>
           </w:rPr>
-          <w:instrText xml:space="preserve"> PAGEREF _Toc237174851 \h </w:instrText>
+          <w:instrText xml:space="preserve"> PAGEREF _Toc237262403 \h </w:instrText>
         </w:r>
         <w:r>
           <w:rPr>
@@ -2445,7 +2445,7 @@
           <w14:ligatures w14:val="standardContextual"/>
         </w:rPr>
       </w:pPr>
-      <w:hyperlink w:anchor="_Toc237174852" w:history="1">
+      <w:hyperlink w:anchor="_Toc237262404" w:history="1">
         <w:r>
           <w:rPr>
             <w:rStyle w:val="aff8"/>
@@ -2473,7 +2473,7 @@
             <w:noProof/>
             <w:webHidden/>
           </w:rPr>
-          <w:instrText xml:space="preserve"> PAGEREF _Toc237174852 \h </w:instrText>
+          <w:instrText xml:space="preserve"> PAGEREF _Toc237262404 \h </w:instrText>
         </w:r>
         <w:r>
           <w:rPr>
@@ -2520,7 +2520,7 @@
           <w14:ligatures w14:val="standardContextual"/>
         </w:rPr>
       </w:pPr>
-      <w:hyperlink w:anchor="_Toc237174853" w:history="1">
+      <w:hyperlink w:anchor="_Toc237262405" w:history="1">
         <w:r>
           <w:rPr>
             <w:rStyle w:val="aff8"/>
@@ -2548,7 +2548,7 @@
             <w:noProof/>
             <w:webHidden/>
           </w:rPr>
-          <w:instrText xml:space="preserve"> PAGEREF _Toc237174853 \h </w:instrText>
+          <w:instrText xml:space="preserve"> PAGEREF _Toc237262405 \h </w:instrText>
         </w:r>
         <w:r>
           <w:rPr>
@@ -2595,7 +2595,7 @@
           <w14:ligatures w14:val="standardContextual"/>
         </w:rPr>
       </w:pPr>
-      <w:hyperlink w:anchor="_Toc237174854" w:history="1">
+      <w:hyperlink w:anchor="_Toc237262406" w:history="1">
         <w:r>
           <w:rPr>
             <w:rStyle w:val="aff8"/>
@@ -2623,7 +2623,7 @@
             <w:noProof/>
             <w:webHidden/>
           </w:rPr>
-          <w:instrText xml:space="preserve"> PAGEREF _Toc237174854 \h </w:instrText>
+          <w:instrText xml:space="preserve"> PAGEREF _Toc237262406 \h </w:instrText>
         </w:r>
         <w:r>
           <w:rPr>
@@ -2670,7 +2670,7 @@
           <w14:ligatures w14:val="standardContextual"/>
         </w:rPr>
       </w:pPr>
-      <w:hyperlink w:anchor="_Toc237174855" w:history="1">
+      <w:hyperlink w:anchor="_Toc237262407" w:history="1">
         <w:r>
           <w:rPr>
             <w:rStyle w:val="aff8"/>
@@ -2698,7 +2698,7 @@
             <w:noProof/>
             <w:webHidden/>
           </w:rPr>
-          <w:instrText xml:space="preserve"> PAGEREF _Toc237174855 \h </w:instrText>
+          <w:instrText xml:space="preserve"> PAGEREF _Toc237262407 \h </w:instrText>
         </w:r>
         <w:r>
           <w:rPr>
@@ -2745,7 +2745,7 @@
           <w14:ligatures w14:val="standardContextual"/>
         </w:rPr>
       </w:pPr>
-      <w:hyperlink w:anchor="_Toc237174856" w:history="1">
+      <w:hyperlink w:anchor="_Toc237262408" w:history="1">
         <w:r>
           <w:rPr>
             <w:rStyle w:val="aff8"/>
@@ -2773,7 +2773,7 @@
             <w:noProof/>
             <w:webHidden/>
           </w:rPr>
-          <w:instrText xml:space="preserve"> PAGEREF _Toc237174856 \h </w:instrText>
+          <w:instrText xml:space="preserve"> PAGEREF _Toc237262408 \h </w:instrText>
         </w:r>
         <w:r>
           <w:rPr>
@@ -2793,7 +2793,7 @@
             <w:noProof/>
             <w:webHidden/>
           </w:rPr>
-          <w:t>37</w:t>
+          <w:t>38</w:t>
         </w:r>
         <w:r>
           <w:rPr>
@@ -2820,7 +2820,7 @@
           <w14:ligatures w14:val="standardContextual"/>
         </w:rPr>
       </w:pPr>
-      <w:hyperlink w:anchor="_Toc237174857" w:history="1">
+      <w:hyperlink w:anchor="_Toc237262409" w:history="1">
         <w:r>
           <w:rPr>
             <w:rStyle w:val="aff8"/>
@@ -2848,7 +2848,7 @@
             <w:noProof/>
             <w:webHidden/>
           </w:rPr>
-          <w:instrText xml:space="preserve"> PAGEREF _Toc237174857 \h </w:instrText>
+          <w:instrText xml:space="preserve"> PAGEREF _Toc237262409 \h </w:instrText>
         </w:r>
         <w:r>
           <w:rPr>
@@ -2895,7 +2895,7 @@
           <w14:ligatures w14:val="standardContextual"/>
         </w:rPr>
       </w:pPr>
-      <w:hyperlink w:anchor="_Toc237174858" w:history="1">
+      <w:hyperlink w:anchor="_Toc237262410" w:history="1">
         <w:r>
           <w:rPr>
             <w:rStyle w:val="aff8"/>
@@ -2923,7 +2923,7 @@
             <w:noProof/>
             <w:webHidden/>
           </w:rPr>
-          <w:instrText xml:space="preserve"> PAGEREF _Toc237174858 \h </w:instrText>
+          <w:instrText xml:space="preserve"> PAGEREF _Toc237262410 \h </w:instrText>
         </w:r>
         <w:r>
           <w:rPr>
@@ -2970,7 +2970,7 @@
           <w14:ligatures w14:val="standardContextual"/>
         </w:rPr>
       </w:pPr>
-      <w:hyperlink w:anchor="_Toc237174859" w:history="1">
+      <w:hyperlink w:anchor="_Toc237262411" w:history="1">
         <w:r>
           <w:rPr>
             <w:rStyle w:val="aff8"/>
@@ -2998,7 +2998,7 @@
             <w:noProof/>
             <w:webHidden/>
           </w:rPr>
-          <w:instrText xml:space="preserve"> PAGEREF _Toc237174859 \h </w:instrText>
+          <w:instrText xml:space="preserve"> PAGEREF _Toc237262411 \h </w:instrText>
         </w:r>
         <w:r>
           <w:rPr>
@@ -3045,7 +3045,7 @@
           <w14:ligatures w14:val="standardContextual"/>
         </w:rPr>
       </w:pPr>
-      <w:hyperlink w:anchor="_Toc237174860" w:history="1">
+      <w:hyperlink w:anchor="_Toc237262412" w:history="1">
         <w:r>
           <w:rPr>
             <w:rStyle w:val="aff8"/>
@@ -3073,7 +3073,7 @@
             <w:noProof/>
             <w:webHidden/>
           </w:rPr>
-          <w:instrText xml:space="preserve"> PAGEREF _Toc237174860 \h </w:instrText>
+          <w:instrText xml:space="preserve"> PAGEREF _Toc237262412 \h </w:instrText>
         </w:r>
         <w:r>
           <w:rPr>
@@ -3120,7 +3120,7 @@
           <w14:ligatures w14:val="standardContextual"/>
         </w:rPr>
       </w:pPr>
-      <w:hyperlink w:anchor="_Toc237174861" w:history="1">
+      <w:hyperlink w:anchor="_Toc237262413" w:history="1">
         <w:r>
           <w:rPr>
             <w:rStyle w:val="aff8"/>
@@ -3148,7 +3148,7 @@
             <w:noProof/>
             <w:webHidden/>
           </w:rPr>
-          <w:instrText xml:space="preserve"> PAGEREF _Toc237174861 \h </w:instrText>
+          <w:instrText xml:space="preserve"> PAGEREF _Toc237262413 \h </w:instrText>
         </w:r>
         <w:r>
           <w:rPr>
@@ -3195,7 +3195,7 @@
           <w14:ligatures w14:val="standardContextual"/>
         </w:rPr>
       </w:pPr>
-      <w:hyperlink w:anchor="_Toc237174862" w:history="1">
+      <w:hyperlink w:anchor="_Toc237262414" w:history="1">
         <w:r>
           <w:rPr>
             <w:rStyle w:val="aff8"/>
@@ -3223,7 +3223,7 @@
             <w:noProof/>
             <w:webHidden/>
           </w:rPr>
-          <w:instrText xml:space="preserve"> PAGEREF _Toc237174862 \h </w:instrText>
+          <w:instrText xml:space="preserve"> PAGEREF _Toc237262414 \h </w:instrText>
         </w:r>
         <w:r>
           <w:rPr>
@@ -3270,7 +3270,7 @@
           <w14:ligatures w14:val="standardContextual"/>
         </w:rPr>
       </w:pPr>
-      <w:hyperlink w:anchor="_Toc237174863" w:history="1">
+      <w:hyperlink w:anchor="_Toc237262415" w:history="1">
         <w:r>
           <w:rPr>
             <w:rStyle w:val="aff8"/>
@@ -3298,7 +3298,7 @@
             <w:noProof/>
             <w:webHidden/>
           </w:rPr>
-          <w:instrText xml:space="preserve"> PAGEREF _Toc237174863 \h </w:instrText>
+          <w:instrText xml:space="preserve"> PAGEREF _Toc237262415 \h </w:instrText>
         </w:r>
         <w:r>
           <w:rPr>
@@ -3345,7 +3345,7 @@
           <w14:ligatures w14:val="standardContextual"/>
         </w:rPr>
       </w:pPr>
-      <w:hyperlink w:anchor="_Toc237174864" w:history="1">
+      <w:hyperlink w:anchor="_Toc237262416" w:history="1">
         <w:r>
           <w:rPr>
             <w:rStyle w:val="aff8"/>
@@ -3373,7 +3373,7 @@
             <w:noProof/>
             <w:webHidden/>
           </w:rPr>
-          <w:instrText xml:space="preserve"> PAGEREF _Toc237174864 \h </w:instrText>
+          <w:instrText xml:space="preserve"> PAGEREF _Toc237262416 \h </w:instrText>
         </w:r>
         <w:r>
           <w:rPr>
@@ -3420,7 +3420,7 @@
           <w14:ligatures w14:val="standardContextual"/>
         </w:rPr>
       </w:pPr>
-      <w:hyperlink w:anchor="_Toc237174865" w:history="1">
+      <w:hyperlink w:anchor="_Toc237262417" w:history="1">
         <w:r>
           <w:rPr>
             <w:rStyle w:val="aff8"/>
@@ -3448,7 +3448,7 @@
             <w:noProof/>
             <w:webHidden/>
           </w:rPr>
-          <w:instrText xml:space="preserve"> PAGEREF _Toc237174865 \h </w:instrText>
+          <w:instrText xml:space="preserve"> PAGEREF _Toc237262417 \h </w:instrText>
         </w:r>
         <w:r>
           <w:rPr>
@@ -3495,7 +3495,7 @@
           <w14:ligatures w14:val="standardContextual"/>
         </w:rPr>
       </w:pPr>
-      <w:hyperlink w:anchor="_Toc237174866" w:history="1">
+      <w:hyperlink w:anchor="_Toc237262418" w:history="1">
         <w:r>
           <w:rPr>
             <w:rStyle w:val="aff8"/>
@@ -3523,7 +3523,7 @@
             <w:noProof/>
             <w:webHidden/>
           </w:rPr>
-          <w:instrText xml:space="preserve"> PAGEREF _Toc237174866 \h </w:instrText>
+          <w:instrText xml:space="preserve"> PAGEREF _Toc237262418 \h </w:instrText>
         </w:r>
         <w:r>
           <w:rPr>
@@ -3570,7 +3570,7 @@
           <w14:ligatures w14:val="standardContextual"/>
         </w:rPr>
       </w:pPr>
-      <w:hyperlink w:anchor="_Toc237174867" w:history="1">
+      <w:hyperlink w:anchor="_Toc237262419" w:history="1">
         <w:r>
           <w:rPr>
             <w:rStyle w:val="aff8"/>
@@ -3598,7 +3598,7 @@
             <w:noProof/>
             <w:webHidden/>
           </w:rPr>
-          <w:instrText xml:space="preserve"> PAGEREF _Toc237174867 \h </w:instrText>
+          <w:instrText xml:space="preserve"> PAGEREF _Toc237262419 \h </w:instrText>
         </w:r>
         <w:r>
           <w:rPr>
@@ -3645,7 +3645,7 @@
           <w14:ligatures w14:val="standardContextual"/>
         </w:rPr>
       </w:pPr>
-      <w:hyperlink w:anchor="_Toc237174868" w:history="1">
+      <w:hyperlink w:anchor="_Toc237262420" w:history="1">
         <w:r>
           <w:rPr>
             <w:rStyle w:val="aff8"/>
@@ -3673,7 +3673,7 @@
             <w:noProof/>
             <w:webHidden/>
           </w:rPr>
-          <w:instrText xml:space="preserve"> PAGEREF _Toc237174868 \h </w:instrText>
+          <w:instrText xml:space="preserve"> PAGEREF _Toc237262420 \h </w:instrText>
         </w:r>
         <w:r>
           <w:rPr>
@@ -3720,7 +3720,7 @@
           <w14:ligatures w14:val="standardContextual"/>
         </w:rPr>
       </w:pPr>
-      <w:hyperlink w:anchor="_Toc237174869" w:history="1">
+      <w:hyperlink w:anchor="_Toc237262421" w:history="1">
         <w:r>
           <w:rPr>
             <w:rStyle w:val="aff8"/>
@@ -3748,7 +3748,7 @@
             <w:noProof/>
             <w:webHidden/>
           </w:rPr>
-          <w:instrText xml:space="preserve"> PAGEREF _Toc237174869 \h </w:instrText>
+          <w:instrText xml:space="preserve"> PAGEREF _Toc237262421 \h </w:instrText>
         </w:r>
         <w:r>
           <w:rPr>
@@ -3795,7 +3795,7 @@
           <w14:ligatures w14:val="standardContextual"/>
         </w:rPr>
       </w:pPr>
-      <w:hyperlink w:anchor="_Toc237174870" w:history="1">
+      <w:hyperlink w:anchor="_Toc237262422" w:history="1">
         <w:r>
           <w:rPr>
             <w:rStyle w:val="aff8"/>
@@ -3823,7 +3823,7 @@
             <w:noProof/>
             <w:webHidden/>
           </w:rPr>
-          <w:instrText xml:space="preserve"> PAGEREF _Toc237174870 \h </w:instrText>
+          <w:instrText xml:space="preserve"> PAGEREF _Toc237262422 \h </w:instrText>
         </w:r>
         <w:r>
           <w:rPr>
@@ -3870,7 +3870,7 @@
           <w14:ligatures w14:val="standardContextual"/>
         </w:rPr>
       </w:pPr>
-      <w:hyperlink w:anchor="_Toc237174871" w:history="1">
+      <w:hyperlink w:anchor="_Toc237262423" w:history="1">
         <w:r>
           <w:rPr>
             <w:rStyle w:val="aff8"/>
@@ -3898,7 +3898,7 @@
             <w:noProof/>
             <w:webHidden/>
           </w:rPr>
-          <w:instrText xml:space="preserve"> PAGEREF _Toc237174871 \h </w:instrText>
+          <w:instrText xml:space="preserve"> PAGEREF _Toc237262423 \h </w:instrText>
         </w:r>
         <w:r>
           <w:rPr>
@@ -3945,7 +3945,7 @@
           <w14:ligatures w14:val="standardContextual"/>
         </w:rPr>
       </w:pPr>
-      <w:hyperlink w:anchor="_Toc237174872" w:history="1">
+      <w:hyperlink w:anchor="_Toc237262424" w:history="1">
         <w:r>
           <w:rPr>
             <w:rStyle w:val="aff8"/>
@@ -3973,7 +3973,7 @@
             <w:noProof/>
             <w:webHidden/>
           </w:rPr>
-          <w:instrText xml:space="preserve"> PAGEREF _Toc237174872 \h </w:instrText>
+          <w:instrText xml:space="preserve"> PAGEREF _Toc237262424 \h </w:instrText>
         </w:r>
         <w:r>
           <w:rPr>
@@ -4020,7 +4020,7 @@
           <w14:ligatures w14:val="standardContextual"/>
         </w:rPr>
       </w:pPr>
-      <w:hyperlink w:anchor="_Toc237174873" w:history="1">
+      <w:hyperlink w:anchor="_Toc237262425" w:history="1">
         <w:r>
           <w:rPr>
             <w:rStyle w:val="aff8"/>
@@ -4048,7 +4048,7 @@
             <w:noProof/>
             <w:webHidden/>
           </w:rPr>
-          <w:instrText xml:space="preserve"> PAGEREF _Toc237174873 \h </w:instrText>
+          <w:instrText xml:space="preserve"> PAGEREF _Toc237262425 \h </w:instrText>
         </w:r>
         <w:r>
           <w:rPr>
@@ -4095,7 +4095,7 @@
           <w14:ligatures w14:val="standardContextual"/>
         </w:rPr>
       </w:pPr>
-      <w:hyperlink w:anchor="_Toc237174874" w:history="1">
+      <w:hyperlink w:anchor="_Toc237262426" w:history="1">
         <w:r>
           <w:rPr>
             <w:rStyle w:val="aff8"/>
@@ -4123,7 +4123,7 @@
             <w:noProof/>
             <w:webHidden/>
           </w:rPr>
-          <w:instrText xml:space="preserve"> PAGEREF _Toc237174874 \h </w:instrText>
+          <w:instrText xml:space="preserve"> PAGEREF _Toc237262426 \h </w:instrText>
         </w:r>
         <w:r>
           <w:rPr>
@@ -4170,7 +4170,7 @@
           <w14:ligatures w14:val="standardContextual"/>
         </w:rPr>
       </w:pPr>
-      <w:hyperlink w:anchor="_Toc237174875" w:history="1">
+      <w:hyperlink w:anchor="_Toc237262427" w:history="1">
         <w:r>
           <w:rPr>
             <w:rStyle w:val="aff8"/>
@@ -4198,7 +4198,7 @@
             <w:noProof/>
             <w:webHidden/>
           </w:rPr>
-          <w:instrText xml:space="preserve"> PAGEREF _Toc237174875 \h </w:instrText>
+          <w:instrText xml:space="preserve"> PAGEREF _Toc237262427 \h </w:instrText>
         </w:r>
         <w:r>
           <w:rPr>
@@ -4245,7 +4245,7 @@
           <w14:ligatures w14:val="standardContextual"/>
         </w:rPr>
       </w:pPr>
-      <w:hyperlink w:anchor="_Toc237174876" w:history="1">
+      <w:hyperlink w:anchor="_Toc237262428" w:history="1">
         <w:r>
           <w:rPr>
             <w:rStyle w:val="aff8"/>
@@ -4273,7 +4273,7 @@
             <w:noProof/>
             <w:webHidden/>
           </w:rPr>
-          <w:instrText xml:space="preserve"> PAGEREF _Toc237174876 \h </w:instrText>
+          <w:instrText xml:space="preserve"> PAGEREF _Toc237262428 \h </w:instrText>
         </w:r>
         <w:r>
           <w:rPr>
@@ -4321,7 +4321,7 @@
       <w:pPr>
         <w:pStyle w:val="1"/>
       </w:pPr>
-      <w:bookmarkStart w:id="0" w:name="_Toc237174821"/>
+      <w:bookmarkStart w:id="0" w:name="_Toc237262373"/>
       <w:r>
         <w:lastRenderedPageBreak/>
         <w:t>1. About the program</w:t>
@@ -4332,7 +4332,7 @@
       <w:pPr>
         <w:pStyle w:val="21"/>
       </w:pPr>
-      <w:bookmarkStart w:id="1" w:name="_Toc237174822"/>
+      <w:bookmarkStart w:id="1" w:name="_Toc237262374"/>
       <w:r>
         <w:t>1.1. What it is for</w:t>
       </w:r>
@@ -4755,7 +4755,7 @@
       <w:pPr>
         <w:pStyle w:val="21"/>
       </w:pPr>
-      <w:bookmarkStart w:id="2" w:name="_Toc237174823"/>
+      <w:bookmarkStart w:id="2" w:name="_Toc237262375"/>
       <w:r>
         <w:t>1.2. What the program gives you</w:t>
       </w:r>
@@ -4840,7 +4840,7 @@
       <w:pPr>
         <w:pStyle w:val="21"/>
       </w:pPr>
-      <w:bookmarkStart w:id="3" w:name="_Toc237174824"/>
+      <w:bookmarkStart w:id="3" w:name="_Toc237262376"/>
       <w:r>
         <w:t>1.3. What the workplace needs</w:t>
       </w:r>
@@ -4870,7 +4870,7 @@
       <w:pPr>
         <w:pStyle w:val="21"/>
       </w:pPr>
-      <w:bookmarkStart w:id="4" w:name="_Toc237174825"/>
+      <w:bookmarkStart w:id="4" w:name="_Toc237262377"/>
       <w:r>
         <w:t>1.4. Installing, starting and updating</w:t>
       </w:r>
@@ -4946,7 +4946,7 @@
       <w:pPr>
         <w:pStyle w:val="1"/>
       </w:pPr>
-      <w:bookmarkStart w:id="5" w:name="_Toc237174826"/>
+      <w:bookmarkStart w:id="5" w:name="_Toc237262378"/>
       <w:r>
         <w:lastRenderedPageBreak/>
         <w:t>2. How working with the program is arranged</w:t>
@@ -4957,7 +4957,7 @@
       <w:pPr>
         <w:pStyle w:val="21"/>
       </w:pPr>
-      <w:bookmarkStart w:id="6" w:name="_Toc237174827"/>
+      <w:bookmarkStart w:id="6" w:name="_Toc237262379"/>
       <w:r>
         <w:t>2.1. The start screen</w:t>
       </w:r>
@@ -4983,7 +4983,7 @@
           <w:noProof/>
         </w:rPr>
         <w:drawing>
-          <wp:inline distT="0" distB="0" distL="0" distR="0" wp14:anchorId="1C1C201A" wp14:editId="7E0851CB">
+          <wp:inline distT="0" distB="0" distL="0" distR="0" wp14:anchorId="40CC3BEA" wp14:editId="762364B5">
             <wp:extent cx="5760000" cy="5127111"/>
             <wp:effectExtent l="0" t="0" r="0" b="0"/>
             <wp:docPr id="1" name="Picture 1"/>
@@ -5047,7 +5047,7 @@
         </w:rPr>
         <w:lastRenderedPageBreak/>
         <w:drawing>
-          <wp:inline distT="0" distB="0" distL="0" distR="0" wp14:anchorId="2036DC79" wp14:editId="73B4CE05">
+          <wp:inline distT="0" distB="0" distL="0" distR="0" wp14:anchorId="46DB78C0" wp14:editId="6CB44779">
             <wp:extent cx="5760000" cy="5127111"/>
             <wp:effectExtent l="0" t="0" r="0" b="0"/>
             <wp:docPr id="2" name="Picture 2"/>
@@ -5134,7 +5134,7 @@
       <w:pPr>
         <w:pStyle w:val="21"/>
       </w:pPr>
-      <w:bookmarkStart w:id="7" w:name="_Toc237174828"/>
+      <w:bookmarkStart w:id="7" w:name="_Toc237262380"/>
       <w:r>
         <w:t>2.2. The language of the interface</w:t>
       </w:r>
@@ -5157,7 +5157,7 @@
           <w:noProof/>
         </w:rPr>
         <w:drawing>
-          <wp:inline distT="0" distB="0" distL="0" distR="0" wp14:anchorId="7A507B44" wp14:editId="7C95DDCE">
+          <wp:inline distT="0" distB="0" distL="0" distR="0" wp14:anchorId="5B26D21C" wp14:editId="7B575E66">
             <wp:extent cx="5760000" cy="5127111"/>
             <wp:effectExtent l="0" t="0" r="0" b="0"/>
             <wp:docPr id="3" name="Picture 3"/>
@@ -5230,7 +5230,7 @@
       <w:pPr>
         <w:pStyle w:val="21"/>
       </w:pPr>
-      <w:bookmarkStart w:id="8" w:name="_Toc237174829"/>
+      <w:bookmarkStart w:id="8" w:name="_Toc237262381"/>
       <w:r>
         <w:t>2.3. The built-in help</w:t>
       </w:r>
@@ -5253,7 +5253,7 @@
           <w:noProof/>
         </w:rPr>
         <w:drawing>
-          <wp:inline distT="0" distB="0" distL="0" distR="0" wp14:anchorId="1C6B1CA7" wp14:editId="5436ED09">
+          <wp:inline distT="0" distB="0" distL="0" distR="0" wp14:anchorId="61CD7447" wp14:editId="21F2A023">
             <wp:extent cx="3133777" cy="6119999"/>
             <wp:effectExtent l="0" t="0" r="0" b="0"/>
             <wp:docPr id="4" name="Picture 4"/>
@@ -5317,8 +5317,8 @@
           <w:noProof/>
         </w:rPr>
         <w:drawing>
-          <wp:inline distT="0" distB="0" distL="0" distR="0" wp14:anchorId="5A305F37" wp14:editId="0CC19EDE">
-            <wp:extent cx="3707476" cy="2718262"/>
+          <wp:inline distT="0" distB="0" distL="0" distR="0" wp14:anchorId="73F6181B" wp14:editId="4307C942">
+            <wp:extent cx="3707476" cy="2859578"/>
             <wp:effectExtent l="0" t="0" r="0" b="0"/>
             <wp:docPr id="5" name="Picture 5"/>
             <wp:cNvGraphicFramePr>
@@ -5340,7 +5340,7 @@
                   <pic:spPr>
                     <a:xfrm>
                       <a:off x="0" y="0"/>
-                      <a:ext cx="3707476" cy="2718262"/>
+                      <a:ext cx="3707476" cy="2859578"/>
                     </a:xfrm>
                     <a:prstGeom prst="rect">
                       <a:avLst/>
@@ -5892,8 +5892,9 @@
       <w:pPr>
         <w:pStyle w:val="21"/>
       </w:pPr>
-      <w:bookmarkStart w:id="9" w:name="_Toc237174830"/>
-      <w:r>
+      <w:bookmarkStart w:id="9" w:name="_Toc237262382"/>
+      <w:r>
+        <w:lastRenderedPageBreak/>
         <w:t>2.4. The page grid</w:t>
       </w:r>
       <w:bookmarkEnd w:id="9"/>
@@ -5903,11 +5904,7 @@
         <w:t xml:space="preserve">All the PDF </w:t>
       </w:r>
       <w:r>
-        <w:t xml:space="preserve">tools are built around the same grid of thumbnails. Learn it once and you can work with every one of them. The only difference is what the grid lets </w:t>
-      </w:r>
-      <w:r>
-        <w:lastRenderedPageBreak/>
-        <w:t>you do: in merging and in the conversions the pages are also reordered, while in splitting and in the other operations they are only selected, because the order does not change there.</w:t>
+        <w:t>tools are built around the same grid of thumbnails. Learn it once and you can work with every one of them. The only difference is what the grid lets you do: in merging and in the conversions the pages are also reordered, while in splitting and in the other operations they are only selected, because the order does not change there.</w:t>
       </w:r>
     </w:p>
     <w:p>
@@ -5931,8 +5928,9 @@
         <w:rPr>
           <w:noProof/>
         </w:rPr>
+        <w:lastRenderedPageBreak/>
         <w:drawing>
-          <wp:inline distT="0" distB="0" distL="0" distR="0" wp14:anchorId="7AF874F9" wp14:editId="28AC7BDB">
+          <wp:inline distT="0" distB="0" distL="0" distR="0" wp14:anchorId="1CC0AFC9" wp14:editId="27247E73">
             <wp:extent cx="5760000" cy="4608000"/>
             <wp:effectExtent l="0" t="0" r="0" b="0"/>
             <wp:docPr id="6" name="Picture 6"/>
@@ -5980,7 +5978,6 @@
     </w:p>
     <w:p>
       <w:r>
-        <w:lastRenderedPageBreak/>
         <w:t>“Go to page…” (Ctrl + G) is useful in thick documents: instead of scrolling, name the number and the grid scrolls to that page and selects it (fig. 7).</w:t>
       </w:r>
     </w:p>
@@ -5996,7 +5993,7 @@
           <w:noProof/>
         </w:rPr>
         <w:drawing>
-          <wp:inline distT="0" distB="0" distL="0" distR="0" wp14:anchorId="7C183CB9" wp14:editId="48DE7FF0">
+          <wp:inline distT="0" distB="0" distL="0" distR="0" wp14:anchorId="3E13BFBE" wp14:editId="16AFBE2F">
             <wp:extent cx="2543694" cy="1255222"/>
             <wp:effectExtent l="0" t="0" r="0" b="0"/>
             <wp:docPr id="7" name="Picture 7"/>
@@ -6068,8 +6065,9 @@
       <w:pPr>
         <w:pStyle w:val="21"/>
       </w:pPr>
-      <w:bookmarkStart w:id="10" w:name="_Toc237174831"/>
-      <w:r>
+      <w:bookmarkStart w:id="10" w:name="_Toc237262383"/>
+      <w:r>
+        <w:lastRenderedPageBreak/>
         <w:t>2.5. Viewing a page full size</w:t>
       </w:r>
       <w:bookmarkEnd w:id="10"/>
@@ -6090,9 +6088,8 @@
         <w:rPr>
           <w:noProof/>
         </w:rPr>
-        <w:lastRenderedPageBreak/>
         <w:drawing>
-          <wp:inline distT="0" distB="0" distL="0" distR="0" wp14:anchorId="1ADF0869" wp14:editId="79525F09">
+          <wp:inline distT="0" distB="0" distL="0" distR="0" wp14:anchorId="6F1FC299" wp14:editId="30796A42">
             <wp:extent cx="5338723" cy="6120000"/>
             <wp:effectExtent l="0" t="0" r="0" b="0"/>
             <wp:docPr id="8" name="Picture 8"/>
@@ -6143,23 +6140,23 @@
         <w:t xml:space="preserve">The </w:t>
       </w:r>
       <w:r>
-        <w:t>viewer has a magnifier: the “−” and “+” buttons, a box with the current zoom, a “Fit” button and Ctrl + mouse wheel. When zooming with the wheel the point under the pointer stays put — what grows is what you are looking at. Once the page no longer fits the window it can be moved with the mouse, “taken by hand”.</w:t>
-      </w:r>
-    </w:p>
-    <w:p>
-      <w:r>
-        <w:t xml:space="preserve">A right click offers rotation right and left and a “Print” button. A rotation made here applies to the page in the grid and is undone by the same Ctrl + Z. The </w:t>
+        <w:t xml:space="preserve">viewer has a magnifier: the “−” and “+” buttons, a box with the current zoom, a “Fit” button and Ctrl + mouse wheel. When zooming with the wheel the point under the pointer stays put — what grows is what you are looking at. Once </w:t>
       </w:r>
       <w:r>
         <w:lastRenderedPageBreak/>
-        <w:t>viewer minimises to the taskbar like any other window and closes with Esc or the cross.</w:t>
+        <w:t>the page no longer fits the window it can be moved with the mouse, “taken by hand”.</w:t>
+      </w:r>
+    </w:p>
+    <w:p>
+      <w:r>
+        <w:t>A right click offers rotation right and left and a “Print” button. A rotation made here applies to the page in the grid and is undone by the same Ctrl + Z. The viewer minimises to the taskbar like any other window and closes with Esc or the cross.</w:t>
       </w:r>
     </w:p>
     <w:p>
       <w:pPr>
         <w:pStyle w:val="21"/>
       </w:pPr>
-      <w:bookmarkStart w:id="11" w:name="_Toc237174832"/>
+      <w:bookmarkStart w:id="11" w:name="_Toc237262384"/>
       <w:r>
         <w:t>2.6. Printing</w:t>
       </w:r>
@@ -6179,7 +6176,7 @@
       <w:pPr>
         <w:pStyle w:val="21"/>
       </w:pPr>
-      <w:bookmarkStart w:id="12" w:name="_Toc237174833"/>
+      <w:bookmarkStart w:id="12" w:name="_Toc237262385"/>
       <w:r>
         <w:t>2.7. Making the file smaller (compression)</w:t>
       </w:r>
@@ -6203,7 +6200,7 @@
         </w:rPr>
         <w:lastRenderedPageBreak/>
         <w:drawing>
-          <wp:inline distT="0" distB="0" distL="0" distR="0" wp14:anchorId="6814D3A1" wp14:editId="0207AEF8">
+          <wp:inline distT="0" distB="0" distL="0" distR="0" wp14:anchorId="3CEE376D" wp14:editId="19D11516">
             <wp:extent cx="5760000" cy="4608000"/>
             <wp:effectExtent l="0" t="0" r="0" b="0"/>
             <wp:docPr id="9" name="Picture 9"/>
@@ -6402,6 +6399,59 @@
               <w:jc w:val="left"/>
             </w:pPr>
             <w:r>
+              <w:t>Very good — smaller without losing sharpness</w:t>
+            </w:r>
+          </w:p>
+        </w:tc>
+        <w:tc>
+          <w:tcPr>
+            <w:tcW w:w="2835" w:type="dxa"/>
+          </w:tcPr>
+          <w:p>
+            <w:pPr>
+              <w:spacing w:line="240" w:lineRule="auto"/>
+              <w:ind w:firstLine="0"/>
+              <w:jc w:val="left"/>
+            </w:pPr>
+            <w:r>
+              <w:t>The document is rebuilt without recompressing images</w:t>
+            </w:r>
+          </w:p>
+        </w:tc>
+        <w:tc>
+          <w:tcPr>
+            <w:tcW w:w="3402" w:type="dxa"/>
+          </w:tcPr>
+          <w:p>
+            <w:pPr>
+              <w:spacing w:line="240" w:lineRule="auto"/>
+              <w:ind w:firstLine="0"/>
+              <w:jc w:val="left"/>
+            </w:pPr>
+            <w:r>
+              <w:t xml:space="preserve">When you need to reduce size </w:t>
+            </w:r>
+            <w:r>
+              <w:t>while preserving picture quality</w:t>
+            </w:r>
+          </w:p>
+        </w:tc>
+      </w:tr>
+      <w:tr>
+        <w:trPr>
+          <w:jc w:val="center"/>
+        </w:trPr>
+        <w:tc>
+          <w:tcPr>
+            <w:tcW w:w="2835" w:type="dxa"/>
+          </w:tcPr>
+          <w:p>
+            <w:pPr>
+              <w:spacing w:line="240" w:lineRule="auto"/>
+              <w:ind w:firstLine="0"/>
+              <w:jc w:val="left"/>
+            </w:pPr>
+            <w:r>
               <w:t>Good — smaller size (150 dpi)</w:t>
             </w:r>
           </w:p>
@@ -6432,10 +6482,7 @@
               <w:jc w:val="left"/>
             </w:pPr>
             <w:r>
-              <w:t xml:space="preserve">Sending by mail, publishing. Text on a scan stays </w:t>
-            </w:r>
-            <w:r>
-              <w:t>legible</w:t>
+              <w:t>Sending by mail, publishing. Text on a scan stays legible</w:t>
             </w:r>
           </w:p>
         </w:tc>
@@ -6455,6 +6502,7 @@
               <w:jc w:val="left"/>
             </w:pPr>
             <w:r>
+              <w:lastRenderedPageBreak/>
               <w:t>Normal — minimal size (72 dpi)</w:t>
             </w:r>
           </w:p>
@@ -6498,7 +6546,7 @@
     </w:p>
     <w:p>
       <w:r>
-        <w:t>How much that is worth is shown by a measurement on a scanned document of four pages (fig. 10). The source file took 8.97 MB, after “Good” — 0.68 MB, after “Normal” — 0.24 MB.</w:t>
+        <w:t>How much that is worth is shown by a measurement on a scanned document of four pages (fig. 10). The source file took 8.97 MB, after “Very good” — 7.18 MB, after “Good” — 0.68 MB, after “Normal” — 0.24 MB. The difference between “Good” and “Normal” is barely visible to the eye, while “Very good” saves the least but leaves the images themselves untouched.</w:t>
       </w:r>
     </w:p>
     <w:p>
@@ -6513,7 +6561,7 @@
           <w:noProof/>
         </w:rPr>
         <w:drawing>
-          <wp:inline distT="0" distB="0" distL="0" distR="0" wp14:anchorId="7BD00DA6" wp14:editId="77A883ED">
+          <wp:inline distT="0" distB="0" distL="0" distR="0" wp14:anchorId="0522A139" wp14:editId="1C8FABFA">
             <wp:extent cx="5760000" cy="2724324"/>
             <wp:effectExtent l="0" t="0" r="0" b="0"/>
             <wp:docPr id="10" name="Picture 10"/>
@@ -6561,7 +6609,10 @@
     </w:p>
     <w:p>
       <w:r>
-        <w:t>Compression changes the contents of the file, so a digital signature on the document becomes invalid. Compress before signing, not after.</w:t>
+        <w:t xml:space="preserve">Compression </w:t>
+      </w:r>
+      <w:r>
+        <w:t>changes the contents of the file, so a digital signature on the document becomes invalid. Compress before signing, not after.</w:t>
       </w:r>
       <w:r>
         <w:rPr>
@@ -6574,7 +6625,7 @@
       <w:pPr>
         <w:pStyle w:val="21"/>
       </w:pPr>
-      <w:bookmarkStart w:id="13" w:name="_Toc237174834"/>
+      <w:bookmarkStart w:id="13" w:name="_Toc237262386"/>
       <w:r>
         <w:t>2.8. Settings</w:t>
       </w:r>
@@ -6598,7 +6649,7 @@
         </w:rPr>
         <w:lastRenderedPageBreak/>
         <w:drawing>
-          <wp:inline distT="0" distB="0" distL="0" distR="0" wp14:anchorId="16DA1E26" wp14:editId="48C365CE">
+          <wp:inline distT="0" distB="0" distL="0" distR="0" wp14:anchorId="4EC54600" wp14:editId="011B3FFA">
             <wp:extent cx="3873730" cy="4588624"/>
             <wp:effectExtent l="0" t="0" r="0" b="0"/>
             <wp:docPr id="11" name="Picture 11"/>
@@ -6641,10 +6692,7 @@
         <w:jc w:val="center"/>
       </w:pPr>
       <w:r>
-        <w:t xml:space="preserve">Fig. 11. The settings of </w:t>
-      </w:r>
-      <w:r>
-        <w:t>the program</w:t>
+        <w:t>Fig. 11. The settings of the program</w:t>
       </w:r>
     </w:p>
     <w:p>
@@ -6684,7 +6732,7 @@
       <w:pPr>
         <w:pStyle w:val="21"/>
       </w:pPr>
-      <w:bookmarkStart w:id="14" w:name="_Toc237174835"/>
+      <w:bookmarkStart w:id="14" w:name="_Toc237262387"/>
       <w:r>
         <w:t>2.9. Statistics</w:t>
       </w:r>
@@ -6707,7 +6755,7 @@
           <w:noProof/>
         </w:rPr>
         <w:drawing>
-          <wp:inline distT="0" distB="0" distL="0" distR="0" wp14:anchorId="0B256D0D" wp14:editId="35D53DB3">
+          <wp:inline distT="0" distB="0" distL="0" distR="0" wp14:anchorId="0D72025C" wp14:editId="69D14129">
             <wp:extent cx="3707476" cy="4148051"/>
             <wp:effectExtent l="0" t="0" r="0" b="0"/>
             <wp:docPr id="12" name="Picture 12"/>
@@ -6762,7 +6810,7 @@
       <w:pPr>
         <w:pStyle w:val="21"/>
       </w:pPr>
-      <w:bookmarkStart w:id="15" w:name="_Toc237174836"/>
+      <w:bookmarkStart w:id="15" w:name="_Toc237262388"/>
       <w:r>
         <w:t>2.10. What happens to your files</w:t>
       </w:r>
@@ -6786,7 +6834,7 @@
       <w:pPr>
         <w:pStyle w:val="1"/>
       </w:pPr>
-      <w:bookmarkStart w:id="16" w:name="_Toc237174837"/>
+      <w:bookmarkStart w:id="16" w:name="_Toc237262389"/>
       <w:r>
         <w:t>3. Merge PDF</w:t>
       </w:r>
@@ -6796,7 +6844,7 @@
       <w:pPr>
         <w:pStyle w:val="21"/>
       </w:pPr>
-      <w:bookmarkStart w:id="17" w:name="_Toc237174838"/>
+      <w:bookmarkStart w:id="17" w:name="_Toc237262390"/>
       <w:r>
         <w:t>3.1. What it is for</w:t>
       </w:r>
@@ -6809,14 +6857,17 @@
     </w:p>
     <w:p>
       <w:r>
-        <w:t>Its main property is that pages are copied as they are, without being converted again. A scan stays the same scan; stamps and signatures do not drift. That is why merging is safe for documents that will travel further up the chain.</w:t>
+        <w:t xml:space="preserve">Its main property is that pages are copied as they are, </w:t>
+      </w:r>
+      <w:r>
+        <w:t>without being converted again. A scan stays the same scan; stamps and signatures do not drift. That is why merging is safe for documents that will travel further up the chain.</w:t>
       </w:r>
     </w:p>
     <w:p>
       <w:pPr>
         <w:pStyle w:val="21"/>
       </w:pPr>
-      <w:bookmarkStart w:id="18" w:name="_Toc237174839"/>
+      <w:bookmarkStart w:id="18" w:name="_Toc237262391"/>
       <w:r>
         <w:t>3.2. The window</w:t>
       </w:r>
@@ -6840,7 +6891,7 @@
         </w:rPr>
         <w:lastRenderedPageBreak/>
         <w:drawing>
-          <wp:inline distT="0" distB="0" distL="0" distR="0" wp14:anchorId="50ACDBC9" wp14:editId="12788D1B">
+          <wp:inline distT="0" distB="0" distL="0" distR="0" wp14:anchorId="1BBDC103" wp14:editId="59A25CAA">
             <wp:extent cx="5760000" cy="4608000"/>
             <wp:effectExtent l="0" t="0" r="0" b="0"/>
             <wp:docPr id="13" name="Picture 13"/>
@@ -6890,7 +6941,7 @@
       <w:pPr>
         <w:pStyle w:val="21"/>
       </w:pPr>
-      <w:bookmarkStart w:id="19" w:name="_Toc237174840"/>
+      <w:bookmarkStart w:id="19" w:name="_Toc237262392"/>
       <w:r>
         <w:t>3.3. The order of work</w:t>
       </w:r>
@@ -6904,7 +6955,10 @@
         <w:t xml:space="preserve">1. Add the files with “Add PDF…” </w:t>
       </w:r>
       <w:r>
-        <w:t>or drag them into the window. There may be any number of files; the pages of all of them line up in one grid.</w:t>
+        <w:t xml:space="preserve">or drag them into the window. There may be any number of </w:t>
+      </w:r>
+      <w:r>
+        <w:t>files; the pages of all of them line up in one grid.</w:t>
       </w:r>
     </w:p>
     <w:p>
@@ -6915,10 +6969,7 @@
         <w:t xml:space="preserve">2. Set the order of the pages </w:t>
       </w:r>
       <w:r>
-        <w:t xml:space="preserve">by dragging the </w:t>
-      </w:r>
-      <w:r>
-        <w:t>thumbnails or with the “◀ Move left” and “Move right ▶” buttons. Remove pages you do not need with “Remove” or the Delete key.</w:t>
+        <w:t>by dragging the thumbnails or with the “◀ Move left” and “Move right ▶” buttons. Remove pages you do not need with “Remove” or the Delete key.</w:t>
       </w:r>
     </w:p>
     <w:p>
@@ -6947,7 +6998,7 @@
       <w:pPr>
         <w:pStyle w:val="21"/>
       </w:pPr>
-      <w:bookmarkStart w:id="20" w:name="_Toc237174841"/>
+      <w:bookmarkStart w:id="20" w:name="_Toc237262393"/>
       <w:r>
         <w:lastRenderedPageBreak/>
         <w:t>3.4. Double-sided printing: “Add a blank page”</w:t>
@@ -6980,7 +7031,7 @@
       <w:pPr>
         <w:pStyle w:val="21"/>
       </w:pPr>
-      <w:bookmarkStart w:id="21" w:name="_Toc237174842"/>
+      <w:bookmarkStart w:id="21" w:name="_Toc237262394"/>
       <w:r>
         <w:t>3.5. Assembling a double-sided scan</w:t>
       </w:r>
@@ -7004,7 +7055,7 @@
         </w:rPr>
         <w:lastRenderedPageBreak/>
         <w:drawing>
-          <wp:inline distT="0" distB="0" distL="0" distR="0" wp14:anchorId="35CA0B8B" wp14:editId="232998F5">
+          <wp:inline distT="0" distB="0" distL="0" distR="0" wp14:anchorId="44C9D806" wp14:editId="0E713819">
             <wp:extent cx="5760000" cy="4608000"/>
             <wp:effectExtent l="0" t="0" r="0" b="0"/>
             <wp:docPr id="14" name="Picture 14"/>
@@ -7059,7 +7110,7 @@
       <w:pPr>
         <w:pStyle w:val="1"/>
       </w:pPr>
-      <w:bookmarkStart w:id="22" w:name="_Toc237174843"/>
+      <w:bookmarkStart w:id="22" w:name="_Toc237262395"/>
       <w:r>
         <w:t>4. Split PDF</w:t>
       </w:r>
@@ -7069,7 +7120,7 @@
       <w:pPr>
         <w:pStyle w:val="21"/>
       </w:pPr>
-      <w:bookmarkStart w:id="23" w:name="_Toc237174844"/>
+      <w:bookmarkStart w:id="23" w:name="_Toc237262396"/>
       <w:r>
         <w:t>4.1. What it is for</w:t>
       </w:r>
@@ -7090,7 +7141,7 @@
       <w:pPr>
         <w:pStyle w:val="21"/>
       </w:pPr>
-      <w:bookmarkStart w:id="24" w:name="_Toc237174845"/>
+      <w:bookmarkStart w:id="24" w:name="_Toc237262397"/>
       <w:r>
         <w:t>4.2. The window</w:t>
       </w:r>
@@ -7113,7 +7164,7 @@
           <w:noProof/>
         </w:rPr>
         <w:drawing>
-          <wp:inline distT="0" distB="0" distL="0" distR="0" wp14:anchorId="0DDDB118" wp14:editId="0CDFA124">
+          <wp:inline distT="0" distB="0" distL="0" distR="0" wp14:anchorId="2881C95C" wp14:editId="1616A3B1">
             <wp:extent cx="5760000" cy="4608000"/>
             <wp:effectExtent l="0" t="0" r="0" b="0"/>
             <wp:docPr id="15" name="Picture 15"/>
@@ -7163,7 +7214,7 @@
       <w:pPr>
         <w:pStyle w:val="21"/>
       </w:pPr>
-      <w:bookmarkStart w:id="25" w:name="_Toc237174846"/>
+      <w:bookmarkStart w:id="25" w:name="_Toc237262398"/>
       <w:r>
         <w:t>4.3. The modes of splitting</w:t>
       </w:r>
@@ -7190,7 +7241,7 @@
           <w:noProof/>
         </w:rPr>
         <w:drawing>
-          <wp:inline distT="0" distB="0" distL="0" distR="0" wp14:anchorId="7A359720" wp14:editId="74F3978A">
+          <wp:inline distT="0" distB="0" distL="0" distR="0" wp14:anchorId="7D928BE6" wp14:editId="7A0DE525">
             <wp:extent cx="5760000" cy="4608000"/>
             <wp:effectExtent l="0" t="0" r="0" b="0"/>
             <wp:docPr id="16" name="Picture 16"/>
@@ -7233,7 +7284,10 @@
         <w:jc w:val="center"/>
       </w:pPr>
       <w:r>
-        <w:t>Fig. 16. Choosing the mode of splitting</w:t>
+        <w:t xml:space="preserve">Fig. 16. </w:t>
+      </w:r>
+      <w:r>
+        <w:t>Choosing the mode of splitting</w:t>
       </w:r>
     </w:p>
     <w:p>
@@ -7334,10 +7388,7 @@
               <w:jc w:val="left"/>
             </w:pPr>
             <w:r>
-              <w:t xml:space="preserve">Extract </w:t>
-            </w:r>
-            <w:r>
-              <w:t>selected</w:t>
+              <w:t>Extract selected</w:t>
             </w:r>
           </w:p>
         </w:tc>
@@ -7402,7 +7453,10 @@
               <w:jc w:val="left"/>
             </w:pPr>
             <w:r>
-              <w:t>A file per range, or one common file</w:t>
+              <w:t xml:space="preserve">A file per range, or </w:t>
+            </w:r>
+            <w:r>
+              <w:t>one common file</w:t>
             </w:r>
           </w:p>
         </w:tc>
@@ -7467,10 +7521,7 @@
               <w:jc w:val="left"/>
             </w:pPr>
             <w:r>
-              <w:t xml:space="preserve">The </w:t>
-            </w:r>
-            <w:r>
-              <w:t>document has to be broken into equal parts</w:t>
+              <w:t>The document has to be broken into equal parts</w:t>
             </w:r>
           </w:p>
         </w:tc>
@@ -7534,10 +7585,7 @@
     <w:p>
       <w:r>
         <w:lastRenderedPageBreak/>
-        <w:t xml:space="preserve">“By ranges” takes numbers and ranges — “1-3, 5, 8-” (fig. 17). For the common cases the “Ranges” </w:t>
-      </w:r>
-      <w:r>
-        <w:t>field offers ready-made choices: “All pages”, “Odd pages”, “Even pages”, “Every 2nd” and “Every 3rd”. Pick one from the list and the range is filled in for you, ready to edit or to use as it is. By default every range becomes a separate file, and the “Combine into one file” tick box gathers all the listed pages into a single document.</w:t>
+        <w:t>“By ranges” takes numbers and ranges — “1-3, 5, 8-” (fig. 17). For the common cases the “Ranges” field offers ready-made choices: “All pages”, “Odd pages”, “Even pages”, “Every 2nd” and “Every 3rd”. Pick one from the list and the range is filled in for you, ready to edit or to use as it is. By default every range becomes a separate file, and the “Combine into one file” tick box gathers all the listed pages into a single document.</w:t>
       </w:r>
     </w:p>
     <w:p>
@@ -7552,7 +7600,7 @@
           <w:noProof/>
         </w:rPr>
         <w:drawing>
-          <wp:inline distT="0" distB="0" distL="0" distR="0" wp14:anchorId="40097F25" wp14:editId="475F8B94">
+          <wp:inline distT="0" distB="0" distL="0" distR="0" wp14:anchorId="021CC08B" wp14:editId="241350F7">
             <wp:extent cx="5760000" cy="4608000"/>
             <wp:effectExtent l="0" t="0" r="0" b="0"/>
             <wp:docPr id="17" name="Picture 17"/>
@@ -7616,7 +7664,7 @@
         </w:rPr>
         <w:lastRenderedPageBreak/>
         <w:drawing>
-          <wp:inline distT="0" distB="0" distL="0" distR="0" wp14:anchorId="377A7E23" wp14:editId="7145E897">
+          <wp:inline distT="0" distB="0" distL="0" distR="0" wp14:anchorId="1415DD9D" wp14:editId="25E39E43">
             <wp:extent cx="5760000" cy="4608000"/>
             <wp:effectExtent l="0" t="0" r="0" b="0"/>
             <wp:docPr id="18" name="Picture 18"/>
@@ -7664,7 +7712,10 @@
     </w:p>
     <w:p>
       <w:r>
-        <w:t>“By bookmarks” relies on the table of contents inside the PDF: every top-level bookmark gives a separate file, and its name goes into the file name (fig. 19). If the document has no bookmarks, the program says so and writes nothing.</w:t>
+        <w:t xml:space="preserve">“By bookmarks” relies on the table of contents inside the PDF: every top-level bookmark gives a separate file, and its name goes into the </w:t>
+      </w:r>
+      <w:r>
+        <w:t>file name (fig. 19). If the document has no bookmarks, the program says so and writes nothing.</w:t>
       </w:r>
     </w:p>
     <w:p>
@@ -7680,7 +7731,7 @@
         </w:rPr>
         <w:lastRenderedPageBreak/>
         <w:drawing>
-          <wp:inline distT="0" distB="0" distL="0" distR="0" wp14:anchorId="21F8EDEE" wp14:editId="65CC8DB7">
+          <wp:inline distT="0" distB="0" distL="0" distR="0" wp14:anchorId="283B3C18" wp14:editId="037D30B3">
             <wp:extent cx="5760000" cy="4608000"/>
             <wp:effectExtent l="0" t="0" r="0" b="0"/>
             <wp:docPr id="19" name="Picture 19"/>
@@ -7730,7 +7781,7 @@
       <w:pPr>
         <w:pStyle w:val="21"/>
       </w:pPr>
-      <w:bookmarkStart w:id="26" w:name="_Toc237174847"/>
+      <w:bookmarkStart w:id="26" w:name="_Toc237262399"/>
       <w:r>
         <w:t>4.4. Naming the parts</w:t>
       </w:r>
@@ -7759,7 +7810,7 @@
         </w:rPr>
         <w:lastRenderedPageBreak/>
         <w:drawing>
-          <wp:inline distT="0" distB="0" distL="0" distR="0" wp14:anchorId="73657F8B" wp14:editId="17DADE13">
+          <wp:inline distT="0" distB="0" distL="0" distR="0" wp14:anchorId="74C1FD8B" wp14:editId="5128B861">
             <wp:extent cx="5760000" cy="4608000"/>
             <wp:effectExtent l="0" t="0" r="0" b="0"/>
             <wp:docPr id="20" name="Picture 20"/>
@@ -7812,10 +7863,7 @@
         <w:ind w:firstLine="0"/>
       </w:pPr>
       <w:r>
-        <w:t xml:space="preserve">Table 5 — </w:t>
-      </w:r>
-      <w:r>
-        <w:t>Placeholders in the name template</w:t>
+        <w:t>Table 5 — Placeholders in the name template</w:t>
       </w:r>
     </w:p>
     <w:tbl>
@@ -7971,7 +8019,10 @@
               <w:jc w:val="left"/>
             </w:pPr>
             <w:r>
-              <w:t>The number of the part in order</w:t>
+              <w:t xml:space="preserve">The number of the part in </w:t>
+            </w:r>
+            <w:r>
+              <w:t>order</w:t>
             </w:r>
           </w:p>
         </w:tc>
@@ -8324,7 +8375,7 @@
       <w:pPr>
         <w:pStyle w:val="21"/>
       </w:pPr>
-      <w:bookmarkStart w:id="27" w:name="_Toc237174848"/>
+      <w:bookmarkStart w:id="27" w:name="_Toc237262400"/>
       <w:r>
         <w:t>4.5. Other operations on the open document</w:t>
       </w:r>
@@ -8339,7 +8390,7 @@
       <w:pPr>
         <w:pStyle w:val="1"/>
       </w:pPr>
-      <w:bookmarkStart w:id="28" w:name="_Toc237174849"/>
+      <w:bookmarkStart w:id="28" w:name="_Toc237262401"/>
       <w:r>
         <w:t>5. More operations</w:t>
       </w:r>
@@ -8349,7 +8400,7 @@
       <w:pPr>
         <w:pStyle w:val="21"/>
       </w:pPr>
-      <w:bookmarkStart w:id="29" w:name="_Toc237174850"/>
+      <w:bookmarkStart w:id="29" w:name="_Toc237262402"/>
       <w:r>
         <w:t>5.1. What it is for</w:t>
       </w:r>
@@ -8375,7 +8426,7 @@
       <w:pPr>
         <w:pStyle w:val="21"/>
       </w:pPr>
-      <w:bookmarkStart w:id="30" w:name="_Toc237174851"/>
+      <w:bookmarkStart w:id="30" w:name="_Toc237262403"/>
       <w:r>
         <w:lastRenderedPageBreak/>
         <w:t>5.2. The window</w:t>
@@ -8399,7 +8450,7 @@
           <w:noProof/>
         </w:rPr>
         <w:drawing>
-          <wp:inline distT="0" distB="0" distL="0" distR="0" wp14:anchorId="42864C01" wp14:editId="351E98AF">
+          <wp:inline distT="0" distB="0" distL="0" distR="0" wp14:anchorId="223636E2" wp14:editId="14E4472F">
             <wp:extent cx="5760000" cy="4905646"/>
             <wp:effectExtent l="0" t="0" r="0" b="0"/>
             <wp:docPr id="21" name="Picture 21"/>
@@ -8447,10 +8498,10 @@
     </w:p>
     <w:p>
       <w:r>
-        <w:t xml:space="preserve">A document reaches this window three ways: with the “Open PDF…” button, by being dragged into the window, and by </w:t>
-      </w:r>
-      <w:r>
-        <w:t>coming across from a neighbouring tool — “Split PDF” hands over its open document with its own “More operations” button, and “Merge PDF” hands over the file it has just built through “More operations” in its Menu. Images can simply be dragged in as well — onto the window, onto the grid, or onto the tool’s card on the start screen.</w:t>
+        <w:t xml:space="preserve">A document reaches this window three ways: </w:t>
+      </w:r>
+      <w:r>
+        <w:t>with the “Open PDF…” button, by being dragged into the window, and by coming across from a neighbouring tool — “Split PDF” hands over its open document with its own “More operations” button, and “Merge PDF” hands over the file it has just built through “More operations” in its Menu. Images can simply be dragged in as well — onto the window, onto the grid, or onto the tool’s card on the start screen.</w:t>
       </w:r>
     </w:p>
     <w:p>
@@ -8475,7 +8526,7 @@
       <w:pPr>
         <w:pStyle w:val="21"/>
       </w:pPr>
-      <w:bookmarkStart w:id="31" w:name="_Toc237174852"/>
+      <w:bookmarkStart w:id="31" w:name="_Toc237262404"/>
       <w:r>
         <w:t>5.3. Assembling the document</w:t>
       </w:r>
@@ -8518,7 +8569,7 @@
         </w:rPr>
         <w:lastRenderedPageBreak/>
         <w:drawing>
-          <wp:inline distT="0" distB="0" distL="0" distR="0" wp14:anchorId="71D42EA3" wp14:editId="740E24D7">
+          <wp:inline distT="0" distB="0" distL="0" distR="0" wp14:anchorId="148B89B4" wp14:editId="482E77A3">
             <wp:extent cx="5760000" cy="4905646"/>
             <wp:effectExtent l="0" t="0" r="0" b="0"/>
             <wp:docPr id="22" name="Picture 22"/>
@@ -8585,11 +8636,16 @@
       <w:pPr>
         <w:pStyle w:val="21"/>
       </w:pPr>
-      <w:bookmarkStart w:id="32" w:name="_Toc237174853"/>
+      <w:bookmarkStart w:id="32" w:name="_Toc237262405"/>
       <w:r>
         <w:t>5.4. The actions</w:t>
       </w:r>
       <w:bookmarkEnd w:id="32"/>
+    </w:p>
+    <w:p>
+      <w:r>
+        <w:t>The “Convert” button opens a menu of operations on the assembled document:</w:t>
+      </w:r>
     </w:p>
     <w:p>
       <w:r>
@@ -8602,11 +8658,15 @@
         <w:t xml:space="preserve">Save PDF. </w:t>
       </w:r>
       <w:r>
-        <w:t>Writes what is assembled into a new PDF: that is how images become a document and reordered or rotated pages become a finished file. The compression level comes from the same list at the bottom of the window.</w:t>
-      </w:r>
-    </w:p>
-    <w:p>
-      <w:r>
+        <w:t xml:space="preserve">Writes what is assembled into a new PDF: that is how images become a document and reordered or rotated pages become a finished file. The compression level comes from the same list </w:t>
+      </w:r>
+      <w:r>
+        <w:t>at the bottom of the window.</w:t>
+      </w:r>
+    </w:p>
+    <w:p>
+      <w:r>
+        <w:lastRenderedPageBreak/>
         <w:t>— </w:t>
       </w:r>
       <w:r>
@@ -8621,7 +8681,6 @@
     </w:p>
     <w:p>
       <w:r>
-        <w:lastRenderedPageBreak/>
         <w:t>— </w:t>
       </w:r>
       <w:r>
@@ -8645,10 +8704,12 @@
         <w:t xml:space="preserve">Repair. </w:t>
       </w:r>
       <w:r>
-        <w:t xml:space="preserve">The file is rebuilt by </w:t>
-      </w:r>
-      <w:r>
-        <w:t>the PDF engine, which repairs a broken cross-reference table — the commonest cause of the message “the file is damaged”. The file is chosen in a separate dialog, because a damaged document cannot be opened into the grid — and that is exactly when repair is needed.</w:t>
+        <w:t>The file is rebuilt by the PDF engine, which repairs a broken cross-reference table — the commonest cause of the message “the file is damaged”. The file is chosen in a separate dialog, because a damaged document cannot be opened into the grid — and that is exactly when repair is needed.</w:t>
+      </w:r>
+    </w:p>
+    <w:p>
+      <w:r>
+        <w:t>The “Extract” button opens a menu for extracting content:</w:t>
       </w:r>
     </w:p>
     <w:p>
@@ -8662,7 +8723,7 @@
         <w:t xml:space="preserve">Pages as images. </w:t>
       </w:r>
       <w:r>
-        <w:t>PNG or JPEG with a choice of resolution (fig. 23). Needed when a page has to go into a presentation, a letter or a memo. The resolution applies to the real size of the sheet, so a landscape insertion is not stretched. The selected pages are saved, or all of them if nothing is selected.</w:t>
+        <w:t>PNG or JPEG with a choice of resolution (fig. 23). Needed when a page has to go into a presentation, a letter or a memo. Available resolutions are 96, 150, 300 and 600 dots per inch. The resolution applies to the real size of the sheet, so a landscape insertion is not stretched. The selected pages are saved, or all of them if nothing is selected.</w:t>
       </w:r>
     </w:p>
     <w:p>
@@ -8676,9 +8737,10 @@
         <w:rPr>
           <w:noProof/>
         </w:rPr>
+        <w:lastRenderedPageBreak/>
         <w:drawing>
-          <wp:inline distT="0" distB="0" distL="0" distR="0" wp14:anchorId="5DA82F3C" wp14:editId="1828F6A1">
-            <wp:extent cx="5760000" cy="4905646"/>
+          <wp:inline distT="0" distB="0" distL="0" distR="0" wp14:anchorId="39B0795D" wp14:editId="422CB3C3">
+            <wp:extent cx="5760000" cy="4713931"/>
             <wp:effectExtent l="0" t="0" r="0" b="0"/>
             <wp:docPr id="23" name="Picture 23"/>
             <wp:cNvGraphicFramePr>
@@ -8700,7 +8762,7 @@
                   <pic:spPr>
                     <a:xfrm>
                       <a:off x="0" y="0"/>
-                      <a:ext cx="5760000" cy="4905646"/>
+                      <a:ext cx="5760000" cy="4713931"/>
                     </a:xfrm>
                     <a:prstGeom prst="rect">
                       <a:avLst/>
@@ -8725,7 +8787,6 @@
     </w:p>
     <w:p>
       <w:r>
-        <w:lastRenderedPageBreak/>
         <w:t>— </w:t>
       </w:r>
       <w:r>
@@ -8740,6 +8801,11 @@
     </w:p>
     <w:p>
       <w:r>
+        <w:t>Separate buttons:</w:t>
+      </w:r>
+    </w:p>
+    <w:p>
+      <w:r>
         <w:t>— </w:t>
       </w:r>
       <w:r>
@@ -8777,8 +8843,9 @@
         <w:rPr>
           <w:noProof/>
         </w:rPr>
+        <w:lastRenderedPageBreak/>
         <w:drawing>
-          <wp:inline distT="0" distB="0" distL="0" distR="0" wp14:anchorId="768A2C31" wp14:editId="2DCE4C5D">
+          <wp:inline distT="0" distB="0" distL="0" distR="0" wp14:anchorId="47F9048D" wp14:editId="37305E5B">
             <wp:extent cx="3873730" cy="3474719"/>
             <wp:effectExtent l="0" t="0" r="0" b="0"/>
             <wp:docPr id="24" name="Picture 24"/>
@@ -8821,7 +8888,10 @@
         <w:jc w:val="center"/>
       </w:pPr>
       <w:r>
-        <w:t>Fig. 24. Editing the properties of a document</w:t>
+        <w:t xml:space="preserve">Fig. 24. </w:t>
+      </w:r>
+      <w:r>
+        <w:t>Editing the properties of a document</w:t>
       </w:r>
     </w:p>
     <w:p>
@@ -8845,42 +8915,39 @@
       <w:pPr>
         <w:pStyle w:val="1"/>
       </w:pPr>
-      <w:bookmarkStart w:id="33" w:name="_Toc237174854"/>
+      <w:bookmarkStart w:id="33" w:name="_Toc237262406"/>
+      <w:r>
+        <w:t>6. PDF → Word</w:t>
+      </w:r>
+      <w:bookmarkEnd w:id="33"/>
+    </w:p>
+    <w:p>
+      <w:pPr>
+        <w:pStyle w:val="21"/>
+      </w:pPr>
+      <w:bookmarkStart w:id="34" w:name="_Toc237262407"/>
+      <w:r>
+        <w:t>6.1. What it is for</w:t>
+      </w:r>
+      <w:bookmarkEnd w:id="34"/>
+    </w:p>
+    <w:p>
+      <w:r>
+        <w:t>The tool extracts the text and tables of a born-digital PDF into an editable Word document (.docx). Born-digital means saved from Word, from a browser or through “Microsoft Print to PDF”: in such a file the text is held as text, not as a picture.</w:t>
+      </w:r>
+    </w:p>
+    <w:p>
+      <w:r>
+        <w:t>The point is simple: text somebody has already typed does not have to be typed again. From the resulting .docx you can take a paragraph, a table or the whole document and work with it as usual.</w:t>
+      </w:r>
+    </w:p>
+    <w:p>
+      <w:pPr>
+        <w:pStyle w:val="21"/>
+      </w:pPr>
+      <w:bookmarkStart w:id="35" w:name="_Toc237262408"/>
       <w:r>
         <w:lastRenderedPageBreak/>
-        <w:t>6. PDF → Word</w:t>
-      </w:r>
-      <w:bookmarkEnd w:id="33"/>
-    </w:p>
-    <w:p>
-      <w:pPr>
-        <w:pStyle w:val="21"/>
-      </w:pPr>
-      <w:bookmarkStart w:id="34" w:name="_Toc237174855"/>
-      <w:r>
-        <w:t>6.1. What it is for</w:t>
-      </w:r>
-      <w:bookmarkEnd w:id="34"/>
-    </w:p>
-    <w:p>
-      <w:r>
-        <w:t xml:space="preserve">The tool </w:t>
-      </w:r>
-      <w:r>
-        <w:t>extracts the text and tables of a born-digital PDF into an editable Word document (.docx). Born-digital means saved from Word, from a browser or through “Microsoft Print to PDF”: in such a file the text is held as text, not as a picture.</w:t>
-      </w:r>
-    </w:p>
-    <w:p>
-      <w:r>
-        <w:t>The point is simple: text somebody has already typed does not have to be typed again. From the resulting .docx you can take a paragraph, a table or the whole document and work with it as usual.</w:t>
-      </w:r>
-    </w:p>
-    <w:p>
-      <w:pPr>
-        <w:pStyle w:val="21"/>
-      </w:pPr>
-      <w:bookmarkStart w:id="35" w:name="_Toc237174856"/>
-      <w:r>
         <w:t>6.2. The window</w:t>
       </w:r>
       <w:bookmarkEnd w:id="35"/>
@@ -8901,9 +8968,8 @@
         <w:rPr>
           <w:noProof/>
         </w:rPr>
-        <w:lastRenderedPageBreak/>
         <w:drawing>
-          <wp:inline distT="0" distB="0" distL="0" distR="0" wp14:anchorId="5E54494D" wp14:editId="628CEDAE">
+          <wp:inline distT="0" distB="0" distL="0" distR="0" wp14:anchorId="55A08753" wp14:editId="0A7452D2">
             <wp:extent cx="5760000" cy="4608000"/>
             <wp:effectExtent l="0" t="0" r="0" b="0"/>
             <wp:docPr id="25" name="Picture 25"/>
@@ -8953,7 +9019,7 @@
       <w:pPr>
         <w:pStyle w:val="21"/>
       </w:pPr>
-      <w:bookmarkStart w:id="36" w:name="_Toc237174857"/>
+      <w:bookmarkStart w:id="36" w:name="_Toc237262409"/>
       <w:r>
         <w:t>6.3. The order of work</w:t>
       </w:r>
@@ -8986,6 +9052,7 @@
         <w:rPr>
           <w:b/>
         </w:rPr>
+        <w:lastRenderedPageBreak/>
         <w:t xml:space="preserve">3. Straighten rotated pages. </w:t>
       </w:r>
       <w:r>
@@ -8997,7 +9064,6 @@
         <w:rPr>
           <w:b/>
         </w:rPr>
-        <w:lastRenderedPageBreak/>
         <w:t xml:space="preserve">4. Press “Convert to Word…” </w:t>
       </w:r>
       <w:r>
@@ -9008,7 +9074,7 @@
       <w:pPr>
         <w:pStyle w:val="21"/>
       </w:pPr>
-      <w:bookmarkStart w:id="37" w:name="_Toc237174858"/>
+      <w:bookmarkStart w:id="37" w:name="_Toc237262410"/>
       <w:r>
         <w:t>6.4. What comes across and what does not</w:t>
       </w:r>
@@ -9016,7 +9082,10 @@
     </w:p>
     <w:p>
       <w:r>
-        <w:t>What comes across: text in paragraphs in reading order — with its font, size, weight, colour, underline, alignment and first-line indent. Tables with visible lines are rebuilt as cells, merged ones included. Portrait and landscape orientation is kept page by page. Images and hyperlinks come across too.</w:t>
+        <w:t xml:space="preserve">What comes across: text in paragraphs in reading order — with its font, size, weight, </w:t>
+      </w:r>
+      <w:r>
+        <w:t>colour, underline, alignment and first-line indent. Tables with visible lines are rebuilt as cells, merged ones included. Portrait and landscape orientation is kept page by page. Images and hyperlinks come across too.</w:t>
       </w:r>
     </w:p>
     <w:p>
@@ -9049,10 +9118,7 @@
         <w:t xml:space="preserve">If the font of the PDF is not in the system, </w:t>
       </w:r>
       <w:r>
-        <w:t xml:space="preserve">the text is set in Times New Roman. The shape of the letters may differ a </w:t>
-      </w:r>
-      <w:r>
-        <w:t>little from the original.</w:t>
+        <w:t>the text is set in Times New Roman. The shape of the letters may differ a little from the original.</w:t>
       </w:r>
     </w:p>
     <w:p>
@@ -9084,7 +9150,7 @@
       <w:pPr>
         <w:pStyle w:val="1"/>
       </w:pPr>
-      <w:bookmarkStart w:id="38" w:name="_Toc237174859"/>
+      <w:bookmarkStart w:id="38" w:name="_Toc237262411"/>
       <w:r>
         <w:t>7. PDF → PowerPoint</w:t>
       </w:r>
@@ -9094,7 +9160,7 @@
       <w:pPr>
         <w:pStyle w:val="21"/>
       </w:pPr>
-      <w:bookmarkStart w:id="39" w:name="_Toc237174860"/>
+      <w:bookmarkStart w:id="39" w:name="_Toc237262412"/>
       <w:r>
         <w:t>7.1. What it is for</w:t>
       </w:r>
@@ -9102,17 +9168,20 @@
     </w:p>
     <w:p>
       <w:r>
-        <w:t>The tool turns the pages of a born-digital PDF into a PowerPoint presentation (.pptx). Every page becomes a slide, and the text on it stays TEXT: it can be selected, corrected, retyped — it is not a picture of letters.</w:t>
-      </w:r>
-    </w:p>
-    <w:p>
-      <w:r>
+        <w:t xml:space="preserve">The tool turns the pages of a born-digital PDF into a PowerPoint </w:t>
+      </w:r>
+      <w:r>
+        <w:t>presentation (.pptx). Every page becomes a slide, and the text on it stays TEXT: it can be selected, corrected, retyped — it is not a picture of letters.</w:t>
+      </w:r>
+    </w:p>
+    <w:p>
+      <w:r>
+        <w:lastRenderedPageBreak/>
         <w:t>The situation this exists for comes up constantly: the presentation went to its recipient as a PDF, the source file is lost, and it has to be edited. The usual way is to retype the slides; this tool brings them back in one action.</w:t>
       </w:r>
     </w:p>
     <w:p>
       <w:r>
-        <w:lastRenderedPageBreak/>
         <w:t>PowerPoint itself is not needed for it: the program assembles the .pptx on its own. The tool is used precisely when there is no office suite at hand, and requiring one to be installed in order to put text into slides would be odd.</w:t>
       </w:r>
       <w:r>
@@ -9126,7 +9195,7 @@
       <w:pPr>
         <w:pStyle w:val="21"/>
       </w:pPr>
-      <w:bookmarkStart w:id="40" w:name="_Toc237174861"/>
+      <w:bookmarkStart w:id="40" w:name="_Toc237262413"/>
       <w:r>
         <w:t>7.2. How a slide is built</w:t>
       </w:r>
@@ -9134,10 +9203,7 @@
     </w:p>
     <w:p>
       <w:r>
-        <w:t xml:space="preserve">A slide is made of two layers. The lower one is the page of the source PDF, rendered WITHOUT its text layer: background, frames, charts, logos, stamps. The </w:t>
-      </w:r>
-      <w:r>
-        <w:t>upper one is the text boxes, placed exactly where the text stood in the original.</w:t>
+        <w:t>A slide is made of two layers. The lower one is the page of the source PDF, rendered WITHOUT its text layer: background, frames, charts, logos, stamps. The upper one is the text boxes, placed exactly where the text stood in the original.</w:t>
       </w:r>
     </w:p>
     <w:p>
@@ -9166,7 +9232,7 @@
       <w:pPr>
         <w:pStyle w:val="21"/>
       </w:pPr>
-      <w:bookmarkStart w:id="41" w:name="_Toc237174862"/>
+      <w:bookmarkStart w:id="41" w:name="_Toc237262414"/>
       <w:r>
         <w:t>7.3. The window</w:t>
       </w:r>
@@ -9190,7 +9256,7 @@
         </w:rPr>
         <w:lastRenderedPageBreak/>
         <w:drawing>
-          <wp:inline distT="0" distB="0" distL="0" distR="0" wp14:anchorId="53871CD4" wp14:editId="0169CB15">
+          <wp:inline distT="0" distB="0" distL="0" distR="0" wp14:anchorId="2B9A09B3" wp14:editId="4F72CF79">
             <wp:extent cx="5760000" cy="4608000"/>
             <wp:effectExtent l="0" t="0" r="0" b="0"/>
             <wp:docPr id="26" name="Picture 26"/>
@@ -9240,7 +9306,7 @@
       <w:pPr>
         <w:pStyle w:val="21"/>
       </w:pPr>
-      <w:bookmarkStart w:id="42" w:name="_Toc237174863"/>
+      <w:bookmarkStart w:id="42" w:name="_Toc237262415"/>
       <w:r>
         <w:t>7.4. The order of work</w:t>
       </w:r>
@@ -9294,7 +9360,7 @@
       <w:pPr>
         <w:pStyle w:val="21"/>
       </w:pPr>
-      <w:bookmarkStart w:id="43" w:name="_Toc237174864"/>
+      <w:bookmarkStart w:id="43" w:name="_Toc237262416"/>
       <w:r>
         <w:lastRenderedPageBreak/>
         <w:t>7.5. What comes across</w:t>
@@ -9315,7 +9381,7 @@
       <w:pPr>
         <w:pStyle w:val="21"/>
       </w:pPr>
-      <w:bookmarkStart w:id="44" w:name="_Toc237174865"/>
+      <w:bookmarkStart w:id="44" w:name="_Toc237262417"/>
       <w:r>
         <w:t>7.6. What not to expect</w:t>
       </w:r>
@@ -9367,7 +9433,7 @@
       <w:pPr>
         <w:pStyle w:val="1"/>
       </w:pPr>
-      <w:bookmarkStart w:id="45" w:name="_Toc237174866"/>
+      <w:bookmarkStart w:id="45" w:name="_Toc237262418"/>
       <w:r>
         <w:t>8. Merge Excel</w:t>
       </w:r>
@@ -9377,7 +9443,7 @@
       <w:pPr>
         <w:pStyle w:val="21"/>
       </w:pPr>
-      <w:bookmarkStart w:id="46" w:name="_Toc237174867"/>
+      <w:bookmarkStart w:id="46" w:name="_Toc237262419"/>
       <w:r>
         <w:t>8.1. What it is for</w:t>
       </w:r>
@@ -9385,10 +9451,10 @@
     </w:p>
     <w:p>
       <w:r>
-        <w:t xml:space="preserve">The tool gathers the sheets of several Excel workbooks into one workbook — a digest. The typical task: the </w:t>
-      </w:r>
-      <w:r>
-        <w:t xml:space="preserve">divisions have each sent a file, and what is wanted </w:t>
+        <w:t xml:space="preserve">The tool gathers the sheets of </w:t>
+      </w:r>
+      <w:r>
+        <w:t xml:space="preserve">several Excel workbooks into one workbook — a digest. The typical task: the divisions have each sent a file, and what is wanted </w:t>
       </w:r>
       <w:r>
         <w:lastRenderedPageBreak/>
@@ -9404,7 +9470,7 @@
       <w:pPr>
         <w:pStyle w:val="21"/>
       </w:pPr>
-      <w:bookmarkStart w:id="47" w:name="_Toc237174868"/>
+      <w:bookmarkStart w:id="47" w:name="_Toc237262420"/>
       <w:r>
         <w:t>8.2. The window</w:t>
       </w:r>
@@ -9427,7 +9493,7 @@
           <w:noProof/>
         </w:rPr>
         <w:drawing>
-          <wp:inline distT="0" distB="0" distL="0" distR="0" wp14:anchorId="52A0A4D7" wp14:editId="77E0BF7E">
+          <wp:inline distT="0" distB="0" distL="0" distR="0" wp14:anchorId="028E3EAF" wp14:editId="26077E5E">
             <wp:extent cx="5760000" cy="4250667"/>
             <wp:effectExtent l="0" t="0" r="0" b="0"/>
             <wp:docPr id="27" name="Picture 27"/>
@@ -9477,7 +9543,7 @@
       <w:pPr>
         <w:pStyle w:val="21"/>
       </w:pPr>
-      <w:bookmarkStart w:id="48" w:name="_Toc237174869"/>
+      <w:bookmarkStart w:id="48" w:name="_Toc237262421"/>
       <w:r>
         <w:t>8.3. The order of work</w:t>
       </w:r>
@@ -9491,10 +9557,7 @@
         <w:t xml:space="preserve">1. Give the folder of the source files with “Browse…” </w:t>
       </w:r>
       <w:r>
-        <w:t xml:space="preserve">or drag it straight into the window. The program counts the files found at once and shows them in </w:t>
-      </w:r>
-      <w:r>
-        <w:t>the list below.</w:t>
+        <w:t>or drag it straight into the window. The program counts the files found at once and shows them in the list below.</w:t>
       </w:r>
     </w:p>
     <w:p>
@@ -9535,7 +9598,7 @@
       <w:pPr>
         <w:pStyle w:val="21"/>
       </w:pPr>
-      <w:bookmarkStart w:id="49" w:name="_Toc237174870"/>
+      <w:bookmarkStart w:id="49" w:name="_Toc237262422"/>
       <w:r>
         <w:t>8.4. The options</w:t>
       </w:r>
@@ -9587,7 +9650,7 @@
       <w:pPr>
         <w:pStyle w:val="21"/>
       </w:pPr>
-      <w:bookmarkStart w:id="50" w:name="_Toc237174871"/>
+      <w:bookmarkStart w:id="50" w:name="_Toc237262423"/>
       <w:r>
         <w:t>8.5. The result, the report and the cover note</w:t>
       </w:r>
@@ -9619,7 +9682,7 @@
       <w:pPr>
         <w:pStyle w:val="21"/>
       </w:pPr>
-      <w:bookmarkStart w:id="51" w:name="_Toc237174872"/>
+      <w:bookmarkStart w:id="51" w:name="_Toc237262424"/>
       <w:r>
         <w:t>8.6. The Menu of the tool</w:t>
       </w:r>
@@ -9642,7 +9705,7 @@
           <w:noProof/>
         </w:rPr>
         <w:drawing>
-          <wp:inline distT="0" distB="0" distL="0" distR="0" wp14:anchorId="041F45F4" wp14:editId="3ECB5AD0">
+          <wp:inline distT="0" distB="0" distL="0" distR="0" wp14:anchorId="088797DF" wp14:editId="54DA0793">
             <wp:extent cx="5760000" cy="4250667"/>
             <wp:effectExtent l="0" t="0" r="0" b="0"/>
             <wp:docPr id="28" name="Picture 28"/>
@@ -9709,7 +9772,7 @@
       <w:pPr>
         <w:pStyle w:val="1"/>
       </w:pPr>
-      <w:bookmarkStart w:id="52" w:name="_Toc237174873"/>
+      <w:bookmarkStart w:id="52" w:name="_Toc237262425"/>
       <w:r>
         <w:lastRenderedPageBreak/>
         <w:t>9. Reference</w:t>
@@ -9720,9 +9783,12 @@
       <w:pPr>
         <w:pStyle w:val="21"/>
       </w:pPr>
-      <w:bookmarkStart w:id="53" w:name="_Toc237174874"/>
-      <w:r>
-        <w:t>9.1. About the program</w:t>
+      <w:bookmarkStart w:id="53" w:name="_Toc237262426"/>
+      <w:r>
+        <w:t xml:space="preserve">9.1. About the </w:t>
+      </w:r>
+      <w:r>
+        <w:t>program</w:t>
       </w:r>
       <w:bookmarkEnd w:id="53"/>
     </w:p>
@@ -9743,7 +9809,7 @@
           <w:noProof/>
         </w:rPr>
         <w:drawing>
-          <wp:inline distT="0" distB="0" distL="0" distR="0" wp14:anchorId="1A67A7BE" wp14:editId="159AF71F">
+          <wp:inline distT="0" distB="0" distL="0" distR="0" wp14:anchorId="4B6169C5" wp14:editId="73237C76">
             <wp:extent cx="3873730" cy="3940232"/>
             <wp:effectExtent l="0" t="0" r="0" b="0"/>
             <wp:docPr id="29" name="Picture 29"/>
@@ -9791,10 +9857,7 @@
     </w:p>
     <w:p>
       <w:r>
-        <w:t xml:space="preserve">The version number is useful when asking for help: it says at once which build is meant. The details for supporting the </w:t>
-      </w:r>
-      <w:r>
-        <w:t>project voluntarily can be selected and copied as ordinary text.</w:t>
+        <w:t>The version number is useful when asking for help: it says at once which build is meant. The details for supporting the project voluntarily can be selected and copied as ordinary text.</w:t>
       </w:r>
     </w:p>
     <w:p>
@@ -9812,7 +9875,7 @@
       <w:pPr>
         <w:pStyle w:val="21"/>
       </w:pPr>
-      <w:bookmarkStart w:id="54" w:name="_Toc237174875"/>
+      <w:bookmarkStart w:id="54" w:name="_Toc237262427"/>
       <w:r>
         <w:lastRenderedPageBreak/>
         <w:t>9.2. If something went wrong</w:t>
@@ -9918,7 +9981,10 @@
               <w:jc w:val="left"/>
             </w:pPr>
             <w:r>
-              <w:t>The compression engine is not installed. The window has a link to download it, and in the installed version of the program it is put in place at once</w:t>
+              <w:t xml:space="preserve">The compression engine is not installed. The window has a link to </w:t>
+            </w:r>
+            <w:r>
+              <w:t>download it, and in the installed version of the program it is put in place at once</w:t>
             </w:r>
           </w:p>
         </w:tc>
@@ -9988,10 +10054,7 @@
               <w:jc w:val="left"/>
             </w:pPr>
             <w:r>
-              <w:t xml:space="preserve">The PDF has no text </w:t>
-            </w:r>
-            <w:r>
-              <w:t>layer, there is nothing to convert. The file is not damaged</w:t>
+              <w:t>The PDF has no text layer, there is nothing to convert. The file is not damaged</w:t>
             </w:r>
           </w:p>
         </w:tc>
@@ -10186,7 +10249,10 @@
               <w:jc w:val="left"/>
             </w:pPr>
             <w:r>
-              <w:t>The download page did not open after the message about a new version</w:t>
+              <w:t xml:space="preserve">The download page did not open </w:t>
+            </w:r>
+            <w:r>
+              <w:t>after the message about a new version</w:t>
             </w:r>
           </w:p>
         </w:tc>
@@ -10216,7 +10282,7 @@
       <w:pPr>
         <w:pStyle w:val="21"/>
       </w:pPr>
-      <w:bookmarkStart w:id="55" w:name="_Toc237174876"/>
+      <w:bookmarkStart w:id="55" w:name="_Toc237262428"/>
       <w:r>
         <w:t>9.3. A short reminder</w:t>
       </w:r>
@@ -10235,10 +10301,7 @@
     </w:p>
     <w:p>
       <w:r>
-        <w:t xml:space="preserve">— Anything done to the pages is </w:t>
-      </w:r>
-      <w:r>
-        <w:t>undone with Ctrl + Z.</w:t>
+        <w:t>— Anything done to the pages is undone with Ctrl + Z.</w:t>
       </w:r>
     </w:p>
     <w:p>
@@ -10726,31 +10789,31 @@
       </w:rPr>
     </w:lvl>
   </w:abstractNum>
-  <w:num w:numId="1" w16cid:durableId="867304555">
+  <w:num w:numId="1" w16cid:durableId="1877892193">
     <w:abstractNumId w:val="8"/>
   </w:num>
-  <w:num w:numId="2" w16cid:durableId="1231498120">
+  <w:num w:numId="2" w16cid:durableId="51806155">
     <w:abstractNumId w:val="6"/>
   </w:num>
-  <w:num w:numId="3" w16cid:durableId="342360181">
+  <w:num w:numId="3" w16cid:durableId="392704078">
     <w:abstractNumId w:val="5"/>
   </w:num>
-  <w:num w:numId="4" w16cid:durableId="1780101343">
+  <w:num w:numId="4" w16cid:durableId="42796319">
     <w:abstractNumId w:val="4"/>
   </w:num>
-  <w:num w:numId="5" w16cid:durableId="410659898">
+  <w:num w:numId="5" w16cid:durableId="243342240">
     <w:abstractNumId w:val="7"/>
   </w:num>
-  <w:num w:numId="6" w16cid:durableId="1531603289">
+  <w:num w:numId="6" w16cid:durableId="1541671346">
     <w:abstractNumId w:val="3"/>
   </w:num>
-  <w:num w:numId="7" w16cid:durableId="888422544">
+  <w:num w:numId="7" w16cid:durableId="1321229141">
     <w:abstractNumId w:val="2"/>
   </w:num>
-  <w:num w:numId="8" w16cid:durableId="2029260349">
+  <w:num w:numId="8" w16cid:durableId="1218737888">
     <w:abstractNumId w:val="1"/>
   </w:num>
-  <w:num w:numId="9" w16cid:durableId="1636448545">
+  <w:num w:numId="9" w16cid:durableId="1451364778">
     <w:abstractNumId w:val="0"/>
   </w:num>
 </w:numbering>
@@ -22189,7 +22252,7 @@
     <w:autoRedefine/>
     <w:uiPriority w:val="39"/>
     <w:unhideWhenUsed/>
-    <w:rsid w:val="00AF7AD9"/>
+    <w:rsid w:val="00B638ED"/>
     <w:pPr>
       <w:spacing w:after="100"/>
     </w:pPr>
@@ -22201,7 +22264,7 @@
     <w:autoRedefine/>
     <w:uiPriority w:val="39"/>
     <w:unhideWhenUsed/>
-    <w:rsid w:val="00AF7AD9"/>
+    <w:rsid w:val="00B638ED"/>
     <w:pPr>
       <w:spacing w:after="100"/>
       <w:ind w:left="280"/>
@@ -22212,7 +22275,7 @@
     <w:basedOn w:val="a2"/>
     <w:uiPriority w:val="99"/>
     <w:unhideWhenUsed/>
-    <w:rsid w:val="00AF7AD9"/>
+    <w:rsid w:val="00B638ED"/>
     <w:rPr>
       <w:color w:val="0000FF" w:themeColor="hyperlink"/>
       <w:u w:val="single"/>

</xml_diff>

<commit_message>
Finalize 1.18.5 reliability and unified review
</commit_message>
<xml_diff>
--- a/docs/User manual.docx
+++ b/docs/User manual.docx
@@ -121,7 +121,7 @@
       <w:r>
         <w:fldChar w:fldCharType="separate"/>
       </w:r>
-      <w:hyperlink w:anchor="_Toc238650536" w:history="1">
+      <w:hyperlink w:anchor="_Toc238700710" w:history="1">
         <w:r>
           <w:rPr>
             <w:rStyle w:val="aff8"/>
@@ -149,7 +149,7 @@
             <w:noProof/>
             <w:webHidden/>
           </w:rPr>
-          <w:instrText xml:space="preserve"> PAGEREF _Toc238650536 \h </w:instrText>
+          <w:instrText xml:space="preserve"> PAGEREF _Toc238700710 \h </w:instrText>
         </w:r>
         <w:r>
           <w:rPr>
@@ -197,7 +197,7 @@
           <w14:ligatures w14:val="standardContextual"/>
         </w:rPr>
       </w:pPr>
-      <w:hyperlink w:anchor="_Toc238650537" w:history="1">
+      <w:hyperlink w:anchor="_Toc238700711" w:history="1">
         <w:r>
           <w:rPr>
             <w:rStyle w:val="aff8"/>
@@ -225,7 +225,7 @@
             <w:noProof/>
             <w:webHidden/>
           </w:rPr>
-          <w:instrText xml:space="preserve"> PAGEREF _Toc238650537 \h </w:instrText>
+          <w:instrText xml:space="preserve"> PAGEREF _Toc238700711 \h </w:instrText>
         </w:r>
         <w:r>
           <w:rPr>
@@ -273,7 +273,7 @@
           <w14:ligatures w14:val="standardContextual"/>
         </w:rPr>
       </w:pPr>
-      <w:hyperlink w:anchor="_Toc238650538" w:history="1">
+      <w:hyperlink w:anchor="_Toc238700712" w:history="1">
         <w:r>
           <w:rPr>
             <w:rStyle w:val="aff8"/>
@@ -301,7 +301,7 @@
             <w:noProof/>
             <w:webHidden/>
           </w:rPr>
-          <w:instrText xml:space="preserve"> PAGEREF _Toc238650538 \h </w:instrText>
+          <w:instrText xml:space="preserve"> PAGEREF _Toc238700712 \h </w:instrText>
         </w:r>
         <w:r>
           <w:rPr>
@@ -349,7 +349,7 @@
           <w14:ligatures w14:val="standardContextual"/>
         </w:rPr>
       </w:pPr>
-      <w:hyperlink w:anchor="_Toc238650539" w:history="1">
+      <w:hyperlink w:anchor="_Toc238700713" w:history="1">
         <w:r>
           <w:rPr>
             <w:rStyle w:val="aff8"/>
@@ -377,7 +377,7 @@
             <w:noProof/>
             <w:webHidden/>
           </w:rPr>
-          <w:instrText xml:space="preserve"> PAGEREF _Toc238650539 \h </w:instrText>
+          <w:instrText xml:space="preserve"> PAGEREF _Toc238700713 \h </w:instrText>
         </w:r>
         <w:r>
           <w:rPr>
@@ -425,7 +425,7 @@
           <w14:ligatures w14:val="standardContextual"/>
         </w:rPr>
       </w:pPr>
-      <w:hyperlink w:anchor="_Toc238650540" w:history="1">
+      <w:hyperlink w:anchor="_Toc238700714" w:history="1">
         <w:r>
           <w:rPr>
             <w:rStyle w:val="aff8"/>
@@ -453,7 +453,7 @@
             <w:noProof/>
             <w:webHidden/>
           </w:rPr>
-          <w:instrText xml:space="preserve"> PAGEREF _Toc238650540 \h </w:instrText>
+          <w:instrText xml:space="preserve"> PAGEREF _Toc238700714 \h </w:instrText>
         </w:r>
         <w:r>
           <w:rPr>
@@ -501,7 +501,7 @@
           <w14:ligatures w14:val="standardContextual"/>
         </w:rPr>
       </w:pPr>
-      <w:hyperlink w:anchor="_Toc238650541" w:history="1">
+      <w:hyperlink w:anchor="_Toc238700715" w:history="1">
         <w:r>
           <w:rPr>
             <w:rStyle w:val="aff8"/>
@@ -529,7 +529,7 @@
             <w:noProof/>
             <w:webHidden/>
           </w:rPr>
-          <w:instrText xml:space="preserve"> PAGEREF _Toc238650541 \h </w:instrText>
+          <w:instrText xml:space="preserve"> PAGEREF _Toc238700715 \h </w:instrText>
         </w:r>
         <w:r>
           <w:rPr>
@@ -577,7 +577,7 @@
           <w14:ligatures w14:val="standardContextual"/>
         </w:rPr>
       </w:pPr>
-      <w:hyperlink w:anchor="_Toc238650542" w:history="1">
+      <w:hyperlink w:anchor="_Toc238700716" w:history="1">
         <w:r>
           <w:rPr>
             <w:rStyle w:val="aff8"/>
@@ -605,7 +605,7 @@
             <w:noProof/>
             <w:webHidden/>
           </w:rPr>
-          <w:instrText xml:space="preserve"> PAGEREF _Toc238650542 \h </w:instrText>
+          <w:instrText xml:space="preserve"> PAGEREF _Toc238700716 \h </w:instrText>
         </w:r>
         <w:r>
           <w:rPr>
@@ -653,7 +653,7 @@
           <w14:ligatures w14:val="standardContextual"/>
         </w:rPr>
       </w:pPr>
-      <w:hyperlink w:anchor="_Toc238650543" w:history="1">
+      <w:hyperlink w:anchor="_Toc238700717" w:history="1">
         <w:r>
           <w:rPr>
             <w:rStyle w:val="aff8"/>
@@ -681,7 +681,7 @@
             <w:noProof/>
             <w:webHidden/>
           </w:rPr>
-          <w:instrText xml:space="preserve"> PAGEREF _Toc238650543 \h </w:instrText>
+          <w:instrText xml:space="preserve"> PAGEREF _Toc238700717 \h </w:instrText>
         </w:r>
         <w:r>
           <w:rPr>
@@ -729,7 +729,7 @@
           <w14:ligatures w14:val="standardContextual"/>
         </w:rPr>
       </w:pPr>
-      <w:hyperlink w:anchor="_Toc238650544" w:history="1">
+      <w:hyperlink w:anchor="_Toc238700718" w:history="1">
         <w:r>
           <w:rPr>
             <w:rStyle w:val="aff8"/>
@@ -757,7 +757,7 @@
             <w:noProof/>
             <w:webHidden/>
           </w:rPr>
-          <w:instrText xml:space="preserve"> PAGEREF _Toc238650544 \h </w:instrText>
+          <w:instrText xml:space="preserve"> PAGEREF _Toc238700718 \h </w:instrText>
         </w:r>
         <w:r>
           <w:rPr>
@@ -805,7 +805,7 @@
           <w14:ligatures w14:val="standardContextual"/>
         </w:rPr>
       </w:pPr>
-      <w:hyperlink w:anchor="_Toc238650545" w:history="1">
+      <w:hyperlink w:anchor="_Toc238700719" w:history="1">
         <w:r>
           <w:rPr>
             <w:rStyle w:val="aff8"/>
@@ -833,7 +833,7 @@
             <w:noProof/>
             <w:webHidden/>
           </w:rPr>
-          <w:instrText xml:space="preserve"> PAGEREF _Toc238650545 \h </w:instrText>
+          <w:instrText xml:space="preserve"> PAGEREF _Toc238700719 \h </w:instrText>
         </w:r>
         <w:r>
           <w:rPr>
@@ -881,7 +881,7 @@
           <w14:ligatures w14:val="standardContextual"/>
         </w:rPr>
       </w:pPr>
-      <w:hyperlink w:anchor="_Toc238650546" w:history="1">
+      <w:hyperlink w:anchor="_Toc238700720" w:history="1">
         <w:r>
           <w:rPr>
             <w:rStyle w:val="aff8"/>
@@ -909,7 +909,7 @@
             <w:noProof/>
             <w:webHidden/>
           </w:rPr>
-          <w:instrText xml:space="preserve"> PAGEREF _Toc238650546 \h </w:instrText>
+          <w:instrText xml:space="preserve"> PAGEREF _Toc238700720 \h </w:instrText>
         </w:r>
         <w:r>
           <w:rPr>
@@ -957,7 +957,7 @@
           <w14:ligatures w14:val="standardContextual"/>
         </w:rPr>
       </w:pPr>
-      <w:hyperlink w:anchor="_Toc238650547" w:history="1">
+      <w:hyperlink w:anchor="_Toc238700721" w:history="1">
         <w:r>
           <w:rPr>
             <w:rStyle w:val="aff8"/>
@@ -985,7 +985,7 @@
             <w:noProof/>
             <w:webHidden/>
           </w:rPr>
-          <w:instrText xml:space="preserve"> PAGEREF _Toc238650547 \h </w:instrText>
+          <w:instrText xml:space="preserve"> PAGEREF _Toc238700721 \h </w:instrText>
         </w:r>
         <w:r>
           <w:rPr>
@@ -1033,7 +1033,7 @@
           <w14:ligatures w14:val="standardContextual"/>
         </w:rPr>
       </w:pPr>
-      <w:hyperlink w:anchor="_Toc238650548" w:history="1">
+      <w:hyperlink w:anchor="_Toc238700722" w:history="1">
         <w:r>
           <w:rPr>
             <w:rStyle w:val="aff8"/>
@@ -1061,7 +1061,7 @@
             <w:noProof/>
             <w:webHidden/>
           </w:rPr>
-          <w:instrText xml:space="preserve"> PAGEREF _Toc238650548 \h </w:instrText>
+          <w:instrText xml:space="preserve"> PAGEREF _Toc238700722 \h </w:instrText>
         </w:r>
         <w:r>
           <w:rPr>
@@ -1109,7 +1109,7 @@
           <w14:ligatures w14:val="standardContextual"/>
         </w:rPr>
       </w:pPr>
-      <w:hyperlink w:anchor="_Toc238650549" w:history="1">
+      <w:hyperlink w:anchor="_Toc238700723" w:history="1">
         <w:r>
           <w:rPr>
             <w:rStyle w:val="aff8"/>
@@ -1137,7 +1137,7 @@
             <w:noProof/>
             <w:webHidden/>
           </w:rPr>
-          <w:instrText xml:space="preserve"> PAGEREF _Toc238650549 \h </w:instrText>
+          <w:instrText xml:space="preserve"> PAGEREF _Toc238700723 \h </w:instrText>
         </w:r>
         <w:r>
           <w:rPr>
@@ -1185,7 +1185,7 @@
           <w14:ligatures w14:val="standardContextual"/>
         </w:rPr>
       </w:pPr>
-      <w:hyperlink w:anchor="_Toc238650550" w:history="1">
+      <w:hyperlink w:anchor="_Toc238700724" w:history="1">
         <w:r>
           <w:rPr>
             <w:rStyle w:val="aff8"/>
@@ -1213,7 +1213,7 @@
             <w:noProof/>
             <w:webHidden/>
           </w:rPr>
-          <w:instrText xml:space="preserve"> PAGEREF _Toc238650550 \h </w:instrText>
+          <w:instrText xml:space="preserve"> PAGEREF _Toc238700724 \h </w:instrText>
         </w:r>
         <w:r>
           <w:rPr>
@@ -1261,7 +1261,7 @@
           <w14:ligatures w14:val="standardContextual"/>
         </w:rPr>
       </w:pPr>
-      <w:hyperlink w:anchor="_Toc238650551" w:history="1">
+      <w:hyperlink w:anchor="_Toc238700725" w:history="1">
         <w:r>
           <w:rPr>
             <w:rStyle w:val="aff8"/>
@@ -1289,7 +1289,7 @@
             <w:noProof/>
             <w:webHidden/>
           </w:rPr>
-          <w:instrText xml:space="preserve"> PAGEREF _Toc238650551 \h </w:instrText>
+          <w:instrText xml:space="preserve"> PAGEREF _Toc238700725 \h </w:instrText>
         </w:r>
         <w:r>
           <w:rPr>
@@ -1309,7 +1309,7 @@
             <w:noProof/>
             <w:webHidden/>
           </w:rPr>
-          <w:t>21</w:t>
+          <w:t>22</w:t>
         </w:r>
         <w:r>
           <w:rPr>
@@ -1337,7 +1337,7 @@
           <w14:ligatures w14:val="standardContextual"/>
         </w:rPr>
       </w:pPr>
-      <w:hyperlink w:anchor="_Toc238650552" w:history="1">
+      <w:hyperlink w:anchor="_Toc238700726" w:history="1">
         <w:r>
           <w:rPr>
             <w:rStyle w:val="aff8"/>
@@ -1365,7 +1365,7 @@
             <w:noProof/>
             <w:webHidden/>
           </w:rPr>
-          <w:instrText xml:space="preserve"> PAGEREF _Toc238650552 \h </w:instrText>
+          <w:instrText xml:space="preserve"> PAGEREF _Toc238700726 \h </w:instrText>
         </w:r>
         <w:r>
           <w:rPr>
@@ -1413,7 +1413,7 @@
           <w14:ligatures w14:val="standardContextual"/>
         </w:rPr>
       </w:pPr>
-      <w:hyperlink w:anchor="_Toc238650553" w:history="1">
+      <w:hyperlink w:anchor="_Toc238700727" w:history="1">
         <w:r>
           <w:rPr>
             <w:rStyle w:val="aff8"/>
@@ -1441,7 +1441,7 @@
             <w:noProof/>
             <w:webHidden/>
           </w:rPr>
-          <w:instrText xml:space="preserve"> PAGEREF _Toc238650553 \h </w:instrText>
+          <w:instrText xml:space="preserve"> PAGEREF _Toc238700727 \h </w:instrText>
         </w:r>
         <w:r>
           <w:rPr>
@@ -1489,7 +1489,7 @@
           <w14:ligatures w14:val="standardContextual"/>
         </w:rPr>
       </w:pPr>
-      <w:hyperlink w:anchor="_Toc238650554" w:history="1">
+      <w:hyperlink w:anchor="_Toc238700728" w:history="1">
         <w:r>
           <w:rPr>
             <w:rStyle w:val="aff8"/>
@@ -1517,7 +1517,7 @@
             <w:noProof/>
             <w:webHidden/>
           </w:rPr>
-          <w:instrText xml:space="preserve"> PAGEREF _Toc238650554 \h </w:instrText>
+          <w:instrText xml:space="preserve"> PAGEREF _Toc238700728 \h </w:instrText>
         </w:r>
         <w:r>
           <w:rPr>
@@ -1565,7 +1565,7 @@
           <w14:ligatures w14:val="standardContextual"/>
         </w:rPr>
       </w:pPr>
-      <w:hyperlink w:anchor="_Toc238650555" w:history="1">
+      <w:hyperlink w:anchor="_Toc238700729" w:history="1">
         <w:r>
           <w:rPr>
             <w:rStyle w:val="aff8"/>
@@ -1593,7 +1593,7 @@
             <w:noProof/>
             <w:webHidden/>
           </w:rPr>
-          <w:instrText xml:space="preserve"> PAGEREF _Toc238650555 \h </w:instrText>
+          <w:instrText xml:space="preserve"> PAGEREF _Toc238700729 \h </w:instrText>
         </w:r>
         <w:r>
           <w:rPr>
@@ -1641,7 +1641,7 @@
           <w14:ligatures w14:val="standardContextual"/>
         </w:rPr>
       </w:pPr>
-      <w:hyperlink w:anchor="_Toc238650556" w:history="1">
+      <w:hyperlink w:anchor="_Toc238700730" w:history="1">
         <w:r>
           <w:rPr>
             <w:rStyle w:val="aff8"/>
@@ -1669,7 +1669,7 @@
             <w:noProof/>
             <w:webHidden/>
           </w:rPr>
-          <w:instrText xml:space="preserve"> PAGEREF _Toc238650556 \h </w:instrText>
+          <w:instrText xml:space="preserve"> PAGEREF _Toc238700730 \h </w:instrText>
         </w:r>
         <w:r>
           <w:rPr>
@@ -1717,7 +1717,7 @@
           <w14:ligatures w14:val="standardContextual"/>
         </w:rPr>
       </w:pPr>
-      <w:hyperlink w:anchor="_Toc238650557" w:history="1">
+      <w:hyperlink w:anchor="_Toc238700731" w:history="1">
         <w:r>
           <w:rPr>
             <w:rStyle w:val="aff8"/>
@@ -1745,7 +1745,7 @@
             <w:noProof/>
             <w:webHidden/>
           </w:rPr>
-          <w:instrText xml:space="preserve"> PAGEREF _Toc238650557 \h </w:instrText>
+          <w:instrText xml:space="preserve"> PAGEREF _Toc238700731 \h </w:instrText>
         </w:r>
         <w:r>
           <w:rPr>
@@ -1793,7 +1793,7 @@
           <w14:ligatures w14:val="standardContextual"/>
         </w:rPr>
       </w:pPr>
-      <w:hyperlink w:anchor="_Toc238650558" w:history="1">
+      <w:hyperlink w:anchor="_Toc238700732" w:history="1">
         <w:r>
           <w:rPr>
             <w:rStyle w:val="aff8"/>
@@ -1821,7 +1821,7 @@
             <w:noProof/>
             <w:webHidden/>
           </w:rPr>
-          <w:instrText xml:space="preserve"> PAGEREF _Toc238650558 \h </w:instrText>
+          <w:instrText xml:space="preserve"> PAGEREF _Toc238700732 \h </w:instrText>
         </w:r>
         <w:r>
           <w:rPr>
@@ -1869,7 +1869,7 @@
           <w14:ligatures w14:val="standardContextual"/>
         </w:rPr>
       </w:pPr>
-      <w:hyperlink w:anchor="_Toc238650559" w:history="1">
+      <w:hyperlink w:anchor="_Toc238700733" w:history="1">
         <w:r>
           <w:rPr>
             <w:rStyle w:val="aff8"/>
@@ -1897,7 +1897,7 @@
             <w:noProof/>
             <w:webHidden/>
           </w:rPr>
-          <w:instrText xml:space="preserve"> PAGEREF _Toc238650559 \h </w:instrText>
+          <w:instrText xml:space="preserve"> PAGEREF _Toc238700733 \h </w:instrText>
         </w:r>
         <w:r>
           <w:rPr>
@@ -1945,7 +1945,7 @@
           <w14:ligatures w14:val="standardContextual"/>
         </w:rPr>
       </w:pPr>
-      <w:hyperlink w:anchor="_Toc238650560" w:history="1">
+      <w:hyperlink w:anchor="_Toc238700734" w:history="1">
         <w:r>
           <w:rPr>
             <w:rStyle w:val="aff8"/>
@@ -1973,7 +1973,7 @@
             <w:noProof/>
             <w:webHidden/>
           </w:rPr>
-          <w:instrText xml:space="preserve"> PAGEREF _Toc238650560 \h </w:instrText>
+          <w:instrText xml:space="preserve"> PAGEREF _Toc238700734 \h </w:instrText>
         </w:r>
         <w:r>
           <w:rPr>
@@ -2021,7 +2021,7 @@
           <w14:ligatures w14:val="standardContextual"/>
         </w:rPr>
       </w:pPr>
-      <w:hyperlink w:anchor="_Toc238650561" w:history="1">
+      <w:hyperlink w:anchor="_Toc238700735" w:history="1">
         <w:r>
           <w:rPr>
             <w:rStyle w:val="aff8"/>
@@ -2049,7 +2049,7 @@
             <w:noProof/>
             <w:webHidden/>
           </w:rPr>
-          <w:instrText xml:space="preserve"> PAGEREF _Toc238650561 \h </w:instrText>
+          <w:instrText xml:space="preserve"> PAGEREF _Toc238700735 \h </w:instrText>
         </w:r>
         <w:r>
           <w:rPr>
@@ -2097,7 +2097,7 @@
           <w14:ligatures w14:val="standardContextual"/>
         </w:rPr>
       </w:pPr>
-      <w:hyperlink w:anchor="_Toc238650562" w:history="1">
+      <w:hyperlink w:anchor="_Toc238700736" w:history="1">
         <w:r>
           <w:rPr>
             <w:rStyle w:val="aff8"/>
@@ -2125,7 +2125,7 @@
             <w:noProof/>
             <w:webHidden/>
           </w:rPr>
-          <w:instrText xml:space="preserve"> PAGEREF _Toc238650562 \h </w:instrText>
+          <w:instrText xml:space="preserve"> PAGEREF _Toc238700736 \h </w:instrText>
         </w:r>
         <w:r>
           <w:rPr>
@@ -2173,7 +2173,7 @@
           <w14:ligatures w14:val="standardContextual"/>
         </w:rPr>
       </w:pPr>
-      <w:hyperlink w:anchor="_Toc238650563" w:history="1">
+      <w:hyperlink w:anchor="_Toc238700737" w:history="1">
         <w:r>
           <w:rPr>
             <w:rStyle w:val="aff8"/>
@@ -2201,7 +2201,7 @@
             <w:noProof/>
             <w:webHidden/>
           </w:rPr>
-          <w:instrText xml:space="preserve"> PAGEREF _Toc238650563 \h </w:instrText>
+          <w:instrText xml:space="preserve"> PAGEREF _Toc238700737 \h </w:instrText>
         </w:r>
         <w:r>
           <w:rPr>
@@ -2249,7 +2249,7 @@
           <w14:ligatures w14:val="standardContextual"/>
         </w:rPr>
       </w:pPr>
-      <w:hyperlink w:anchor="_Toc238650564" w:history="1">
+      <w:hyperlink w:anchor="_Toc238700738" w:history="1">
         <w:r>
           <w:rPr>
             <w:rStyle w:val="aff8"/>
@@ -2277,7 +2277,7 @@
             <w:noProof/>
             <w:webHidden/>
           </w:rPr>
-          <w:instrText xml:space="preserve"> PAGEREF _Toc238650564 \h </w:instrText>
+          <w:instrText xml:space="preserve"> PAGEREF _Toc238700738 \h </w:instrText>
         </w:r>
         <w:r>
           <w:rPr>
@@ -2325,7 +2325,7 @@
           <w14:ligatures w14:val="standardContextual"/>
         </w:rPr>
       </w:pPr>
-      <w:hyperlink w:anchor="_Toc238650565" w:history="1">
+      <w:hyperlink w:anchor="_Toc238700739" w:history="1">
         <w:r>
           <w:rPr>
             <w:rStyle w:val="aff8"/>
@@ -2353,7 +2353,7 @@
             <w:noProof/>
             <w:webHidden/>
           </w:rPr>
-          <w:instrText xml:space="preserve"> PAGEREF _Toc238650565 \h </w:instrText>
+          <w:instrText xml:space="preserve"> PAGEREF _Toc238700739 \h </w:instrText>
         </w:r>
         <w:r>
           <w:rPr>
@@ -2401,7 +2401,7 @@
           <w14:ligatures w14:val="standardContextual"/>
         </w:rPr>
       </w:pPr>
-      <w:hyperlink w:anchor="_Toc238650566" w:history="1">
+      <w:hyperlink w:anchor="_Toc238700740" w:history="1">
         <w:r>
           <w:rPr>
             <w:rStyle w:val="aff8"/>
@@ -2429,7 +2429,7 @@
             <w:noProof/>
             <w:webHidden/>
           </w:rPr>
-          <w:instrText xml:space="preserve"> PAGEREF _Toc238650566 \h </w:instrText>
+          <w:instrText xml:space="preserve"> PAGEREF _Toc238700740 \h </w:instrText>
         </w:r>
         <w:r>
           <w:rPr>
@@ -2477,7 +2477,7 @@
           <w14:ligatures w14:val="standardContextual"/>
         </w:rPr>
       </w:pPr>
-      <w:hyperlink w:anchor="_Toc238650567" w:history="1">
+      <w:hyperlink w:anchor="_Toc238700741" w:history="1">
         <w:r>
           <w:rPr>
             <w:rStyle w:val="aff8"/>
@@ -2505,7 +2505,7 @@
             <w:noProof/>
             <w:webHidden/>
           </w:rPr>
-          <w:instrText xml:space="preserve"> PAGEREF _Toc238650567 \h </w:instrText>
+          <w:instrText xml:space="preserve"> PAGEREF _Toc238700741 \h </w:instrText>
         </w:r>
         <w:r>
           <w:rPr>
@@ -2553,7 +2553,7 @@
           <w14:ligatures w14:val="standardContextual"/>
         </w:rPr>
       </w:pPr>
-      <w:hyperlink w:anchor="_Toc238650568" w:history="1">
+      <w:hyperlink w:anchor="_Toc238700742" w:history="1">
         <w:r>
           <w:rPr>
             <w:rStyle w:val="aff8"/>
@@ -2581,7 +2581,7 @@
             <w:noProof/>
             <w:webHidden/>
           </w:rPr>
-          <w:instrText xml:space="preserve"> PAGEREF _Toc238650568 \h </w:instrText>
+          <w:instrText xml:space="preserve"> PAGEREF _Toc238700742 \h </w:instrText>
         </w:r>
         <w:r>
           <w:rPr>
@@ -2629,7 +2629,7 @@
           <w14:ligatures w14:val="standardContextual"/>
         </w:rPr>
       </w:pPr>
-      <w:hyperlink w:anchor="_Toc238650569" w:history="1">
+      <w:hyperlink w:anchor="_Toc238700743" w:history="1">
         <w:r>
           <w:rPr>
             <w:rStyle w:val="aff8"/>
@@ -2657,7 +2657,7 @@
             <w:noProof/>
             <w:webHidden/>
           </w:rPr>
-          <w:instrText xml:space="preserve"> PAGEREF _Toc238650569 \h </w:instrText>
+          <w:instrText xml:space="preserve"> PAGEREF _Toc238700743 \h </w:instrText>
         </w:r>
         <w:r>
           <w:rPr>
@@ -2705,7 +2705,7 @@
           <w14:ligatures w14:val="standardContextual"/>
         </w:rPr>
       </w:pPr>
-      <w:hyperlink w:anchor="_Toc238650570" w:history="1">
+      <w:hyperlink w:anchor="_Toc238700744" w:history="1">
         <w:r>
           <w:rPr>
             <w:rStyle w:val="aff8"/>
@@ -2733,7 +2733,7 @@
             <w:noProof/>
             <w:webHidden/>
           </w:rPr>
-          <w:instrText xml:space="preserve"> PAGEREF _Toc238650570 \h </w:instrText>
+          <w:instrText xml:space="preserve"> PAGEREF _Toc238700744 \h </w:instrText>
         </w:r>
         <w:r>
           <w:rPr>
@@ -2781,7 +2781,7 @@
           <w14:ligatures w14:val="standardContextual"/>
         </w:rPr>
       </w:pPr>
-      <w:hyperlink w:anchor="_Toc238650571" w:history="1">
+      <w:hyperlink w:anchor="_Toc238700745" w:history="1">
         <w:r>
           <w:rPr>
             <w:rStyle w:val="aff8"/>
@@ -2809,7 +2809,7 @@
             <w:noProof/>
             <w:webHidden/>
           </w:rPr>
-          <w:instrText xml:space="preserve"> PAGEREF _Toc238650571 \h </w:instrText>
+          <w:instrText xml:space="preserve"> PAGEREF _Toc238700745 \h </w:instrText>
         </w:r>
         <w:r>
           <w:rPr>
@@ -2857,7 +2857,7 @@
           <w14:ligatures w14:val="standardContextual"/>
         </w:rPr>
       </w:pPr>
-      <w:hyperlink w:anchor="_Toc238650572" w:history="1">
+      <w:hyperlink w:anchor="_Toc238700746" w:history="1">
         <w:r>
           <w:rPr>
             <w:rStyle w:val="aff8"/>
@@ -2885,7 +2885,7 @@
             <w:noProof/>
             <w:webHidden/>
           </w:rPr>
-          <w:instrText xml:space="preserve"> PAGEREF _Toc238650572 \h </w:instrText>
+          <w:instrText xml:space="preserve"> PAGEREF _Toc238700746 \h </w:instrText>
         </w:r>
         <w:r>
           <w:rPr>
@@ -2933,7 +2933,7 @@
           <w14:ligatures w14:val="standardContextual"/>
         </w:rPr>
       </w:pPr>
-      <w:hyperlink w:anchor="_Toc238650573" w:history="1">
+      <w:hyperlink w:anchor="_Toc238700747" w:history="1">
         <w:r>
           <w:rPr>
             <w:rStyle w:val="aff8"/>
@@ -2961,7 +2961,7 @@
             <w:noProof/>
             <w:webHidden/>
           </w:rPr>
-          <w:instrText xml:space="preserve"> PAGEREF _Toc238650573 \h </w:instrText>
+          <w:instrText xml:space="preserve"> PAGEREF _Toc238700747 \h </w:instrText>
         </w:r>
         <w:r>
           <w:rPr>
@@ -2981,7 +2981,7 @@
             <w:noProof/>
             <w:webHidden/>
           </w:rPr>
-          <w:t>40</w:t>
+          <w:t>41</w:t>
         </w:r>
         <w:r>
           <w:rPr>
@@ -3009,7 +3009,7 @@
           <w14:ligatures w14:val="standardContextual"/>
         </w:rPr>
       </w:pPr>
-      <w:hyperlink w:anchor="_Toc238650574" w:history="1">
+      <w:hyperlink w:anchor="_Toc238700748" w:history="1">
         <w:r>
           <w:rPr>
             <w:rStyle w:val="aff8"/>
@@ -3037,7 +3037,7 @@
             <w:noProof/>
             <w:webHidden/>
           </w:rPr>
-          <w:instrText xml:space="preserve"> PAGEREF _Toc238650574 \h </w:instrText>
+          <w:instrText xml:space="preserve"> PAGEREF _Toc238700748 \h </w:instrText>
         </w:r>
         <w:r>
           <w:rPr>
@@ -3085,7 +3085,7 @@
           <w14:ligatures w14:val="standardContextual"/>
         </w:rPr>
       </w:pPr>
-      <w:hyperlink w:anchor="_Toc238650575" w:history="1">
+      <w:hyperlink w:anchor="_Toc238700749" w:history="1">
         <w:r>
           <w:rPr>
             <w:rStyle w:val="aff8"/>
@@ -3113,7 +3113,7 @@
             <w:noProof/>
             <w:webHidden/>
           </w:rPr>
-          <w:instrText xml:space="preserve"> PAGEREF _Toc238650575 \h </w:instrText>
+          <w:instrText xml:space="preserve"> PAGEREF _Toc238700749 \h </w:instrText>
         </w:r>
         <w:r>
           <w:rPr>
@@ -3161,7 +3161,7 @@
           <w14:ligatures w14:val="standardContextual"/>
         </w:rPr>
       </w:pPr>
-      <w:hyperlink w:anchor="_Toc238650576" w:history="1">
+      <w:hyperlink w:anchor="_Toc238700750" w:history="1">
         <w:r>
           <w:rPr>
             <w:rStyle w:val="aff8"/>
@@ -3189,7 +3189,7 @@
             <w:noProof/>
             <w:webHidden/>
           </w:rPr>
-          <w:instrText xml:space="preserve"> PAGEREF _Toc238650576 \h </w:instrText>
+          <w:instrText xml:space="preserve"> PAGEREF _Toc238700750 \h </w:instrText>
         </w:r>
         <w:r>
           <w:rPr>
@@ -3237,7 +3237,7 @@
           <w14:ligatures w14:val="standardContextual"/>
         </w:rPr>
       </w:pPr>
-      <w:hyperlink w:anchor="_Toc238650577" w:history="1">
+      <w:hyperlink w:anchor="_Toc238700751" w:history="1">
         <w:r>
           <w:rPr>
             <w:rStyle w:val="aff8"/>
@@ -3265,7 +3265,7 @@
             <w:noProof/>
             <w:webHidden/>
           </w:rPr>
-          <w:instrText xml:space="preserve"> PAGEREF _Toc238650577 \h </w:instrText>
+          <w:instrText xml:space="preserve"> PAGEREF _Toc238700751 \h </w:instrText>
         </w:r>
         <w:r>
           <w:rPr>
@@ -3313,7 +3313,7 @@
           <w14:ligatures w14:val="standardContextual"/>
         </w:rPr>
       </w:pPr>
-      <w:hyperlink w:anchor="_Toc238650578" w:history="1">
+      <w:hyperlink w:anchor="_Toc238700752" w:history="1">
         <w:r>
           <w:rPr>
             <w:rStyle w:val="aff8"/>
@@ -3341,7 +3341,7 @@
             <w:noProof/>
             <w:webHidden/>
           </w:rPr>
-          <w:instrText xml:space="preserve"> PAGEREF _Toc238650578 \h </w:instrText>
+          <w:instrText xml:space="preserve"> PAGEREF _Toc238700752 \h </w:instrText>
         </w:r>
         <w:r>
           <w:rPr>
@@ -3389,7 +3389,7 @@
           <w14:ligatures w14:val="standardContextual"/>
         </w:rPr>
       </w:pPr>
-      <w:hyperlink w:anchor="_Toc238650579" w:history="1">
+      <w:hyperlink w:anchor="_Toc238700753" w:history="1">
         <w:r>
           <w:rPr>
             <w:rStyle w:val="aff8"/>
@@ -3417,7 +3417,7 @@
             <w:noProof/>
             <w:webHidden/>
           </w:rPr>
-          <w:instrText xml:space="preserve"> PAGEREF _Toc238650579 \h </w:instrText>
+          <w:instrText xml:space="preserve"> PAGEREF _Toc238700753 \h </w:instrText>
         </w:r>
         <w:r>
           <w:rPr>
@@ -3465,7 +3465,7 @@
           <w14:ligatures w14:val="standardContextual"/>
         </w:rPr>
       </w:pPr>
-      <w:hyperlink w:anchor="_Toc238650580" w:history="1">
+      <w:hyperlink w:anchor="_Toc238700754" w:history="1">
         <w:r>
           <w:rPr>
             <w:rStyle w:val="aff8"/>
@@ -3493,7 +3493,7 @@
             <w:noProof/>
             <w:webHidden/>
           </w:rPr>
-          <w:instrText xml:space="preserve"> PAGEREF _Toc238650580 \h </w:instrText>
+          <w:instrText xml:space="preserve"> PAGEREF _Toc238700754 \h </w:instrText>
         </w:r>
         <w:r>
           <w:rPr>
@@ -3541,7 +3541,7 @@
           <w14:ligatures w14:val="standardContextual"/>
         </w:rPr>
       </w:pPr>
-      <w:hyperlink w:anchor="_Toc238650581" w:history="1">
+      <w:hyperlink w:anchor="_Toc238700755" w:history="1">
         <w:r>
           <w:rPr>
             <w:rStyle w:val="aff8"/>
@@ -3569,7 +3569,7 @@
             <w:noProof/>
             <w:webHidden/>
           </w:rPr>
-          <w:instrText xml:space="preserve"> PAGEREF _Toc238650581 \h </w:instrText>
+          <w:instrText xml:space="preserve"> PAGEREF _Toc238700755 \h </w:instrText>
         </w:r>
         <w:r>
           <w:rPr>
@@ -3617,7 +3617,7 @@
           <w14:ligatures w14:val="standardContextual"/>
         </w:rPr>
       </w:pPr>
-      <w:hyperlink w:anchor="_Toc238650582" w:history="1">
+      <w:hyperlink w:anchor="_Toc238700756" w:history="1">
         <w:r>
           <w:rPr>
             <w:rStyle w:val="aff8"/>
@@ -3645,7 +3645,7 @@
             <w:noProof/>
             <w:webHidden/>
           </w:rPr>
-          <w:instrText xml:space="preserve"> PAGEREF _Toc238650582 \h </w:instrText>
+          <w:instrText xml:space="preserve"> PAGEREF _Toc238700756 \h </w:instrText>
         </w:r>
         <w:r>
           <w:rPr>
@@ -3693,7 +3693,7 @@
           <w14:ligatures w14:val="standardContextual"/>
         </w:rPr>
       </w:pPr>
-      <w:hyperlink w:anchor="_Toc238650583" w:history="1">
+      <w:hyperlink w:anchor="_Toc238700757" w:history="1">
         <w:r>
           <w:rPr>
             <w:rStyle w:val="aff8"/>
@@ -3721,7 +3721,7 @@
             <w:noProof/>
             <w:webHidden/>
           </w:rPr>
-          <w:instrText xml:space="preserve"> PAGEREF _Toc238650583 \h </w:instrText>
+          <w:instrText xml:space="preserve"> PAGEREF _Toc238700757 \h </w:instrText>
         </w:r>
         <w:r>
           <w:rPr>
@@ -3769,7 +3769,7 @@
           <w14:ligatures w14:val="standardContextual"/>
         </w:rPr>
       </w:pPr>
-      <w:hyperlink w:anchor="_Toc238650584" w:history="1">
+      <w:hyperlink w:anchor="_Toc238700758" w:history="1">
         <w:r>
           <w:rPr>
             <w:rStyle w:val="aff8"/>
@@ -3797,7 +3797,7 @@
             <w:noProof/>
             <w:webHidden/>
           </w:rPr>
-          <w:instrText xml:space="preserve"> PAGEREF _Toc238650584 \h </w:instrText>
+          <w:instrText xml:space="preserve"> PAGEREF _Toc238700758 \h </w:instrText>
         </w:r>
         <w:r>
           <w:rPr>
@@ -3845,7 +3845,7 @@
           <w14:ligatures w14:val="standardContextual"/>
         </w:rPr>
       </w:pPr>
-      <w:hyperlink w:anchor="_Toc238650585" w:history="1">
+      <w:hyperlink w:anchor="_Toc238700759" w:history="1">
         <w:r>
           <w:rPr>
             <w:rStyle w:val="aff8"/>
@@ -3873,7 +3873,7 @@
             <w:noProof/>
             <w:webHidden/>
           </w:rPr>
-          <w:instrText xml:space="preserve"> PAGEREF _Toc238650585 \h </w:instrText>
+          <w:instrText xml:space="preserve"> PAGEREF _Toc238700759 \h </w:instrText>
         </w:r>
         <w:r>
           <w:rPr>
@@ -3921,7 +3921,7 @@
           <w14:ligatures w14:val="standardContextual"/>
         </w:rPr>
       </w:pPr>
-      <w:hyperlink w:anchor="_Toc238650586" w:history="1">
+      <w:hyperlink w:anchor="_Toc238700760" w:history="1">
         <w:r>
           <w:rPr>
             <w:rStyle w:val="aff8"/>
@@ -3949,7 +3949,7 @@
             <w:noProof/>
             <w:webHidden/>
           </w:rPr>
-          <w:instrText xml:space="preserve"> PAGEREF _Toc238650586 \h </w:instrText>
+          <w:instrText xml:space="preserve"> PAGEREF _Toc238700760 \h </w:instrText>
         </w:r>
         <w:r>
           <w:rPr>
@@ -3997,7 +3997,7 @@
           <w14:ligatures w14:val="standardContextual"/>
         </w:rPr>
       </w:pPr>
-      <w:hyperlink w:anchor="_Toc238650587" w:history="1">
+      <w:hyperlink w:anchor="_Toc238700761" w:history="1">
         <w:r>
           <w:rPr>
             <w:rStyle w:val="aff8"/>
@@ -4025,7 +4025,7 @@
             <w:noProof/>
             <w:webHidden/>
           </w:rPr>
-          <w:instrText xml:space="preserve"> PAGEREF _Toc238650587 \h </w:instrText>
+          <w:instrText xml:space="preserve"> PAGEREF _Toc238700761 \h </w:instrText>
         </w:r>
         <w:r>
           <w:rPr>
@@ -4073,7 +4073,7 @@
           <w14:ligatures w14:val="standardContextual"/>
         </w:rPr>
       </w:pPr>
-      <w:hyperlink w:anchor="_Toc238650588" w:history="1">
+      <w:hyperlink w:anchor="_Toc238700762" w:history="1">
         <w:r>
           <w:rPr>
             <w:rStyle w:val="aff8"/>
@@ -4101,7 +4101,7 @@
             <w:noProof/>
             <w:webHidden/>
           </w:rPr>
-          <w:instrText xml:space="preserve"> PAGEREF _Toc238650588 \h </w:instrText>
+          <w:instrText xml:space="preserve"> PAGEREF _Toc238700762 \h </w:instrText>
         </w:r>
         <w:r>
           <w:rPr>
@@ -4149,7 +4149,7 @@
           <w14:ligatures w14:val="standardContextual"/>
         </w:rPr>
       </w:pPr>
-      <w:hyperlink w:anchor="_Toc238650589" w:history="1">
+      <w:hyperlink w:anchor="_Toc238700763" w:history="1">
         <w:r>
           <w:rPr>
             <w:rStyle w:val="aff8"/>
@@ -4177,7 +4177,7 @@
             <w:noProof/>
             <w:webHidden/>
           </w:rPr>
-          <w:instrText xml:space="preserve"> PAGEREF _Toc238650589 \h </w:instrText>
+          <w:instrText xml:space="preserve"> PAGEREF _Toc238700763 \h </w:instrText>
         </w:r>
         <w:r>
           <w:rPr>
@@ -4225,7 +4225,7 @@
           <w14:ligatures w14:val="standardContextual"/>
         </w:rPr>
       </w:pPr>
-      <w:hyperlink w:anchor="_Toc238650590" w:history="1">
+      <w:hyperlink w:anchor="_Toc238700764" w:history="1">
         <w:r>
           <w:rPr>
             <w:rStyle w:val="aff8"/>
@@ -4253,7 +4253,7 @@
             <w:noProof/>
             <w:webHidden/>
           </w:rPr>
-          <w:instrText xml:space="preserve"> PAGEREF _Toc238650590 \h </w:instrText>
+          <w:instrText xml:space="preserve"> PAGEREF _Toc238700764 \h </w:instrText>
         </w:r>
         <w:r>
           <w:rPr>
@@ -4301,7 +4301,7 @@
           <w14:ligatures w14:val="standardContextual"/>
         </w:rPr>
       </w:pPr>
-      <w:hyperlink w:anchor="_Toc238650591" w:history="1">
+      <w:hyperlink w:anchor="_Toc238700765" w:history="1">
         <w:r>
           <w:rPr>
             <w:rStyle w:val="aff8"/>
@@ -4329,7 +4329,7 @@
             <w:noProof/>
             <w:webHidden/>
           </w:rPr>
-          <w:instrText xml:space="preserve"> PAGEREF _Toc238650591 \h </w:instrText>
+          <w:instrText xml:space="preserve"> PAGEREF _Toc238700765 \h </w:instrText>
         </w:r>
         <w:r>
           <w:rPr>
@@ -4377,7 +4377,7 @@
           <w14:ligatures w14:val="standardContextual"/>
         </w:rPr>
       </w:pPr>
-      <w:hyperlink w:anchor="_Toc238650592" w:history="1">
+      <w:hyperlink w:anchor="_Toc238700766" w:history="1">
         <w:r>
           <w:rPr>
             <w:rStyle w:val="aff8"/>
@@ -4405,7 +4405,7 @@
             <w:noProof/>
             <w:webHidden/>
           </w:rPr>
-          <w:instrText xml:space="preserve"> PAGEREF _Toc238650592 \h </w:instrText>
+          <w:instrText xml:space="preserve"> PAGEREF _Toc238700766 \h </w:instrText>
         </w:r>
         <w:r>
           <w:rPr>
@@ -4453,7 +4453,7 @@
           <w14:ligatures w14:val="standardContextual"/>
         </w:rPr>
       </w:pPr>
-      <w:hyperlink w:anchor="_Toc238650593" w:history="1">
+      <w:hyperlink w:anchor="_Toc238700767" w:history="1">
         <w:r>
           <w:rPr>
             <w:rStyle w:val="aff8"/>
@@ -4481,7 +4481,7 @@
             <w:noProof/>
             <w:webHidden/>
           </w:rPr>
-          <w:instrText xml:space="preserve"> PAGEREF _Toc238650593 \h </w:instrText>
+          <w:instrText xml:space="preserve"> PAGEREF _Toc238700767 \h </w:instrText>
         </w:r>
         <w:r>
           <w:rPr>
@@ -4529,7 +4529,7 @@
           <w14:ligatures w14:val="standardContextual"/>
         </w:rPr>
       </w:pPr>
-      <w:hyperlink w:anchor="_Toc238650594" w:history="1">
+      <w:hyperlink w:anchor="_Toc238700768" w:history="1">
         <w:r>
           <w:rPr>
             <w:rStyle w:val="aff8"/>
@@ -4557,7 +4557,7 @@
             <w:noProof/>
             <w:webHidden/>
           </w:rPr>
-          <w:instrText xml:space="preserve"> PAGEREF _Toc238650594 \h </w:instrText>
+          <w:instrText xml:space="preserve"> PAGEREF _Toc238700768 \h </w:instrText>
         </w:r>
         <w:r>
           <w:rPr>
@@ -4605,7 +4605,7 @@
           <w14:ligatures w14:val="standardContextual"/>
         </w:rPr>
       </w:pPr>
-      <w:hyperlink w:anchor="_Toc238650595" w:history="1">
+      <w:hyperlink w:anchor="_Toc238700769" w:history="1">
         <w:r>
           <w:rPr>
             <w:rStyle w:val="aff8"/>
@@ -4633,7 +4633,7 @@
             <w:noProof/>
             <w:webHidden/>
           </w:rPr>
-          <w:instrText xml:space="preserve"> PAGEREF _Toc238650595 \h </w:instrText>
+          <w:instrText xml:space="preserve"> PAGEREF _Toc238700769 \h </w:instrText>
         </w:r>
         <w:r>
           <w:rPr>
@@ -4681,7 +4681,7 @@
           <w14:ligatures w14:val="standardContextual"/>
         </w:rPr>
       </w:pPr>
-      <w:hyperlink w:anchor="_Toc238650596" w:history="1">
+      <w:hyperlink w:anchor="_Toc238700770" w:history="1">
         <w:r>
           <w:rPr>
             <w:rStyle w:val="aff8"/>
@@ -4709,7 +4709,7 @@
             <w:noProof/>
             <w:webHidden/>
           </w:rPr>
-          <w:instrText xml:space="preserve"> PAGEREF _Toc238650596 \h </w:instrText>
+          <w:instrText xml:space="preserve"> PAGEREF _Toc238700770 \h </w:instrText>
         </w:r>
         <w:r>
           <w:rPr>
@@ -4757,7 +4757,7 @@
           <w14:ligatures w14:val="standardContextual"/>
         </w:rPr>
       </w:pPr>
-      <w:hyperlink w:anchor="_Toc238650597" w:history="1">
+      <w:hyperlink w:anchor="_Toc238700771" w:history="1">
         <w:r>
           <w:rPr>
             <w:rStyle w:val="aff8"/>
@@ -4785,7 +4785,7 @@
             <w:noProof/>
             <w:webHidden/>
           </w:rPr>
-          <w:instrText xml:space="preserve"> PAGEREF _Toc238650597 \h </w:instrText>
+          <w:instrText xml:space="preserve"> PAGEREF _Toc238700771 \h </w:instrText>
         </w:r>
         <w:r>
           <w:rPr>
@@ -4833,7 +4833,7 @@
           <w14:ligatures w14:val="standardContextual"/>
         </w:rPr>
       </w:pPr>
-      <w:hyperlink w:anchor="_Toc238650598" w:history="1">
+      <w:hyperlink w:anchor="_Toc238700772" w:history="1">
         <w:r>
           <w:rPr>
             <w:rStyle w:val="aff8"/>
@@ -4861,7 +4861,7 @@
             <w:noProof/>
             <w:webHidden/>
           </w:rPr>
-          <w:instrText xml:space="preserve"> PAGEREF _Toc238650598 \h </w:instrText>
+          <w:instrText xml:space="preserve"> PAGEREF _Toc238700772 \h </w:instrText>
         </w:r>
         <w:r>
           <w:rPr>
@@ -4909,7 +4909,7 @@
       <w:pPr>
         <w:pStyle w:val="1"/>
       </w:pPr>
-      <w:bookmarkStart w:id="0" w:name="_Toc238650536"/>
+      <w:bookmarkStart w:id="0" w:name="_Toc238700710"/>
       <w:r>
         <w:lastRenderedPageBreak/>
         <w:t>1. About the program</w:t>
@@ -4920,7 +4920,7 @@
       <w:pPr>
         <w:pStyle w:val="21"/>
       </w:pPr>
-      <w:bookmarkStart w:id="1" w:name="_Toc238650537"/>
+      <w:bookmarkStart w:id="1" w:name="_Toc238700711"/>
       <w:r>
         <w:t>1.1. What it is for</w:t>
       </w:r>
@@ -5399,7 +5399,7 @@
       <w:pPr>
         <w:pStyle w:val="21"/>
       </w:pPr>
-      <w:bookmarkStart w:id="2" w:name="_Toc238650538"/>
+      <w:bookmarkStart w:id="2" w:name="_Toc238700712"/>
       <w:r>
         <w:t>1.2. What the program gives you</w:t>
       </w:r>
@@ -5484,7 +5484,7 @@
       <w:pPr>
         <w:pStyle w:val="21"/>
       </w:pPr>
-      <w:bookmarkStart w:id="3" w:name="_Toc238650539"/>
+      <w:bookmarkStart w:id="3" w:name="_Toc238700713"/>
       <w:r>
         <w:lastRenderedPageBreak/>
         <w:t>1.3. What the workplace needs</w:t>
@@ -5511,7 +5511,7 @@
       <w:pPr>
         <w:pStyle w:val="21"/>
       </w:pPr>
-      <w:bookmarkStart w:id="4" w:name="_Toc238650540"/>
+      <w:bookmarkStart w:id="4" w:name="_Toc238700714"/>
       <w:r>
         <w:t>1.4. Installing, starting and updating</w:t>
       </w:r>
@@ -5594,7 +5594,7 @@
       <w:pPr>
         <w:pStyle w:val="1"/>
       </w:pPr>
-      <w:bookmarkStart w:id="5" w:name="_Toc238650541"/>
+      <w:bookmarkStart w:id="5" w:name="_Toc238700715"/>
       <w:r>
         <w:t>2. How working with the program is arranged</w:t>
       </w:r>
@@ -5604,7 +5604,7 @@
       <w:pPr>
         <w:pStyle w:val="21"/>
       </w:pPr>
-      <w:bookmarkStart w:id="6" w:name="_Toc238650542"/>
+      <w:bookmarkStart w:id="6" w:name="_Toc238700716"/>
       <w:r>
         <w:t>2.1. The start screen</w:t>
       </w:r>
@@ -5628,7 +5628,7 @@
         </w:rPr>
         <w:lastRenderedPageBreak/>
         <w:drawing>
-          <wp:inline distT="0" distB="0" distL="0" distR="0" wp14:anchorId="5C0C937C" wp14:editId="6982D80E">
+          <wp:inline distT="0" distB="0" distL="0" distR="0" wp14:anchorId="3125B74A" wp14:editId="0EF55925">
             <wp:extent cx="5760000" cy="5127111"/>
             <wp:effectExtent l="0" t="0" r="0" b="0"/>
             <wp:docPr id="1" name="Picture 1"/>
@@ -5695,7 +5695,7 @@
         </w:rPr>
         <w:lastRenderedPageBreak/>
         <w:drawing>
-          <wp:inline distT="0" distB="0" distL="0" distR="0" wp14:anchorId="5BA79363" wp14:editId="46CE11EF">
+          <wp:inline distT="0" distB="0" distL="0" distR="0" wp14:anchorId="756989F3" wp14:editId="6CDE213E">
             <wp:extent cx="5760000" cy="5134830"/>
             <wp:effectExtent l="0" t="0" r="0" b="0"/>
             <wp:docPr id="2" name="Picture 2"/>
@@ -5779,7 +5779,7 @@
       <w:pPr>
         <w:pStyle w:val="21"/>
       </w:pPr>
-      <w:bookmarkStart w:id="7" w:name="_Toc238650543"/>
+      <w:bookmarkStart w:id="7" w:name="_Toc238700717"/>
       <w:r>
         <w:t>2.2. The language of the interface</w:t>
       </w:r>
@@ -5802,7 +5802,7 @@
           <w:noProof/>
         </w:rPr>
         <w:drawing>
-          <wp:inline distT="0" distB="0" distL="0" distR="0" wp14:anchorId="6A92D6E9" wp14:editId="1E4BA7BA">
+          <wp:inline distT="0" distB="0" distL="0" distR="0" wp14:anchorId="20AE2C01" wp14:editId="54DAEC2B">
             <wp:extent cx="5760000" cy="5127111"/>
             <wp:effectExtent l="0" t="0" r="0" b="0"/>
             <wp:docPr id="3" name="Picture 3"/>
@@ -5875,7 +5875,7 @@
       <w:pPr>
         <w:pStyle w:val="21"/>
       </w:pPr>
-      <w:bookmarkStart w:id="8" w:name="_Toc238650544"/>
+      <w:bookmarkStart w:id="8" w:name="_Toc238700718"/>
       <w:r>
         <w:t>2.3. The built-in help</w:t>
       </w:r>
@@ -5898,7 +5898,7 @@
           <w:noProof/>
         </w:rPr>
         <w:drawing>
-          <wp:inline distT="0" distB="0" distL="0" distR="0" wp14:anchorId="576E4071" wp14:editId="3BAB1FE5">
+          <wp:inline distT="0" distB="0" distL="0" distR="0" wp14:anchorId="6DA3043C" wp14:editId="21E6711A">
             <wp:extent cx="3133777" cy="6119999"/>
             <wp:effectExtent l="0" t="0" r="0" b="0"/>
             <wp:docPr id="4" name="Picture 4"/>
@@ -5962,7 +5962,7 @@
           <w:noProof/>
         </w:rPr>
         <w:drawing>
-          <wp:inline distT="0" distB="0" distL="0" distR="0" wp14:anchorId="2EF35CCC" wp14:editId="493BD853">
+          <wp:inline distT="0" distB="0" distL="0" distR="0" wp14:anchorId="208DBD4D" wp14:editId="78A3F80E">
             <wp:extent cx="3707476" cy="2859578"/>
             <wp:effectExtent l="0" t="0" r="0" b="0"/>
             <wp:docPr id="5" name="Picture 5"/>
@@ -6543,7 +6543,7 @@
       <w:pPr>
         <w:pStyle w:val="21"/>
       </w:pPr>
-      <w:bookmarkStart w:id="9" w:name="_Toc238650545"/>
+      <w:bookmarkStart w:id="9" w:name="_Toc238700719"/>
       <w:r>
         <w:lastRenderedPageBreak/>
         <w:t>2.4. The page grid</w:t>
@@ -6578,7 +6578,7 @@
         </w:rPr>
         <w:lastRenderedPageBreak/>
         <w:drawing>
-          <wp:inline distT="0" distB="0" distL="0" distR="0" wp14:anchorId="17E6B64E" wp14:editId="08EC9320">
+          <wp:inline distT="0" distB="0" distL="0" distR="0" wp14:anchorId="45701D0F" wp14:editId="7917988B">
             <wp:extent cx="5760000" cy="4608000"/>
             <wp:effectExtent l="0" t="0" r="0" b="0"/>
             <wp:docPr id="6" name="Picture 6"/>
@@ -6641,7 +6641,7 @@
           <w:noProof/>
         </w:rPr>
         <w:drawing>
-          <wp:inline distT="0" distB="0" distL="0" distR="0" wp14:anchorId="76D4DC5B" wp14:editId="5F1695EE">
+          <wp:inline distT="0" distB="0" distL="0" distR="0" wp14:anchorId="1944135F" wp14:editId="63A7D530">
             <wp:extent cx="2543694" cy="1255222"/>
             <wp:effectExtent l="0" t="0" r="0" b="0"/>
             <wp:docPr id="7" name="Picture 7"/>
@@ -6719,7 +6719,7 @@
       <w:pPr>
         <w:pStyle w:val="21"/>
       </w:pPr>
-      <w:bookmarkStart w:id="10" w:name="_Toc238650546"/>
+      <w:bookmarkStart w:id="10" w:name="_Toc238700720"/>
       <w:r>
         <w:lastRenderedPageBreak/>
         <w:t>2.5. Viewing a page full size</w:t>
@@ -6743,7 +6743,7 @@
           <w:noProof/>
         </w:rPr>
         <w:drawing>
-          <wp:inline distT="0" distB="0" distL="0" distR="0" wp14:anchorId="0082A382" wp14:editId="2EC74FC0">
+          <wp:inline distT="0" distB="0" distL="0" distR="0" wp14:anchorId="38AA7CB0" wp14:editId="7F7E3524">
             <wp:extent cx="5338723" cy="6120000"/>
             <wp:effectExtent l="0" t="0" r="0" b="0"/>
             <wp:docPr id="8" name="Picture 8"/>
@@ -6807,7 +6807,7 @@
       <w:pPr>
         <w:pStyle w:val="21"/>
       </w:pPr>
-      <w:bookmarkStart w:id="11" w:name="_Toc238650547"/>
+      <w:bookmarkStart w:id="11" w:name="_Toc238700721"/>
       <w:r>
         <w:t>2.6. Printing</w:t>
       </w:r>
@@ -6827,7 +6827,7 @@
       <w:pPr>
         <w:pStyle w:val="21"/>
       </w:pPr>
-      <w:bookmarkStart w:id="12" w:name="_Toc238650548"/>
+      <w:bookmarkStart w:id="12" w:name="_Toc238700722"/>
       <w:r>
         <w:t>2.7. Making the file smaller (compression)</w:t>
       </w:r>
@@ -6851,7 +6851,7 @@
         </w:rPr>
         <w:lastRenderedPageBreak/>
         <w:drawing>
-          <wp:inline distT="0" distB="0" distL="0" distR="0" wp14:anchorId="2F4B41F5" wp14:editId="752E24BC">
+          <wp:inline distT="0" distB="0" distL="0" distR="0" wp14:anchorId="27C991AD" wp14:editId="7AE66D64">
             <wp:extent cx="5760000" cy="4608000"/>
             <wp:effectExtent l="0" t="0" r="0" b="0"/>
             <wp:docPr id="9" name="Picture 9"/>
@@ -7215,7 +7215,7 @@
           <w:noProof/>
         </w:rPr>
         <w:drawing>
-          <wp:inline distT="0" distB="0" distL="0" distR="0" wp14:anchorId="064448DC" wp14:editId="04ABC1DE">
+          <wp:inline distT="0" distB="0" distL="0" distR="0" wp14:anchorId="74FF8378" wp14:editId="09639366">
             <wp:extent cx="5760000" cy="2724324"/>
             <wp:effectExtent l="0" t="0" r="0" b="0"/>
             <wp:docPr id="10" name="Picture 10"/>
@@ -7276,7 +7276,7 @@
       <w:pPr>
         <w:pStyle w:val="21"/>
       </w:pPr>
-      <w:bookmarkStart w:id="13" w:name="_Toc238650549"/>
+      <w:bookmarkStart w:id="13" w:name="_Toc238700723"/>
       <w:r>
         <w:t>2.8. Settings</w:t>
       </w:r>
@@ -7300,7 +7300,7 @@
         </w:rPr>
         <w:lastRenderedPageBreak/>
         <w:drawing>
-          <wp:inline distT="0" distB="0" distL="0" distR="0" wp14:anchorId="4C391FFD" wp14:editId="468D0B8B">
+          <wp:inline distT="0" distB="0" distL="0" distR="0" wp14:anchorId="4C1A6CD2" wp14:editId="2CCD9A0B">
             <wp:extent cx="3873730" cy="4588624"/>
             <wp:effectExtent l="0" t="0" r="0" b="0"/>
             <wp:docPr id="11" name="Picture 11"/>
@@ -7348,7 +7348,7 @@
     </w:p>
     <w:p>
       <w:r>
-        <w:t>“Check for updates at startup” is the only request the program makes to the network. Only a request for the latest version number is sent; no files and no data of yours are ever sent. The check can be switched off entirely, and the “Check now” button asks on demand.</w:t>
+        <w:t>“Check for updates at startup” is the only request the program makes to the network. Only the latest version number is requested; no files and no data of yours are ever sent. The “Check now” button asks on demand. A separate setting controls What's New: it appears once for a new version, can be disabled, and can always be reopened with “What's new in 1.18.5”. Optional details for supporting this independently developed app are collapsed inside that window by default.</w:t>
       </w:r>
     </w:p>
     <w:p>
@@ -7364,6 +7364,7 @@
         <w:rPr>
           <w:b/>
         </w:rPr>
+        <w:lastRenderedPageBreak/>
         <w:t xml:space="preserve">Note. </w:t>
       </w:r>
       <w:r>
@@ -7375,7 +7376,6 @@
     </w:p>
     <w:p>
       <w:r>
-        <w:lastRenderedPageBreak/>
         <w:t>The compression level and the thumbnail zoom are deliberately left out of Settings: they are changed while working, and walking to a separate window for each file would take longer than the work itself.</w:t>
       </w:r>
     </w:p>
@@ -7383,7 +7383,7 @@
       <w:pPr>
         <w:pStyle w:val="21"/>
       </w:pPr>
-      <w:bookmarkStart w:id="14" w:name="_Toc238650550"/>
+      <w:bookmarkStart w:id="14" w:name="_Toc238700724"/>
       <w:r>
         <w:t>2.9. Statistics</w:t>
       </w:r>
@@ -7406,7 +7406,7 @@
           <w:noProof/>
         </w:rPr>
         <w:drawing>
-          <wp:inline distT="0" distB="0" distL="0" distR="0" wp14:anchorId="2C00BD26" wp14:editId="336512A1">
+          <wp:inline distT="0" distB="0" distL="0" distR="0" wp14:anchorId="669B6518" wp14:editId="72824666">
             <wp:extent cx="3707476" cy="4148051"/>
             <wp:effectExtent l="0" t="0" r="0" b="0"/>
             <wp:docPr id="12" name="Picture 12"/>
@@ -7461,19 +7461,16 @@
       <w:pPr>
         <w:pStyle w:val="21"/>
       </w:pPr>
-      <w:bookmarkStart w:id="15" w:name="_Toc238650551"/>
-      <w:r>
+      <w:bookmarkStart w:id="15" w:name="_Toc238700725"/>
+      <w:r>
+        <w:lastRenderedPageBreak/>
         <w:t>2.10. What happens to your files</w:t>
       </w:r>
       <w:bookmarkEnd w:id="15"/>
     </w:p>
     <w:p>
       <w:r>
-        <w:t xml:space="preserve">The program does not send documents anywhere, does not keep copies of them and does not log their contents. All it writes is window settings, operation </w:t>
-      </w:r>
-      <w:r>
-        <w:lastRenderedPageBreak/>
-        <w:t>counters and reports on merging Excel workbooks. A report holds the names of files and sheets, not what is in them.</w:t>
+        <w:t>The program does not send documents anywhere, does not keep copies of them and does not log their contents. All it writes is window settings, operation counters and reports on merging Excel workbooks. A report holds the names of files and sheets, not what is in them.</w:t>
       </w:r>
     </w:p>
     <w:p>
@@ -7485,7 +7482,7 @@
       <w:pPr>
         <w:pStyle w:val="1"/>
       </w:pPr>
-      <w:bookmarkStart w:id="16" w:name="_Toc238650552"/>
+      <w:bookmarkStart w:id="16" w:name="_Toc238700726"/>
       <w:r>
         <w:t>3. Merge PDF</w:t>
       </w:r>
@@ -7495,7 +7492,7 @@
       <w:pPr>
         <w:pStyle w:val="21"/>
       </w:pPr>
-      <w:bookmarkStart w:id="17" w:name="_Toc238650553"/>
+      <w:bookmarkStart w:id="17" w:name="_Toc238700727"/>
       <w:r>
         <w:t>3.1. What it is for</w:t>
       </w:r>
@@ -7508,17 +7505,14 @@
     </w:p>
     <w:p>
       <w:r>
-        <w:t xml:space="preserve">Its </w:t>
-      </w:r>
-      <w:r>
-        <w:t>main property is that pages are copied as they are, without being converted again. A scan stays the same scan; stamps and signatures do not drift. That is why merging is safe for documents that will travel further up the chain.</w:t>
+        <w:t>Its main property is that pages are copied as they are, without being converted again. A scan stays the same scan; stamps and signatures do not drift. That is why merging is safe for documents that will travel further up the chain.</w:t>
       </w:r>
     </w:p>
     <w:p>
       <w:pPr>
         <w:pStyle w:val="21"/>
       </w:pPr>
-      <w:bookmarkStart w:id="18" w:name="_Toc238650554"/>
+      <w:bookmarkStart w:id="18" w:name="_Toc238700728"/>
       <w:r>
         <w:t>3.2. The window</w:t>
       </w:r>
@@ -7526,10 +7520,10 @@
     </w:p>
     <w:p>
       <w:r>
-        <w:t xml:space="preserve">On the </w:t>
-      </w:r>
-      <w:r>
-        <w:t>left is the grid of pages of all the added files, on the right the actions on them, at the bottom the zoom, the compression and the save button (fig. 13).</w:t>
+        <w:t xml:space="preserve">On the left is the grid of pages of all the added </w:t>
+      </w:r>
+      <w:r>
+        <w:t>files, on the right the actions on them, at the bottom the zoom, the compression and the save button (fig. 13).</w:t>
       </w:r>
     </w:p>
     <w:p>
@@ -7545,7 +7539,7 @@
         </w:rPr>
         <w:lastRenderedPageBreak/>
         <w:drawing>
-          <wp:inline distT="0" distB="0" distL="0" distR="0" wp14:anchorId="47886A54" wp14:editId="5763E910">
+          <wp:inline distT="0" distB="0" distL="0" distR="0" wp14:anchorId="0AD39A7D" wp14:editId="72DA6262">
             <wp:extent cx="5760000" cy="4608000"/>
             <wp:effectExtent l="0" t="0" r="0" b="0"/>
             <wp:docPr id="13" name="Picture 13"/>
@@ -7595,7 +7589,7 @@
       <w:pPr>
         <w:pStyle w:val="21"/>
       </w:pPr>
-      <w:bookmarkStart w:id="19" w:name="_Toc238650555"/>
+      <w:bookmarkStart w:id="19" w:name="_Toc238700729"/>
       <w:r>
         <w:t>3.3. The order of work</w:t>
       </w:r>
@@ -7649,7 +7643,7 @@
       <w:pPr>
         <w:pStyle w:val="21"/>
       </w:pPr>
-      <w:bookmarkStart w:id="20" w:name="_Toc238650556"/>
+      <w:bookmarkStart w:id="20" w:name="_Toc238700730"/>
       <w:r>
         <w:lastRenderedPageBreak/>
         <w:t>3.4. Double-sided printing: “Add a blank page”</w:t>
@@ -7682,7 +7676,7 @@
       <w:pPr>
         <w:pStyle w:val="21"/>
       </w:pPr>
-      <w:bookmarkStart w:id="21" w:name="_Toc238650557"/>
+      <w:bookmarkStart w:id="21" w:name="_Toc238700731"/>
       <w:r>
         <w:t>3.5. Assembling a double-sided scan</w:t>
       </w:r>
@@ -7706,7 +7700,7 @@
         </w:rPr>
         <w:lastRenderedPageBreak/>
         <w:drawing>
-          <wp:inline distT="0" distB="0" distL="0" distR="0" wp14:anchorId="2EF0EEC5" wp14:editId="6C04BAE1">
+          <wp:inline distT="0" distB="0" distL="0" distR="0" wp14:anchorId="3EFD338D" wp14:editId="12AF7C12">
             <wp:extent cx="5760000" cy="4608000"/>
             <wp:effectExtent l="0" t="0" r="0" b="0"/>
             <wp:docPr id="14" name="Picture 14"/>
@@ -7761,7 +7755,7 @@
       <w:pPr>
         <w:pStyle w:val="1"/>
       </w:pPr>
-      <w:bookmarkStart w:id="22" w:name="_Toc238650558"/>
+      <w:bookmarkStart w:id="22" w:name="_Toc238700732"/>
       <w:r>
         <w:t>4. Split PDF</w:t>
       </w:r>
@@ -7771,7 +7765,7 @@
       <w:pPr>
         <w:pStyle w:val="21"/>
       </w:pPr>
-      <w:bookmarkStart w:id="23" w:name="_Toc238650559"/>
+      <w:bookmarkStart w:id="23" w:name="_Toc238700733"/>
       <w:r>
         <w:t>4.1. What it is for</w:t>
       </w:r>
@@ -7792,7 +7786,7 @@
       <w:pPr>
         <w:pStyle w:val="21"/>
       </w:pPr>
-      <w:bookmarkStart w:id="24" w:name="_Toc238650560"/>
+      <w:bookmarkStart w:id="24" w:name="_Toc238700734"/>
       <w:r>
         <w:t>4.2. The window</w:t>
       </w:r>
@@ -7815,7 +7809,7 @@
           <w:noProof/>
         </w:rPr>
         <w:drawing>
-          <wp:inline distT="0" distB="0" distL="0" distR="0" wp14:anchorId="0C82363D" wp14:editId="7A67763B">
+          <wp:inline distT="0" distB="0" distL="0" distR="0" wp14:anchorId="71377BD4" wp14:editId="7896642E">
             <wp:extent cx="5760000" cy="4608000"/>
             <wp:effectExtent l="0" t="0" r="0" b="0"/>
             <wp:docPr id="15" name="Picture 15"/>
@@ -7865,9 +7859,12 @@
       <w:pPr>
         <w:pStyle w:val="21"/>
       </w:pPr>
-      <w:bookmarkStart w:id="25" w:name="_Toc238650561"/>
-      <w:r>
-        <w:t>4.3. The modes of splitting</w:t>
+      <w:bookmarkStart w:id="25" w:name="_Toc238700735"/>
+      <w:r>
+        <w:t xml:space="preserve">4.3. The modes of </w:t>
+      </w:r>
+      <w:r>
+        <w:t>splitting</w:t>
       </w:r>
       <w:bookmarkEnd w:id="25"/>
     </w:p>
@@ -7877,10 +7874,7 @@
       </w:r>
       <w:r>
         <w:lastRenderedPageBreak/>
-        <w:t xml:space="preserve">changes from “Extract…” to “Split…” — so that what will </w:t>
-      </w:r>
-      <w:r>
-        <w:t>happen is clear before it does.</w:t>
+        <w:t>changes from “Extract…” to “Split…” — so that what will happen is clear before it does.</w:t>
       </w:r>
     </w:p>
     <w:p>
@@ -7895,7 +7889,7 @@
           <w:noProof/>
         </w:rPr>
         <w:drawing>
-          <wp:inline distT="0" distB="0" distL="0" distR="0" wp14:anchorId="6E2FBED9" wp14:editId="38B99021">
+          <wp:inline distT="0" distB="0" distL="0" distR="0" wp14:anchorId="3C8E35C4" wp14:editId="36B18030">
             <wp:extent cx="5760000" cy="4608000"/>
             <wp:effectExtent l="0" t="0" r="0" b="0"/>
             <wp:docPr id="16" name="Picture 16"/>
@@ -8069,10 +8063,7 @@
               <w:jc w:val="left"/>
             </w:pPr>
             <w:r>
-              <w:t xml:space="preserve">Particular pages are needed and are easier to </w:t>
-            </w:r>
-            <w:r>
-              <w:t>pick by eye</w:t>
+              <w:t>Particular pages are needed and are easier to pick by eye</w:t>
             </w:r>
           </w:p>
         </w:tc>
@@ -8107,7 +8098,10 @@
               <w:jc w:val="left"/>
             </w:pPr>
             <w:r>
-              <w:t>A file per range, or one common file</w:t>
+              <w:t xml:space="preserve">A file per </w:t>
+            </w:r>
+            <w:r>
+              <w:t>range, or one common file</w:t>
             </w:r>
           </w:p>
         </w:tc>
@@ -8222,10 +8216,7 @@
               <w:jc w:val="left"/>
             </w:pPr>
             <w:r>
-              <w:t xml:space="preserve">The </w:t>
-            </w:r>
-            <w:r>
-              <w:t>document has bookmarks: the sections separate themselves</w:t>
+              <w:t>The document has bookmarks: the sections separate themselves</w:t>
             </w:r>
           </w:p>
         </w:tc>
@@ -8254,7 +8245,7 @@
           <w:noProof/>
         </w:rPr>
         <w:drawing>
-          <wp:inline distT="0" distB="0" distL="0" distR="0" wp14:anchorId="41DB2139" wp14:editId="0E965C61">
+          <wp:inline distT="0" distB="0" distL="0" distR="0" wp14:anchorId="528F7F10" wp14:editId="660A698B">
             <wp:extent cx="5760000" cy="4608000"/>
             <wp:effectExtent l="0" t="0" r="0" b="0"/>
             <wp:docPr id="17" name="Picture 17"/>
@@ -8318,7 +8309,7 @@
         </w:rPr>
         <w:lastRenderedPageBreak/>
         <w:drawing>
-          <wp:inline distT="0" distB="0" distL="0" distR="0" wp14:anchorId="3962B275" wp14:editId="1A64F558">
+          <wp:inline distT="0" distB="0" distL="0" distR="0" wp14:anchorId="387FE671" wp14:editId="1DB85AF0">
             <wp:extent cx="5760000" cy="4608000"/>
             <wp:effectExtent l="0" t="0" r="0" b="0"/>
             <wp:docPr id="18" name="Picture 18"/>
@@ -8366,10 +8357,10 @@
     </w:p>
     <w:p>
       <w:r>
-        <w:t xml:space="preserve">“By bookmarks” relies on the table of contents inside the PDF: every </w:t>
-      </w:r>
-      <w:r>
-        <w:t>top-level bookmark gives a separate file, and its name goes into the file name (fig. 19). If the document has no bookmarks, the program says so and writes nothing.</w:t>
+        <w:t xml:space="preserve">“By bookmarks” relies on the table of contents inside the PDF: every top-level bookmark gives a separate file, and its name goes </w:t>
+      </w:r>
+      <w:r>
+        <w:t>into the file name (fig. 19). If the document has no bookmarks, the program says so and writes nothing.</w:t>
       </w:r>
     </w:p>
     <w:p>
@@ -8385,7 +8376,7 @@
         </w:rPr>
         <w:lastRenderedPageBreak/>
         <w:drawing>
-          <wp:inline distT="0" distB="0" distL="0" distR="0" wp14:anchorId="2E24E558" wp14:editId="587F3988">
+          <wp:inline distT="0" distB="0" distL="0" distR="0" wp14:anchorId="44857384" wp14:editId="4EAD6FFC">
             <wp:extent cx="5760000" cy="4608000"/>
             <wp:effectExtent l="0" t="0" r="0" b="0"/>
             <wp:docPr id="19" name="Picture 19"/>
@@ -8435,7 +8426,7 @@
       <w:pPr>
         <w:pStyle w:val="21"/>
       </w:pPr>
-      <w:bookmarkStart w:id="26" w:name="_Toc238650562"/>
+      <w:bookmarkStart w:id="26" w:name="_Toc238700736"/>
       <w:r>
         <w:t>4.4. Naming the parts</w:t>
       </w:r>
@@ -8464,7 +8455,7 @@
         </w:rPr>
         <w:lastRenderedPageBreak/>
         <w:drawing>
-          <wp:inline distT="0" distB="0" distL="0" distR="0" wp14:anchorId="23CF0B12" wp14:editId="58E88442">
+          <wp:inline distT="0" distB="0" distL="0" distR="0" wp14:anchorId="6EADF900" wp14:editId="233668C4">
             <wp:extent cx="5760000" cy="4608000"/>
             <wp:effectExtent l="0" t="0" r="0" b="0"/>
             <wp:docPr id="20" name="Picture 20"/>
@@ -8623,10 +8614,7 @@
               <w:jc w:val="left"/>
             </w:pPr>
             <w:r>
-              <w:t xml:space="preserve">The base name </w:t>
-            </w:r>
-            <w:r>
-              <w:t>from the save dialog</w:t>
+              <w:t>The base name from the save dialog</w:t>
             </w:r>
           </w:p>
         </w:tc>
@@ -8676,7 +8664,10 @@
               <w:jc w:val="left"/>
             </w:pPr>
             <w:r>
-              <w:t>The number of the part in order</w:t>
+              <w:t xml:space="preserve">The number of the </w:t>
+            </w:r>
+            <w:r>
+              <w:t>part in order</w:t>
             </w:r>
           </w:p>
         </w:tc>
@@ -8826,10 +8817,7 @@
               <w:jc w:val="left"/>
             </w:pPr>
             <w:r>
-              <w:t xml:space="preserve">The first page of the part in the </w:t>
-            </w:r>
-            <w:r>
-              <w:t>source document</w:t>
+              <w:t>The first page of the part in the source document</w:t>
             </w:r>
           </w:p>
         </w:tc>
@@ -9008,10 +8996,10 @@
     <w:p>
       <w:r>
         <w:lastRenderedPageBreak/>
-        <w:t xml:space="preserve">Placeholders can be mixed with ordinary text. The </w:t>
-      </w:r>
-      <w:r>
-        <w:t>template “[BASENAME]_part_[FILENUMBER###]”, for instance, gives “Contract_part_001”, “Contract_part_002” and so on — which sort correctly in the file manager even at a hundred parts.</w:t>
+        <w:t xml:space="preserve">Placeholders can be mixed with ordinary text. The template </w:t>
+      </w:r>
+      <w:r>
+        <w:t>“[BASENAME]_part_[FILENUMBER###]”, for instance, gives “Contract_part_001”, “Contract_part_002” and so on — which sort correctly in the file manager even at a hundred parts.</w:t>
       </w:r>
     </w:p>
     <w:p>
@@ -9035,7 +9023,7 @@
       <w:pPr>
         <w:pStyle w:val="21"/>
       </w:pPr>
-      <w:bookmarkStart w:id="27" w:name="_Toc238650563"/>
+      <w:bookmarkStart w:id="27" w:name="_Toc238700737"/>
       <w:r>
         <w:t>4.5. Other operations on the open document</w:t>
       </w:r>
@@ -9050,7 +9038,7 @@
       <w:pPr>
         <w:pStyle w:val="1"/>
       </w:pPr>
-      <w:bookmarkStart w:id="28" w:name="_Toc238650564"/>
+      <w:bookmarkStart w:id="28" w:name="_Toc238700738"/>
       <w:r>
         <w:t>5. More operations</w:t>
       </w:r>
@@ -9060,7 +9048,7 @@
       <w:pPr>
         <w:pStyle w:val="21"/>
       </w:pPr>
-      <w:bookmarkStart w:id="29" w:name="_Toc238650565"/>
+      <w:bookmarkStart w:id="29" w:name="_Toc238700739"/>
       <w:r>
         <w:t>5.1. What it is for</w:t>
       </w:r>
@@ -9086,7 +9074,7 @@
       <w:pPr>
         <w:pStyle w:val="21"/>
       </w:pPr>
-      <w:bookmarkStart w:id="30" w:name="_Toc238650566"/>
+      <w:bookmarkStart w:id="30" w:name="_Toc238700740"/>
       <w:r>
         <w:lastRenderedPageBreak/>
         <w:t>5.2. The window</w:t>
@@ -9110,7 +9098,7 @@
           <w:noProof/>
         </w:rPr>
         <w:drawing>
-          <wp:inline distT="0" distB="0" distL="0" distR="0" wp14:anchorId="6B26C632" wp14:editId="498E4D6C">
+          <wp:inline distT="0" distB="0" distL="0" distR="0" wp14:anchorId="795DF31A" wp14:editId="24442CB9">
             <wp:extent cx="5760000" cy="4905646"/>
             <wp:effectExtent l="0" t="0" r="0" b="0"/>
             <wp:docPr id="21" name="Picture 21"/>
@@ -9153,10 +9141,10 @@
         <w:jc w:val="center"/>
       </w:pPr>
       <w:r>
-        <w:t xml:space="preserve">Fig. 21. The </w:t>
-      </w:r>
-      <w:r>
-        <w:t>“More operations” window</w:t>
+        <w:t xml:space="preserve">Fig. 21. The “More </w:t>
+      </w:r>
+      <w:r>
+        <w:t>operations” window</w:t>
       </w:r>
     </w:p>
     <w:p>
@@ -9186,7 +9174,7 @@
       <w:pPr>
         <w:pStyle w:val="21"/>
       </w:pPr>
-      <w:bookmarkStart w:id="31" w:name="_Toc238650567"/>
+      <w:bookmarkStart w:id="31" w:name="_Toc238700741"/>
       <w:r>
         <w:t>5.3. Assembling the document</w:t>
       </w:r>
@@ -9229,7 +9217,7 @@
         </w:rPr>
         <w:lastRenderedPageBreak/>
         <w:drawing>
-          <wp:inline distT="0" distB="0" distL="0" distR="0" wp14:anchorId="733CF961" wp14:editId="0537F394">
+          <wp:inline distT="0" distB="0" distL="0" distR="0" wp14:anchorId="66748DD8" wp14:editId="2072931A">
             <wp:extent cx="5760000" cy="4905646"/>
             <wp:effectExtent l="0" t="0" r="0" b="0"/>
             <wp:docPr id="22" name="Picture 22"/>
@@ -9296,7 +9284,7 @@
       <w:pPr>
         <w:pStyle w:val="21"/>
       </w:pPr>
-      <w:bookmarkStart w:id="32" w:name="_Toc238650568"/>
+      <w:bookmarkStart w:id="32" w:name="_Toc238700742"/>
       <w:r>
         <w:t>5.4. The actions</w:t>
       </w:r>
@@ -9318,10 +9306,10 @@
         <w:t xml:space="preserve">Save PDF. </w:t>
       </w:r>
       <w:r>
-        <w:t xml:space="preserve">Writes what is assembled into a new PDF: that is how images become a document and reordered or rotated pages </w:t>
-      </w:r>
-      <w:r>
-        <w:t>become a finished file. The compression level comes from the same list at the bottom of the window.</w:t>
+        <w:t xml:space="preserve">Writes what is assembled into a new PDF: that is how images become a document and reordered or rotated pages become a </w:t>
+      </w:r>
+      <w:r>
+        <w:t>finished file. The compression level comes from the same list at the bottom of the window.</w:t>
       </w:r>
     </w:p>
     <w:p>
@@ -9399,7 +9387,7 @@
         </w:rPr>
         <w:lastRenderedPageBreak/>
         <w:drawing>
-          <wp:inline distT="0" distB="0" distL="0" distR="0" wp14:anchorId="4E8839A0" wp14:editId="5B178631">
+          <wp:inline distT="0" distB="0" distL="0" distR="0" wp14:anchorId="66821B0B" wp14:editId="28546398">
             <wp:extent cx="5760000" cy="4713931"/>
             <wp:effectExtent l="0" t="0" r="0" b="0"/>
             <wp:docPr id="23" name="Picture 23"/>
@@ -9505,7 +9493,7 @@
         </w:rPr>
         <w:lastRenderedPageBreak/>
         <w:drawing>
-          <wp:inline distT="0" distB="0" distL="0" distR="0" wp14:anchorId="3083E230" wp14:editId="4E8923DA">
+          <wp:inline distT="0" distB="0" distL="0" distR="0" wp14:anchorId="487D7597" wp14:editId="1015049D">
             <wp:extent cx="3873730" cy="3474719"/>
             <wp:effectExtent l="0" t="0" r="0" b="0"/>
             <wp:docPr id="24" name="Picture 24"/>
@@ -9565,20 +9553,20 @@
         <w:rPr>
           <w:i/>
         </w:rPr>
-        <w:t xml:space="preserve">Compression, conversion to grayscale and repair are done by the Ghostscript engine. In the installed version it is already there; for the </w:t>
+        <w:t xml:space="preserve">Compression, conversion to grayscale and repair are done by the Ghostscript engine. In the installed version it is already there; for the portable one </w:t>
       </w:r>
       <w:r>
         <w:rPr>
           <w:i/>
         </w:rPr>
-        <w:t>portable one the program offers a link to download it.</w:t>
+        <w:t>the program offers a link to download it.</w:t>
       </w:r>
     </w:p>
     <w:p>
       <w:pPr>
         <w:pStyle w:val="1"/>
       </w:pPr>
-      <w:bookmarkStart w:id="33" w:name="_Toc238650569"/>
+      <w:bookmarkStart w:id="33" w:name="_Toc238700743"/>
       <w:r>
         <w:t>6. PDF Compare</w:t>
       </w:r>
@@ -9588,7 +9576,7 @@
       <w:pPr>
         <w:pStyle w:val="21"/>
       </w:pPr>
-      <w:bookmarkStart w:id="34" w:name="_Toc238650570"/>
+      <w:bookmarkStart w:id="34" w:name="_Toc238700744"/>
       <w:r>
         <w:t>6.1. Purpose and scope</w:t>
       </w:r>
@@ -9596,7 +9584,7 @@
     </w:p>
     <w:p>
       <w:r>
-        <w:t>The tool shows the earlier born-digital PDF on the left and the later one on the right, marking which words disappeared and which appeared. The pages remain the originals: the program neither reflows the document nor turns it into an editable file. This is a review window, not an editor.</w:t>
+        <w:t>The tool compares earlier and later versions of a born-digital PDF. By default, the result is a unified redline: the later page is the base, additions are green, and deleted fragments from the earlier version are overlaid in red with a strike line. Side by side keeps both original pages and can be enabled without rerunning the comparison. This is a review window, not an editor; neither source file is changed.</w:t>
       </w:r>
     </w:p>
     <w:p>
@@ -9626,7 +9614,7 @@
       <w:pPr>
         <w:pStyle w:val="21"/>
       </w:pPr>
-      <w:bookmarkStart w:id="35" w:name="_Toc238650571"/>
+      <w:bookmarkStart w:id="35" w:name="_Toc238700745"/>
       <w:r>
         <w:t>6.2. The window and its marks</w:t>
       </w:r>
@@ -9634,7 +9622,7 @@
     </w:p>
     <w:p>
       <w:r>
-        <w:t>The sources at the top are “Earlier version · left” and “Later version · right”. Browse for a file, type or paste its path, or drop it onto the required side. Two files dropped together take the sides in order; one file dropped on neutral space fills only the first empty side.</w:t>
+        <w:t>The sources at the top are “Earlier version · left” and “Later version · right”. Browse for a file, type or paste its path, or drop it onto the required side. After comparison, the Unified redline and Side by side buttons change only the presentation. The 1 ↔ 1 alignment list has a visible splitter: drag it to give the list or page more room. Two files dropped together take the sides in order; one file dropped on neutral space fills the first empty side.</w:t>
       </w:r>
     </w:p>
     <w:p>
@@ -9649,7 +9637,7 @@
           <w:noProof/>
         </w:rPr>
         <w:drawing>
-          <wp:inline distT="0" distB="0" distL="0" distR="0" wp14:anchorId="7E3148EB" wp14:editId="43C760B3">
+          <wp:inline distT="0" distB="0" distL="0" distR="0" wp14:anchorId="115EBDF3" wp14:editId="7AA9CE9E">
             <wp:extent cx="5760000" cy="3908571"/>
             <wp:effectExtent l="0" t="0" r="0" b="0"/>
             <wp:docPr id="25" name="Picture 25"/>
@@ -9692,27 +9680,30 @@
         <w:jc w:val="center"/>
       </w:pPr>
       <w:r>
-        <w:t>Fig. 25. The comparison result: earlier version left, later version right</w:t>
-      </w:r>
-    </w:p>
-    <w:p>
-      <w:r>
-        <w:t>In normal mode a change background follows the verified word box tightly. It is not widened over a space, neighbouring unchanged text or a visible geometry gap. The dark strokes of the original glyphs remain readable, and coloured source elements keep their colour. A red or green side rail marks each changed line; click the rail to select that line's corresponding trusted fragment.</w:t>
-      </w:r>
-    </w:p>
-    <w:p>
+        <w:t>Fig. 25. The unified comparison document; Side by side is available next to it</w:t>
+      </w:r>
+    </w:p>
+    <w:p>
+      <w:r>
+        <w:t xml:space="preserve">In the unified view, the later page remains the background: additions are green and only deleted earlier-version fragments are transferred in red—unchanged earlier-page pixels do not cover the result. Double-click opens the same marked-up view full screen. In Side by side, a change fill follows the verified word box tightly </w:t>
+      </w:r>
       <w:r>
         <w:lastRenderedPageBreak/>
+        <w:t>and is not widened over a space, nearby unchanged text or a geometry gap; either marked-up side can also be opened full screen.</w:t>
+      </w:r>
+    </w:p>
+    <w:p>
+      <w:r>
         <w:t>— </w:t>
       </w:r>
       <w:r>
         <w:rPr>
           <w:b/>
         </w:rPr>
-        <w:t xml:space="preserve">Earlier version, left. </w:t>
-      </w:r>
-      <w:r>
-        <w:t>A tight red background and − mean a word removed from the earlier version. This meaning belongs only to the left pane.</w:t>
+        <w:t xml:space="preserve">Removed from the earlier version. </w:t>
+      </w:r>
+      <w:r>
+        <w:t>A red fill, strike line and − mean a word removed from the earlier version. In the unified redline the fragment is overlaid on the later page; in Side by side it remains in the left pane.</w:t>
       </w:r>
     </w:p>
     <w:p>
@@ -9723,10 +9714,13 @@
         <w:rPr>
           <w:b/>
         </w:rPr>
-        <w:t xml:space="preserve">Later version, right. </w:t>
-      </w:r>
-      <w:r>
-        <w:t>A tight green background and + mean a word added to the later version. This meaning belongs only to the right pane.</w:t>
+        <w:t xml:space="preserve">Added in the later version. </w:t>
+      </w:r>
+      <w:r>
+        <w:t xml:space="preserve">A green fill and + mean a word </w:t>
+      </w:r>
+      <w:r>
+        <w:t>added to the later version. It belongs to the later page in both the unified redline and the right pane of Side by side.</w:t>
       </w:r>
     </w:p>
     <w:p>
@@ -9764,7 +9758,7 @@
       <w:pPr>
         <w:pStyle w:val="21"/>
       </w:pPr>
-      <w:bookmarkStart w:id="36" w:name="_Toc238650572"/>
+      <w:bookmarkStart w:id="36" w:name="_Toc238700746"/>
       <w:r>
         <w:t>6.3. The order of review</w:t>
       </w:r>
@@ -9789,7 +9783,7 @@
         <w:t xml:space="preserve">2. Press “Compare”. </w:t>
       </w:r>
       <w:r>
-        <w:t>The paths are validated first; the program then extracts the text, compares the whole document once, and shows the original pages side by side.</w:t>
+        <w:t>The paths are validated first; the program then extracts the text, compares the whole document once, and opens the unified redline. Switch to Side by side if needed—the comparison result itself remains unchanged.</w:t>
       </w:r>
     </w:p>
     <w:p>
@@ -9800,7 +9794,7 @@
         <w:t xml:space="preserve">3. Review every row with a change. </w:t>
       </w:r>
       <w:r>
-        <w:t>Click alignment rows or move through changes with the buttons and F3 / Shift+F3. The page field above either pane independently opens a physical page; the wheel scrolls only the side under the pointer, while Ctrl+wheel zooms only that side.</w:t>
+        <w:t>Click alignment rows or move through changes with the buttons and F3 / Shift+F3. Drag the splitter to resize the list. The wheel scrolls the active view, Ctrl+wheel zooms, and a double-click opens the page full screen with its red and green markup. In Side by side, the page field above either pane independently opens a physical page.</w:t>
       </w:r>
     </w:p>
     <w:p>
@@ -9811,14 +9805,18 @@
         <w:t xml:space="preserve">4. Adjust only the displayed pair if necessary. </w:t>
       </w:r>
       <w:r>
-        <w:t>If an automatic viewer row is inconvenient, “Pair pages…” joins two physical pages for display and conservative corroboration. It does not begin a new page-local diff or change the meaning of words already found.</w:t>
+        <w:t xml:space="preserve">If an automatic viewer row is inconvenient, “Pair pages…” joins two physical pages for display and </w:t>
+      </w:r>
+      <w:r>
+        <w:lastRenderedPageBreak/>
+        <w:t>conservative corroboration. It does not begin a new page-local diff or change the meaning of words already found.</w:t>
       </w:r>
     </w:p>
     <w:p>
       <w:pPr>
         <w:pStyle w:val="21"/>
       </w:pPr>
-      <w:bookmarkStart w:id="37" w:name="_Toc238650573"/>
+      <w:bookmarkStart w:id="37" w:name="_Toc238700747"/>
       <w:r>
         <w:t>6.4. Selecting and copying</w:t>
       </w:r>
@@ -9826,11 +9824,7 @@
     </w:p>
     <w:p>
       <w:r>
-        <w:t xml:space="preserve">Both pages remain read-only, but trusted text can be selected. Drag over words, press Ctrl+A to select trusted text on the current page, and Ctrl+C to copy it </w:t>
-      </w:r>
-      <w:r>
-        <w:lastRenderedPageBreak/>
-        <w:t>as Unicode. The local “Copy” and “Select all page text” menu commands do the same. The result pastes into an ordinary field, document or another application; text cannot be pasted into or edited in the Review pane.</w:t>
+        <w:t>Both pages remain read-only, but trusted text can be selected. Drag over words, press Ctrl+A to select trusted text on the current page, and Ctrl+C to copy it as Unicode. The local “Copy” and “Select all page text” menu commands do the same. The result pastes into an ordinary field, document or another application; text cannot be pasted into or edited in the Review pane.</w:t>
       </w:r>
     </w:p>
     <w:p>
@@ -9858,7 +9852,10 @@
         <w:t xml:space="preserve">Whitespace needs proof. </w:t>
       </w:r>
       <w:r>
-        <w:t>Between adjacent words, only a separator literally decoded from the source text layer is kept exactly: an empty boundary, one or more spaces, NBSP, a tab or a line break.</w:t>
+        <w:t xml:space="preserve">Between adjacent words, only a separator literally decoded from the source text layer is kept </w:t>
+      </w:r>
+      <w:r>
+        <w:t>exactly: an empty boundary, one or more spaces, NBSP, a tab or a line break.</w:t>
       </w:r>
     </w:p>
     <w:p>
@@ -9896,7 +9893,7 @@
       <w:pPr>
         <w:pStyle w:val="21"/>
       </w:pPr>
-      <w:bookmarkStart w:id="38" w:name="_Toc238650574"/>
+      <w:bookmarkStart w:id="38" w:name="_Toc238700748"/>
       <w:r>
         <w:t>6.5. What counts as a change</w:t>
       </w:r>
@@ -9923,6 +9920,7 @@
     </w:p>
     <w:p>
       <w:r>
+        <w:lastRenderedPageBreak/>
         <w:t>— </w:t>
       </w:r>
       <w:r>
@@ -9937,7 +9935,6 @@
     </w:p>
     <w:p>
       <w:r>
-        <w:lastRenderedPageBreak/>
         <w:t>— </w:t>
       </w:r>
       <w:r>
@@ -9954,7 +9951,7 @@
       <w:pPr>
         <w:pStyle w:val="1"/>
       </w:pPr>
-      <w:bookmarkStart w:id="39" w:name="_Toc238650575"/>
+      <w:bookmarkStart w:id="39" w:name="_Toc238700749"/>
       <w:r>
         <w:t>7. PDF → Word</w:t>
       </w:r>
@@ -9964,7 +9961,7 @@
       <w:pPr>
         <w:pStyle w:val="21"/>
       </w:pPr>
-      <w:bookmarkStart w:id="40" w:name="_Toc238650576"/>
+      <w:bookmarkStart w:id="40" w:name="_Toc238700750"/>
       <w:r>
         <w:t>7.1. What it is for</w:t>
       </w:r>
@@ -9984,7 +9981,7 @@
       <w:pPr>
         <w:pStyle w:val="21"/>
       </w:pPr>
-      <w:bookmarkStart w:id="41" w:name="_Toc238650577"/>
+      <w:bookmarkStart w:id="41" w:name="_Toc238700751"/>
       <w:r>
         <w:t>7.2. The window</w:t>
       </w:r>
@@ -10008,7 +10005,7 @@
         </w:rPr>
         <w:lastRenderedPageBreak/>
         <w:drawing>
-          <wp:inline distT="0" distB="0" distL="0" distR="0" wp14:anchorId="52D57A49" wp14:editId="62C11264">
+          <wp:inline distT="0" distB="0" distL="0" distR="0" wp14:anchorId="5F687E34" wp14:editId="46BE8601">
             <wp:extent cx="5760000" cy="4608000"/>
             <wp:effectExtent l="0" t="0" r="0" b="0"/>
             <wp:docPr id="26" name="Picture 26"/>
@@ -10058,7 +10055,7 @@
       <w:pPr>
         <w:pStyle w:val="21"/>
       </w:pPr>
-      <w:bookmarkStart w:id="42" w:name="_Toc238650578"/>
+      <w:bookmarkStart w:id="42" w:name="_Toc238700752"/>
       <w:r>
         <w:t>7.3. The order of work</w:t>
       </w:r>
@@ -10072,7 +10069,10 @@
         <w:t xml:space="preserve">1. Add one or more PDFs with “Add PDF…” </w:t>
       </w:r>
       <w:r>
-        <w:t>or drag them into the window. The pages of all the files are shown in one grid, so one Word document can be assembled from several PDFs.</w:t>
+        <w:t xml:space="preserve">or drag them into the window. The pages of all the files </w:t>
+      </w:r>
+      <w:r>
+        <w:t>are shown in one grid, so one Word document can be assembled from several PDFs.</w:t>
       </w:r>
     </w:p>
     <w:p>
@@ -10080,13 +10080,7 @@
         <w:rPr>
           <w:b/>
         </w:rPr>
-        <w:t xml:space="preserve">2. </w:t>
-      </w:r>
-      <w:r>
-        <w:rPr>
-          <w:b/>
-        </w:rPr>
-        <w:t xml:space="preserve">Change the order of the pages if you need to </w:t>
+        <w:t xml:space="preserve">2. Change the order of the pages if you need to </w:t>
       </w:r>
       <w:r>
         <w:t>by dragging the thumbnails or with the “◀ Move left” and “Move right ▶” buttons. Remove pages you do not need with “Remove”. The pages reach Word in exactly the order shown.</w:t>
@@ -10119,7 +10113,7 @@
       <w:pPr>
         <w:pStyle w:val="21"/>
       </w:pPr>
-      <w:bookmarkStart w:id="43" w:name="_Toc238650579"/>
+      <w:bookmarkStart w:id="43" w:name="_Toc238700753"/>
       <w:r>
         <w:t>7.4. What comes across and what does not</w:t>
       </w:r>
@@ -10160,7 +10154,10 @@
         <w:t xml:space="preserve">If the font of the PDF is not in the system, </w:t>
       </w:r>
       <w:r>
-        <w:t>the text is set in Times New Roman. The shape of the letters may differ a little from the original.</w:t>
+        <w:t xml:space="preserve">the text is set in Times New Roman. The shape of the letters may differ a little from the </w:t>
+      </w:r>
+      <w:r>
+        <w:t>original.</w:t>
       </w:r>
     </w:p>
     <w:p>
@@ -10174,10 +10171,7 @@
         <w:t xml:space="preserve">Tables without lines, </w:t>
       </w:r>
       <w:r>
-        <w:t xml:space="preserve">boxed insets and text in several columns come across as </w:t>
-      </w:r>
-      <w:r>
-        <w:t>plain paragraphs in one column — they may have to be tidied by hand.</w:t>
+        <w:t>boxed insets and text in several columns come across as plain paragraphs in one column — they may have to be tidied by hand.</w:t>
       </w:r>
     </w:p>
     <w:p>
@@ -10195,7 +10189,7 @@
       <w:pPr>
         <w:pStyle w:val="1"/>
       </w:pPr>
-      <w:bookmarkStart w:id="44" w:name="_Toc238650580"/>
+      <w:bookmarkStart w:id="44" w:name="_Toc238700754"/>
       <w:r>
         <w:t>8. PDF → PowerPoint</w:t>
       </w:r>
@@ -10205,7 +10199,7 @@
       <w:pPr>
         <w:pStyle w:val="21"/>
       </w:pPr>
-      <w:bookmarkStart w:id="45" w:name="_Toc238650581"/>
+      <w:bookmarkStart w:id="45" w:name="_Toc238700755"/>
       <w:r>
         <w:t>8.1. What it is for</w:t>
       </w:r>
@@ -10237,7 +10231,7 @@
       <w:pPr>
         <w:pStyle w:val="21"/>
       </w:pPr>
-      <w:bookmarkStart w:id="46" w:name="_Toc238650582"/>
+      <w:bookmarkStart w:id="46" w:name="_Toc238700756"/>
       <w:r>
         <w:t>8.2. How a slide is built</w:t>
       </w:r>
@@ -10274,7 +10268,7 @@
       <w:pPr>
         <w:pStyle w:val="21"/>
       </w:pPr>
-      <w:bookmarkStart w:id="47" w:name="_Toc238650583"/>
+      <w:bookmarkStart w:id="47" w:name="_Toc238700757"/>
       <w:r>
         <w:t>8.3. The window</w:t>
       </w:r>
@@ -10298,7 +10292,7 @@
         </w:rPr>
         <w:lastRenderedPageBreak/>
         <w:drawing>
-          <wp:inline distT="0" distB="0" distL="0" distR="0" wp14:anchorId="23EB784C" wp14:editId="1B72B9A7">
+          <wp:inline distT="0" distB="0" distL="0" distR="0" wp14:anchorId="1627AA89" wp14:editId="0AC5F8E7">
             <wp:extent cx="5760000" cy="4608000"/>
             <wp:effectExtent l="0" t="0" r="0" b="0"/>
             <wp:docPr id="27" name="Picture 27"/>
@@ -10348,7 +10342,7 @@
       <w:pPr>
         <w:pStyle w:val="21"/>
       </w:pPr>
-      <w:bookmarkStart w:id="48" w:name="_Toc238650584"/>
+      <w:bookmarkStart w:id="48" w:name="_Toc238700758"/>
       <w:r>
         <w:t>8.4. The order of work</w:t>
       </w:r>
@@ -10402,7 +10396,7 @@
       <w:pPr>
         <w:pStyle w:val="21"/>
       </w:pPr>
-      <w:bookmarkStart w:id="49" w:name="_Toc238650585"/>
+      <w:bookmarkStart w:id="49" w:name="_Toc238700759"/>
       <w:r>
         <w:lastRenderedPageBreak/>
         <w:t>8.5. What comes across</w:t>
@@ -10411,22 +10405,25 @@
     </w:p>
     <w:p>
       <w:r>
-        <w:t>Text comes across in paragraphs, with its font, size, weight, colour, underline, super- and subscripts and hyperlinks. Tables become real slide tables, merged cells included. The slide size follows the page: a 16:9 deck stays 16:9, and an A4 document gives A4 slides.</w:t>
-      </w:r>
-    </w:p>
-    <w:p>
-      <w:r>
-        <w:t xml:space="preserve">The boundaries of the paragraphs are taken from the file itself where it carries them: a PDF saved from Word, </w:t>
-      </w:r>
-      <w:r>
-        <w:t>PowerPoint or Acrobat holds the structure of the document, and in it the author has already marked where one paragraph ends and the next begins. Then a paragraph arrives as one text box and is edited as a whole. Where there is no such structure, the boundaries are recovered from the distances between the lines.</w:t>
+        <w:t xml:space="preserve">Text comes across in paragraphs, with </w:t>
+      </w:r>
+      <w:r>
+        <w:t>its font, size, weight, colour, underline, super- and subscripts and hyperlinks. Tables become real slide tables, merged cells included. The slide size follows the page: a 16:9 deck stays 16:9, and an A4 document gives A4 slides.</w:t>
+      </w:r>
+    </w:p>
+    <w:p>
+      <w:r>
+        <w:t xml:space="preserve">The boundaries of the </w:t>
+      </w:r>
+      <w:r>
+        <w:t>paragraphs are taken from the file itself where it carries them: a PDF saved from Word, PowerPoint or Acrobat holds the structure of the document, and in it the author has already marked where one paragraph ends and the next begins. Then a paragraph arrives as one text box and is edited as a whole. Where there is no such structure, the boundaries are recovered from the distances between the lines.</w:t>
       </w:r>
     </w:p>
     <w:p>
       <w:pPr>
         <w:pStyle w:val="21"/>
       </w:pPr>
-      <w:bookmarkStart w:id="50" w:name="_Toc238650586"/>
+      <w:bookmarkStart w:id="50" w:name="_Toc238700760"/>
       <w:r>
         <w:t>8.6. What not to expect</w:t>
       </w:r>
@@ -10478,7 +10475,7 @@
       <w:pPr>
         <w:pStyle w:val="1"/>
       </w:pPr>
-      <w:bookmarkStart w:id="51" w:name="_Toc238650587"/>
+      <w:bookmarkStart w:id="51" w:name="_Toc238700761"/>
       <w:r>
         <w:t>9. Merge Excel</w:t>
       </w:r>
@@ -10488,7 +10485,7 @@
       <w:pPr>
         <w:pStyle w:val="21"/>
       </w:pPr>
-      <w:bookmarkStart w:id="52" w:name="_Toc238650588"/>
+      <w:bookmarkStart w:id="52" w:name="_Toc238700762"/>
       <w:r>
         <w:t>9.1. What it is for</w:t>
       </w:r>
@@ -10512,7 +10509,7 @@
       <w:pPr>
         <w:pStyle w:val="21"/>
       </w:pPr>
-      <w:bookmarkStart w:id="53" w:name="_Toc238650589"/>
+      <w:bookmarkStart w:id="53" w:name="_Toc238700763"/>
       <w:r>
         <w:t>9.2. The window</w:t>
       </w:r>
@@ -10535,7 +10532,7 @@
           <w:noProof/>
         </w:rPr>
         <w:drawing>
-          <wp:inline distT="0" distB="0" distL="0" distR="0" wp14:anchorId="1B48FE6F" wp14:editId="5A5595BB">
+          <wp:inline distT="0" distB="0" distL="0" distR="0" wp14:anchorId="67EA730F" wp14:editId="284CE8AF">
             <wp:extent cx="5760000" cy="4250667"/>
             <wp:effectExtent l="0" t="0" r="0" b="0"/>
             <wp:docPr id="28" name="Picture 28"/>
@@ -10585,7 +10582,7 @@
       <w:pPr>
         <w:pStyle w:val="21"/>
       </w:pPr>
-      <w:bookmarkStart w:id="54" w:name="_Toc238650590"/>
+      <w:bookmarkStart w:id="54" w:name="_Toc238700764"/>
       <w:r>
         <w:t>9.3. The order of work</w:t>
       </w:r>
@@ -10640,7 +10637,7 @@
       <w:pPr>
         <w:pStyle w:val="21"/>
       </w:pPr>
-      <w:bookmarkStart w:id="55" w:name="_Toc238650591"/>
+      <w:bookmarkStart w:id="55" w:name="_Toc238700765"/>
       <w:r>
         <w:t>9.4. The options</w:t>
       </w:r>
@@ -10692,7 +10689,7 @@
       <w:pPr>
         <w:pStyle w:val="21"/>
       </w:pPr>
-      <w:bookmarkStart w:id="56" w:name="_Toc238650592"/>
+      <w:bookmarkStart w:id="56" w:name="_Toc238700766"/>
       <w:r>
         <w:t>9.5. The result, the report and the cover note</w:t>
       </w:r>
@@ -10724,7 +10721,7 @@
       <w:pPr>
         <w:pStyle w:val="21"/>
       </w:pPr>
-      <w:bookmarkStart w:id="57" w:name="_Toc238650593"/>
+      <w:bookmarkStart w:id="57" w:name="_Toc238700767"/>
       <w:r>
         <w:t>9.6. The Menu of the tool</w:t>
       </w:r>
@@ -10732,10 +10729,7 @@
     </w:p>
     <w:p>
       <w:r>
-        <w:t xml:space="preserve">The Menu holds the built-in help, the statistics, the choice of language and </w:t>
-      </w:r>
-      <w:r>
-        <w:t>“Reports folder”, which opens the folder with the most recent merge reports (fig. 29).</w:t>
+        <w:t>The Menu holds the built-in help, the statistics, the choice of language and “Reports folder”, which opens the folder with the most recent merge reports (fig. 29).</w:t>
       </w:r>
     </w:p>
     <w:p>
@@ -10750,7 +10744,7 @@
           <w:noProof/>
         </w:rPr>
         <w:drawing>
-          <wp:inline distT="0" distB="0" distL="0" distR="0" wp14:anchorId="205E039F" wp14:editId="51BDB8B0">
+          <wp:inline distT="0" distB="0" distL="0" distR="0" wp14:anchorId="29873A12" wp14:editId="43CB9CBB">
             <wp:extent cx="5760000" cy="4250667"/>
             <wp:effectExtent l="0" t="0" r="0" b="0"/>
             <wp:docPr id="29" name="Picture 29"/>
@@ -10817,7 +10811,7 @@
       <w:pPr>
         <w:pStyle w:val="1"/>
       </w:pPr>
-      <w:bookmarkStart w:id="58" w:name="_Toc238650594"/>
+      <w:bookmarkStart w:id="58" w:name="_Toc238700768"/>
       <w:r>
         <w:lastRenderedPageBreak/>
         <w:t>10. Reference</w:t>
@@ -10828,7 +10822,7 @@
       <w:pPr>
         <w:pStyle w:val="21"/>
       </w:pPr>
-      <w:bookmarkStart w:id="59" w:name="_Toc238650595"/>
+      <w:bookmarkStart w:id="59" w:name="_Toc238700769"/>
       <w:r>
         <w:t>10.1. About the program</w:t>
       </w:r>
@@ -10851,7 +10845,7 @@
           <w:noProof/>
         </w:rPr>
         <w:drawing>
-          <wp:inline distT="0" distB="0" distL="0" distR="0" wp14:anchorId="76630E2D" wp14:editId="5123D72C">
+          <wp:inline distT="0" distB="0" distL="0" distR="0" wp14:anchorId="754883C1" wp14:editId="79F36A70">
             <wp:extent cx="3873730" cy="3940232"/>
             <wp:effectExtent l="0" t="0" r="0" b="0"/>
             <wp:docPr id="30" name="Picture 30"/>
@@ -10917,7 +10911,7 @@
       <w:pPr>
         <w:pStyle w:val="21"/>
       </w:pPr>
-      <w:bookmarkStart w:id="60" w:name="_Toc238650596"/>
+      <w:bookmarkStart w:id="60" w:name="_Toc238700770"/>
       <w:r>
         <w:lastRenderedPageBreak/>
         <w:t>10.2. If something went wrong</w:t>
@@ -11008,10 +11002,7 @@
               <w:jc w:val="left"/>
             </w:pPr>
             <w:r>
-              <w:t xml:space="preserve">The message “Ghostscript is needed” when </w:t>
-            </w:r>
-            <w:r>
-              <w:t>choosing compression</w:t>
+              <w:t>The message “Ghostscript is needed” when choosing compression</w:t>
             </w:r>
           </w:p>
         </w:tc>
@@ -11046,7 +11037,10 @@
               <w:jc w:val="left"/>
             </w:pPr>
             <w:r>
-              <w:t>A file was skipped while building the digest</w:t>
+              <w:t xml:space="preserve">A file was </w:t>
+            </w:r>
+            <w:r>
+              <w:t>skipped while building the digest</w:t>
             </w:r>
           </w:p>
         </w:tc>
@@ -11221,10 +11215,7 @@
               <w:jc w:val="left"/>
             </w:pPr>
             <w:r>
-              <w:t xml:space="preserve">The window does not appear when the </w:t>
-            </w:r>
-            <w:r>
-              <w:t>program is started again</w:t>
+              <w:t>The window does not appear when the program is started again</w:t>
             </w:r>
           </w:p>
         </w:tc>
@@ -11274,7 +11265,10 @@
               <w:jc w:val="left"/>
             </w:pPr>
             <w:r>
-              <w:t>The document is password-protected: the engine cannot read it. Remove the protection in the program that applied it and try again</w:t>
+              <w:t xml:space="preserve">The </w:t>
+            </w:r>
+            <w:r>
+              <w:t>document is password-protected: the engine cannot read it. Remove the protection in the program that applied it and try again</w:t>
             </w:r>
           </w:p>
         </w:tc>
@@ -11309,7 +11303,10 @@
               <w:jc w:val="left"/>
             </w:pPr>
             <w:r>
-              <w:t>There is no default browser in the system. The program shows the address itself — it can be typed by hand</w:t>
+              <w:t xml:space="preserve">There is no default browser in the system. The </w:t>
+            </w:r>
+            <w:r>
+              <w:t>program shows the address itself — it can be typed by hand</w:t>
             </w:r>
           </w:p>
         </w:tc>
@@ -11324,12 +11321,9 @@
       <w:pPr>
         <w:pStyle w:val="21"/>
       </w:pPr>
-      <w:bookmarkStart w:id="61" w:name="_Toc238650597"/>
-      <w:r>
-        <w:t xml:space="preserve">10.3. Updating the </w:t>
-      </w:r>
-      <w:r>
-        <w:t>contents after edits</w:t>
+      <w:bookmarkStart w:id="61" w:name="_Toc238700771"/>
+      <w:r>
+        <w:t>10.3. Updating the contents after edits</w:t>
       </w:r>
       <w:bookmarkEnd w:id="61"/>
     </w:p>
@@ -11346,7 +11340,7 @@
       <w:pPr>
         <w:pStyle w:val="21"/>
       </w:pPr>
-      <w:bookmarkStart w:id="62" w:name="_Toc238650598"/>
+      <w:bookmarkStart w:id="62" w:name="_Toc238700772"/>
       <w:r>
         <w:t>10.4. A short reminder</w:t>
       </w:r>
@@ -11852,31 +11846,31 @@
       </w:rPr>
     </w:lvl>
   </w:abstractNum>
-  <w:num w:numId="1" w16cid:durableId="754521952">
+  <w:num w:numId="1" w16cid:durableId="1926956593">
     <w:abstractNumId w:val="8"/>
   </w:num>
-  <w:num w:numId="2" w16cid:durableId="723023732">
+  <w:num w:numId="2" w16cid:durableId="1439567881">
     <w:abstractNumId w:val="6"/>
   </w:num>
-  <w:num w:numId="3" w16cid:durableId="1619216590">
+  <w:num w:numId="3" w16cid:durableId="1991057749">
     <w:abstractNumId w:val="5"/>
   </w:num>
-  <w:num w:numId="4" w16cid:durableId="788402813">
+  <w:num w:numId="4" w16cid:durableId="441998494">
     <w:abstractNumId w:val="4"/>
   </w:num>
-  <w:num w:numId="5" w16cid:durableId="169563615">
+  <w:num w:numId="5" w16cid:durableId="2013221258">
     <w:abstractNumId w:val="7"/>
   </w:num>
-  <w:num w:numId="6" w16cid:durableId="1171600545">
+  <w:num w:numId="6" w16cid:durableId="1307395024">
     <w:abstractNumId w:val="3"/>
   </w:num>
-  <w:num w:numId="7" w16cid:durableId="978342854">
+  <w:num w:numId="7" w16cid:durableId="1915434060">
     <w:abstractNumId w:val="2"/>
   </w:num>
-  <w:num w:numId="8" w16cid:durableId="1669091228">
+  <w:num w:numId="8" w16cid:durableId="172108037">
     <w:abstractNumId w:val="1"/>
   </w:num>
-  <w:num w:numId="9" w16cid:durableId="466168177">
+  <w:num w:numId="9" w16cid:durableId="288054919">
     <w:abstractNumId w:val="0"/>
   </w:num>
 </w:numbering>
@@ -23315,7 +23309,7 @@
     <w:autoRedefine/>
     <w:uiPriority w:val="39"/>
     <w:unhideWhenUsed/>
-    <w:rsid w:val="00183F5B"/>
+    <w:rsid w:val="00AF4A5E"/>
     <w:pPr>
       <w:spacing w:after="100"/>
     </w:pPr>
@@ -23327,7 +23321,7 @@
     <w:autoRedefine/>
     <w:uiPriority w:val="39"/>
     <w:unhideWhenUsed/>
-    <w:rsid w:val="00183F5B"/>
+    <w:rsid w:val="00AF4A5E"/>
     <w:pPr>
       <w:spacing w:after="100"/>
       <w:ind w:left="280"/>
@@ -23338,7 +23332,7 @@
     <w:basedOn w:val="a2"/>
     <w:uiPriority w:val="99"/>
     <w:unhideWhenUsed/>
-    <w:rsid w:val="00183F5B"/>
+    <w:rsid w:val="00AF4A5E"/>
     <w:rPr>
       <w:color w:val="0000FF" w:themeColor="hyperlink"/>
       <w:u w:val="single"/>

</xml_diff>

<commit_message>
Refine PDF compare redline and What's New UX
</commit_message>
<xml_diff>
--- a/docs/User manual.docx
+++ b/docs/User manual.docx
@@ -121,7 +121,7 @@
       <w:r>
         <w:fldChar w:fldCharType="separate"/>
       </w:r>
-      <w:hyperlink w:anchor="_Toc238700710" w:history="1">
+      <w:hyperlink w:anchor="_Toc238720507" w:history="1">
         <w:r>
           <w:rPr>
             <w:rStyle w:val="aff8"/>
@@ -149,7 +149,7 @@
             <w:noProof/>
             <w:webHidden/>
           </w:rPr>
-          <w:instrText xml:space="preserve"> PAGEREF _Toc238700710 \h </w:instrText>
+          <w:instrText xml:space="preserve"> PAGEREF _Toc238720507 \h </w:instrText>
         </w:r>
         <w:r>
           <w:rPr>
@@ -197,7 +197,7 @@
           <w14:ligatures w14:val="standardContextual"/>
         </w:rPr>
       </w:pPr>
-      <w:hyperlink w:anchor="_Toc238700711" w:history="1">
+      <w:hyperlink w:anchor="_Toc238720508" w:history="1">
         <w:r>
           <w:rPr>
             <w:rStyle w:val="aff8"/>
@@ -225,7 +225,7 @@
             <w:noProof/>
             <w:webHidden/>
           </w:rPr>
-          <w:instrText xml:space="preserve"> PAGEREF _Toc238700711 \h </w:instrText>
+          <w:instrText xml:space="preserve"> PAGEREF _Toc238720508 \h </w:instrText>
         </w:r>
         <w:r>
           <w:rPr>
@@ -273,7 +273,7 @@
           <w14:ligatures w14:val="standardContextual"/>
         </w:rPr>
       </w:pPr>
-      <w:hyperlink w:anchor="_Toc238700712" w:history="1">
+      <w:hyperlink w:anchor="_Toc238720509" w:history="1">
         <w:r>
           <w:rPr>
             <w:rStyle w:val="aff8"/>
@@ -301,7 +301,7 @@
             <w:noProof/>
             <w:webHidden/>
           </w:rPr>
-          <w:instrText xml:space="preserve"> PAGEREF _Toc238700712 \h </w:instrText>
+          <w:instrText xml:space="preserve"> PAGEREF _Toc238720509 \h </w:instrText>
         </w:r>
         <w:r>
           <w:rPr>
@@ -349,7 +349,7 @@
           <w14:ligatures w14:val="standardContextual"/>
         </w:rPr>
       </w:pPr>
-      <w:hyperlink w:anchor="_Toc238700713" w:history="1">
+      <w:hyperlink w:anchor="_Toc238720510" w:history="1">
         <w:r>
           <w:rPr>
             <w:rStyle w:val="aff8"/>
@@ -377,7 +377,7 @@
             <w:noProof/>
             <w:webHidden/>
           </w:rPr>
-          <w:instrText xml:space="preserve"> PAGEREF _Toc238700713 \h </w:instrText>
+          <w:instrText xml:space="preserve"> PAGEREF _Toc238720510 \h </w:instrText>
         </w:r>
         <w:r>
           <w:rPr>
@@ -425,7 +425,7 @@
           <w14:ligatures w14:val="standardContextual"/>
         </w:rPr>
       </w:pPr>
-      <w:hyperlink w:anchor="_Toc238700714" w:history="1">
+      <w:hyperlink w:anchor="_Toc238720511" w:history="1">
         <w:r>
           <w:rPr>
             <w:rStyle w:val="aff8"/>
@@ -453,7 +453,7 @@
             <w:noProof/>
             <w:webHidden/>
           </w:rPr>
-          <w:instrText xml:space="preserve"> PAGEREF _Toc238700714 \h </w:instrText>
+          <w:instrText xml:space="preserve"> PAGEREF _Toc238720511 \h </w:instrText>
         </w:r>
         <w:r>
           <w:rPr>
@@ -501,7 +501,7 @@
           <w14:ligatures w14:val="standardContextual"/>
         </w:rPr>
       </w:pPr>
-      <w:hyperlink w:anchor="_Toc238700715" w:history="1">
+      <w:hyperlink w:anchor="_Toc238720512" w:history="1">
         <w:r>
           <w:rPr>
             <w:rStyle w:val="aff8"/>
@@ -529,7 +529,7 @@
             <w:noProof/>
             <w:webHidden/>
           </w:rPr>
-          <w:instrText xml:space="preserve"> PAGEREF _Toc238700715 \h </w:instrText>
+          <w:instrText xml:space="preserve"> PAGEREF _Toc238720512 \h </w:instrText>
         </w:r>
         <w:r>
           <w:rPr>
@@ -577,7 +577,7 @@
           <w14:ligatures w14:val="standardContextual"/>
         </w:rPr>
       </w:pPr>
-      <w:hyperlink w:anchor="_Toc238700716" w:history="1">
+      <w:hyperlink w:anchor="_Toc238720513" w:history="1">
         <w:r>
           <w:rPr>
             <w:rStyle w:val="aff8"/>
@@ -605,7 +605,7 @@
             <w:noProof/>
             <w:webHidden/>
           </w:rPr>
-          <w:instrText xml:space="preserve"> PAGEREF _Toc238700716 \h </w:instrText>
+          <w:instrText xml:space="preserve"> PAGEREF _Toc238720513 \h </w:instrText>
         </w:r>
         <w:r>
           <w:rPr>
@@ -653,7 +653,7 @@
           <w14:ligatures w14:val="standardContextual"/>
         </w:rPr>
       </w:pPr>
-      <w:hyperlink w:anchor="_Toc238700717" w:history="1">
+      <w:hyperlink w:anchor="_Toc238720514" w:history="1">
         <w:r>
           <w:rPr>
             <w:rStyle w:val="aff8"/>
@@ -681,7 +681,7 @@
             <w:noProof/>
             <w:webHidden/>
           </w:rPr>
-          <w:instrText xml:space="preserve"> PAGEREF _Toc238700717 \h </w:instrText>
+          <w:instrText xml:space="preserve"> PAGEREF _Toc238720514 \h </w:instrText>
         </w:r>
         <w:r>
           <w:rPr>
@@ -729,7 +729,7 @@
           <w14:ligatures w14:val="standardContextual"/>
         </w:rPr>
       </w:pPr>
-      <w:hyperlink w:anchor="_Toc238700718" w:history="1">
+      <w:hyperlink w:anchor="_Toc238720515" w:history="1">
         <w:r>
           <w:rPr>
             <w:rStyle w:val="aff8"/>
@@ -757,7 +757,7 @@
             <w:noProof/>
             <w:webHidden/>
           </w:rPr>
-          <w:instrText xml:space="preserve"> PAGEREF _Toc238700718 \h </w:instrText>
+          <w:instrText xml:space="preserve"> PAGEREF _Toc238720515 \h </w:instrText>
         </w:r>
         <w:r>
           <w:rPr>
@@ -805,7 +805,7 @@
           <w14:ligatures w14:val="standardContextual"/>
         </w:rPr>
       </w:pPr>
-      <w:hyperlink w:anchor="_Toc238700719" w:history="1">
+      <w:hyperlink w:anchor="_Toc238720516" w:history="1">
         <w:r>
           <w:rPr>
             <w:rStyle w:val="aff8"/>
@@ -833,7 +833,7 @@
             <w:noProof/>
             <w:webHidden/>
           </w:rPr>
-          <w:instrText xml:space="preserve"> PAGEREF _Toc238700719 \h </w:instrText>
+          <w:instrText xml:space="preserve"> PAGEREF _Toc238720516 \h </w:instrText>
         </w:r>
         <w:r>
           <w:rPr>
@@ -881,7 +881,7 @@
           <w14:ligatures w14:val="standardContextual"/>
         </w:rPr>
       </w:pPr>
-      <w:hyperlink w:anchor="_Toc238700720" w:history="1">
+      <w:hyperlink w:anchor="_Toc238720517" w:history="1">
         <w:r>
           <w:rPr>
             <w:rStyle w:val="aff8"/>
@@ -909,7 +909,7 @@
             <w:noProof/>
             <w:webHidden/>
           </w:rPr>
-          <w:instrText xml:space="preserve"> PAGEREF _Toc238700720 \h </w:instrText>
+          <w:instrText xml:space="preserve"> PAGEREF _Toc238720517 \h </w:instrText>
         </w:r>
         <w:r>
           <w:rPr>
@@ -957,7 +957,7 @@
           <w14:ligatures w14:val="standardContextual"/>
         </w:rPr>
       </w:pPr>
-      <w:hyperlink w:anchor="_Toc238700721" w:history="1">
+      <w:hyperlink w:anchor="_Toc238720518" w:history="1">
         <w:r>
           <w:rPr>
             <w:rStyle w:val="aff8"/>
@@ -985,7 +985,7 @@
             <w:noProof/>
             <w:webHidden/>
           </w:rPr>
-          <w:instrText xml:space="preserve"> PAGEREF _Toc238700721 \h </w:instrText>
+          <w:instrText xml:space="preserve"> PAGEREF _Toc238720518 \h </w:instrText>
         </w:r>
         <w:r>
           <w:rPr>
@@ -1033,7 +1033,7 @@
           <w14:ligatures w14:val="standardContextual"/>
         </w:rPr>
       </w:pPr>
-      <w:hyperlink w:anchor="_Toc238700722" w:history="1">
+      <w:hyperlink w:anchor="_Toc238720519" w:history="1">
         <w:r>
           <w:rPr>
             <w:rStyle w:val="aff8"/>
@@ -1061,7 +1061,7 @@
             <w:noProof/>
             <w:webHidden/>
           </w:rPr>
-          <w:instrText xml:space="preserve"> PAGEREF _Toc238700722 \h </w:instrText>
+          <w:instrText xml:space="preserve"> PAGEREF _Toc238720519 \h </w:instrText>
         </w:r>
         <w:r>
           <w:rPr>
@@ -1109,7 +1109,7 @@
           <w14:ligatures w14:val="standardContextual"/>
         </w:rPr>
       </w:pPr>
-      <w:hyperlink w:anchor="_Toc238700723" w:history="1">
+      <w:hyperlink w:anchor="_Toc238720520" w:history="1">
         <w:r>
           <w:rPr>
             <w:rStyle w:val="aff8"/>
@@ -1137,7 +1137,7 @@
             <w:noProof/>
             <w:webHidden/>
           </w:rPr>
-          <w:instrText xml:space="preserve"> PAGEREF _Toc238700723 \h </w:instrText>
+          <w:instrText xml:space="preserve"> PAGEREF _Toc238720520 \h </w:instrText>
         </w:r>
         <w:r>
           <w:rPr>
@@ -1185,7 +1185,7 @@
           <w14:ligatures w14:val="standardContextual"/>
         </w:rPr>
       </w:pPr>
-      <w:hyperlink w:anchor="_Toc238700724" w:history="1">
+      <w:hyperlink w:anchor="_Toc238720521" w:history="1">
         <w:r>
           <w:rPr>
             <w:rStyle w:val="aff8"/>
@@ -1213,7 +1213,7 @@
             <w:noProof/>
             <w:webHidden/>
           </w:rPr>
-          <w:instrText xml:space="preserve"> PAGEREF _Toc238700724 \h </w:instrText>
+          <w:instrText xml:space="preserve"> PAGEREF _Toc238720521 \h </w:instrText>
         </w:r>
         <w:r>
           <w:rPr>
@@ -1261,7 +1261,7 @@
           <w14:ligatures w14:val="standardContextual"/>
         </w:rPr>
       </w:pPr>
-      <w:hyperlink w:anchor="_Toc238700725" w:history="1">
+      <w:hyperlink w:anchor="_Toc238720522" w:history="1">
         <w:r>
           <w:rPr>
             <w:rStyle w:val="aff8"/>
@@ -1289,7 +1289,7 @@
             <w:noProof/>
             <w:webHidden/>
           </w:rPr>
-          <w:instrText xml:space="preserve"> PAGEREF _Toc238700725 \h </w:instrText>
+          <w:instrText xml:space="preserve"> PAGEREF _Toc238720522 \h </w:instrText>
         </w:r>
         <w:r>
           <w:rPr>
@@ -1337,7 +1337,7 @@
           <w14:ligatures w14:val="standardContextual"/>
         </w:rPr>
       </w:pPr>
-      <w:hyperlink w:anchor="_Toc238700726" w:history="1">
+      <w:hyperlink w:anchor="_Toc238720523" w:history="1">
         <w:r>
           <w:rPr>
             <w:rStyle w:val="aff8"/>
@@ -1365,7 +1365,7 @@
             <w:noProof/>
             <w:webHidden/>
           </w:rPr>
-          <w:instrText xml:space="preserve"> PAGEREF _Toc238700726 \h </w:instrText>
+          <w:instrText xml:space="preserve"> PAGEREF _Toc238720523 \h </w:instrText>
         </w:r>
         <w:r>
           <w:rPr>
@@ -1413,7 +1413,7 @@
           <w14:ligatures w14:val="standardContextual"/>
         </w:rPr>
       </w:pPr>
-      <w:hyperlink w:anchor="_Toc238700727" w:history="1">
+      <w:hyperlink w:anchor="_Toc238720524" w:history="1">
         <w:r>
           <w:rPr>
             <w:rStyle w:val="aff8"/>
@@ -1441,7 +1441,7 @@
             <w:noProof/>
             <w:webHidden/>
           </w:rPr>
-          <w:instrText xml:space="preserve"> PAGEREF _Toc238700727 \h </w:instrText>
+          <w:instrText xml:space="preserve"> PAGEREF _Toc238720524 \h </w:instrText>
         </w:r>
         <w:r>
           <w:rPr>
@@ -1489,7 +1489,7 @@
           <w14:ligatures w14:val="standardContextual"/>
         </w:rPr>
       </w:pPr>
-      <w:hyperlink w:anchor="_Toc238700728" w:history="1">
+      <w:hyperlink w:anchor="_Toc238720525" w:history="1">
         <w:r>
           <w:rPr>
             <w:rStyle w:val="aff8"/>
@@ -1517,7 +1517,7 @@
             <w:noProof/>
             <w:webHidden/>
           </w:rPr>
-          <w:instrText xml:space="preserve"> PAGEREF _Toc238700728 \h </w:instrText>
+          <w:instrText xml:space="preserve"> PAGEREF _Toc238720525 \h </w:instrText>
         </w:r>
         <w:r>
           <w:rPr>
@@ -1565,7 +1565,7 @@
           <w14:ligatures w14:val="standardContextual"/>
         </w:rPr>
       </w:pPr>
-      <w:hyperlink w:anchor="_Toc238700729" w:history="1">
+      <w:hyperlink w:anchor="_Toc238720526" w:history="1">
         <w:r>
           <w:rPr>
             <w:rStyle w:val="aff8"/>
@@ -1593,7 +1593,7 @@
             <w:noProof/>
             <w:webHidden/>
           </w:rPr>
-          <w:instrText xml:space="preserve"> PAGEREF _Toc238700729 \h </w:instrText>
+          <w:instrText xml:space="preserve"> PAGEREF _Toc238720526 \h </w:instrText>
         </w:r>
         <w:r>
           <w:rPr>
@@ -1641,7 +1641,7 @@
           <w14:ligatures w14:val="standardContextual"/>
         </w:rPr>
       </w:pPr>
-      <w:hyperlink w:anchor="_Toc238700730" w:history="1">
+      <w:hyperlink w:anchor="_Toc238720527" w:history="1">
         <w:r>
           <w:rPr>
             <w:rStyle w:val="aff8"/>
@@ -1669,7 +1669,7 @@
             <w:noProof/>
             <w:webHidden/>
           </w:rPr>
-          <w:instrText xml:space="preserve"> PAGEREF _Toc238700730 \h </w:instrText>
+          <w:instrText xml:space="preserve"> PAGEREF _Toc238720527 \h </w:instrText>
         </w:r>
         <w:r>
           <w:rPr>
@@ -1717,7 +1717,7 @@
           <w14:ligatures w14:val="standardContextual"/>
         </w:rPr>
       </w:pPr>
-      <w:hyperlink w:anchor="_Toc238700731" w:history="1">
+      <w:hyperlink w:anchor="_Toc238720528" w:history="1">
         <w:r>
           <w:rPr>
             <w:rStyle w:val="aff8"/>
@@ -1745,7 +1745,7 @@
             <w:noProof/>
             <w:webHidden/>
           </w:rPr>
-          <w:instrText xml:space="preserve"> PAGEREF _Toc238700731 \h </w:instrText>
+          <w:instrText xml:space="preserve"> PAGEREF _Toc238720528 \h </w:instrText>
         </w:r>
         <w:r>
           <w:rPr>
@@ -1793,7 +1793,7 @@
           <w14:ligatures w14:val="standardContextual"/>
         </w:rPr>
       </w:pPr>
-      <w:hyperlink w:anchor="_Toc238700732" w:history="1">
+      <w:hyperlink w:anchor="_Toc238720529" w:history="1">
         <w:r>
           <w:rPr>
             <w:rStyle w:val="aff8"/>
@@ -1821,7 +1821,7 @@
             <w:noProof/>
             <w:webHidden/>
           </w:rPr>
-          <w:instrText xml:space="preserve"> PAGEREF _Toc238700732 \h </w:instrText>
+          <w:instrText xml:space="preserve"> PAGEREF _Toc238720529 \h </w:instrText>
         </w:r>
         <w:r>
           <w:rPr>
@@ -1869,7 +1869,7 @@
           <w14:ligatures w14:val="standardContextual"/>
         </w:rPr>
       </w:pPr>
-      <w:hyperlink w:anchor="_Toc238700733" w:history="1">
+      <w:hyperlink w:anchor="_Toc238720530" w:history="1">
         <w:r>
           <w:rPr>
             <w:rStyle w:val="aff8"/>
@@ -1897,7 +1897,7 @@
             <w:noProof/>
             <w:webHidden/>
           </w:rPr>
-          <w:instrText xml:space="preserve"> PAGEREF _Toc238700733 \h </w:instrText>
+          <w:instrText xml:space="preserve"> PAGEREF _Toc238720530 \h </w:instrText>
         </w:r>
         <w:r>
           <w:rPr>
@@ -1945,7 +1945,7 @@
           <w14:ligatures w14:val="standardContextual"/>
         </w:rPr>
       </w:pPr>
-      <w:hyperlink w:anchor="_Toc238700734" w:history="1">
+      <w:hyperlink w:anchor="_Toc238720531" w:history="1">
         <w:r>
           <w:rPr>
             <w:rStyle w:val="aff8"/>
@@ -1973,7 +1973,7 @@
             <w:noProof/>
             <w:webHidden/>
           </w:rPr>
-          <w:instrText xml:space="preserve"> PAGEREF _Toc238700734 \h </w:instrText>
+          <w:instrText xml:space="preserve"> PAGEREF _Toc238720531 \h </w:instrText>
         </w:r>
         <w:r>
           <w:rPr>
@@ -2021,7 +2021,7 @@
           <w14:ligatures w14:val="standardContextual"/>
         </w:rPr>
       </w:pPr>
-      <w:hyperlink w:anchor="_Toc238700735" w:history="1">
+      <w:hyperlink w:anchor="_Toc238720532" w:history="1">
         <w:r>
           <w:rPr>
             <w:rStyle w:val="aff8"/>
@@ -2049,7 +2049,7 @@
             <w:noProof/>
             <w:webHidden/>
           </w:rPr>
-          <w:instrText xml:space="preserve"> PAGEREF _Toc238700735 \h </w:instrText>
+          <w:instrText xml:space="preserve"> PAGEREF _Toc238720532 \h </w:instrText>
         </w:r>
         <w:r>
           <w:rPr>
@@ -2097,7 +2097,7 @@
           <w14:ligatures w14:val="standardContextual"/>
         </w:rPr>
       </w:pPr>
-      <w:hyperlink w:anchor="_Toc238700736" w:history="1">
+      <w:hyperlink w:anchor="_Toc238720533" w:history="1">
         <w:r>
           <w:rPr>
             <w:rStyle w:val="aff8"/>
@@ -2125,7 +2125,7 @@
             <w:noProof/>
             <w:webHidden/>
           </w:rPr>
-          <w:instrText xml:space="preserve"> PAGEREF _Toc238700736 \h </w:instrText>
+          <w:instrText xml:space="preserve"> PAGEREF _Toc238720533 \h </w:instrText>
         </w:r>
         <w:r>
           <w:rPr>
@@ -2173,7 +2173,7 @@
           <w14:ligatures w14:val="standardContextual"/>
         </w:rPr>
       </w:pPr>
-      <w:hyperlink w:anchor="_Toc238700737" w:history="1">
+      <w:hyperlink w:anchor="_Toc238720534" w:history="1">
         <w:r>
           <w:rPr>
             <w:rStyle w:val="aff8"/>
@@ -2201,7 +2201,7 @@
             <w:noProof/>
             <w:webHidden/>
           </w:rPr>
-          <w:instrText xml:space="preserve"> PAGEREF _Toc238700737 \h </w:instrText>
+          <w:instrText xml:space="preserve"> PAGEREF _Toc238720534 \h </w:instrText>
         </w:r>
         <w:r>
           <w:rPr>
@@ -2249,7 +2249,7 @@
           <w14:ligatures w14:val="standardContextual"/>
         </w:rPr>
       </w:pPr>
-      <w:hyperlink w:anchor="_Toc238700738" w:history="1">
+      <w:hyperlink w:anchor="_Toc238720535" w:history="1">
         <w:r>
           <w:rPr>
             <w:rStyle w:val="aff8"/>
@@ -2277,7 +2277,7 @@
             <w:noProof/>
             <w:webHidden/>
           </w:rPr>
-          <w:instrText xml:space="preserve"> PAGEREF _Toc238700738 \h </w:instrText>
+          <w:instrText xml:space="preserve"> PAGEREF _Toc238720535 \h </w:instrText>
         </w:r>
         <w:r>
           <w:rPr>
@@ -2325,7 +2325,7 @@
           <w14:ligatures w14:val="standardContextual"/>
         </w:rPr>
       </w:pPr>
-      <w:hyperlink w:anchor="_Toc238700739" w:history="1">
+      <w:hyperlink w:anchor="_Toc238720536" w:history="1">
         <w:r>
           <w:rPr>
             <w:rStyle w:val="aff8"/>
@@ -2353,7 +2353,7 @@
             <w:noProof/>
             <w:webHidden/>
           </w:rPr>
-          <w:instrText xml:space="preserve"> PAGEREF _Toc238700739 \h </w:instrText>
+          <w:instrText xml:space="preserve"> PAGEREF _Toc238720536 \h </w:instrText>
         </w:r>
         <w:r>
           <w:rPr>
@@ -2401,7 +2401,7 @@
           <w14:ligatures w14:val="standardContextual"/>
         </w:rPr>
       </w:pPr>
-      <w:hyperlink w:anchor="_Toc238700740" w:history="1">
+      <w:hyperlink w:anchor="_Toc238720537" w:history="1">
         <w:r>
           <w:rPr>
             <w:rStyle w:val="aff8"/>
@@ -2429,7 +2429,7 @@
             <w:noProof/>
             <w:webHidden/>
           </w:rPr>
-          <w:instrText xml:space="preserve"> PAGEREF _Toc238700740 \h </w:instrText>
+          <w:instrText xml:space="preserve"> PAGEREF _Toc238720537 \h </w:instrText>
         </w:r>
         <w:r>
           <w:rPr>
@@ -2477,7 +2477,7 @@
           <w14:ligatures w14:val="standardContextual"/>
         </w:rPr>
       </w:pPr>
-      <w:hyperlink w:anchor="_Toc238700741" w:history="1">
+      <w:hyperlink w:anchor="_Toc238720538" w:history="1">
         <w:r>
           <w:rPr>
             <w:rStyle w:val="aff8"/>
@@ -2505,7 +2505,7 @@
             <w:noProof/>
             <w:webHidden/>
           </w:rPr>
-          <w:instrText xml:space="preserve"> PAGEREF _Toc238700741 \h </w:instrText>
+          <w:instrText xml:space="preserve"> PAGEREF _Toc238720538 \h </w:instrText>
         </w:r>
         <w:r>
           <w:rPr>
@@ -2553,7 +2553,7 @@
           <w14:ligatures w14:val="standardContextual"/>
         </w:rPr>
       </w:pPr>
-      <w:hyperlink w:anchor="_Toc238700742" w:history="1">
+      <w:hyperlink w:anchor="_Toc238720539" w:history="1">
         <w:r>
           <w:rPr>
             <w:rStyle w:val="aff8"/>
@@ -2581,7 +2581,7 @@
             <w:noProof/>
             <w:webHidden/>
           </w:rPr>
-          <w:instrText xml:space="preserve"> PAGEREF _Toc238700742 \h </w:instrText>
+          <w:instrText xml:space="preserve"> PAGEREF _Toc238720539 \h </w:instrText>
         </w:r>
         <w:r>
           <w:rPr>
@@ -2629,7 +2629,7 @@
           <w14:ligatures w14:val="standardContextual"/>
         </w:rPr>
       </w:pPr>
-      <w:hyperlink w:anchor="_Toc238700743" w:history="1">
+      <w:hyperlink w:anchor="_Toc238720540" w:history="1">
         <w:r>
           <w:rPr>
             <w:rStyle w:val="aff8"/>
@@ -2657,7 +2657,7 @@
             <w:noProof/>
             <w:webHidden/>
           </w:rPr>
-          <w:instrText xml:space="preserve"> PAGEREF _Toc238700743 \h </w:instrText>
+          <w:instrText xml:space="preserve"> PAGEREF _Toc238720540 \h </w:instrText>
         </w:r>
         <w:r>
           <w:rPr>
@@ -2705,7 +2705,7 @@
           <w14:ligatures w14:val="standardContextual"/>
         </w:rPr>
       </w:pPr>
-      <w:hyperlink w:anchor="_Toc238700744" w:history="1">
+      <w:hyperlink w:anchor="_Toc238720541" w:history="1">
         <w:r>
           <w:rPr>
             <w:rStyle w:val="aff8"/>
@@ -2733,7 +2733,7 @@
             <w:noProof/>
             <w:webHidden/>
           </w:rPr>
-          <w:instrText xml:space="preserve"> PAGEREF _Toc238700744 \h </w:instrText>
+          <w:instrText xml:space="preserve"> PAGEREF _Toc238720541 \h </w:instrText>
         </w:r>
         <w:r>
           <w:rPr>
@@ -2781,7 +2781,7 @@
           <w14:ligatures w14:val="standardContextual"/>
         </w:rPr>
       </w:pPr>
-      <w:hyperlink w:anchor="_Toc238700745" w:history="1">
+      <w:hyperlink w:anchor="_Toc238720542" w:history="1">
         <w:r>
           <w:rPr>
             <w:rStyle w:val="aff8"/>
@@ -2809,7 +2809,7 @@
             <w:noProof/>
             <w:webHidden/>
           </w:rPr>
-          <w:instrText xml:space="preserve"> PAGEREF _Toc238700745 \h </w:instrText>
+          <w:instrText xml:space="preserve"> PAGEREF _Toc238720542 \h </w:instrText>
         </w:r>
         <w:r>
           <w:rPr>
@@ -2857,7 +2857,7 @@
           <w14:ligatures w14:val="standardContextual"/>
         </w:rPr>
       </w:pPr>
-      <w:hyperlink w:anchor="_Toc238700746" w:history="1">
+      <w:hyperlink w:anchor="_Toc238720543" w:history="1">
         <w:r>
           <w:rPr>
             <w:rStyle w:val="aff8"/>
@@ -2885,7 +2885,7 @@
             <w:noProof/>
             <w:webHidden/>
           </w:rPr>
-          <w:instrText xml:space="preserve"> PAGEREF _Toc238700746 \h </w:instrText>
+          <w:instrText xml:space="preserve"> PAGEREF _Toc238720543 \h </w:instrText>
         </w:r>
         <w:r>
           <w:rPr>
@@ -2933,7 +2933,7 @@
           <w14:ligatures w14:val="standardContextual"/>
         </w:rPr>
       </w:pPr>
-      <w:hyperlink w:anchor="_Toc238700747" w:history="1">
+      <w:hyperlink w:anchor="_Toc238720544" w:history="1">
         <w:r>
           <w:rPr>
             <w:rStyle w:val="aff8"/>
@@ -2961,7 +2961,7 @@
             <w:noProof/>
             <w:webHidden/>
           </w:rPr>
-          <w:instrText xml:space="preserve"> PAGEREF _Toc238700747 \h </w:instrText>
+          <w:instrText xml:space="preserve"> PAGEREF _Toc238720544 \h </w:instrText>
         </w:r>
         <w:r>
           <w:rPr>
@@ -3009,7 +3009,7 @@
           <w14:ligatures w14:val="standardContextual"/>
         </w:rPr>
       </w:pPr>
-      <w:hyperlink w:anchor="_Toc238700748" w:history="1">
+      <w:hyperlink w:anchor="_Toc238720545" w:history="1">
         <w:r>
           <w:rPr>
             <w:rStyle w:val="aff8"/>
@@ -3037,7 +3037,7 @@
             <w:noProof/>
             <w:webHidden/>
           </w:rPr>
-          <w:instrText xml:space="preserve"> PAGEREF _Toc238700748 \h </w:instrText>
+          <w:instrText xml:space="preserve"> PAGEREF _Toc238720545 \h </w:instrText>
         </w:r>
         <w:r>
           <w:rPr>
@@ -3057,7 +3057,7 @@
             <w:noProof/>
             <w:webHidden/>
           </w:rPr>
-          <w:t>41</w:t>
+          <w:t>42</w:t>
         </w:r>
         <w:r>
           <w:rPr>
@@ -3085,7 +3085,7 @@
           <w14:ligatures w14:val="standardContextual"/>
         </w:rPr>
       </w:pPr>
-      <w:hyperlink w:anchor="_Toc238700749" w:history="1">
+      <w:hyperlink w:anchor="_Toc238720546" w:history="1">
         <w:r>
           <w:rPr>
             <w:rStyle w:val="aff8"/>
@@ -3113,7 +3113,7 @@
             <w:noProof/>
             <w:webHidden/>
           </w:rPr>
-          <w:instrText xml:space="preserve"> PAGEREF _Toc238700749 \h </w:instrText>
+          <w:instrText xml:space="preserve"> PAGEREF _Toc238720546 \h </w:instrText>
         </w:r>
         <w:r>
           <w:rPr>
@@ -3161,7 +3161,7 @@
           <w14:ligatures w14:val="standardContextual"/>
         </w:rPr>
       </w:pPr>
-      <w:hyperlink w:anchor="_Toc238700750" w:history="1">
+      <w:hyperlink w:anchor="_Toc238720547" w:history="1">
         <w:r>
           <w:rPr>
             <w:rStyle w:val="aff8"/>
@@ -3189,7 +3189,7 @@
             <w:noProof/>
             <w:webHidden/>
           </w:rPr>
-          <w:instrText xml:space="preserve"> PAGEREF _Toc238700750 \h </w:instrText>
+          <w:instrText xml:space="preserve"> PAGEREF _Toc238720547 \h </w:instrText>
         </w:r>
         <w:r>
           <w:rPr>
@@ -3237,7 +3237,7 @@
           <w14:ligatures w14:val="standardContextual"/>
         </w:rPr>
       </w:pPr>
-      <w:hyperlink w:anchor="_Toc238700751" w:history="1">
+      <w:hyperlink w:anchor="_Toc238720548" w:history="1">
         <w:r>
           <w:rPr>
             <w:rStyle w:val="aff8"/>
@@ -3265,7 +3265,7 @@
             <w:noProof/>
             <w:webHidden/>
           </w:rPr>
-          <w:instrText xml:space="preserve"> PAGEREF _Toc238700751 \h </w:instrText>
+          <w:instrText xml:space="preserve"> PAGEREF _Toc238720548 \h </w:instrText>
         </w:r>
         <w:r>
           <w:rPr>
@@ -3313,7 +3313,7 @@
           <w14:ligatures w14:val="standardContextual"/>
         </w:rPr>
       </w:pPr>
-      <w:hyperlink w:anchor="_Toc238700752" w:history="1">
+      <w:hyperlink w:anchor="_Toc238720549" w:history="1">
         <w:r>
           <w:rPr>
             <w:rStyle w:val="aff8"/>
@@ -3341,7 +3341,7 @@
             <w:noProof/>
             <w:webHidden/>
           </w:rPr>
-          <w:instrText xml:space="preserve"> PAGEREF _Toc238700752 \h </w:instrText>
+          <w:instrText xml:space="preserve"> PAGEREF _Toc238720549 \h </w:instrText>
         </w:r>
         <w:r>
           <w:rPr>
@@ -3389,7 +3389,7 @@
           <w14:ligatures w14:val="standardContextual"/>
         </w:rPr>
       </w:pPr>
-      <w:hyperlink w:anchor="_Toc238700753" w:history="1">
+      <w:hyperlink w:anchor="_Toc238720550" w:history="1">
         <w:r>
           <w:rPr>
             <w:rStyle w:val="aff8"/>
@@ -3417,7 +3417,7 @@
             <w:noProof/>
             <w:webHidden/>
           </w:rPr>
-          <w:instrText xml:space="preserve"> PAGEREF _Toc238700753 \h </w:instrText>
+          <w:instrText xml:space="preserve"> PAGEREF _Toc238720550 \h </w:instrText>
         </w:r>
         <w:r>
           <w:rPr>
@@ -3465,7 +3465,7 @@
           <w14:ligatures w14:val="standardContextual"/>
         </w:rPr>
       </w:pPr>
-      <w:hyperlink w:anchor="_Toc238700754" w:history="1">
+      <w:hyperlink w:anchor="_Toc238720551" w:history="1">
         <w:r>
           <w:rPr>
             <w:rStyle w:val="aff8"/>
@@ -3493,7 +3493,7 @@
             <w:noProof/>
             <w:webHidden/>
           </w:rPr>
-          <w:instrText xml:space="preserve"> PAGEREF _Toc238700754 \h </w:instrText>
+          <w:instrText xml:space="preserve"> PAGEREF _Toc238720551 \h </w:instrText>
         </w:r>
         <w:r>
           <w:rPr>
@@ -3541,7 +3541,7 @@
           <w14:ligatures w14:val="standardContextual"/>
         </w:rPr>
       </w:pPr>
-      <w:hyperlink w:anchor="_Toc238700755" w:history="1">
+      <w:hyperlink w:anchor="_Toc238720552" w:history="1">
         <w:r>
           <w:rPr>
             <w:rStyle w:val="aff8"/>
@@ -3569,7 +3569,7 @@
             <w:noProof/>
             <w:webHidden/>
           </w:rPr>
-          <w:instrText xml:space="preserve"> PAGEREF _Toc238700755 \h </w:instrText>
+          <w:instrText xml:space="preserve"> PAGEREF _Toc238720552 \h </w:instrText>
         </w:r>
         <w:r>
           <w:rPr>
@@ -3617,7 +3617,7 @@
           <w14:ligatures w14:val="standardContextual"/>
         </w:rPr>
       </w:pPr>
-      <w:hyperlink w:anchor="_Toc238700756" w:history="1">
+      <w:hyperlink w:anchor="_Toc238720553" w:history="1">
         <w:r>
           <w:rPr>
             <w:rStyle w:val="aff8"/>
@@ -3645,7 +3645,7 @@
             <w:noProof/>
             <w:webHidden/>
           </w:rPr>
-          <w:instrText xml:space="preserve"> PAGEREF _Toc238700756 \h </w:instrText>
+          <w:instrText xml:space="preserve"> PAGEREF _Toc238720553 \h </w:instrText>
         </w:r>
         <w:r>
           <w:rPr>
@@ -3693,7 +3693,7 @@
           <w14:ligatures w14:val="standardContextual"/>
         </w:rPr>
       </w:pPr>
-      <w:hyperlink w:anchor="_Toc238700757" w:history="1">
+      <w:hyperlink w:anchor="_Toc238720554" w:history="1">
         <w:r>
           <w:rPr>
             <w:rStyle w:val="aff8"/>
@@ -3721,7 +3721,7 @@
             <w:noProof/>
             <w:webHidden/>
           </w:rPr>
-          <w:instrText xml:space="preserve"> PAGEREF _Toc238700757 \h </w:instrText>
+          <w:instrText xml:space="preserve"> PAGEREF _Toc238720554 \h </w:instrText>
         </w:r>
         <w:r>
           <w:rPr>
@@ -3769,7 +3769,7 @@
           <w14:ligatures w14:val="standardContextual"/>
         </w:rPr>
       </w:pPr>
-      <w:hyperlink w:anchor="_Toc238700758" w:history="1">
+      <w:hyperlink w:anchor="_Toc238720555" w:history="1">
         <w:r>
           <w:rPr>
             <w:rStyle w:val="aff8"/>
@@ -3797,7 +3797,7 @@
             <w:noProof/>
             <w:webHidden/>
           </w:rPr>
-          <w:instrText xml:space="preserve"> PAGEREF _Toc238700758 \h </w:instrText>
+          <w:instrText xml:space="preserve"> PAGEREF _Toc238720555 \h </w:instrText>
         </w:r>
         <w:r>
           <w:rPr>
@@ -3845,7 +3845,7 @@
           <w14:ligatures w14:val="standardContextual"/>
         </w:rPr>
       </w:pPr>
-      <w:hyperlink w:anchor="_Toc238700759" w:history="1">
+      <w:hyperlink w:anchor="_Toc238720556" w:history="1">
         <w:r>
           <w:rPr>
             <w:rStyle w:val="aff8"/>
@@ -3873,7 +3873,7 @@
             <w:noProof/>
             <w:webHidden/>
           </w:rPr>
-          <w:instrText xml:space="preserve"> PAGEREF _Toc238700759 \h </w:instrText>
+          <w:instrText xml:space="preserve"> PAGEREF _Toc238720556 \h </w:instrText>
         </w:r>
         <w:r>
           <w:rPr>
@@ -3921,7 +3921,7 @@
           <w14:ligatures w14:val="standardContextual"/>
         </w:rPr>
       </w:pPr>
-      <w:hyperlink w:anchor="_Toc238700760" w:history="1">
+      <w:hyperlink w:anchor="_Toc238720557" w:history="1">
         <w:r>
           <w:rPr>
             <w:rStyle w:val="aff8"/>
@@ -3949,7 +3949,7 @@
             <w:noProof/>
             <w:webHidden/>
           </w:rPr>
-          <w:instrText xml:space="preserve"> PAGEREF _Toc238700760 \h </w:instrText>
+          <w:instrText xml:space="preserve"> PAGEREF _Toc238720557 \h </w:instrText>
         </w:r>
         <w:r>
           <w:rPr>
@@ -3997,7 +3997,7 @@
           <w14:ligatures w14:val="standardContextual"/>
         </w:rPr>
       </w:pPr>
-      <w:hyperlink w:anchor="_Toc238700761" w:history="1">
+      <w:hyperlink w:anchor="_Toc238720558" w:history="1">
         <w:r>
           <w:rPr>
             <w:rStyle w:val="aff8"/>
@@ -4025,7 +4025,7 @@
             <w:noProof/>
             <w:webHidden/>
           </w:rPr>
-          <w:instrText xml:space="preserve"> PAGEREF _Toc238700761 \h </w:instrText>
+          <w:instrText xml:space="preserve"> PAGEREF _Toc238720558 \h </w:instrText>
         </w:r>
         <w:r>
           <w:rPr>
@@ -4073,7 +4073,7 @@
           <w14:ligatures w14:val="standardContextual"/>
         </w:rPr>
       </w:pPr>
-      <w:hyperlink w:anchor="_Toc238700762" w:history="1">
+      <w:hyperlink w:anchor="_Toc238720559" w:history="1">
         <w:r>
           <w:rPr>
             <w:rStyle w:val="aff8"/>
@@ -4101,7 +4101,7 @@
             <w:noProof/>
             <w:webHidden/>
           </w:rPr>
-          <w:instrText xml:space="preserve"> PAGEREF _Toc238700762 \h </w:instrText>
+          <w:instrText xml:space="preserve"> PAGEREF _Toc238720559 \h </w:instrText>
         </w:r>
         <w:r>
           <w:rPr>
@@ -4149,7 +4149,7 @@
           <w14:ligatures w14:val="standardContextual"/>
         </w:rPr>
       </w:pPr>
-      <w:hyperlink w:anchor="_Toc238700763" w:history="1">
+      <w:hyperlink w:anchor="_Toc238720560" w:history="1">
         <w:r>
           <w:rPr>
             <w:rStyle w:val="aff8"/>
@@ -4177,7 +4177,7 @@
             <w:noProof/>
             <w:webHidden/>
           </w:rPr>
-          <w:instrText xml:space="preserve"> PAGEREF _Toc238700763 \h </w:instrText>
+          <w:instrText xml:space="preserve"> PAGEREF _Toc238720560 \h </w:instrText>
         </w:r>
         <w:r>
           <w:rPr>
@@ -4225,7 +4225,7 @@
           <w14:ligatures w14:val="standardContextual"/>
         </w:rPr>
       </w:pPr>
-      <w:hyperlink w:anchor="_Toc238700764" w:history="1">
+      <w:hyperlink w:anchor="_Toc238720561" w:history="1">
         <w:r>
           <w:rPr>
             <w:rStyle w:val="aff8"/>
@@ -4253,7 +4253,7 @@
             <w:noProof/>
             <w:webHidden/>
           </w:rPr>
-          <w:instrText xml:space="preserve"> PAGEREF _Toc238700764 \h </w:instrText>
+          <w:instrText xml:space="preserve"> PAGEREF _Toc238720561 \h </w:instrText>
         </w:r>
         <w:r>
           <w:rPr>
@@ -4301,7 +4301,7 @@
           <w14:ligatures w14:val="standardContextual"/>
         </w:rPr>
       </w:pPr>
-      <w:hyperlink w:anchor="_Toc238700765" w:history="1">
+      <w:hyperlink w:anchor="_Toc238720562" w:history="1">
         <w:r>
           <w:rPr>
             <w:rStyle w:val="aff8"/>
@@ -4329,7 +4329,7 @@
             <w:noProof/>
             <w:webHidden/>
           </w:rPr>
-          <w:instrText xml:space="preserve"> PAGEREF _Toc238700765 \h </w:instrText>
+          <w:instrText xml:space="preserve"> PAGEREF _Toc238720562 \h </w:instrText>
         </w:r>
         <w:r>
           <w:rPr>
@@ -4377,7 +4377,7 @@
           <w14:ligatures w14:val="standardContextual"/>
         </w:rPr>
       </w:pPr>
-      <w:hyperlink w:anchor="_Toc238700766" w:history="1">
+      <w:hyperlink w:anchor="_Toc238720563" w:history="1">
         <w:r>
           <w:rPr>
             <w:rStyle w:val="aff8"/>
@@ -4405,7 +4405,7 @@
             <w:noProof/>
             <w:webHidden/>
           </w:rPr>
-          <w:instrText xml:space="preserve"> PAGEREF _Toc238700766 \h </w:instrText>
+          <w:instrText xml:space="preserve"> PAGEREF _Toc238720563 \h </w:instrText>
         </w:r>
         <w:r>
           <w:rPr>
@@ -4453,7 +4453,7 @@
           <w14:ligatures w14:val="standardContextual"/>
         </w:rPr>
       </w:pPr>
-      <w:hyperlink w:anchor="_Toc238700767" w:history="1">
+      <w:hyperlink w:anchor="_Toc238720564" w:history="1">
         <w:r>
           <w:rPr>
             <w:rStyle w:val="aff8"/>
@@ -4481,7 +4481,7 @@
             <w:noProof/>
             <w:webHidden/>
           </w:rPr>
-          <w:instrText xml:space="preserve"> PAGEREF _Toc238700767 \h </w:instrText>
+          <w:instrText xml:space="preserve"> PAGEREF _Toc238720564 \h </w:instrText>
         </w:r>
         <w:r>
           <w:rPr>
@@ -4529,7 +4529,7 @@
           <w14:ligatures w14:val="standardContextual"/>
         </w:rPr>
       </w:pPr>
-      <w:hyperlink w:anchor="_Toc238700768" w:history="1">
+      <w:hyperlink w:anchor="_Toc238720565" w:history="1">
         <w:r>
           <w:rPr>
             <w:rStyle w:val="aff8"/>
@@ -4557,7 +4557,7 @@
             <w:noProof/>
             <w:webHidden/>
           </w:rPr>
-          <w:instrText xml:space="preserve"> PAGEREF _Toc238700768 \h </w:instrText>
+          <w:instrText xml:space="preserve"> PAGEREF _Toc238720565 \h </w:instrText>
         </w:r>
         <w:r>
           <w:rPr>
@@ -4605,7 +4605,7 @@
           <w14:ligatures w14:val="standardContextual"/>
         </w:rPr>
       </w:pPr>
-      <w:hyperlink w:anchor="_Toc238700769" w:history="1">
+      <w:hyperlink w:anchor="_Toc238720566" w:history="1">
         <w:r>
           <w:rPr>
             <w:rStyle w:val="aff8"/>
@@ -4633,7 +4633,7 @@
             <w:noProof/>
             <w:webHidden/>
           </w:rPr>
-          <w:instrText xml:space="preserve"> PAGEREF _Toc238700769 \h </w:instrText>
+          <w:instrText xml:space="preserve"> PAGEREF _Toc238720566 \h </w:instrText>
         </w:r>
         <w:r>
           <w:rPr>
@@ -4681,7 +4681,7 @@
           <w14:ligatures w14:val="standardContextual"/>
         </w:rPr>
       </w:pPr>
-      <w:hyperlink w:anchor="_Toc238700770" w:history="1">
+      <w:hyperlink w:anchor="_Toc238720567" w:history="1">
         <w:r>
           <w:rPr>
             <w:rStyle w:val="aff8"/>
@@ -4709,7 +4709,7 @@
             <w:noProof/>
             <w:webHidden/>
           </w:rPr>
-          <w:instrText xml:space="preserve"> PAGEREF _Toc238700770 \h </w:instrText>
+          <w:instrText xml:space="preserve"> PAGEREF _Toc238720567 \h </w:instrText>
         </w:r>
         <w:r>
           <w:rPr>
@@ -4757,7 +4757,7 @@
           <w14:ligatures w14:val="standardContextual"/>
         </w:rPr>
       </w:pPr>
-      <w:hyperlink w:anchor="_Toc238700771" w:history="1">
+      <w:hyperlink w:anchor="_Toc238720568" w:history="1">
         <w:r>
           <w:rPr>
             <w:rStyle w:val="aff8"/>
@@ -4785,7 +4785,7 @@
             <w:noProof/>
             <w:webHidden/>
           </w:rPr>
-          <w:instrText xml:space="preserve"> PAGEREF _Toc238700771 \h </w:instrText>
+          <w:instrText xml:space="preserve"> PAGEREF _Toc238720568 \h </w:instrText>
         </w:r>
         <w:r>
           <w:rPr>
@@ -4833,7 +4833,7 @@
           <w14:ligatures w14:val="standardContextual"/>
         </w:rPr>
       </w:pPr>
-      <w:hyperlink w:anchor="_Toc238700772" w:history="1">
+      <w:hyperlink w:anchor="_Toc238720569" w:history="1">
         <w:r>
           <w:rPr>
             <w:rStyle w:val="aff8"/>
@@ -4861,7 +4861,7 @@
             <w:noProof/>
             <w:webHidden/>
           </w:rPr>
-          <w:instrText xml:space="preserve"> PAGEREF _Toc238700772 \h </w:instrText>
+          <w:instrText xml:space="preserve"> PAGEREF _Toc238720569 \h </w:instrText>
         </w:r>
         <w:r>
           <w:rPr>
@@ -4909,7 +4909,7 @@
       <w:pPr>
         <w:pStyle w:val="1"/>
       </w:pPr>
-      <w:bookmarkStart w:id="0" w:name="_Toc238700710"/>
+      <w:bookmarkStart w:id="0" w:name="_Toc238720507"/>
       <w:r>
         <w:lastRenderedPageBreak/>
         <w:t>1. About the program</w:t>
@@ -4920,7 +4920,7 @@
       <w:pPr>
         <w:pStyle w:val="21"/>
       </w:pPr>
-      <w:bookmarkStart w:id="1" w:name="_Toc238700711"/>
+      <w:bookmarkStart w:id="1" w:name="_Toc238720508"/>
       <w:r>
         <w:t>1.1. What it is for</w:t>
       </w:r>
@@ -5399,7 +5399,7 @@
       <w:pPr>
         <w:pStyle w:val="21"/>
       </w:pPr>
-      <w:bookmarkStart w:id="2" w:name="_Toc238700712"/>
+      <w:bookmarkStart w:id="2" w:name="_Toc238720509"/>
       <w:r>
         <w:t>1.2. What the program gives you</w:t>
       </w:r>
@@ -5484,7 +5484,7 @@
       <w:pPr>
         <w:pStyle w:val="21"/>
       </w:pPr>
-      <w:bookmarkStart w:id="3" w:name="_Toc238700713"/>
+      <w:bookmarkStart w:id="3" w:name="_Toc238720510"/>
       <w:r>
         <w:lastRenderedPageBreak/>
         <w:t>1.3. What the workplace needs</w:t>
@@ -5511,7 +5511,7 @@
       <w:pPr>
         <w:pStyle w:val="21"/>
       </w:pPr>
-      <w:bookmarkStart w:id="4" w:name="_Toc238700714"/>
+      <w:bookmarkStart w:id="4" w:name="_Toc238720511"/>
       <w:r>
         <w:t>1.4. Installing, starting and updating</w:t>
       </w:r>
@@ -5594,7 +5594,7 @@
       <w:pPr>
         <w:pStyle w:val="1"/>
       </w:pPr>
-      <w:bookmarkStart w:id="5" w:name="_Toc238700715"/>
+      <w:bookmarkStart w:id="5" w:name="_Toc238720512"/>
       <w:r>
         <w:t>2. How working with the program is arranged</w:t>
       </w:r>
@@ -5604,7 +5604,7 @@
       <w:pPr>
         <w:pStyle w:val="21"/>
       </w:pPr>
-      <w:bookmarkStart w:id="6" w:name="_Toc238700716"/>
+      <w:bookmarkStart w:id="6" w:name="_Toc238720513"/>
       <w:r>
         <w:t>2.1. The start screen</w:t>
       </w:r>
@@ -5628,7 +5628,7 @@
         </w:rPr>
         <w:lastRenderedPageBreak/>
         <w:drawing>
-          <wp:inline distT="0" distB="0" distL="0" distR="0" wp14:anchorId="3125B74A" wp14:editId="0EF55925">
+          <wp:inline distT="0" distB="0" distL="0" distR="0" wp14:anchorId="29DCF9CE" wp14:editId="1D680A16">
             <wp:extent cx="5760000" cy="5127111"/>
             <wp:effectExtent l="0" t="0" r="0" b="0"/>
             <wp:docPr id="1" name="Picture 1"/>
@@ -5695,7 +5695,7 @@
         </w:rPr>
         <w:lastRenderedPageBreak/>
         <w:drawing>
-          <wp:inline distT="0" distB="0" distL="0" distR="0" wp14:anchorId="756989F3" wp14:editId="6CDE213E">
+          <wp:inline distT="0" distB="0" distL="0" distR="0" wp14:anchorId="3B57B4F3" wp14:editId="2EC5A8A4">
             <wp:extent cx="5760000" cy="5134830"/>
             <wp:effectExtent l="0" t="0" r="0" b="0"/>
             <wp:docPr id="2" name="Picture 2"/>
@@ -5779,7 +5779,7 @@
       <w:pPr>
         <w:pStyle w:val="21"/>
       </w:pPr>
-      <w:bookmarkStart w:id="7" w:name="_Toc238700717"/>
+      <w:bookmarkStart w:id="7" w:name="_Toc238720514"/>
       <w:r>
         <w:t>2.2. The language of the interface</w:t>
       </w:r>
@@ -5802,7 +5802,7 @@
           <w:noProof/>
         </w:rPr>
         <w:drawing>
-          <wp:inline distT="0" distB="0" distL="0" distR="0" wp14:anchorId="20AE2C01" wp14:editId="54DAEC2B">
+          <wp:inline distT="0" distB="0" distL="0" distR="0" wp14:anchorId="6FE377AA" wp14:editId="047297AB">
             <wp:extent cx="5760000" cy="5127111"/>
             <wp:effectExtent l="0" t="0" r="0" b="0"/>
             <wp:docPr id="3" name="Picture 3"/>
@@ -5875,7 +5875,7 @@
       <w:pPr>
         <w:pStyle w:val="21"/>
       </w:pPr>
-      <w:bookmarkStart w:id="8" w:name="_Toc238700718"/>
+      <w:bookmarkStart w:id="8" w:name="_Toc238720515"/>
       <w:r>
         <w:t>2.3. The built-in help</w:t>
       </w:r>
@@ -5898,7 +5898,7 @@
           <w:noProof/>
         </w:rPr>
         <w:drawing>
-          <wp:inline distT="0" distB="0" distL="0" distR="0" wp14:anchorId="6DA3043C" wp14:editId="21E6711A">
+          <wp:inline distT="0" distB="0" distL="0" distR="0" wp14:anchorId="3B31259B" wp14:editId="677C84C5">
             <wp:extent cx="3133777" cy="6119999"/>
             <wp:effectExtent l="0" t="0" r="0" b="0"/>
             <wp:docPr id="4" name="Picture 4"/>
@@ -5962,7 +5962,7 @@
           <w:noProof/>
         </w:rPr>
         <w:drawing>
-          <wp:inline distT="0" distB="0" distL="0" distR="0" wp14:anchorId="208DBD4D" wp14:editId="78A3F80E">
+          <wp:inline distT="0" distB="0" distL="0" distR="0" wp14:anchorId="2EFE7520" wp14:editId="72E01441">
             <wp:extent cx="3707476" cy="2859578"/>
             <wp:effectExtent l="0" t="0" r="0" b="0"/>
             <wp:docPr id="5" name="Picture 5"/>
@@ -6543,7 +6543,7 @@
       <w:pPr>
         <w:pStyle w:val="21"/>
       </w:pPr>
-      <w:bookmarkStart w:id="9" w:name="_Toc238700719"/>
+      <w:bookmarkStart w:id="9" w:name="_Toc238720516"/>
       <w:r>
         <w:lastRenderedPageBreak/>
         <w:t>2.4. The page grid</w:t>
@@ -6578,7 +6578,7 @@
         </w:rPr>
         <w:lastRenderedPageBreak/>
         <w:drawing>
-          <wp:inline distT="0" distB="0" distL="0" distR="0" wp14:anchorId="45701D0F" wp14:editId="7917988B">
+          <wp:inline distT="0" distB="0" distL="0" distR="0" wp14:anchorId="1975F455" wp14:editId="5D2B17F3">
             <wp:extent cx="5760000" cy="4608000"/>
             <wp:effectExtent l="0" t="0" r="0" b="0"/>
             <wp:docPr id="6" name="Picture 6"/>
@@ -6641,7 +6641,7 @@
           <w:noProof/>
         </w:rPr>
         <w:drawing>
-          <wp:inline distT="0" distB="0" distL="0" distR="0" wp14:anchorId="1944135F" wp14:editId="63A7D530">
+          <wp:inline distT="0" distB="0" distL="0" distR="0" wp14:anchorId="5942B286" wp14:editId="6EC79213">
             <wp:extent cx="2543694" cy="1255222"/>
             <wp:effectExtent l="0" t="0" r="0" b="0"/>
             <wp:docPr id="7" name="Picture 7"/>
@@ -6719,7 +6719,7 @@
       <w:pPr>
         <w:pStyle w:val="21"/>
       </w:pPr>
-      <w:bookmarkStart w:id="10" w:name="_Toc238700720"/>
+      <w:bookmarkStart w:id="10" w:name="_Toc238720517"/>
       <w:r>
         <w:lastRenderedPageBreak/>
         <w:t>2.5. Viewing a page full size</w:t>
@@ -6743,7 +6743,7 @@
           <w:noProof/>
         </w:rPr>
         <w:drawing>
-          <wp:inline distT="0" distB="0" distL="0" distR="0" wp14:anchorId="38AA7CB0" wp14:editId="7F7E3524">
+          <wp:inline distT="0" distB="0" distL="0" distR="0" wp14:anchorId="793BC31B" wp14:editId="04B8EBB5">
             <wp:extent cx="5338723" cy="6120000"/>
             <wp:effectExtent l="0" t="0" r="0" b="0"/>
             <wp:docPr id="8" name="Picture 8"/>
@@ -6807,7 +6807,7 @@
       <w:pPr>
         <w:pStyle w:val="21"/>
       </w:pPr>
-      <w:bookmarkStart w:id="11" w:name="_Toc238700721"/>
+      <w:bookmarkStart w:id="11" w:name="_Toc238720518"/>
       <w:r>
         <w:t>2.6. Printing</w:t>
       </w:r>
@@ -6827,7 +6827,7 @@
       <w:pPr>
         <w:pStyle w:val="21"/>
       </w:pPr>
-      <w:bookmarkStart w:id="12" w:name="_Toc238700722"/>
+      <w:bookmarkStart w:id="12" w:name="_Toc238720519"/>
       <w:r>
         <w:t>2.7. Making the file smaller (compression)</w:t>
       </w:r>
@@ -6851,7 +6851,7 @@
         </w:rPr>
         <w:lastRenderedPageBreak/>
         <w:drawing>
-          <wp:inline distT="0" distB="0" distL="0" distR="0" wp14:anchorId="27C991AD" wp14:editId="7AE66D64">
+          <wp:inline distT="0" distB="0" distL="0" distR="0" wp14:anchorId="45372CD6" wp14:editId="70BFDC6A">
             <wp:extent cx="5760000" cy="4608000"/>
             <wp:effectExtent l="0" t="0" r="0" b="0"/>
             <wp:docPr id="9" name="Picture 9"/>
@@ -7215,7 +7215,7 @@
           <w:noProof/>
         </w:rPr>
         <w:drawing>
-          <wp:inline distT="0" distB="0" distL="0" distR="0" wp14:anchorId="74FF8378" wp14:editId="09639366">
+          <wp:inline distT="0" distB="0" distL="0" distR="0" wp14:anchorId="0B77C413" wp14:editId="0CA9C03B">
             <wp:extent cx="5760000" cy="2724324"/>
             <wp:effectExtent l="0" t="0" r="0" b="0"/>
             <wp:docPr id="10" name="Picture 10"/>
@@ -7276,7 +7276,7 @@
       <w:pPr>
         <w:pStyle w:val="21"/>
       </w:pPr>
-      <w:bookmarkStart w:id="13" w:name="_Toc238700723"/>
+      <w:bookmarkStart w:id="13" w:name="_Toc238720520"/>
       <w:r>
         <w:t>2.8. Settings</w:t>
       </w:r>
@@ -7300,7 +7300,7 @@
         </w:rPr>
         <w:lastRenderedPageBreak/>
         <w:drawing>
-          <wp:inline distT="0" distB="0" distL="0" distR="0" wp14:anchorId="4C1A6CD2" wp14:editId="2CCD9A0B">
+          <wp:inline distT="0" distB="0" distL="0" distR="0" wp14:anchorId="67405B2B" wp14:editId="2AF66241">
             <wp:extent cx="3873730" cy="4588624"/>
             <wp:effectExtent l="0" t="0" r="0" b="0"/>
             <wp:docPr id="11" name="Picture 11"/>
@@ -7383,7 +7383,7 @@
       <w:pPr>
         <w:pStyle w:val="21"/>
       </w:pPr>
-      <w:bookmarkStart w:id="14" w:name="_Toc238700724"/>
+      <w:bookmarkStart w:id="14" w:name="_Toc238720521"/>
       <w:r>
         <w:t>2.9. Statistics</w:t>
       </w:r>
@@ -7406,7 +7406,7 @@
           <w:noProof/>
         </w:rPr>
         <w:drawing>
-          <wp:inline distT="0" distB="0" distL="0" distR="0" wp14:anchorId="669B6518" wp14:editId="72824666">
+          <wp:inline distT="0" distB="0" distL="0" distR="0" wp14:anchorId="49242517" wp14:editId="0AAFB628">
             <wp:extent cx="3707476" cy="4148051"/>
             <wp:effectExtent l="0" t="0" r="0" b="0"/>
             <wp:docPr id="12" name="Picture 12"/>
@@ -7461,7 +7461,7 @@
       <w:pPr>
         <w:pStyle w:val="21"/>
       </w:pPr>
-      <w:bookmarkStart w:id="15" w:name="_Toc238700725"/>
+      <w:bookmarkStart w:id="15" w:name="_Toc238720522"/>
       <w:r>
         <w:lastRenderedPageBreak/>
         <w:t>2.10. What happens to your files</w:t>
@@ -7482,7 +7482,7 @@
       <w:pPr>
         <w:pStyle w:val="1"/>
       </w:pPr>
-      <w:bookmarkStart w:id="16" w:name="_Toc238700726"/>
+      <w:bookmarkStart w:id="16" w:name="_Toc238720523"/>
       <w:r>
         <w:t>3. Merge PDF</w:t>
       </w:r>
@@ -7492,7 +7492,7 @@
       <w:pPr>
         <w:pStyle w:val="21"/>
       </w:pPr>
-      <w:bookmarkStart w:id="17" w:name="_Toc238700727"/>
+      <w:bookmarkStart w:id="17" w:name="_Toc238720524"/>
       <w:r>
         <w:t>3.1. What it is for</w:t>
       </w:r>
@@ -7512,7 +7512,7 @@
       <w:pPr>
         <w:pStyle w:val="21"/>
       </w:pPr>
-      <w:bookmarkStart w:id="18" w:name="_Toc238700728"/>
+      <w:bookmarkStart w:id="18" w:name="_Toc238720525"/>
       <w:r>
         <w:t>3.2. The window</w:t>
       </w:r>
@@ -7539,7 +7539,7 @@
         </w:rPr>
         <w:lastRenderedPageBreak/>
         <w:drawing>
-          <wp:inline distT="0" distB="0" distL="0" distR="0" wp14:anchorId="0AD39A7D" wp14:editId="72DA6262">
+          <wp:inline distT="0" distB="0" distL="0" distR="0" wp14:anchorId="11EBC4FF" wp14:editId="1CF12169">
             <wp:extent cx="5760000" cy="4608000"/>
             <wp:effectExtent l="0" t="0" r="0" b="0"/>
             <wp:docPr id="13" name="Picture 13"/>
@@ -7589,7 +7589,7 @@
       <w:pPr>
         <w:pStyle w:val="21"/>
       </w:pPr>
-      <w:bookmarkStart w:id="19" w:name="_Toc238700729"/>
+      <w:bookmarkStart w:id="19" w:name="_Toc238720526"/>
       <w:r>
         <w:t>3.3. The order of work</w:t>
       </w:r>
@@ -7643,7 +7643,7 @@
       <w:pPr>
         <w:pStyle w:val="21"/>
       </w:pPr>
-      <w:bookmarkStart w:id="20" w:name="_Toc238700730"/>
+      <w:bookmarkStart w:id="20" w:name="_Toc238720527"/>
       <w:r>
         <w:lastRenderedPageBreak/>
         <w:t>3.4. Double-sided printing: “Add a blank page”</w:t>
@@ -7676,7 +7676,7 @@
       <w:pPr>
         <w:pStyle w:val="21"/>
       </w:pPr>
-      <w:bookmarkStart w:id="21" w:name="_Toc238700731"/>
+      <w:bookmarkStart w:id="21" w:name="_Toc238720528"/>
       <w:r>
         <w:t>3.5. Assembling a double-sided scan</w:t>
       </w:r>
@@ -7700,7 +7700,7 @@
         </w:rPr>
         <w:lastRenderedPageBreak/>
         <w:drawing>
-          <wp:inline distT="0" distB="0" distL="0" distR="0" wp14:anchorId="3EFD338D" wp14:editId="12AF7C12">
+          <wp:inline distT="0" distB="0" distL="0" distR="0" wp14:anchorId="699B8A84" wp14:editId="0F1DCDD6">
             <wp:extent cx="5760000" cy="4608000"/>
             <wp:effectExtent l="0" t="0" r="0" b="0"/>
             <wp:docPr id="14" name="Picture 14"/>
@@ -7755,7 +7755,7 @@
       <w:pPr>
         <w:pStyle w:val="1"/>
       </w:pPr>
-      <w:bookmarkStart w:id="22" w:name="_Toc238700732"/>
+      <w:bookmarkStart w:id="22" w:name="_Toc238720529"/>
       <w:r>
         <w:t>4. Split PDF</w:t>
       </w:r>
@@ -7765,7 +7765,7 @@
       <w:pPr>
         <w:pStyle w:val="21"/>
       </w:pPr>
-      <w:bookmarkStart w:id="23" w:name="_Toc238700733"/>
+      <w:bookmarkStart w:id="23" w:name="_Toc238720530"/>
       <w:r>
         <w:t>4.1. What it is for</w:t>
       </w:r>
@@ -7786,7 +7786,7 @@
       <w:pPr>
         <w:pStyle w:val="21"/>
       </w:pPr>
-      <w:bookmarkStart w:id="24" w:name="_Toc238700734"/>
+      <w:bookmarkStart w:id="24" w:name="_Toc238720531"/>
       <w:r>
         <w:t>4.2. The window</w:t>
       </w:r>
@@ -7809,7 +7809,7 @@
           <w:noProof/>
         </w:rPr>
         <w:drawing>
-          <wp:inline distT="0" distB="0" distL="0" distR="0" wp14:anchorId="71377BD4" wp14:editId="7896642E">
+          <wp:inline distT="0" distB="0" distL="0" distR="0" wp14:anchorId="056E4318" wp14:editId="7210939B">
             <wp:extent cx="5760000" cy="4608000"/>
             <wp:effectExtent l="0" t="0" r="0" b="0"/>
             <wp:docPr id="15" name="Picture 15"/>
@@ -7859,7 +7859,7 @@
       <w:pPr>
         <w:pStyle w:val="21"/>
       </w:pPr>
-      <w:bookmarkStart w:id="25" w:name="_Toc238700735"/>
+      <w:bookmarkStart w:id="25" w:name="_Toc238720532"/>
       <w:r>
         <w:t xml:space="preserve">4.3. The modes of </w:t>
       </w:r>
@@ -7889,7 +7889,7 @@
           <w:noProof/>
         </w:rPr>
         <w:drawing>
-          <wp:inline distT="0" distB="0" distL="0" distR="0" wp14:anchorId="3C8E35C4" wp14:editId="36B18030">
+          <wp:inline distT="0" distB="0" distL="0" distR="0" wp14:anchorId="00FBA1BD" wp14:editId="50789006">
             <wp:extent cx="5760000" cy="4608000"/>
             <wp:effectExtent l="0" t="0" r="0" b="0"/>
             <wp:docPr id="16" name="Picture 16"/>
@@ -8245,7 +8245,7 @@
           <w:noProof/>
         </w:rPr>
         <w:drawing>
-          <wp:inline distT="0" distB="0" distL="0" distR="0" wp14:anchorId="528F7F10" wp14:editId="660A698B">
+          <wp:inline distT="0" distB="0" distL="0" distR="0" wp14:anchorId="3C3A1125" wp14:editId="1AB08B04">
             <wp:extent cx="5760000" cy="4608000"/>
             <wp:effectExtent l="0" t="0" r="0" b="0"/>
             <wp:docPr id="17" name="Picture 17"/>
@@ -8309,7 +8309,7 @@
         </w:rPr>
         <w:lastRenderedPageBreak/>
         <w:drawing>
-          <wp:inline distT="0" distB="0" distL="0" distR="0" wp14:anchorId="387FE671" wp14:editId="1DB85AF0">
+          <wp:inline distT="0" distB="0" distL="0" distR="0" wp14:anchorId="01D1D260" wp14:editId="69807002">
             <wp:extent cx="5760000" cy="4608000"/>
             <wp:effectExtent l="0" t="0" r="0" b="0"/>
             <wp:docPr id="18" name="Picture 18"/>
@@ -8376,7 +8376,7 @@
         </w:rPr>
         <w:lastRenderedPageBreak/>
         <w:drawing>
-          <wp:inline distT="0" distB="0" distL="0" distR="0" wp14:anchorId="44857384" wp14:editId="4EAD6FFC">
+          <wp:inline distT="0" distB="0" distL="0" distR="0" wp14:anchorId="7F55F356" wp14:editId="1F652FB1">
             <wp:extent cx="5760000" cy="4608000"/>
             <wp:effectExtent l="0" t="0" r="0" b="0"/>
             <wp:docPr id="19" name="Picture 19"/>
@@ -8426,7 +8426,7 @@
       <w:pPr>
         <w:pStyle w:val="21"/>
       </w:pPr>
-      <w:bookmarkStart w:id="26" w:name="_Toc238700736"/>
+      <w:bookmarkStart w:id="26" w:name="_Toc238720533"/>
       <w:r>
         <w:t>4.4. Naming the parts</w:t>
       </w:r>
@@ -8455,7 +8455,7 @@
         </w:rPr>
         <w:lastRenderedPageBreak/>
         <w:drawing>
-          <wp:inline distT="0" distB="0" distL="0" distR="0" wp14:anchorId="6EADF900" wp14:editId="233668C4">
+          <wp:inline distT="0" distB="0" distL="0" distR="0" wp14:anchorId="07E3601D" wp14:editId="38EADE99">
             <wp:extent cx="5760000" cy="4608000"/>
             <wp:effectExtent l="0" t="0" r="0" b="0"/>
             <wp:docPr id="20" name="Picture 20"/>
@@ -9023,7 +9023,7 @@
       <w:pPr>
         <w:pStyle w:val="21"/>
       </w:pPr>
-      <w:bookmarkStart w:id="27" w:name="_Toc238700737"/>
+      <w:bookmarkStart w:id="27" w:name="_Toc238720534"/>
       <w:r>
         <w:t>4.5. Other operations on the open document</w:t>
       </w:r>
@@ -9038,7 +9038,7 @@
       <w:pPr>
         <w:pStyle w:val="1"/>
       </w:pPr>
-      <w:bookmarkStart w:id="28" w:name="_Toc238700738"/>
+      <w:bookmarkStart w:id="28" w:name="_Toc238720535"/>
       <w:r>
         <w:t>5. More operations</w:t>
       </w:r>
@@ -9048,7 +9048,7 @@
       <w:pPr>
         <w:pStyle w:val="21"/>
       </w:pPr>
-      <w:bookmarkStart w:id="29" w:name="_Toc238700739"/>
+      <w:bookmarkStart w:id="29" w:name="_Toc238720536"/>
       <w:r>
         <w:t>5.1. What it is for</w:t>
       </w:r>
@@ -9074,7 +9074,7 @@
       <w:pPr>
         <w:pStyle w:val="21"/>
       </w:pPr>
-      <w:bookmarkStart w:id="30" w:name="_Toc238700740"/>
+      <w:bookmarkStart w:id="30" w:name="_Toc238720537"/>
       <w:r>
         <w:lastRenderedPageBreak/>
         <w:t>5.2. The window</w:t>
@@ -9098,7 +9098,7 @@
           <w:noProof/>
         </w:rPr>
         <w:drawing>
-          <wp:inline distT="0" distB="0" distL="0" distR="0" wp14:anchorId="795DF31A" wp14:editId="24442CB9">
+          <wp:inline distT="0" distB="0" distL="0" distR="0" wp14:anchorId="256A77EA" wp14:editId="008707CE">
             <wp:extent cx="5760000" cy="4905646"/>
             <wp:effectExtent l="0" t="0" r="0" b="0"/>
             <wp:docPr id="21" name="Picture 21"/>
@@ -9174,7 +9174,7 @@
       <w:pPr>
         <w:pStyle w:val="21"/>
       </w:pPr>
-      <w:bookmarkStart w:id="31" w:name="_Toc238700741"/>
+      <w:bookmarkStart w:id="31" w:name="_Toc238720538"/>
       <w:r>
         <w:t>5.3. Assembling the document</w:t>
       </w:r>
@@ -9217,7 +9217,7 @@
         </w:rPr>
         <w:lastRenderedPageBreak/>
         <w:drawing>
-          <wp:inline distT="0" distB="0" distL="0" distR="0" wp14:anchorId="66748DD8" wp14:editId="2072931A">
+          <wp:inline distT="0" distB="0" distL="0" distR="0" wp14:anchorId="57431B5D" wp14:editId="447D9B19">
             <wp:extent cx="5760000" cy="4905646"/>
             <wp:effectExtent l="0" t="0" r="0" b="0"/>
             <wp:docPr id="22" name="Picture 22"/>
@@ -9284,7 +9284,7 @@
       <w:pPr>
         <w:pStyle w:val="21"/>
       </w:pPr>
-      <w:bookmarkStart w:id="32" w:name="_Toc238700742"/>
+      <w:bookmarkStart w:id="32" w:name="_Toc238720539"/>
       <w:r>
         <w:t>5.4. The actions</w:t>
       </w:r>
@@ -9387,7 +9387,7 @@
         </w:rPr>
         <w:lastRenderedPageBreak/>
         <w:drawing>
-          <wp:inline distT="0" distB="0" distL="0" distR="0" wp14:anchorId="66821B0B" wp14:editId="28546398">
+          <wp:inline distT="0" distB="0" distL="0" distR="0" wp14:anchorId="21B3EAFF" wp14:editId="0E4AF51B">
             <wp:extent cx="5760000" cy="4713931"/>
             <wp:effectExtent l="0" t="0" r="0" b="0"/>
             <wp:docPr id="23" name="Picture 23"/>
@@ -9493,7 +9493,7 @@
         </w:rPr>
         <w:lastRenderedPageBreak/>
         <w:drawing>
-          <wp:inline distT="0" distB="0" distL="0" distR="0" wp14:anchorId="487D7597" wp14:editId="1015049D">
+          <wp:inline distT="0" distB="0" distL="0" distR="0" wp14:anchorId="6CA9D6AF" wp14:editId="4A9DFB86">
             <wp:extent cx="3873730" cy="3474719"/>
             <wp:effectExtent l="0" t="0" r="0" b="0"/>
             <wp:docPr id="24" name="Picture 24"/>
@@ -9566,7 +9566,7 @@
       <w:pPr>
         <w:pStyle w:val="1"/>
       </w:pPr>
-      <w:bookmarkStart w:id="33" w:name="_Toc238700743"/>
+      <w:bookmarkStart w:id="33" w:name="_Toc238720540"/>
       <w:r>
         <w:t>6. PDF Compare</w:t>
       </w:r>
@@ -9576,7 +9576,7 @@
       <w:pPr>
         <w:pStyle w:val="21"/>
       </w:pPr>
-      <w:bookmarkStart w:id="34" w:name="_Toc238700744"/>
+      <w:bookmarkStart w:id="34" w:name="_Toc238720541"/>
       <w:r>
         <w:t>6.1. Purpose and scope</w:t>
       </w:r>
@@ -9584,7 +9584,7 @@
     </w:p>
     <w:p>
       <w:r>
-        <w:t>The tool compares earlier and later versions of a born-digital PDF. By default, the result is a unified redline: the later page is the base, additions are green, and deleted fragments from the earlier version are overlaid in red with a strike line. Side by side keeps both original pages and can be enabled without rerunning the comparison. This is a review window, not an editor; neither source file is changed.</w:t>
+        <w:t>The tool compares earlier and later versions of a born-digital PDF. By default, the result is a unified redline: the later page is the base, additions and added whitespace are green, while deleted fragments and removed whitespace from the earlier version are red. Side by side keeps both original pages and can be enabled without rerunning the comparison. This is a review window, not an editor; neither source file is changed.</w:t>
       </w:r>
     </w:p>
     <w:p>
@@ -9614,7 +9614,7 @@
       <w:pPr>
         <w:pStyle w:val="21"/>
       </w:pPr>
-      <w:bookmarkStart w:id="35" w:name="_Toc238700745"/>
+      <w:bookmarkStart w:id="35" w:name="_Toc238720542"/>
       <w:r>
         <w:t>6.2. The window and its marks</w:t>
       </w:r>
@@ -9637,7 +9637,7 @@
           <w:noProof/>
         </w:rPr>
         <w:drawing>
-          <wp:inline distT="0" distB="0" distL="0" distR="0" wp14:anchorId="115EBDF3" wp14:editId="7AA9CE9E">
+          <wp:inline distT="0" distB="0" distL="0" distR="0" wp14:anchorId="29C71893" wp14:editId="56069186">
             <wp:extent cx="5760000" cy="3908571"/>
             <wp:effectExtent l="0" t="0" r="0" b="0"/>
             <wp:docPr id="25" name="Picture 25"/>
@@ -9685,11 +9685,11 @@
     </w:p>
     <w:p>
       <w:r>
-        <w:t xml:space="preserve">In the unified view, the later page remains the background: additions are green and only deleted earlier-version fragments are transferred in red—unchanged earlier-page pixels do not cover the result. Double-click opens the same marked-up view full screen. In Side by side, a change fill follows the verified word box tightly </w:t>
+        <w:t xml:space="preserve">In the unified view, the later page remains the background: additions are green and only deleted earlier-version fragments are transferred in red—unchanged earlier-page pixels do not cover the result. Green and red marks separately show added and removed whitespace. Double-click opens the same marked-up view full </w:t>
       </w:r>
       <w:r>
         <w:lastRenderedPageBreak/>
-        <w:t>and is not widened over a space, nearby unchanged text or a geometry gap; either marked-up side can also be opened full screen.</w:t>
+        <w:t>screen. In Side by side, only the compact ‘Red — removed’ and ‘Green — added’ legends remain above the pages, so service text does not crowd the document; either side can also be opened full screen.</w:t>
       </w:r>
     </w:p>
     <w:p>
@@ -9717,10 +9717,7 @@
         <w:t xml:space="preserve">Added in the later version. </w:t>
       </w:r>
       <w:r>
-        <w:t xml:space="preserve">A green fill and + mean a word </w:t>
-      </w:r>
-      <w:r>
-        <w:t>added to the later version. It belongs to the later page in both the unified redline and the right pane of Side by side.</w:t>
+        <w:t>A green fill and + mean a word added to the later version. It belongs to the later page in both the unified redline and the right pane of Side by side.</w:t>
       </w:r>
     </w:p>
     <w:p>
@@ -9734,7 +9731,10 @@
         <w:t xml:space="preserve">Whitespace changes. </w:t>
       </w:r>
       <w:r>
-        <w:t>The ␠, NBSP, ⇥ and ↵ marks are separate from words and appear only when a space, non-breaking space, tab or line break is literally proven by the PDF text layer.</w:t>
+        <w:t xml:space="preserve">The ␠, NBSP, ⇥ and ↵ marks are </w:t>
+      </w:r>
+      <w:r>
+        <w:t>separate from words and appear only when a space, non-breaking space, tab or line break is literally proven by the PDF text layer.</w:t>
       </w:r>
     </w:p>
     <w:p>
@@ -9758,7 +9758,7 @@
       <w:pPr>
         <w:pStyle w:val="21"/>
       </w:pPr>
-      <w:bookmarkStart w:id="36" w:name="_Toc238700746"/>
+      <w:bookmarkStart w:id="36" w:name="_Toc238720543"/>
       <w:r>
         <w:t>6.3. The order of review</w:t>
       </w:r>
@@ -9802,21 +9802,18 @@
         <w:rPr>
           <w:b/>
         </w:rPr>
+        <w:lastRenderedPageBreak/>
         <w:t xml:space="preserve">4. Adjust only the displayed pair if necessary. </w:t>
       </w:r>
       <w:r>
-        <w:t xml:space="preserve">If an automatic viewer row is inconvenient, “Pair pages…” joins two physical pages for display and </w:t>
-      </w:r>
-      <w:r>
-        <w:lastRenderedPageBreak/>
-        <w:t>conservative corroboration. It does not begin a new page-local diff or change the meaning of words already found.</w:t>
+        <w:t>If an automatic viewer row is inconvenient, “Pair pages…” joins two physical pages for display and conservative corroboration. It does not begin a new page-local diff or change the meaning of words already found.</w:t>
       </w:r>
     </w:p>
     <w:p>
       <w:pPr>
         <w:pStyle w:val="21"/>
       </w:pPr>
-      <w:bookmarkStart w:id="37" w:name="_Toc238700747"/>
+      <w:bookmarkStart w:id="37" w:name="_Toc238720544"/>
       <w:r>
         <w:t>6.4. Selecting and copying</w:t>
       </w:r>
@@ -9824,7 +9821,7 @@
     </w:p>
     <w:p>
       <w:r>
-        <w:t>Both pages remain read-only, but trusted text can be selected. Drag over words, press Ctrl+A to select trusted text on the current page, and Ctrl+C to copy it as Unicode. The local “Copy” and “Select all page text” menu commands do the same. The result pastes into an ordinary field, document or another application; text cannot be pasted into or edited in the Review pane.</w:t>
+        <w:t>Both pages remain read-only, but trusted text can be selected. Selection can start and continue in the natural white space immediately around a line, so drag through the required words without pixel-perfect aiming. Press Ctrl+A to select trusted text on the current page, and Ctrl+C to copy it as Unicode. The local “Copy” and “Select all page text” menu commands do the same. The result pastes into an ordinary field, document or another application; text cannot be pasted into or edited in the Review pane.</w:t>
       </w:r>
     </w:p>
     <w:p>
@@ -9852,10 +9849,10 @@
         <w:t xml:space="preserve">Whitespace needs proof. </w:t>
       </w:r>
       <w:r>
-        <w:t xml:space="preserve">Between adjacent words, only a separator literally decoded from the source text layer is kept </w:t>
-      </w:r>
-      <w:r>
-        <w:t>exactly: an empty boundary, one or more spaces, NBSP, a tab or a line break.</w:t>
+        <w:t xml:space="preserve">Between adjacent words, only a separator literally decoded from the source text layer is kept exactly: an empty boundary, one or </w:t>
+      </w:r>
+      <w:r>
+        <w:t>more spaces, NBSP, a tab or a line break.</w:t>
       </w:r>
     </w:p>
     <w:p>
@@ -9893,8 +9890,9 @@
       <w:pPr>
         <w:pStyle w:val="21"/>
       </w:pPr>
-      <w:bookmarkStart w:id="38" w:name="_Toc238700748"/>
-      <w:r>
+      <w:bookmarkStart w:id="38" w:name="_Toc238720545"/>
+      <w:r>
+        <w:lastRenderedPageBreak/>
         <w:t>6.5. What counts as a change</w:t>
       </w:r>
       <w:bookmarkEnd w:id="38"/>
@@ -9920,7 +9918,6 @@
     </w:p>
     <w:p>
       <w:r>
-        <w:lastRenderedPageBreak/>
         <w:t>— </w:t>
       </w:r>
       <w:r>
@@ -9951,7 +9948,7 @@
       <w:pPr>
         <w:pStyle w:val="1"/>
       </w:pPr>
-      <w:bookmarkStart w:id="39" w:name="_Toc238700749"/>
+      <w:bookmarkStart w:id="39" w:name="_Toc238720546"/>
       <w:r>
         <w:t>7. PDF → Word</w:t>
       </w:r>
@@ -9961,7 +9958,7 @@
       <w:pPr>
         <w:pStyle w:val="21"/>
       </w:pPr>
-      <w:bookmarkStart w:id="40" w:name="_Toc238700750"/>
+      <w:bookmarkStart w:id="40" w:name="_Toc238720547"/>
       <w:r>
         <w:t>7.1. What it is for</w:t>
       </w:r>
@@ -9981,7 +9978,7 @@
       <w:pPr>
         <w:pStyle w:val="21"/>
       </w:pPr>
-      <w:bookmarkStart w:id="41" w:name="_Toc238700751"/>
+      <w:bookmarkStart w:id="41" w:name="_Toc238720548"/>
       <w:r>
         <w:t>7.2. The window</w:t>
       </w:r>
@@ -10005,7 +10002,7 @@
         </w:rPr>
         <w:lastRenderedPageBreak/>
         <w:drawing>
-          <wp:inline distT="0" distB="0" distL="0" distR="0" wp14:anchorId="5F687E34" wp14:editId="46BE8601">
+          <wp:inline distT="0" distB="0" distL="0" distR="0" wp14:anchorId="55099E84" wp14:editId="6D1309D0">
             <wp:extent cx="5760000" cy="4608000"/>
             <wp:effectExtent l="0" t="0" r="0" b="0"/>
             <wp:docPr id="26" name="Picture 26"/>
@@ -10055,7 +10052,7 @@
       <w:pPr>
         <w:pStyle w:val="21"/>
       </w:pPr>
-      <w:bookmarkStart w:id="42" w:name="_Toc238700752"/>
+      <w:bookmarkStart w:id="42" w:name="_Toc238720549"/>
       <w:r>
         <w:t>7.3. The order of work</w:t>
       </w:r>
@@ -10069,10 +10066,10 @@
         <w:t xml:space="preserve">1. Add one or more PDFs with “Add PDF…” </w:t>
       </w:r>
       <w:r>
-        <w:t xml:space="preserve">or drag them into the window. The pages of all the files </w:t>
-      </w:r>
-      <w:r>
-        <w:t>are shown in one grid, so one Word document can be assembled from several PDFs.</w:t>
+        <w:t xml:space="preserve">or drag them into the window. The pages of all the files are shown in one grid, so one Word </w:t>
+      </w:r>
+      <w:r>
+        <w:t>document can be assembled from several PDFs.</w:t>
       </w:r>
     </w:p>
     <w:p>
@@ -10113,7 +10110,7 @@
       <w:pPr>
         <w:pStyle w:val="21"/>
       </w:pPr>
-      <w:bookmarkStart w:id="43" w:name="_Toc238700753"/>
+      <w:bookmarkStart w:id="43" w:name="_Toc238720550"/>
       <w:r>
         <w:t>7.4. What comes across and what does not</w:t>
       </w:r>
@@ -10154,10 +10151,7 @@
         <w:t xml:space="preserve">If the font of the PDF is not in the system, </w:t>
       </w:r>
       <w:r>
-        <w:t xml:space="preserve">the text is set in Times New Roman. The shape of the letters may differ a little from the </w:t>
-      </w:r>
-      <w:r>
-        <w:t>original.</w:t>
+        <w:t>the text is set in Times New Roman. The shape of the letters may differ a little from the original.</w:t>
       </w:r>
     </w:p>
     <w:p>
@@ -10189,7 +10183,7 @@
       <w:pPr>
         <w:pStyle w:val="1"/>
       </w:pPr>
-      <w:bookmarkStart w:id="44" w:name="_Toc238700754"/>
+      <w:bookmarkStart w:id="44" w:name="_Toc238720551"/>
       <w:r>
         <w:t>8. PDF → PowerPoint</w:t>
       </w:r>
@@ -10199,7 +10193,7 @@
       <w:pPr>
         <w:pStyle w:val="21"/>
       </w:pPr>
-      <w:bookmarkStart w:id="45" w:name="_Toc238700755"/>
+      <w:bookmarkStart w:id="45" w:name="_Toc238720552"/>
       <w:r>
         <w:t>8.1. What it is for</w:t>
       </w:r>
@@ -10231,7 +10225,7 @@
       <w:pPr>
         <w:pStyle w:val="21"/>
       </w:pPr>
-      <w:bookmarkStart w:id="46" w:name="_Toc238700756"/>
+      <w:bookmarkStart w:id="46" w:name="_Toc238720553"/>
       <w:r>
         <w:t>8.2. How a slide is built</w:t>
       </w:r>
@@ -10268,7 +10262,7 @@
       <w:pPr>
         <w:pStyle w:val="21"/>
       </w:pPr>
-      <w:bookmarkStart w:id="47" w:name="_Toc238700757"/>
+      <w:bookmarkStart w:id="47" w:name="_Toc238720554"/>
       <w:r>
         <w:t>8.3. The window</w:t>
       </w:r>
@@ -10292,7 +10286,7 @@
         </w:rPr>
         <w:lastRenderedPageBreak/>
         <w:drawing>
-          <wp:inline distT="0" distB="0" distL="0" distR="0" wp14:anchorId="1627AA89" wp14:editId="0AC5F8E7">
+          <wp:inline distT="0" distB="0" distL="0" distR="0" wp14:anchorId="0E6C64EE" wp14:editId="6F68B561">
             <wp:extent cx="5760000" cy="4608000"/>
             <wp:effectExtent l="0" t="0" r="0" b="0"/>
             <wp:docPr id="27" name="Picture 27"/>
@@ -10342,7 +10336,7 @@
       <w:pPr>
         <w:pStyle w:val="21"/>
       </w:pPr>
-      <w:bookmarkStart w:id="48" w:name="_Toc238700758"/>
+      <w:bookmarkStart w:id="48" w:name="_Toc238720555"/>
       <w:r>
         <w:t>8.4. The order of work</w:t>
       </w:r>
@@ -10396,7 +10390,7 @@
       <w:pPr>
         <w:pStyle w:val="21"/>
       </w:pPr>
-      <w:bookmarkStart w:id="49" w:name="_Toc238700759"/>
+      <w:bookmarkStart w:id="49" w:name="_Toc238720556"/>
       <w:r>
         <w:lastRenderedPageBreak/>
         <w:t>8.5. What comes across</w:t>
@@ -10405,10 +10399,10 @@
     </w:p>
     <w:p>
       <w:r>
-        <w:t xml:space="preserve">Text comes across in paragraphs, with </w:t>
-      </w:r>
-      <w:r>
-        <w:t>its font, size, weight, colour, underline, super- and subscripts and hyperlinks. Tables become real slide tables, merged cells included. The slide size follows the page: a 16:9 deck stays 16:9, and an A4 document gives A4 slides.</w:t>
+        <w:t xml:space="preserve">Text comes across in paragraphs, with its font, </w:t>
+      </w:r>
+      <w:r>
+        <w:t>size, weight, colour, underline, super- and subscripts and hyperlinks. Tables become real slide tables, merged cells included. The slide size follows the page: a 16:9 deck stays 16:9, and an A4 document gives A4 slides.</w:t>
       </w:r>
     </w:p>
     <w:p>
@@ -10423,7 +10417,7 @@
       <w:pPr>
         <w:pStyle w:val="21"/>
       </w:pPr>
-      <w:bookmarkStart w:id="50" w:name="_Toc238700760"/>
+      <w:bookmarkStart w:id="50" w:name="_Toc238720557"/>
       <w:r>
         <w:t>8.6. What not to expect</w:t>
       </w:r>
@@ -10475,7 +10469,7 @@
       <w:pPr>
         <w:pStyle w:val="1"/>
       </w:pPr>
-      <w:bookmarkStart w:id="51" w:name="_Toc238700761"/>
+      <w:bookmarkStart w:id="51" w:name="_Toc238720558"/>
       <w:r>
         <w:t>9. Merge Excel</w:t>
       </w:r>
@@ -10485,7 +10479,7 @@
       <w:pPr>
         <w:pStyle w:val="21"/>
       </w:pPr>
-      <w:bookmarkStart w:id="52" w:name="_Toc238700762"/>
+      <w:bookmarkStart w:id="52" w:name="_Toc238720559"/>
       <w:r>
         <w:t>9.1. What it is for</w:t>
       </w:r>
@@ -10509,7 +10503,7 @@
       <w:pPr>
         <w:pStyle w:val="21"/>
       </w:pPr>
-      <w:bookmarkStart w:id="53" w:name="_Toc238700763"/>
+      <w:bookmarkStart w:id="53" w:name="_Toc238720560"/>
       <w:r>
         <w:t>9.2. The window</w:t>
       </w:r>
@@ -10532,7 +10526,7 @@
           <w:noProof/>
         </w:rPr>
         <w:drawing>
-          <wp:inline distT="0" distB="0" distL="0" distR="0" wp14:anchorId="67EA730F" wp14:editId="284CE8AF">
+          <wp:inline distT="0" distB="0" distL="0" distR="0" wp14:anchorId="1F034FEA" wp14:editId="5D1D7948">
             <wp:extent cx="5760000" cy="4250667"/>
             <wp:effectExtent l="0" t="0" r="0" b="0"/>
             <wp:docPr id="28" name="Picture 28"/>
@@ -10582,7 +10576,7 @@
       <w:pPr>
         <w:pStyle w:val="21"/>
       </w:pPr>
-      <w:bookmarkStart w:id="54" w:name="_Toc238700764"/>
+      <w:bookmarkStart w:id="54" w:name="_Toc238720561"/>
       <w:r>
         <w:t>9.3. The order of work</w:t>
       </w:r>
@@ -10637,7 +10631,7 @@
       <w:pPr>
         <w:pStyle w:val="21"/>
       </w:pPr>
-      <w:bookmarkStart w:id="55" w:name="_Toc238700765"/>
+      <w:bookmarkStart w:id="55" w:name="_Toc238720562"/>
       <w:r>
         <w:t>9.4. The options</w:t>
       </w:r>
@@ -10689,7 +10683,7 @@
       <w:pPr>
         <w:pStyle w:val="21"/>
       </w:pPr>
-      <w:bookmarkStart w:id="56" w:name="_Toc238700766"/>
+      <w:bookmarkStart w:id="56" w:name="_Toc238720563"/>
       <w:r>
         <w:t>9.5. The result, the report and the cover note</w:t>
       </w:r>
@@ -10721,7 +10715,7 @@
       <w:pPr>
         <w:pStyle w:val="21"/>
       </w:pPr>
-      <w:bookmarkStart w:id="57" w:name="_Toc238700767"/>
+      <w:bookmarkStart w:id="57" w:name="_Toc238720564"/>
       <w:r>
         <w:t>9.6. The Menu of the tool</w:t>
       </w:r>
@@ -10744,7 +10738,7 @@
           <w:noProof/>
         </w:rPr>
         <w:drawing>
-          <wp:inline distT="0" distB="0" distL="0" distR="0" wp14:anchorId="29873A12" wp14:editId="43CB9CBB">
+          <wp:inline distT="0" distB="0" distL="0" distR="0" wp14:anchorId="4EC29E9D" wp14:editId="1B4BD69D">
             <wp:extent cx="5760000" cy="4250667"/>
             <wp:effectExtent l="0" t="0" r="0" b="0"/>
             <wp:docPr id="29" name="Picture 29"/>
@@ -10811,7 +10805,7 @@
       <w:pPr>
         <w:pStyle w:val="1"/>
       </w:pPr>
-      <w:bookmarkStart w:id="58" w:name="_Toc238700768"/>
+      <w:bookmarkStart w:id="58" w:name="_Toc238720565"/>
       <w:r>
         <w:lastRenderedPageBreak/>
         <w:t>10. Reference</w:t>
@@ -10822,7 +10816,7 @@
       <w:pPr>
         <w:pStyle w:val="21"/>
       </w:pPr>
-      <w:bookmarkStart w:id="59" w:name="_Toc238700769"/>
+      <w:bookmarkStart w:id="59" w:name="_Toc238720566"/>
       <w:r>
         <w:t>10.1. About the program</w:t>
       </w:r>
@@ -10845,7 +10839,7 @@
           <w:noProof/>
         </w:rPr>
         <w:drawing>
-          <wp:inline distT="0" distB="0" distL="0" distR="0" wp14:anchorId="754883C1" wp14:editId="79F36A70">
+          <wp:inline distT="0" distB="0" distL="0" distR="0" wp14:anchorId="4774F5E3" wp14:editId="6D09EFC9">
             <wp:extent cx="3873730" cy="3940232"/>
             <wp:effectExtent l="0" t="0" r="0" b="0"/>
             <wp:docPr id="30" name="Picture 30"/>
@@ -10911,7 +10905,7 @@
       <w:pPr>
         <w:pStyle w:val="21"/>
       </w:pPr>
-      <w:bookmarkStart w:id="60" w:name="_Toc238700770"/>
+      <w:bookmarkStart w:id="60" w:name="_Toc238720567"/>
       <w:r>
         <w:lastRenderedPageBreak/>
         <w:t>10.2. If something went wrong</w:t>
@@ -11321,7 +11315,7 @@
       <w:pPr>
         <w:pStyle w:val="21"/>
       </w:pPr>
-      <w:bookmarkStart w:id="61" w:name="_Toc238700771"/>
+      <w:bookmarkStart w:id="61" w:name="_Toc238720568"/>
       <w:r>
         <w:t>10.3. Updating the contents after edits</w:t>
       </w:r>
@@ -11340,7 +11334,7 @@
       <w:pPr>
         <w:pStyle w:val="21"/>
       </w:pPr>
-      <w:bookmarkStart w:id="62" w:name="_Toc238700772"/>
+      <w:bookmarkStart w:id="62" w:name="_Toc238720569"/>
       <w:r>
         <w:t>10.4. A short reminder</w:t>
       </w:r>
@@ -11846,31 +11840,31 @@
       </w:rPr>
     </w:lvl>
   </w:abstractNum>
-  <w:num w:numId="1" w16cid:durableId="1926956593">
+  <w:num w:numId="1" w16cid:durableId="968900964">
     <w:abstractNumId w:val="8"/>
   </w:num>
-  <w:num w:numId="2" w16cid:durableId="1439567881">
+  <w:num w:numId="2" w16cid:durableId="559753951">
     <w:abstractNumId w:val="6"/>
   </w:num>
-  <w:num w:numId="3" w16cid:durableId="1991057749">
+  <w:num w:numId="3" w16cid:durableId="382604375">
     <w:abstractNumId w:val="5"/>
   </w:num>
-  <w:num w:numId="4" w16cid:durableId="441998494">
+  <w:num w:numId="4" w16cid:durableId="759449226">
     <w:abstractNumId w:val="4"/>
   </w:num>
-  <w:num w:numId="5" w16cid:durableId="2013221258">
+  <w:num w:numId="5" w16cid:durableId="356539698">
     <w:abstractNumId w:val="7"/>
   </w:num>
-  <w:num w:numId="6" w16cid:durableId="1307395024">
+  <w:num w:numId="6" w16cid:durableId="1174613758">
     <w:abstractNumId w:val="3"/>
   </w:num>
-  <w:num w:numId="7" w16cid:durableId="1915434060">
+  <w:num w:numId="7" w16cid:durableId="2070574554">
     <w:abstractNumId w:val="2"/>
   </w:num>
-  <w:num w:numId="8" w16cid:durableId="172108037">
+  <w:num w:numId="8" w16cid:durableId="1227030803">
     <w:abstractNumId w:val="1"/>
   </w:num>
-  <w:num w:numId="9" w16cid:durableId="288054919">
+  <w:num w:numId="9" w16cid:durableId="915937212">
     <w:abstractNumId w:val="0"/>
   </w:num>
 </w:numbering>
@@ -23309,7 +23303,7 @@
     <w:autoRedefine/>
     <w:uiPriority w:val="39"/>
     <w:unhideWhenUsed/>
-    <w:rsid w:val="00AF4A5E"/>
+    <w:rsid w:val="004B3794"/>
     <w:pPr>
       <w:spacing w:after="100"/>
     </w:pPr>
@@ -23321,7 +23315,7 @@
     <w:autoRedefine/>
     <w:uiPriority w:val="39"/>
     <w:unhideWhenUsed/>
-    <w:rsid w:val="00AF4A5E"/>
+    <w:rsid w:val="004B3794"/>
     <w:pPr>
       <w:spacing w:after="100"/>
       <w:ind w:left="280"/>
@@ -23332,7 +23326,7 @@
     <w:basedOn w:val="a2"/>
     <w:uiPriority w:val="99"/>
     <w:unhideWhenUsed/>
-    <w:rsid w:val="00AF4A5E"/>
+    <w:rsid w:val="004B3794"/>
     <w:rPr>
       <w:color w:val="0000FF" w:themeColor="hyperlink"/>
       <w:u w:val="single"/>

</xml_diff>